<commit_message>
Add persona experiment results, demographic ceiling analysis, and manuscript update
Co-Authored-By: Claude Sonnet 5.5 <noreply@anthropic.com>
Claude-Session: https://claude.ai/code/session_01VRbK37d38KZhVAbWS4xw4x
</commit_message>
<xml_diff>
--- a/llm-count-study/ISR_manuscript_draft.docx
+++ b/llm-count-study/ISR_manuscript_draft.docx
@@ -51,7 +51,7 @@
         <w:pStyle w:val="BodyText"/>
       </w:pPr>
       <w:r>
-        <w:t xml:space="preserve">Large language models (LLMs) are increasingly used to create synthetic customers for pre-testing marketing decisions, but evaluations have concentrated on ratings, choices, and stated willingness to pay. We study an output that customer analytics depends on more directly: the number of purchases a customer makes in a period. Building on the Poisson–gamma account of purchase counts, we show analytically that overdispersion measures unobserved customer heterogeneity, derive how much of it a persona-conditioned simulator can carry, and show how a hybrid design avoids double counting. We evaluate four elicitation designs across three LLMs in two public transaction settings (mean counts of about 0.5 and 4.8) and in a randomized email experiment. Direct and day-by-day designs collapse toward a single value in both settings. Describing a distribution recovers part of the dispersion but under-produces zero counts. The hybrid matches dispersion only when the model’s mean is accurate. Promotion effects have the right sign in most settings, yet their size varies by an order of magnitude with model and prompt, and the absolute lift in purchase probability is overstated four- to 26-fold. We offer a diagnostic protocol for practitioners who consider synthetic customers for decision support.</w:t>
+        <w:t xml:space="preserve">Large language models (LLMs) are increasingly used to create synthetic customers for pre-testing marketing decisions, but evaluations have concentrated on ratings, choices, and stated willingness to pay. We study an output that customer analytics depends on more directly: the number of purchases a customer makes in a period. Building on the Poisson–gamma account of purchase counts, we show analytically that overdispersion measures unobserved customer heterogeneity, derive how much of it a persona-conditioned simulator can carry, and show how a hybrid design avoids double counting. We evaluate four elicitation designs across three LLMs in two public transaction settings (mean counts of about 0.5 and 4.8) and in a randomized email experiment. Direct and day-by-day designs collapse toward a single value in both settings. Describing a distribution recovers part of the dispersion but under-produces zero counts where zeros are common. Personas built from real household demographics change nothing, because those demographics explain about 1% of the heterogeneity in counts. The hybrid matches dispersion only when the model’s mean is accurate. Promotion effects have the right sign in most settings, yet their size varies by an order of magnitude with model and prompt, and the absolute lift in purchase probability is overstated four- to 26-fold. We offer a diagnostic protocol for practitioners who consider synthetic customers for decision support.</w:t>
       </w:r>
     </w:p>
     <w:p>
@@ -4139,7 +4139,7 @@
     </w:p>
     <w:bookmarkEnd w:id="36"/>
     <w:bookmarkEnd w:id="37"/>
-    <w:bookmarkStart w:id="50" w:name="results"/>
+    <w:bookmarkStart w:id="51" w:name="results"/>
     <w:p>
       <w:pPr>
         <w:pStyle w:val="Heading1"/>
@@ -5675,13 +5675,1049 @@
       </w:r>
     </w:p>
     <w:bookmarkEnd w:id="44"/>
-    <w:bookmarkStart w:id="48" w:name="randomized-email-experiment"/>
+    <w:bookmarkStart w:id="45" w:name="Xe23f2af77092521160ea0caefb57b398689219a"/>
     <w:p>
       <w:pPr>
         <w:pStyle w:val="Heading2"/>
       </w:pPr>
       <w:r>
-        <w:t xml:space="preserve">5.5 Randomized email experiment</w:t>
+        <w:t xml:space="preserve">5.5 Richer personas from real household demographics</w:t>
+      </w:r>
+    </w:p>
+    <w:p>
+      <w:pPr>
+        <w:pStyle w:val="FirstParagraph"/>
+      </w:pPr>
+      <w:r>
+        <w:t xml:space="preserve">The personas used so far were deliberately simple. To test whether richer personas change the picture, we drew 200 household-windows at random from the 801 Complete Journey households with demographic records and described each household by its real age group, household type and size, number of children, marital status, income, and home ownership. This design also lets us compare each simulated count with that household’s real count in the same window. The reference is now the real distribution of these households, who shop more often than the full panel: mean 7.83, variance-to-mean ratio 6.52, zero share 0.03, and</w:t>
+      </w:r>
+      <w:r>
+        <w:t xml:space="preserve"> </w:t>
+      </w:r>
+      <m:oMath>
+        <m:r>
+          <m:t>α</m:t>
+        </m:r>
+        <m:r>
+          <m:rPr>
+            <m:sty m:val="p"/>
+          </m:rPr>
+          <m:t>=</m:t>
+        </m:r>
+        <m:r>
+          <m:t>0.71</m:t>
+        </m:r>
+      </m:oMath>
+      <w:r>
+        <w:t xml:space="preserve">. The ceiling of design C for this reference is 5.01.</w:t>
+      </w:r>
+    </w:p>
+    <w:p>
+      <w:pPr>
+        <w:pStyle w:val="BodyText"/>
+      </w:pPr>
+      <w:r>
+        <w:t xml:space="preserve">How much can demographics explain? Out of sample (households held out), a Poisson regression of the household’s count on all demographic fields reaches a Spearman correlation of only 0.04 with the real count, and the squared coefficient of variation of its predicted means is</w:t>
+      </w:r>
+      <w:r>
+        <w:t xml:space="preserve"> </w:t>
+      </w:r>
+      <m:oMath>
+        <m:sSup>
+          <m:e>
+            <m:r>
+              <m:t>c</m:t>
+            </m:r>
+          </m:e>
+          <m:sup>
+            <m:r>
+              <m:t>2</m:t>
+            </m:r>
+          </m:sup>
+        </m:sSup>
+        <m:r>
+          <m:rPr>
+            <m:sty m:val="p"/>
+          </m:rPr>
+          <m:t>=</m:t>
+        </m:r>
+        <m:r>
+          <m:t>0.006</m:t>
+        </m:r>
+      </m:oMath>
+      <w:r>
+        <w:t xml:space="preserve">, about 1% of</w:t>
+      </w:r>
+      <w:r>
+        <w:t xml:space="preserve"> </w:t>
+      </w:r>
+      <m:oMath>
+        <m:r>
+          <m:t>α</m:t>
+        </m:r>
+      </m:oMath>
+      <w:r>
+        <w:t xml:space="preserve">. In terms of Proposition 1, the unexplained share</w:t>
+      </w:r>
+      <w:r>
+        <w:t xml:space="preserve"> </w:t>
+      </w:r>
+      <m:oMath>
+        <m:r>
+          <m:t>R</m:t>
+        </m:r>
+      </m:oMath>
+      <w:r>
+        <w:t xml:space="preserve"> </w:t>
+      </w:r>
+      <w:r>
+        <w:t xml:space="preserve">is almost equal to</w:t>
+      </w:r>
+      <w:r>
+        <w:t xml:space="preserve"> </w:t>
+      </w:r>
+      <m:oMath>
+        <m:r>
+          <m:t>α</m:t>
+        </m:r>
+      </m:oMath>
+      <w:r>
+        <w:t xml:space="preserve">: the persona describes almost none of the heterogeneity. A deterministic simulator that predicted these means perfectly would have</w:t>
+      </w:r>
+      <w:r>
+        <w:t xml:space="preserve"> </w:t>
+      </w:r>
+      <m:oMath>
+        <m:sSup>
+          <m:e>
+            <m:r>
+              <m:t>α</m:t>
+            </m:r>
+          </m:e>
+          <m:sup>
+            <m:r>
+              <m:rPr>
+                <m:sty m:val="p"/>
+              </m:rPr>
+              <m:t>*</m:t>
+            </m:r>
+          </m:sup>
+        </m:sSup>
+        <m:r>
+          <m:rPr>
+            <m:sty m:val="p"/>
+          </m:rPr>
+          <m:t>=</m:t>
+        </m:r>
+        <m:sSup>
+          <m:e>
+            <m:r>
+              <m:t>c</m:t>
+            </m:r>
+          </m:e>
+          <m:sup>
+            <m:r>
+              <m:t>2</m:t>
+            </m:r>
+          </m:sup>
+        </m:sSup>
+        <m:r>
+          <m:rPr>
+            <m:sty m:val="p"/>
+          </m:rPr>
+          <m:t>−</m:t>
+        </m:r>
+        <m:r>
+          <m:t>1</m:t>
+        </m:r>
+        <m:r>
+          <m:rPr>
+            <m:sty m:val="p"/>
+          </m:rPr>
+          <m:t>/</m:t>
+        </m:r>
+        <m:r>
+          <m:t>μ</m:t>
+        </m:r>
+        <m:r>
+          <m:rPr>
+            <m:sty m:val="p"/>
+          </m:rPr>
+          <m:t>=</m:t>
+        </m:r>
+        <m:r>
+          <m:rPr>
+            <m:sty m:val="p"/>
+          </m:rPr>
+          <m:t>−</m:t>
+        </m:r>
+        <m:r>
+          <m:t>0.12</m:t>
+        </m:r>
+      </m:oMath>
+      <w:r>
+        <w:t xml:space="preserve">, against a real</w:t>
+      </w:r>
+      <w:r>
+        <w:t xml:space="preserve"> </w:t>
+      </w:r>
+      <m:oMath>
+        <m:r>
+          <m:t>α</m:t>
+        </m:r>
+      </m:oMath>
+      <w:r>
+        <w:t xml:space="preserve"> </w:t>
+      </w:r>
+      <w:r>
+        <w:t xml:space="preserve">of 0.71.</w:t>
+      </w:r>
+    </w:p>
+    <w:p>
+      <w:pPr>
+        <w:pStyle w:val="BodyText"/>
+      </w:pPr>
+      <w:r>
+        <w:t xml:space="preserve">The simulations behave as Proposition 1 predicts (Table 3, Table B3). Direct answers are collapsed again (variance-to-mean ratio 0.00 to 0.39, zero share 0.00) with</w:t>
+      </w:r>
+      <w:r>
+        <w:t xml:space="preserve"> </w:t>
+      </w:r>
+      <m:oMath>
+        <m:r>
+          <m:t>α</m:t>
+        </m:r>
+      </m:oMath>
+      <w:r>
+        <w:t xml:space="preserve"> </w:t>
+      </w:r>
+      <w:r>
+        <w:t xml:space="preserve">between -0.16 and -0.08. GPT-4o-mini answered</w:t>
+      </w:r>
+      <w:r>
+        <w:t xml:space="preserve"> </w:t>
+      </w:r>
+      <w:r>
+        <w:t xml:space="preserve">“</w:t>
+      </w:r>
+      <w:r>
+        <w:t xml:space="preserve">8</w:t>
+      </w:r>
+      <w:r>
+        <w:t xml:space="preserve">”</w:t>
+      </w:r>
+      <w:r>
+        <w:t xml:space="preserve"> </w:t>
+      </w:r>
+      <w:r>
+        <w:t xml:space="preserve">for every household when told the base rate (the number in the anchor text) and for practically every household without it, which gives</w:t>
+      </w:r>
+      <w:r>
+        <w:t xml:space="preserve"> </w:t>
+      </w:r>
+      <m:oMath>
+        <m:r>
+          <m:t>α</m:t>
+        </m:r>
+        <m:r>
+          <m:rPr>
+            <m:sty m:val="p"/>
+          </m:rPr>
+          <m:t>=</m:t>
+        </m:r>
+        <m:r>
+          <m:rPr>
+            <m:sty m:val="p"/>
+          </m:rPr>
+          <m:t>−</m:t>
+        </m:r>
+        <m:r>
+          <m:t>1</m:t>
+        </m:r>
+        <m:r>
+          <m:rPr>
+            <m:sty m:val="p"/>
+          </m:rPr>
+          <m:t>/</m:t>
+        </m:r>
+        <m:r>
+          <m:t>μ</m:t>
+        </m:r>
+        <m:r>
+          <m:rPr>
+            <m:sty m:val="p"/>
+          </m:rPr>
+          <m:t>=</m:t>
+        </m:r>
+        <m:r>
+          <m:rPr>
+            <m:sty m:val="p"/>
+          </m:rPr>
+          <m:t>−</m:t>
+        </m:r>
+        <m:r>
+          <m:t>0.125</m:t>
+        </m:r>
+      </m:oMath>
+      <w:r>
+        <w:t xml:space="preserve">, exactly the value of Proposition 1 with</w:t>
+      </w:r>
+      <w:r>
+        <w:t xml:space="preserve"> </w:t>
+      </w:r>
+      <m:oMath>
+        <m:sSup>
+          <m:e>
+            <m:r>
+              <m:t>c</m:t>
+            </m:r>
+          </m:e>
+          <m:sup>
+            <m:r>
+              <m:t>2</m:t>
+            </m:r>
+          </m:sup>
+        </m:sSup>
+        <m:r>
+          <m:rPr>
+            <m:sty m:val="p"/>
+          </m:rPr>
+          <m:t>=</m:t>
+        </m:r>
+        <m:r>
+          <m:t>0</m:t>
+        </m:r>
+      </m:oMath>
+      <w:r>
+        <w:t xml:space="preserve">. Daily simulation again overstates the mean (8.2 to 17.3 against 7.83). Describing a distribution reaches ratios of 3.70 to 5.05, and the intervals contain its ceiling of 5.01 in five of six cells; its zero share (0.03 to 0.09) is close to the small real share of 0.03. The hybrid matches the reference ratio in all six cells (5.21 to 7.26), but its mean is too low in five of six cells (4.73 to 6.42 against 7.83) and its zero share too high (0.07 to 0.12).</w:t>
+      </w:r>
+    </w:p>
+    <w:tbl>
+      <w:tblPr>
+        <w:tblStyle w:val="Table"/>
+        <w:tblW w:type="pct" w:w="5000"/>
+        <w:tblLook w:firstRow="1" w:lastRow="0" w:firstColumn="0" w:lastColumn="0" w:noHBand="0" w:noVBand="0" w:val="0020"/>
+        <w:jc w:val="start"/>
+        <w:tblBorders>
+          <w:top w:val="single" w:sz="4" w:color="808080"/>
+          <w:bottom w:val="single" w:sz="4" w:color="808080"/>
+          <w:insideH w:val="single" w:sz="4" w:color="808080"/>
+        </w:tblBorders>
+      </w:tblPr>
+      <w:tblGrid>
+        <w:gridCol w:w="1320"/>
+        <w:gridCol w:w="1320"/>
+        <w:gridCol w:w="1320"/>
+        <w:gridCol w:w="1320"/>
+        <w:gridCol w:w="1320"/>
+        <w:gridCol w:w="1320"/>
+      </w:tblGrid>
+      <w:tr>
+        <w:trPr>
+          <w:tblHeader w:val="true"/>
+        </w:trPr>
+        <w:tc>
+          <w:tcPr/>
+          <w:p>
+            <w:pPr>
+              <w:pStyle w:val="Compact"/>
+              <w:spacing w:before="20" w:after="20" w:line="240" w:lineRule="auto"/>
+              <w:ind w:firstLine="0"/>
+              <w:jc w:val="left"/>
+            </w:pPr>
+            <w:r>
+              <w:rPr>
+                <w:rFonts w:ascii="Times New Roman" w:hAnsi="Times New Roman"/>
+                <w:b/>
+                <w:sz w:val="17"/>
+              </w:rPr>
+              <w:t xml:space="preserve">Design</w:t>
+            </w:r>
+          </w:p>
+        </w:tc>
+        <w:tc>
+          <w:tcPr/>
+          <w:p>
+            <w:pPr>
+              <w:pStyle w:val="Compact"/>
+              <w:spacing w:before="20" w:after="20" w:line="240" w:lineRule="auto"/>
+              <w:ind w:firstLine="0"/>
+              <w:jc w:val="left"/>
+            </w:pPr>
+            <w:r>
+              <w:rPr>
+                <w:rFonts w:ascii="Times New Roman" w:hAnsi="Times New Roman"/>
+                <w:b/>
+                <w:sz w:val="17"/>
+              </w:rPr>
+              <w:t xml:space="preserve">Mean</w:t>
+            </w:r>
+          </w:p>
+        </w:tc>
+        <w:tc>
+          <w:tcPr/>
+          <w:p>
+            <w:pPr>
+              <w:pStyle w:val="Compact"/>
+              <w:spacing w:before="20" w:after="20" w:line="240" w:lineRule="auto"/>
+              <w:ind w:firstLine="0"/>
+              <w:jc w:val="left"/>
+            </w:pPr>
+            <w:r>
+              <w:rPr>
+                <w:rFonts w:ascii="Times New Roman" w:hAnsi="Times New Roman"/>
+                <w:b/>
+                <w:sz w:val="17"/>
+              </w:rPr>
+              <w:t xml:space="preserve">Var/mean</w:t>
+            </w:r>
+          </w:p>
+        </w:tc>
+        <w:tc>
+          <w:tcPr/>
+          <w:p>
+            <w:pPr>
+              <w:pStyle w:val="Compact"/>
+              <w:spacing w:before="20" w:after="20" w:line="240" w:lineRule="auto"/>
+              <w:ind w:firstLine="0"/>
+              <w:jc w:val="left"/>
+            </w:pPr>
+            <w:r>
+              <w:rPr>
+                <w:rFonts w:ascii="Times New Roman" w:hAnsi="Times New Roman"/>
+                <w:b/>
+                <w:sz w:val="17"/>
+              </w:rPr>
+              <w:t xml:space="preserve">Zero</w:t>
+            </w:r>
+          </w:p>
+        </w:tc>
+        <w:tc>
+          <w:tcPr/>
+          <w:p>
+            <w:pPr>
+              <w:pStyle w:val="Compact"/>
+              <w:spacing w:before="20" w:after="20" w:line="240" w:lineRule="auto"/>
+              <w:ind w:firstLine="0"/>
+              <w:jc w:val="left"/>
+            </w:pPr>
+            <w:r>
+              <w:rPr>
+                <w:rFonts w:ascii="Times New Roman" w:hAnsi="Times New Roman"/>
+                <w:b/>
+                <w:sz w:val="17"/>
+              </w:rPr>
+              <w:t xml:space="preserve">Alpha</w:t>
+            </w:r>
+          </w:p>
+        </w:tc>
+        <w:tc>
+          <w:tcPr/>
+          <w:p>
+            <w:pPr>
+              <w:pStyle w:val="Compact"/>
+              <w:spacing w:before="20" w:after="20" w:line="240" w:lineRule="auto"/>
+              <w:ind w:firstLine="0"/>
+              <w:jc w:val="left"/>
+            </w:pPr>
+            <w:r>
+              <w:rPr>
+                <w:rFonts w:ascii="Times New Roman" w:hAnsi="Times New Roman"/>
+                <w:b/>
+                <w:sz w:val="17"/>
+              </w:rPr>
+              <w:t xml:space="preserve">Rank correlation with real count</w:t>
+            </w:r>
+          </w:p>
+        </w:tc>
+      </w:tr>
+      <w:tr>
+        <w:tc>
+          <w:tcPr/>
+          <w:p>
+            <w:pPr>
+              <w:pStyle w:val="Compact"/>
+              <w:spacing w:before="20" w:after="20" w:line="240" w:lineRule="auto"/>
+              <w:ind w:firstLine="0"/>
+              <w:jc w:val="left"/>
+            </w:pPr>
+            <w:r>
+              <w:rPr>
+                <w:rFonts w:ascii="Times New Roman" w:hAnsi="Times New Roman"/>
+                <w:sz w:val="17"/>
+              </w:rPr>
+              <w:t xml:space="preserve">Reference</w:t>
+            </w:r>
+          </w:p>
+        </w:tc>
+        <w:tc>
+          <w:tcPr/>
+          <w:p>
+            <w:pPr>
+              <w:pStyle w:val="Compact"/>
+              <w:spacing w:before="20" w:after="20" w:line="240" w:lineRule="auto"/>
+              <w:ind w:firstLine="0"/>
+              <w:jc w:val="left"/>
+            </w:pPr>
+            <w:r>
+              <w:rPr>
+                <w:rFonts w:ascii="Times New Roman" w:hAnsi="Times New Roman"/>
+                <w:sz w:val="17"/>
+              </w:rPr>
+              <w:t xml:space="preserve">7.83</w:t>
+            </w:r>
+          </w:p>
+        </w:tc>
+        <w:tc>
+          <w:tcPr/>
+          <w:p>
+            <w:pPr>
+              <w:pStyle w:val="Compact"/>
+              <w:spacing w:before="20" w:after="20" w:line="240" w:lineRule="auto"/>
+              <w:ind w:firstLine="0"/>
+              <w:jc w:val="left"/>
+            </w:pPr>
+            <w:r>
+              <w:rPr>
+                <w:rFonts w:ascii="Times New Roman" w:hAnsi="Times New Roman"/>
+                <w:sz w:val="17"/>
+              </w:rPr>
+              <w:t xml:space="preserve">6.52</w:t>
+            </w:r>
+          </w:p>
+        </w:tc>
+        <w:tc>
+          <w:tcPr/>
+          <w:p>
+            <w:pPr>
+              <w:pStyle w:val="Compact"/>
+              <w:spacing w:before="20" w:after="20" w:line="240" w:lineRule="auto"/>
+              <w:ind w:firstLine="0"/>
+              <w:jc w:val="left"/>
+            </w:pPr>
+            <w:r>
+              <w:rPr>
+                <w:rFonts w:ascii="Times New Roman" w:hAnsi="Times New Roman"/>
+                <w:sz w:val="17"/>
+              </w:rPr>
+              <w:t xml:space="preserve">0.03</w:t>
+            </w:r>
+          </w:p>
+        </w:tc>
+        <w:tc>
+          <w:tcPr/>
+          <w:p>
+            <w:pPr>
+              <w:pStyle w:val="Compact"/>
+              <w:spacing w:before="20" w:after="20" w:line="240" w:lineRule="auto"/>
+              <w:ind w:firstLine="0"/>
+              <w:jc w:val="left"/>
+            </w:pPr>
+            <w:r>
+              <w:rPr>
+                <w:rFonts w:ascii="Times New Roman" w:hAnsi="Times New Roman"/>
+                <w:sz w:val="17"/>
+              </w:rPr>
+              <w:t xml:space="preserve">0.71</w:t>
+            </w:r>
+          </w:p>
+        </w:tc>
+        <w:tc>
+          <w:tcPr/>
+          <w:p>
+            <w:pPr>
+              <w:pStyle w:val="Compact"/>
+              <w:spacing w:before="20" w:after="20" w:line="240" w:lineRule="auto"/>
+              <w:ind w:firstLine="0"/>
+            </w:pPr>
+          </w:p>
+        </w:tc>
+      </w:tr>
+      <w:tr>
+        <w:tc>
+          <w:tcPr/>
+          <w:p>
+            <w:pPr>
+              <w:pStyle w:val="Compact"/>
+              <w:spacing w:before="20" w:after="20" w:line="240" w:lineRule="auto"/>
+              <w:ind w:firstLine="0"/>
+              <w:jc w:val="left"/>
+            </w:pPr>
+            <w:r>
+              <w:rPr>
+                <w:rFonts w:ascii="Times New Roman" w:hAnsi="Times New Roman"/>
+                <w:sz w:val="17"/>
+              </w:rPr>
+              <w:t xml:space="preserve">A Direct</w:t>
+            </w:r>
+          </w:p>
+        </w:tc>
+        <w:tc>
+          <w:tcPr/>
+          <w:p>
+            <w:pPr>
+              <w:pStyle w:val="Compact"/>
+              <w:spacing w:before="20" w:after="20" w:line="240" w:lineRule="auto"/>
+              <w:ind w:firstLine="0"/>
+              <w:jc w:val="left"/>
+            </w:pPr>
+            <w:r>
+              <w:rPr>
+                <w:rFonts w:ascii="Times New Roman" w:hAnsi="Times New Roman"/>
+                <w:sz w:val="17"/>
+              </w:rPr>
+              <w:t xml:space="preserve">6.09 to 8.12</w:t>
+            </w:r>
+          </w:p>
+        </w:tc>
+        <w:tc>
+          <w:tcPr/>
+          <w:p>
+            <w:pPr>
+              <w:pStyle w:val="Compact"/>
+              <w:spacing w:before="20" w:after="20" w:line="240" w:lineRule="auto"/>
+              <w:ind w:firstLine="0"/>
+              <w:jc w:val="left"/>
+            </w:pPr>
+            <w:r>
+              <w:rPr>
+                <w:rFonts w:ascii="Times New Roman" w:hAnsi="Times New Roman"/>
+                <w:sz w:val="17"/>
+              </w:rPr>
+              <w:t xml:space="preserve">0.00 to 0.39</w:t>
+            </w:r>
+          </w:p>
+        </w:tc>
+        <w:tc>
+          <w:tcPr/>
+          <w:p>
+            <w:pPr>
+              <w:pStyle w:val="Compact"/>
+              <w:spacing w:before="20" w:after="20" w:line="240" w:lineRule="auto"/>
+              <w:ind w:firstLine="0"/>
+              <w:jc w:val="left"/>
+            </w:pPr>
+            <w:r>
+              <w:rPr>
+                <w:rFonts w:ascii="Times New Roman" w:hAnsi="Times New Roman"/>
+                <w:sz w:val="17"/>
+              </w:rPr>
+              <w:t xml:space="preserve">0.00 to 0.00</w:t>
+            </w:r>
+          </w:p>
+        </w:tc>
+        <w:tc>
+          <w:tcPr/>
+          <w:p>
+            <w:pPr>
+              <w:pStyle w:val="Compact"/>
+              <w:spacing w:before="20" w:after="20" w:line="240" w:lineRule="auto"/>
+              <w:ind w:firstLine="0"/>
+              <w:jc w:val="left"/>
+            </w:pPr>
+            <w:r>
+              <w:rPr>
+                <w:rFonts w:ascii="Times New Roman" w:hAnsi="Times New Roman"/>
+                <w:sz w:val="17"/>
+              </w:rPr>
+              <w:t xml:space="preserve">-0.16 to -0.08</w:t>
+            </w:r>
+          </w:p>
+        </w:tc>
+        <w:tc>
+          <w:tcPr/>
+          <w:p>
+            <w:pPr>
+              <w:pStyle w:val="Compact"/>
+              <w:spacing w:before="20" w:after="20" w:line="240" w:lineRule="auto"/>
+              <w:ind w:firstLine="0"/>
+              <w:jc w:val="left"/>
+            </w:pPr>
+            <w:r>
+              <w:rPr>
+                <w:rFonts w:ascii="Times New Roman" w:hAnsi="Times New Roman"/>
+                <w:sz w:val="17"/>
+              </w:rPr>
+              <w:t xml:space="preserve">-0.08 to +0.08</w:t>
+            </w:r>
+          </w:p>
+        </w:tc>
+      </w:tr>
+      <w:tr>
+        <w:tc>
+          <w:tcPr/>
+          <w:p>
+            <w:pPr>
+              <w:pStyle w:val="Compact"/>
+              <w:spacing w:before="20" w:after="20" w:line="240" w:lineRule="auto"/>
+              <w:ind w:firstLine="0"/>
+              <w:jc w:val="left"/>
+            </w:pPr>
+            <w:r>
+              <w:rPr>
+                <w:rFonts w:ascii="Times New Roman" w:hAnsi="Times New Roman"/>
+                <w:sz w:val="17"/>
+              </w:rPr>
+              <w:t xml:space="preserve">B Daily</w:t>
+            </w:r>
+          </w:p>
+        </w:tc>
+        <w:tc>
+          <w:tcPr/>
+          <w:p>
+            <w:pPr>
+              <w:pStyle w:val="Compact"/>
+              <w:spacing w:before="20" w:after="20" w:line="240" w:lineRule="auto"/>
+              <w:ind w:firstLine="0"/>
+              <w:jc w:val="left"/>
+            </w:pPr>
+            <w:r>
+              <w:rPr>
+                <w:rFonts w:ascii="Times New Roman" w:hAnsi="Times New Roman"/>
+                <w:sz w:val="17"/>
+              </w:rPr>
+              <w:t xml:space="preserve">8.20 to 17.28</w:t>
+            </w:r>
+          </w:p>
+        </w:tc>
+        <w:tc>
+          <w:tcPr/>
+          <w:p>
+            <w:pPr>
+              <w:pStyle w:val="Compact"/>
+              <w:spacing w:before="20" w:after="20" w:line="240" w:lineRule="auto"/>
+              <w:ind w:firstLine="0"/>
+              <w:jc w:val="left"/>
+            </w:pPr>
+            <w:r>
+              <w:rPr>
+                <w:rFonts w:ascii="Times New Roman" w:hAnsi="Times New Roman"/>
+                <w:sz w:val="17"/>
+              </w:rPr>
+              <w:t xml:space="preserve">0.08 to 0.19</w:t>
+            </w:r>
+          </w:p>
+        </w:tc>
+        <w:tc>
+          <w:tcPr/>
+          <w:p>
+            <w:pPr>
+              <w:pStyle w:val="Compact"/>
+              <w:spacing w:before="20" w:after="20" w:line="240" w:lineRule="auto"/>
+              <w:ind w:firstLine="0"/>
+              <w:jc w:val="left"/>
+            </w:pPr>
+            <w:r>
+              <w:rPr>
+                <w:rFonts w:ascii="Times New Roman" w:hAnsi="Times New Roman"/>
+                <w:sz w:val="17"/>
+              </w:rPr>
+              <w:t xml:space="preserve">0.00 to 0.00</w:t>
+            </w:r>
+          </w:p>
+        </w:tc>
+        <w:tc>
+          <w:tcPr/>
+          <w:p>
+            <w:pPr>
+              <w:pStyle w:val="Compact"/>
+              <w:spacing w:before="20" w:after="20" w:line="240" w:lineRule="auto"/>
+              <w:ind w:firstLine="0"/>
+              <w:jc w:val="left"/>
+            </w:pPr>
+            <w:r>
+              <w:rPr>
+                <w:rFonts w:ascii="Times New Roman" w:hAnsi="Times New Roman"/>
+                <w:sz w:val="17"/>
+              </w:rPr>
+              <w:t xml:space="preserve">-0.10 to -0.05</w:t>
+            </w:r>
+          </w:p>
+        </w:tc>
+        <w:tc>
+          <w:tcPr/>
+          <w:p>
+            <w:pPr>
+              <w:pStyle w:val="Compact"/>
+              <w:spacing w:before="20" w:after="20" w:line="240" w:lineRule="auto"/>
+              <w:ind w:firstLine="0"/>
+              <w:jc w:val="left"/>
+            </w:pPr>
+            <w:r>
+              <w:rPr>
+                <w:rFonts w:ascii="Times New Roman" w:hAnsi="Times New Roman"/>
+                <w:sz w:val="17"/>
+              </w:rPr>
+              <w:t xml:space="preserve">-0.07 to +0.05</w:t>
+            </w:r>
+          </w:p>
+        </w:tc>
+      </w:tr>
+      <w:tr>
+        <w:tc>
+          <w:tcPr/>
+          <w:p>
+            <w:pPr>
+              <w:pStyle w:val="Compact"/>
+              <w:spacing w:before="20" w:after="20" w:line="240" w:lineRule="auto"/>
+              <w:ind w:firstLine="0"/>
+              <w:jc w:val="left"/>
+            </w:pPr>
+            <w:r>
+              <w:rPr>
+                <w:rFonts w:ascii="Times New Roman" w:hAnsi="Times New Roman"/>
+                <w:sz w:val="17"/>
+              </w:rPr>
+              <w:t xml:space="preserve">C Describe</w:t>
+            </w:r>
+          </w:p>
+        </w:tc>
+        <w:tc>
+          <w:tcPr/>
+          <w:p>
+            <w:pPr>
+              <w:pStyle w:val="Compact"/>
+              <w:spacing w:before="20" w:after="20" w:line="240" w:lineRule="auto"/>
+              <w:ind w:firstLine="0"/>
+              <w:jc w:val="left"/>
+            </w:pPr>
+            <w:r>
+              <w:rPr>
+                <w:rFonts w:ascii="Times New Roman" w:hAnsi="Times New Roman"/>
+                <w:sz w:val="17"/>
+              </w:rPr>
+              <w:t xml:space="preserve">5.79 to 6.92</w:t>
+            </w:r>
+          </w:p>
+        </w:tc>
+        <w:tc>
+          <w:tcPr/>
+          <w:p>
+            <w:pPr>
+              <w:pStyle w:val="Compact"/>
+              <w:spacing w:before="20" w:after="20" w:line="240" w:lineRule="auto"/>
+              <w:ind w:firstLine="0"/>
+              <w:jc w:val="left"/>
+            </w:pPr>
+            <w:r>
+              <w:rPr>
+                <w:rFonts w:ascii="Times New Roman" w:hAnsi="Times New Roman"/>
+                <w:sz w:val="17"/>
+              </w:rPr>
+              <w:t xml:space="preserve">3.70 to 5.05</w:t>
+            </w:r>
+          </w:p>
+        </w:tc>
+        <w:tc>
+          <w:tcPr/>
+          <w:p>
+            <w:pPr>
+              <w:pStyle w:val="Compact"/>
+              <w:spacing w:before="20" w:after="20" w:line="240" w:lineRule="auto"/>
+              <w:ind w:firstLine="0"/>
+              <w:jc w:val="left"/>
+            </w:pPr>
+            <w:r>
+              <w:rPr>
+                <w:rFonts w:ascii="Times New Roman" w:hAnsi="Times New Roman"/>
+                <w:sz w:val="17"/>
+              </w:rPr>
+              <w:t xml:space="preserve">0.03 to 0.09</w:t>
+            </w:r>
+          </w:p>
+        </w:tc>
+        <w:tc>
+          <w:tcPr/>
+          <w:p>
+            <w:pPr>
+              <w:pStyle w:val="Compact"/>
+              <w:spacing w:before="20" w:after="20" w:line="240" w:lineRule="auto"/>
+              <w:ind w:firstLine="0"/>
+              <w:jc w:val="left"/>
+            </w:pPr>
+            <w:r>
+              <w:rPr>
+                <w:rFonts w:ascii="Times New Roman" w:hAnsi="Times New Roman"/>
+                <w:sz w:val="17"/>
+              </w:rPr>
+              <w:t xml:space="preserve">0.43 to 0.59</w:t>
+            </w:r>
+          </w:p>
+        </w:tc>
+        <w:tc>
+          <w:tcPr/>
+          <w:p>
+            <w:pPr>
+              <w:pStyle w:val="Compact"/>
+              <w:spacing w:before="20" w:after="20" w:line="240" w:lineRule="auto"/>
+              <w:ind w:firstLine="0"/>
+              <w:jc w:val="left"/>
+            </w:pPr>
+            <w:r>
+              <w:rPr>
+                <w:rFonts w:ascii="Times New Roman" w:hAnsi="Times New Roman"/>
+                <w:sz w:val="17"/>
+              </w:rPr>
+              <w:t xml:space="preserve">-0.06 to +0.10</w:t>
+            </w:r>
+          </w:p>
+        </w:tc>
+      </w:tr>
+      <w:tr>
+        <w:tc>
+          <w:tcPr/>
+          <w:p>
+            <w:pPr>
+              <w:pStyle w:val="Compact"/>
+              <w:spacing w:before="20" w:after="20" w:line="240" w:lineRule="auto"/>
+              <w:ind w:firstLine="0"/>
+              <w:jc w:val="left"/>
+            </w:pPr>
+            <w:r>
+              <w:rPr>
+                <w:rFonts w:ascii="Times New Roman" w:hAnsi="Times New Roman"/>
+                <w:sz w:val="17"/>
+              </w:rPr>
+              <w:t xml:space="preserve">D Hybrid</w:t>
+            </w:r>
+          </w:p>
+        </w:tc>
+        <w:tc>
+          <w:tcPr/>
+          <w:p>
+            <w:pPr>
+              <w:pStyle w:val="Compact"/>
+              <w:spacing w:before="20" w:after="20" w:line="240" w:lineRule="auto"/>
+              <w:ind w:firstLine="0"/>
+              <w:jc w:val="left"/>
+            </w:pPr>
+            <w:r>
+              <w:rPr>
+                <w:rFonts w:ascii="Times New Roman" w:hAnsi="Times New Roman"/>
+                <w:sz w:val="17"/>
+              </w:rPr>
+              <w:t xml:space="preserve">4.73 to 7.04</w:t>
+            </w:r>
+          </w:p>
+        </w:tc>
+        <w:tc>
+          <w:tcPr/>
+          <w:p>
+            <w:pPr>
+              <w:pStyle w:val="Compact"/>
+              <w:spacing w:before="20" w:after="20" w:line="240" w:lineRule="auto"/>
+              <w:ind w:firstLine="0"/>
+              <w:jc w:val="left"/>
+            </w:pPr>
+            <w:r>
+              <w:rPr>
+                <w:rFonts w:ascii="Times New Roman" w:hAnsi="Times New Roman"/>
+                <w:sz w:val="17"/>
+              </w:rPr>
+              <w:t xml:space="preserve">5.21 to 7.26</w:t>
+            </w:r>
+          </w:p>
+        </w:tc>
+        <w:tc>
+          <w:tcPr/>
+          <w:p>
+            <w:pPr>
+              <w:pStyle w:val="Compact"/>
+              <w:spacing w:before="20" w:after="20" w:line="240" w:lineRule="auto"/>
+              <w:ind w:firstLine="0"/>
+              <w:jc w:val="left"/>
+            </w:pPr>
+            <w:r>
+              <w:rPr>
+                <w:rFonts w:ascii="Times New Roman" w:hAnsi="Times New Roman"/>
+                <w:sz w:val="17"/>
+              </w:rPr>
+              <w:t xml:space="preserve">0.07 to 0.12</w:t>
+            </w:r>
+          </w:p>
+        </w:tc>
+        <w:tc>
+          <w:tcPr/>
+          <w:p>
+            <w:pPr>
+              <w:pStyle w:val="Compact"/>
+              <w:spacing w:before="20" w:after="20" w:line="240" w:lineRule="auto"/>
+              <w:ind w:firstLine="0"/>
+              <w:jc w:val="left"/>
+            </w:pPr>
+            <w:r>
+              <w:rPr>
+                <w:rFonts w:ascii="Times New Roman" w:hAnsi="Times New Roman"/>
+                <w:sz w:val="17"/>
+              </w:rPr>
+              <w:t xml:space="preserve">0.74 to 1.14</w:t>
+            </w:r>
+          </w:p>
+        </w:tc>
+        <w:tc>
+          <w:tcPr/>
+          <w:p>
+            <w:pPr>
+              <w:pStyle w:val="Compact"/>
+              <w:spacing w:before="20" w:after="20" w:line="240" w:lineRule="auto"/>
+              <w:ind w:firstLine="0"/>
+              <w:jc w:val="left"/>
+            </w:pPr>
+            <w:r>
+              <w:rPr>
+                <w:rFonts w:ascii="Times New Roman" w:hAnsi="Times New Roman"/>
+                <w:sz w:val="17"/>
+              </w:rPr>
+              <w:t xml:space="preserve">-0.11 to +0.06</w:t>
+            </w:r>
+          </w:p>
+        </w:tc>
+      </w:tr>
+    </w:tbl>
+    <w:p>
+      <w:pPr>
+        <w:pStyle w:val="BodyText"/>
+        <w:spacing w:line="240" w:lineRule="auto"/>
+        <w:ind w:firstLine="0"/>
+      </w:pPr>
+      <w:r>
+        <w:rPr>
+          <w:iCs/>
+          <w:i/>
+        </w:rPr>
+        <w:t xml:space="preserve">Table 3. Persona experiment with real household demographics: range of results across the six model-and-prompt cells of each design (200 households per cell). The last column is the range of the Spearman correlation between the simulated count and the household’s real count in the same window.</w:t>
+      </w:r>
+    </w:p>
+    <w:p>
+      <w:pPr>
+        <w:pStyle w:val="BodyText"/>
+      </w:pPr>
+      <w:r>
+        <w:t xml:space="preserve">Individual-level validity is essentially nil. The Spearman correlation between the simulated count and the household’s real count lies between -0.11 and +0.10, and every interval except one includes zero; the exception is GPT-4o-mini without the anchor in the direct design, whose answers are nearly constant (-0.04, interval -0.09 to -0.03). The model’s own</w:t>
+      </w:r>
+      <w:r>
+        <w:t xml:space="preserve"> </w:t>
+      </w:r>
+      <m:oMath>
+        <m:r>
+          <m:t>λ</m:t>
+        </m:r>
+      </m:oMath>
+      <w:r>
+        <w:t xml:space="preserve"> </w:t>
+      </w:r>
+      <w:r>
+        <w:t xml:space="preserve">in design D correlates between -0.09 and +0.11 with the real count. Because the demographics themselves predict the real count with a Spearman correlation of only 0.04, this result does not show that the models ignore information; it shows that these personas contain almost no information for any simulator to use. It is the empirical counterpart of Proposition 1: richer observable personas cannot supply the heterogeneity that counts contain.</w:t>
+      </w:r>
+    </w:p>
+    <w:bookmarkEnd w:id="45"/>
+    <w:bookmarkStart w:id="49" w:name="randomized-email-experiment"/>
+    <w:p>
+      <w:pPr>
+        <w:pStyle w:val="Heading2"/>
+      </w:pPr>
+      <w:r>
+        <w:t xml:space="preserve">5.6 Randomized email experiment</w:t>
       </w:r>
     </w:p>
     <w:p>
@@ -5691,7 +6727,7 @@
         <w:ind w:firstLine="0"/>
       </w:pPr>
       <w:r>
-        <w:t xml:space="preserve">Table 3 reports the elicited-probability design (the most stable of the three formats we tried), and Figure 2 shows the absolute lift for the men’s email. The real effect is a risk ratio of 1.72 for visits and 2.19 for purchases for the men’s email, with absolute lifts of 7.7 and 0.7 percentage points.</w:t>
+        <w:t xml:space="preserve">Table 4 reports the elicited-probability design (the most stable of the three formats we tried), and Figure 2 shows the absolute lift for the men’s email. The real effect is a risk ratio of 1.72 for visits and 2.19 for purchases for the men’s email, with absolute lifts of 7.7 and 0.7 percentage points.</w:t>
       </w:r>
     </w:p>
     <w:tbl>
@@ -8185,7 +9221,7 @@
           <w:iCs/>
           <w:i/>
         </w:rPr>
-        <w:t xml:space="preserve">Table 3. Probability-elicitation design (mean elicited probability over 300 simulated customers, three independent calls per customer). Lift = probability with the email minus probability without it; gap = lift of the men’s email minus lift of the women’s email; intervals are 95% paired bootstrap intervals over customers (real values: normal approximation). RR = risk ratio. * the simulated and the real intervals do not overlap (for RR: the simulated interval excludes the real risk ratio).</w:t>
+        <w:t xml:space="preserve">Table 4. Probability-elicitation design (mean elicited probability over 300 simulated customers, three independent calls per customer). Lift = probability with the email minus probability without it; gap = lift of the men’s email minus lift of the women’s email; intervals are 95% paired bootstrap intervals over customers (real values: normal approximation). RR = risk ratio. * the simulated and the real intervals do not overlap (for RR: the simulated interval excludes the real risk ratio).</w:t>
       </w:r>
     </w:p>
     <w:p>
@@ -8197,18 +9233,18 @@
           <wp:inline>
             <wp:extent cx="5334000" cy="2029239"/>
             <wp:effectExtent b="0" l="0" r="0" t="0"/>
-            <wp:docPr descr="Figure 2. Absolute lift in the probability of a visit and of a purchase after a men’s email (elicited-probability design). Bars are 95% intervals; the dashed line and band are the real lift and its 95% interval. Note the logarithmic axis in panel b." title="" id="46" name="Picture"/>
+            <wp:docPr descr="Figure 2. Absolute lift in the probability of a visit and of a purchase after a men’s email (elicited-probability design). Bars are 95% intervals; the dashed line and band are the real lift and its 95% interval. Note the logarithmic axis in panel b." title="" id="47" name="Picture"/>
             <a:graphic>
               <a:graphicData uri="http://schemas.openxmlformats.org/drawingml/2006/picture">
                 <pic:pic>
                   <pic:nvPicPr>
-                    <pic:cNvPr descr="fig2_lift.png" id="47" name="Picture"/>
+                    <pic:cNvPr descr="fig2_lift.png" id="48" name="Picture"/>
                     <pic:cNvPicPr>
                       <a:picLocks noChangeArrowheads="1" noChangeAspect="1"/>
                     </pic:cNvPicPr>
                   </pic:nvPicPr>
                   <pic:blipFill>
-                    <a:blip r:embed="rId45"/>
+                    <a:blip r:embed="rId46"/>
                     <a:stretch>
                       <a:fillRect/>
                     </a:stretch>
@@ -8345,14 +9381,14 @@
         <w:t xml:space="preserve">, so the risk ratio is undefined; the same happened with Llama and Haiku for purchases in several cells. In absolute terms the yes/no purchase lifts range from +0.14 to +0.55, 21 to 81 times the real lift.</w:t>
       </w:r>
     </w:p>
-    <w:bookmarkEnd w:id="48"/>
-    <w:bookmarkStart w:id="49" w:name="summary-of-hypotheses"/>
+    <w:bookmarkEnd w:id="49"/>
+    <w:bookmarkStart w:id="50" w:name="summary-of-hypotheses"/>
     <w:p>
       <w:pPr>
         <w:pStyle w:val="Heading2"/>
       </w:pPr>
       <w:r>
-        <w:t xml:space="preserve">5.6 Summary of hypotheses</w:t>
+        <w:t xml:space="preserve">5.7 Summary of hypotheses</w:t>
       </w:r>
     </w:p>
     <w:tbl>
@@ -8447,7 +9483,7 @@
                 <w:rFonts w:ascii="Times New Roman" w:hAnsi="Times New Roman"/>
                 <w:sz w:val="17"/>
               </w:rPr>
-              <w:t xml:space="preserve">Supported. 35 of 36 cells of designs A, B, and C across the two settings lie below the reference variance-to-mean ratio, and the zero share of designs A and B is below the real value in 23 of 24 cells (the exception: Llama with the anchor answered</w:t>
+              <w:t xml:space="preserve">Supported. 35 of 36 cells of designs A, B, and C across the two main settings lie below the reference variance-to-mean ratio, and the zero share of designs A and B is below the real value in 23 of 24 cells (the exception: Llama with the anchor answered</w:t>
             </w:r>
             <w:r>
               <w:rPr>
@@ -8489,7 +9525,67 @@
                 <w:rFonts w:ascii="Times New Roman" w:hAnsi="Times New Roman"/>
                 <w:sz w:val="17"/>
               </w:rPr>
-              <w:t xml:space="preserve">for practically every customer).</w:t>
+              <w:t xml:space="preserve">for practically every customer). The same holds with real household demographics (ratios 0.00 to 0.39,</w:t>
+            </w:r>
+            <w:r>
+              <w:rPr>
+                <w:rFonts w:ascii="Times New Roman" w:hAnsi="Times New Roman"/>
+                <w:sz w:val="17"/>
+              </w:rPr>
+              <w:t xml:space="preserve"> </w:t>
+            </w:r>
+            <m:oMath>
+              <m:r>
+                <m:t>α</m:t>
+              </m:r>
+            </m:oMath>
+            <w:r>
+              <w:rPr>
+                <w:rFonts w:ascii="Times New Roman" w:hAnsi="Times New Roman"/>
+                <w:sz w:val="17"/>
+              </w:rPr>
+              <w:t xml:space="preserve"> </w:t>
+            </w:r>
+            <w:r>
+              <w:rPr>
+                <w:rFonts w:ascii="Times New Roman" w:hAnsi="Times New Roman"/>
+                <w:sz w:val="17"/>
+              </w:rPr>
+              <w:t xml:space="preserve">near</w:t>
+            </w:r>
+            <w:r>
+              <w:rPr>
+                <w:rFonts w:ascii="Times New Roman" w:hAnsi="Times New Roman"/>
+                <w:sz w:val="17"/>
+              </w:rPr>
+              <w:t xml:space="preserve"> </w:t>
+            </w:r>
+            <m:oMath>
+              <m:r>
+                <m:rPr>
+                  <m:sty m:val="p"/>
+                </m:rPr>
+                <m:t>−</m:t>
+              </m:r>
+              <m:r>
+                <m:t>1</m:t>
+              </m:r>
+              <m:r>
+                <m:rPr>
+                  <m:sty m:val="p"/>
+                </m:rPr>
+                <m:t>/</m:t>
+              </m:r>
+              <m:r>
+                <m:t>μ</m:t>
+              </m:r>
+            </m:oMath>
+            <w:r>
+              <w:rPr>
+                <w:rFonts w:ascii="Times New Roman" w:hAnsi="Times New Roman"/>
+                <w:sz w:val="17"/>
+              </w:rPr>
+              <w:t xml:space="preserve">).</w:t>
             </w:r>
           </w:p>
         </w:tc>
@@ -8527,7 +9623,7 @@
                 <w:rFonts w:ascii="Times New Roman" w:hAnsi="Times New Roman"/>
                 <w:sz w:val="17"/>
               </w:rPr>
-              <w:t xml:space="preserve">Supported. In the low-mean setting all six cells stay below the ceiling of 2.10; in the high-mean setting the anchored cells reach the ceiling of 6.61. Zero shares are too low in both.</w:t>
+              <w:t xml:space="preserve">Supported. In the low-mean setting all six cells stay below the ceiling of 2.10; in the high-mean settings the anchored cells (and, with demographic personas, five of six cells) reach the ceiling. Zero shares are too low where the real zero share is large (0.74 and 0.19) but not where it is small (0.03).</w:t>
             </w:r>
           </w:p>
         </w:tc>
@@ -8603,7 +9699,7 @@
                 <w:rFonts w:ascii="Times New Roman" w:hAnsi="Times New Roman"/>
                 <w:sz w:val="17"/>
               </w:rPr>
-              <w:t xml:space="preserve">Mostly supported (see Section 5.5 for exceptions).</w:t>
+              <w:t xml:space="preserve">Mostly supported (see Section 5.6 for exceptions).</w:t>
             </w:r>
           </w:p>
         </w:tc>
@@ -8717,7 +9813,45 @@
                 <w:rFonts w:ascii="Times New Roman" w:hAnsi="Times New Roman"/>
                 <w:sz w:val="17"/>
               </w:rPr>
-              <w:t xml:space="preserve">Not supported. Direct answers collapse at a mean of 0.5 and of 4.8.</w:t>
+              <w:t xml:space="preserve">Not supported. Direct answers collapse at means of 0.5, 4.8, and 7.8.</w:t>
+            </w:r>
+          </w:p>
+        </w:tc>
+      </w:tr>
+      <w:tr>
+        <w:tc>
+          <w:tcPr/>
+          <w:p>
+            <w:pPr>
+              <w:pStyle w:val="Compact"/>
+              <w:spacing w:before="20" w:after="20" w:line="240" w:lineRule="auto"/>
+              <w:ind w:firstLine="0"/>
+              <w:jc w:val="left"/>
+            </w:pPr>
+            <w:r>
+              <w:rPr>
+                <w:rFonts w:ascii="Times New Roman" w:hAnsi="Times New Roman"/>
+                <w:sz w:val="17"/>
+              </w:rPr>
+              <w:t xml:space="preserve">Exploratory: richer personas repair collapse.</w:t>
+            </w:r>
+          </w:p>
+        </w:tc>
+        <w:tc>
+          <w:tcPr/>
+          <w:p>
+            <w:pPr>
+              <w:pStyle w:val="Compact"/>
+              <w:spacing w:before="20" w:after="20" w:line="240" w:lineRule="auto"/>
+              <w:ind w:firstLine="0"/>
+              <w:jc w:val="left"/>
+            </w:pPr>
+            <w:r>
+              <w:rPr>
+                <w:rFonts w:ascii="Times New Roman" w:hAnsi="Times New Roman"/>
+                <w:sz w:val="17"/>
+              </w:rPr>
+              <w:t xml:space="preserve">Not supported. With real demographics the simulated counts have a rank correlation with real counts of -0.11 to +0.10; the demographics themselves explain about 1% of the heterogeneity.</w:t>
             </w:r>
           </w:p>
         </w:tc>
@@ -8734,12 +9868,12 @@
           <w:iCs/>
           <w:i/>
         </w:rPr>
-        <w:t xml:space="preserve">Table 4. Hypotheses and evidence.</w:t>
+        <w:t xml:space="preserve">Table 5. Hypotheses and evidence.</w:t>
       </w:r>
     </w:p>
-    <w:bookmarkEnd w:id="49"/>
     <w:bookmarkEnd w:id="50"/>
-    <w:bookmarkStart w:id="54" w:name="discussion"/>
+    <w:bookmarkEnd w:id="51"/>
+    <w:bookmarkStart w:id="55" w:name="discussion"/>
     <w:p>
       <w:pPr>
         <w:pStyle w:val="Heading1"/>
@@ -8748,7 +9882,7 @@
         <w:t xml:space="preserve">6. Discussion</w:t>
       </w:r>
     </w:p>
-    <w:bookmarkStart w:id="51" w:name="theoretical-contributions"/>
+    <w:bookmarkStart w:id="52" w:name="theoretical-contributions"/>
     <w:p>
       <w:pPr>
         <w:pStyle w:val="Heading2"/>
@@ -8788,7 +9922,7 @@
         <w:pStyle w:val="BodyText"/>
       </w:pPr>
       <w:r>
-        <w:t xml:space="preserve">Two further results extend what is known about LLM-based simulation. First, describing a distribution (Jang et al. 2026, Zhang et al. 2025a) helps more at a high mean than at a low mean, and in both settings it under-produces zeros. The zero share is the part of a count distribution that decides how many customers a campaign is not reaching, and this is where description fails. Second, evaluating a promotion simulator on relative effects alone is hazardous. The relation</w:t>
+        <w:t xml:space="preserve">Two further results extend what is known about LLM-based simulation. First, describing a distribution (Jang et al. 2026, Zhang et al. 2025a) helps more at a high mean than at a low mean, and in the settings where zeros are common it under-produces them. The zero share is the part of a count distribution that decides how many customers a campaign is not reaching, and this is where description fails. Second, evaluating a promotion simulator on relative effects alone is hazardous. The relation</w:t>
       </w:r>
       <w:r>
         <w:t xml:space="preserve"> </w:t>
@@ -8844,8 +9978,8 @@
         <w:t xml:space="preserve">shows that errors in the simulated base rate and errors in the simulated lift are confounded in the risk ratio, and our data contain cases in which the two readings of the same output disagree.</w:t>
       </w:r>
     </w:p>
-    <w:bookmarkEnd w:id="51"/>
-    <w:bookmarkStart w:id="52" w:name="implications-for-practice"/>
+    <w:bookmarkEnd w:id="52"/>
+    <w:bookmarkStart w:id="53" w:name="implications-for-practice"/>
     <w:p>
       <w:pPr>
         <w:pStyle w:val="Heading2"/>
@@ -8983,8 +10117,8 @@
         <w:t xml:space="preserve">Report the simulated base rate and the absolute lift next to the risk ratio, and compare both with a past randomized test before any revenue calculation.</w:t>
       </w:r>
     </w:p>
-    <w:bookmarkEnd w:id="52"/>
-    <w:bookmarkStart w:id="53" w:name="limitations-and-future-research"/>
+    <w:bookmarkEnd w:id="53"/>
+    <w:bookmarkStart w:id="54" w:name="limitations-and-future-research"/>
     <w:p>
       <w:pPr>
         <w:pStyle w:val="Heading2"/>
@@ -8998,56 +10132,47 @@
         <w:pStyle w:val="FirstParagraph"/>
       </w:pPr>
       <w:r>
-        <w:t xml:space="preserve">The evidence is preliminary. We used one random seed, 200 to 600 simulated customers per cell, one prompt wording per design, and three small models, so our intervals capture sampling of customers but not variation across prompts, personas, or seeds. Larger and more recent models may collapse less, and the persistence of overstated purchase lifts there is an open question. The low-mean reference is a calibrated parametric distribution rather than the raw data, and the Complete Journey households are loyalty-card shoppers with relatively high purchase frequency. Personas are simple, and their attributes were drawn independently; richer personas built from real demographic tables would test whether persona detail raises</w:t>
-      </w:r>
-      <w:r>
-        <w:t xml:space="preserve"> </w:t>
+        <w:t xml:space="preserve">The evidence is preliminary. We used one random seed, 200 to 600 simulated customers per cell, one prompt wording per design, and three small models, so our intervals capture sampling of customers but not variation across prompts, personas, or seeds. Larger and more recent models may collapse less, and the persistence of overstated purchase lifts there is an open question. The low-mean reference is a calibrated parametric distribution rather than the raw data, and the Complete Journey households are loyalty-card shoppers with relatively high purchase frequency. Richer personas built from real household demographics did not change the picture, but the demographics in these data explain almost none of the heterogeneity (</w:t>
       </w:r>
       <m:oMath>
+        <m:sSup>
+          <m:e>
+            <m:r>
+              <m:t>c</m:t>
+            </m:r>
+          </m:e>
+          <m:sup>
+            <m:r>
+              <m:t>2</m:t>
+            </m:r>
+          </m:sup>
+        </m:sSup>
         <m:r>
           <m:rPr>
-            <m:nor/>
             <m:sty m:val="p"/>
           </m:rPr>
-          <m:t>Var</m:t>
+          <m:t>/</m:t>
         </m:r>
-        <m:d>
-          <m:dPr>
-            <m:begChr m:val="("/>
-            <m:endChr m:val=")"/>
-            <m:sepChr m:val=""/>
-            <m:grow/>
-          </m:dPr>
-          <m:e>
-            <m:r>
-              <m:t>m</m:t>
-            </m:r>
-            <m:d>
-              <m:dPr>
-                <m:begChr m:val="("/>
-                <m:endChr m:val=")"/>
-                <m:sepChr m:val=""/>
-                <m:grow/>
-              </m:dPr>
-              <m:e>
-                <m:r>
-                  <m:t>X</m:t>
-                </m:r>
-              </m:e>
-            </m:d>
-          </m:e>
-        </m:d>
+        <m:r>
+          <m:t>α</m:t>
+        </m:r>
+        <m:r>
+          <m:rPr>
+            <m:sty m:val="p"/>
+          </m:rPr>
+          <m:t>=</m:t>
+        </m:r>
+        <m:r>
+          <m:t>0.01</m:t>
+        </m:r>
       </m:oMath>
       <w:r>
-        <w:t xml:space="preserve"> </w:t>
-      </w:r>
-      <w:r>
-        <w:t xml:space="preserve">enough to matter (Proposition 1). In the Complete Journey data campaigns were targeted rather than randomized, so only the email experiment supports a causal comparison. Design C truncates its top bin, which lowers the dispersion it can reach; we quantified this ceiling but did not remove it. Public data may also be part of the models’ training data. Future work should evaluate the hybrid design with a calibrated mean, test prompts that elicit several candidate answers with probabilities, and use a randomized promotion data set with purchase counts, for example from a partner firm, so that the count-distribution and treatment-effect questions can be studied on the same customers.</w:t>
+        <w:t xml:space="preserve">), so that test marks the limit of observable personas rather than a limit of particular models; settings in which observable attributes, such as purchase histories, are more predictive of purchase frequency would be a stronger test of Proposition 1. In the Complete Journey data campaigns were targeted rather than randomized, so only the email experiment supports a causal comparison. Design C truncates its top bin, which lowers the dispersion it can reach; we quantified this ceiling but did not remove it. Public data may also be part of the models’ training data. Future work should evaluate the hybrid design with a calibrated mean, test prompts that elicit several candidate answers with probabilities, and use a randomized promotion data set with purchase counts, for example from a partner firm, so that the count-distribution and treatment-effect questions can be studied on the same customers.</w:t>
       </w:r>
     </w:p>
-    <w:bookmarkEnd w:id="53"/>
     <w:bookmarkEnd w:id="54"/>
-    <w:bookmarkStart w:id="55" w:name="conclusion"/>
+    <w:bookmarkEnd w:id="55"/>
+    <w:bookmarkStart w:id="56" w:name="conclusion"/>
     <w:p>
       <w:pPr>
         <w:pStyle w:val="Heading1"/>
@@ -9064,8 +10189,8 @@
         <w:t xml:space="preserve">Synthetic customers built from language models do not yet reproduce the shape of real purchase-count distributions or the size of real promotion effects. Direct and day-by-day designs collapse toward a single value whether the mean is 0.5 or 4.8; describing a distribution repairs part of the damage but loses zeros; and a hybrid that takes only the mean from the model matches the dispersion when that mean is accurate. In a randomized email test the models usually get the sign of the effect right, but the absolute lift in purchase probability is overstated by a large factor and similar treatments are not told apart. Practitioners who use synthetic customers should check dispersion and zero share against their own data, rely on the model for means only, and validate absolute effects before they act on them.</w:t>
       </w:r>
     </w:p>
-    <w:bookmarkEnd w:id="55"/>
-    <w:bookmarkStart w:id="56" w:name="references"/>
+    <w:bookmarkEnd w:id="56"/>
+    <w:bookmarkStart w:id="57" w:name="references"/>
     <w:p>
       <w:pPr>
         <w:pStyle w:val="Heading1"/>
@@ -9340,8 +10465,8 @@
         <w:t xml:space="preserve">Zhang R, Zhang X, Zhao M (2025b) Predicting effects, missing distributions: Evaluating LLMs as human behavior simulators in operations management. Preprint, submitted September 30, arXiv:2510.03310.</w:t>
       </w:r>
     </w:p>
-    <w:bookmarkEnd w:id="56"/>
-    <w:bookmarkStart w:id="57" w:name="appendix-a.-prompt-templates"/>
+    <w:bookmarkEnd w:id="57"/>
+    <w:bookmarkStart w:id="58" w:name="appendix-a.-prompt-templates"/>
     <w:p>
       <w:pPr>
         <w:pStyle w:val="Heading1"/>
@@ -9518,8 +10643,8 @@
         <w:t xml:space="preserve">”</w:t>
       </w:r>
     </w:p>
-    <w:bookmarkEnd w:id="57"/>
-    <w:bookmarkStart w:id="58" w:name="appendix-b.-full-results"/>
+    <w:bookmarkEnd w:id="58"/>
+    <w:bookmarkStart w:id="59" w:name="appendix-b.-full-results"/>
     <w:p>
       <w:pPr>
         <w:pStyle w:val="Heading1"/>
@@ -16244,8 +17369,3366 @@
         <w:t xml:space="preserve">Table B2. High-mean setting, 200 customers per cell. Reference row: empirical Complete Journey distribution. * the 95% bootstrap interval excludes the reference value.</w:t>
       </w:r>
     </w:p>
-    <w:bookmarkEnd w:id="58"/>
-    <w:bookmarkStart w:id="59" w:name="appendix-c.-reproducibility"/>
+    <w:tbl>
+      <w:tblPr>
+        <w:tblStyle w:val="Table"/>
+        <w:tblW w:type="pct" w:w="5000"/>
+        <w:tblLook w:firstRow="1" w:lastRow="0" w:firstColumn="0" w:lastColumn="0" w:noHBand="0" w:noVBand="0" w:val="0020"/>
+        <w:jc w:val="start"/>
+        <w:tblBorders>
+          <w:top w:val="single" w:sz="4" w:color="808080"/>
+          <w:bottom w:val="single" w:sz="4" w:color="808080"/>
+          <w:insideH w:val="single" w:sz="4" w:color="808080"/>
+        </w:tblBorders>
+      </w:tblPr>
+      <w:tblGrid>
+        <w:gridCol w:w="1131"/>
+        <w:gridCol w:w="1131"/>
+        <w:gridCol w:w="1131"/>
+        <w:gridCol w:w="1131"/>
+        <w:gridCol w:w="1131"/>
+        <w:gridCol w:w="1131"/>
+        <w:gridCol w:w="1131"/>
+      </w:tblGrid>
+      <w:tr>
+        <w:trPr>
+          <w:tblHeader w:val="true"/>
+        </w:trPr>
+        <w:tc>
+          <w:tcPr/>
+          <w:p>
+            <w:pPr>
+              <w:pStyle w:val="Compact"/>
+              <w:spacing w:before="20" w:after="20" w:line="240" w:lineRule="auto"/>
+              <w:ind w:firstLine="0"/>
+              <w:jc w:val="left"/>
+            </w:pPr>
+            <w:r>
+              <w:rPr>
+                <w:rFonts w:ascii="Times New Roman" w:hAnsi="Times New Roman"/>
+                <w:b/>
+                <w:sz w:val="17"/>
+              </w:rPr>
+              <w:t xml:space="preserve">Model</w:t>
+            </w:r>
+          </w:p>
+        </w:tc>
+        <w:tc>
+          <w:tcPr/>
+          <w:p>
+            <w:pPr>
+              <w:pStyle w:val="Compact"/>
+              <w:spacing w:before="20" w:after="20" w:line="240" w:lineRule="auto"/>
+              <w:ind w:firstLine="0"/>
+              <w:jc w:val="left"/>
+            </w:pPr>
+            <w:r>
+              <w:rPr>
+                <w:rFonts w:ascii="Times New Roman" w:hAnsi="Times New Roman"/>
+                <w:b/>
+                <w:sz w:val="17"/>
+              </w:rPr>
+              <w:t xml:space="preserve">Prompt</w:t>
+            </w:r>
+          </w:p>
+        </w:tc>
+        <w:tc>
+          <w:tcPr/>
+          <w:p>
+            <w:pPr>
+              <w:pStyle w:val="Compact"/>
+              <w:spacing w:before="20" w:after="20" w:line="240" w:lineRule="auto"/>
+              <w:ind w:firstLine="0"/>
+              <w:jc w:val="left"/>
+            </w:pPr>
+            <w:r>
+              <w:rPr>
+                <w:rFonts w:ascii="Times New Roman" w:hAnsi="Times New Roman"/>
+                <w:b/>
+                <w:sz w:val="17"/>
+              </w:rPr>
+              <w:t xml:space="preserve">Design</w:t>
+            </w:r>
+          </w:p>
+        </w:tc>
+        <w:tc>
+          <w:tcPr/>
+          <w:p>
+            <w:pPr>
+              <w:pStyle w:val="Compact"/>
+              <w:spacing w:before="20" w:after="20" w:line="240" w:lineRule="auto"/>
+              <w:ind w:firstLine="0"/>
+              <w:jc w:val="left"/>
+            </w:pPr>
+            <w:r>
+              <w:rPr>
+                <w:rFonts w:ascii="Times New Roman" w:hAnsi="Times New Roman"/>
+                <w:b/>
+                <w:sz w:val="17"/>
+              </w:rPr>
+              <w:t xml:space="preserve">Mean</w:t>
+            </w:r>
+          </w:p>
+        </w:tc>
+        <w:tc>
+          <w:tcPr/>
+          <w:p>
+            <w:pPr>
+              <w:pStyle w:val="Compact"/>
+              <w:spacing w:before="20" w:after="20" w:line="240" w:lineRule="auto"/>
+              <w:ind w:firstLine="0"/>
+              <w:jc w:val="left"/>
+            </w:pPr>
+            <w:r>
+              <w:rPr>
+                <w:rFonts w:ascii="Times New Roman" w:hAnsi="Times New Roman"/>
+                <w:b/>
+                <w:sz w:val="17"/>
+              </w:rPr>
+              <w:t xml:space="preserve">Var/mean</w:t>
+            </w:r>
+          </w:p>
+        </w:tc>
+        <w:tc>
+          <w:tcPr/>
+          <w:p>
+            <w:pPr>
+              <w:pStyle w:val="Compact"/>
+              <w:spacing w:before="20" w:after="20" w:line="240" w:lineRule="auto"/>
+              <w:ind w:firstLine="0"/>
+              <w:jc w:val="left"/>
+            </w:pPr>
+            <w:r>
+              <w:rPr>
+                <w:rFonts w:ascii="Times New Roman" w:hAnsi="Times New Roman"/>
+                <w:b/>
+                <w:sz w:val="17"/>
+              </w:rPr>
+              <w:t xml:space="preserve">Zero</w:t>
+            </w:r>
+          </w:p>
+        </w:tc>
+        <w:tc>
+          <w:tcPr/>
+          <w:p>
+            <w:pPr>
+              <w:pStyle w:val="Compact"/>
+              <w:spacing w:before="20" w:after="20" w:line="240" w:lineRule="auto"/>
+              <w:ind w:firstLine="0"/>
+              <w:jc w:val="left"/>
+            </w:pPr>
+            <w:r>
+              <w:rPr>
+                <w:rFonts w:ascii="Times New Roman" w:hAnsi="Times New Roman"/>
+                <w:b/>
+                <w:sz w:val="17"/>
+              </w:rPr>
+              <w:t xml:space="preserve">Alpha</w:t>
+            </w:r>
+          </w:p>
+        </w:tc>
+      </w:tr>
+      <w:tr>
+        <w:tc>
+          <w:tcPr/>
+          <w:p>
+            <w:pPr>
+              <w:pStyle w:val="Compact"/>
+              <w:spacing w:before="20" w:after="20" w:line="240" w:lineRule="auto"/>
+              <w:ind w:firstLine="0"/>
+              <w:jc w:val="left"/>
+            </w:pPr>
+            <w:r>
+              <w:rPr>
+                <w:rFonts w:ascii="Times New Roman" w:hAnsi="Times New Roman"/>
+                <w:sz w:val="17"/>
+              </w:rPr>
+              <w:t xml:space="preserve">Reference</w:t>
+            </w:r>
+          </w:p>
+        </w:tc>
+        <w:tc>
+          <w:tcPr/>
+          <w:p>
+            <w:pPr>
+              <w:pStyle w:val="Compact"/>
+              <w:spacing w:before="20" w:after="20" w:line="240" w:lineRule="auto"/>
+              <w:ind w:firstLine="0"/>
+            </w:pPr>
+          </w:p>
+        </w:tc>
+        <w:tc>
+          <w:tcPr/>
+          <w:p>
+            <w:pPr>
+              <w:pStyle w:val="Compact"/>
+              <w:spacing w:before="20" w:after="20" w:line="240" w:lineRule="auto"/>
+              <w:ind w:firstLine="0"/>
+            </w:pPr>
+          </w:p>
+        </w:tc>
+        <w:tc>
+          <w:tcPr/>
+          <w:p>
+            <w:pPr>
+              <w:pStyle w:val="Compact"/>
+              <w:spacing w:before="20" w:after="20" w:line="240" w:lineRule="auto"/>
+              <w:ind w:firstLine="0"/>
+              <w:jc w:val="left"/>
+            </w:pPr>
+            <w:r>
+              <w:rPr>
+                <w:rFonts w:ascii="Times New Roman" w:hAnsi="Times New Roman"/>
+                <w:sz w:val="17"/>
+              </w:rPr>
+              <w:t xml:space="preserve">7.83</w:t>
+            </w:r>
+          </w:p>
+        </w:tc>
+        <w:tc>
+          <w:tcPr/>
+          <w:p>
+            <w:pPr>
+              <w:pStyle w:val="Compact"/>
+              <w:spacing w:before="20" w:after="20" w:line="240" w:lineRule="auto"/>
+              <w:ind w:firstLine="0"/>
+              <w:jc w:val="left"/>
+            </w:pPr>
+            <w:r>
+              <w:rPr>
+                <w:rFonts w:ascii="Times New Roman" w:hAnsi="Times New Roman"/>
+                <w:sz w:val="17"/>
+              </w:rPr>
+              <w:t xml:space="preserve">6.52</w:t>
+            </w:r>
+          </w:p>
+        </w:tc>
+        <w:tc>
+          <w:tcPr/>
+          <w:p>
+            <w:pPr>
+              <w:pStyle w:val="Compact"/>
+              <w:spacing w:before="20" w:after="20" w:line="240" w:lineRule="auto"/>
+              <w:ind w:firstLine="0"/>
+              <w:jc w:val="left"/>
+            </w:pPr>
+            <w:r>
+              <w:rPr>
+                <w:rFonts w:ascii="Times New Roman" w:hAnsi="Times New Roman"/>
+                <w:sz w:val="17"/>
+              </w:rPr>
+              <w:t xml:space="preserve">0.03</w:t>
+            </w:r>
+          </w:p>
+        </w:tc>
+        <w:tc>
+          <w:tcPr/>
+          <w:p>
+            <w:pPr>
+              <w:pStyle w:val="Compact"/>
+              <w:spacing w:before="20" w:after="20" w:line="240" w:lineRule="auto"/>
+              <w:ind w:firstLine="0"/>
+              <w:jc w:val="left"/>
+            </w:pPr>
+            <w:r>
+              <w:rPr>
+                <w:rFonts w:ascii="Times New Roman" w:hAnsi="Times New Roman"/>
+                <w:sz w:val="17"/>
+              </w:rPr>
+              <w:t xml:space="preserve">0.71</w:t>
+            </w:r>
+          </w:p>
+        </w:tc>
+      </w:tr>
+      <w:tr>
+        <w:tc>
+          <w:tcPr/>
+          <w:p>
+            <w:pPr>
+              <w:pStyle w:val="Compact"/>
+              <w:spacing w:before="20" w:after="20" w:line="240" w:lineRule="auto"/>
+              <w:ind w:firstLine="0"/>
+              <w:jc w:val="left"/>
+            </w:pPr>
+            <w:r>
+              <w:rPr>
+                <w:rFonts w:ascii="Times New Roman" w:hAnsi="Times New Roman"/>
+                <w:sz w:val="17"/>
+              </w:rPr>
+              <w:t xml:space="preserve">GPT-4o-mini</w:t>
+            </w:r>
+          </w:p>
+        </w:tc>
+        <w:tc>
+          <w:tcPr/>
+          <w:p>
+            <w:pPr>
+              <w:pStyle w:val="Compact"/>
+              <w:spacing w:before="20" w:after="20" w:line="240" w:lineRule="auto"/>
+              <w:ind w:firstLine="0"/>
+              <w:jc w:val="left"/>
+            </w:pPr>
+            <w:r>
+              <w:rPr>
+                <w:rFonts w:ascii="Times New Roman" w:hAnsi="Times New Roman"/>
+                <w:sz w:val="17"/>
+              </w:rPr>
+              <w:t xml:space="preserve">plain</w:t>
+            </w:r>
+          </w:p>
+        </w:tc>
+        <w:tc>
+          <w:tcPr/>
+          <w:p>
+            <w:pPr>
+              <w:pStyle w:val="Compact"/>
+              <w:spacing w:before="20" w:after="20" w:line="240" w:lineRule="auto"/>
+              <w:ind w:firstLine="0"/>
+              <w:jc w:val="left"/>
+            </w:pPr>
+            <w:r>
+              <w:rPr>
+                <w:rFonts w:ascii="Times New Roman" w:hAnsi="Times New Roman"/>
+                <w:sz w:val="17"/>
+              </w:rPr>
+              <w:t xml:space="preserve">A Direct</w:t>
+            </w:r>
+          </w:p>
+        </w:tc>
+        <w:tc>
+          <w:tcPr/>
+          <w:p>
+            <w:pPr>
+              <w:pStyle w:val="Compact"/>
+              <w:spacing w:before="20" w:after="20" w:line="240" w:lineRule="auto"/>
+              <w:ind w:firstLine="0"/>
+              <w:jc w:val="left"/>
+            </w:pPr>
+            <w:r>
+              <w:rPr>
+                <w:rFonts w:ascii="Times New Roman" w:hAnsi="Times New Roman"/>
+                <w:sz w:val="17"/>
+              </w:rPr>
+              <w:t xml:space="preserve">7.99*</w:t>
+            </w:r>
+          </w:p>
+        </w:tc>
+        <w:tc>
+          <w:tcPr/>
+          <w:p>
+            <w:pPr>
+              <w:pStyle w:val="Compact"/>
+              <w:spacing w:before="20" w:after="20" w:line="240" w:lineRule="auto"/>
+              <w:ind w:firstLine="0"/>
+              <w:jc w:val="left"/>
+            </w:pPr>
+            <w:r>
+              <w:rPr>
+                <w:rFonts w:ascii="Times New Roman" w:hAnsi="Times New Roman"/>
+                <w:sz w:val="17"/>
+              </w:rPr>
+              <w:t xml:space="preserve">0.01*</w:t>
+            </w:r>
+          </w:p>
+        </w:tc>
+        <w:tc>
+          <w:tcPr/>
+          <w:p>
+            <w:pPr>
+              <w:pStyle w:val="Compact"/>
+              <w:spacing w:before="20" w:after="20" w:line="240" w:lineRule="auto"/>
+              <w:ind w:firstLine="0"/>
+              <w:jc w:val="left"/>
+            </w:pPr>
+            <w:r>
+              <w:rPr>
+                <w:rFonts w:ascii="Times New Roman" w:hAnsi="Times New Roman"/>
+                <w:sz w:val="17"/>
+              </w:rPr>
+              <w:t xml:space="preserve">0.00*</w:t>
+            </w:r>
+          </w:p>
+        </w:tc>
+        <w:tc>
+          <w:tcPr/>
+          <w:p>
+            <w:pPr>
+              <w:pStyle w:val="Compact"/>
+              <w:spacing w:before="20" w:after="20" w:line="240" w:lineRule="auto"/>
+              <w:ind w:firstLine="0"/>
+              <w:jc w:val="left"/>
+            </w:pPr>
+            <w:r>
+              <w:rPr>
+                <w:rFonts w:ascii="Times New Roman" w:hAnsi="Times New Roman"/>
+                <w:sz w:val="17"/>
+              </w:rPr>
+              <w:t xml:space="preserve">-0.12*</w:t>
+            </w:r>
+          </w:p>
+        </w:tc>
+      </w:tr>
+      <w:tr>
+        <w:tc>
+          <w:tcPr/>
+          <w:p>
+            <w:pPr>
+              <w:pStyle w:val="Compact"/>
+              <w:spacing w:before="20" w:after="20" w:line="240" w:lineRule="auto"/>
+              <w:ind w:firstLine="0"/>
+              <w:jc w:val="left"/>
+            </w:pPr>
+            <w:r>
+              <w:rPr>
+                <w:rFonts w:ascii="Times New Roman" w:hAnsi="Times New Roman"/>
+                <w:sz w:val="17"/>
+              </w:rPr>
+              <w:t xml:space="preserve">GPT-4o-mini</w:t>
+            </w:r>
+          </w:p>
+        </w:tc>
+        <w:tc>
+          <w:tcPr/>
+          <w:p>
+            <w:pPr>
+              <w:pStyle w:val="Compact"/>
+              <w:spacing w:before="20" w:after="20" w:line="240" w:lineRule="auto"/>
+              <w:ind w:firstLine="0"/>
+              <w:jc w:val="left"/>
+            </w:pPr>
+            <w:r>
+              <w:rPr>
+                <w:rFonts w:ascii="Times New Roman" w:hAnsi="Times New Roman"/>
+                <w:sz w:val="17"/>
+              </w:rPr>
+              <w:t xml:space="preserve">plain</w:t>
+            </w:r>
+          </w:p>
+        </w:tc>
+        <w:tc>
+          <w:tcPr/>
+          <w:p>
+            <w:pPr>
+              <w:pStyle w:val="Compact"/>
+              <w:spacing w:before="20" w:after="20" w:line="240" w:lineRule="auto"/>
+              <w:ind w:firstLine="0"/>
+              <w:jc w:val="left"/>
+            </w:pPr>
+            <w:r>
+              <w:rPr>
+                <w:rFonts w:ascii="Times New Roman" w:hAnsi="Times New Roman"/>
+                <w:sz w:val="17"/>
+              </w:rPr>
+              <w:t xml:space="preserve">B Daily</w:t>
+            </w:r>
+          </w:p>
+        </w:tc>
+        <w:tc>
+          <w:tcPr/>
+          <w:p>
+            <w:pPr>
+              <w:pStyle w:val="Compact"/>
+              <w:spacing w:before="20" w:after="20" w:line="240" w:lineRule="auto"/>
+              <w:ind w:firstLine="0"/>
+              <w:jc w:val="left"/>
+            </w:pPr>
+            <w:r>
+              <w:rPr>
+                <w:rFonts w:ascii="Times New Roman" w:hAnsi="Times New Roman"/>
+                <w:sz w:val="17"/>
+              </w:rPr>
+              <w:t xml:space="preserve">16.66*</w:t>
+            </w:r>
+          </w:p>
+        </w:tc>
+        <w:tc>
+          <w:tcPr/>
+          <w:p>
+            <w:pPr>
+              <w:pStyle w:val="Compact"/>
+              <w:spacing w:before="20" w:after="20" w:line="240" w:lineRule="auto"/>
+              <w:ind w:firstLine="0"/>
+              <w:jc w:val="left"/>
+            </w:pPr>
+            <w:r>
+              <w:rPr>
+                <w:rFonts w:ascii="Times New Roman" w:hAnsi="Times New Roman"/>
+                <w:sz w:val="17"/>
+              </w:rPr>
+              <w:t xml:space="preserve">0.08*</w:t>
+            </w:r>
+          </w:p>
+        </w:tc>
+        <w:tc>
+          <w:tcPr/>
+          <w:p>
+            <w:pPr>
+              <w:pStyle w:val="Compact"/>
+              <w:spacing w:before="20" w:after="20" w:line="240" w:lineRule="auto"/>
+              <w:ind w:firstLine="0"/>
+              <w:jc w:val="left"/>
+            </w:pPr>
+            <w:r>
+              <w:rPr>
+                <w:rFonts w:ascii="Times New Roman" w:hAnsi="Times New Roman"/>
+                <w:sz w:val="17"/>
+              </w:rPr>
+              <w:t xml:space="preserve">0.00*</w:t>
+            </w:r>
+          </w:p>
+        </w:tc>
+        <w:tc>
+          <w:tcPr/>
+          <w:p>
+            <w:pPr>
+              <w:pStyle w:val="Compact"/>
+              <w:spacing w:before="20" w:after="20" w:line="240" w:lineRule="auto"/>
+              <w:ind w:firstLine="0"/>
+              <w:jc w:val="left"/>
+            </w:pPr>
+            <w:r>
+              <w:rPr>
+                <w:rFonts w:ascii="Times New Roman" w:hAnsi="Times New Roman"/>
+                <w:sz w:val="17"/>
+              </w:rPr>
+              <w:t xml:space="preserve">-0.06*</w:t>
+            </w:r>
+          </w:p>
+        </w:tc>
+      </w:tr>
+      <w:tr>
+        <w:tc>
+          <w:tcPr/>
+          <w:p>
+            <w:pPr>
+              <w:pStyle w:val="Compact"/>
+              <w:spacing w:before="20" w:after="20" w:line="240" w:lineRule="auto"/>
+              <w:ind w:firstLine="0"/>
+              <w:jc w:val="left"/>
+            </w:pPr>
+            <w:r>
+              <w:rPr>
+                <w:rFonts w:ascii="Times New Roman" w:hAnsi="Times New Roman"/>
+                <w:sz w:val="17"/>
+              </w:rPr>
+              <w:t xml:space="preserve">GPT-4o-mini</w:t>
+            </w:r>
+          </w:p>
+        </w:tc>
+        <w:tc>
+          <w:tcPr/>
+          <w:p>
+            <w:pPr>
+              <w:pStyle w:val="Compact"/>
+              <w:spacing w:before="20" w:after="20" w:line="240" w:lineRule="auto"/>
+              <w:ind w:firstLine="0"/>
+              <w:jc w:val="left"/>
+            </w:pPr>
+            <w:r>
+              <w:rPr>
+                <w:rFonts w:ascii="Times New Roman" w:hAnsi="Times New Roman"/>
+                <w:sz w:val="17"/>
+              </w:rPr>
+              <w:t xml:space="preserve">plain</w:t>
+            </w:r>
+          </w:p>
+        </w:tc>
+        <w:tc>
+          <w:tcPr/>
+          <w:p>
+            <w:pPr>
+              <w:pStyle w:val="Compact"/>
+              <w:spacing w:before="20" w:after="20" w:line="240" w:lineRule="auto"/>
+              <w:ind w:firstLine="0"/>
+              <w:jc w:val="left"/>
+            </w:pPr>
+            <w:r>
+              <w:rPr>
+                <w:rFonts w:ascii="Times New Roman" w:hAnsi="Times New Roman"/>
+                <w:sz w:val="17"/>
+              </w:rPr>
+              <w:t xml:space="preserve">C Describe</w:t>
+            </w:r>
+          </w:p>
+        </w:tc>
+        <w:tc>
+          <w:tcPr/>
+          <w:p>
+            <w:pPr>
+              <w:pStyle w:val="Compact"/>
+              <w:spacing w:before="20" w:after="20" w:line="240" w:lineRule="auto"/>
+              <w:ind w:firstLine="0"/>
+              <w:jc w:val="left"/>
+            </w:pPr>
+            <w:r>
+              <w:rPr>
+                <w:rFonts w:ascii="Times New Roman" w:hAnsi="Times New Roman"/>
+                <w:sz w:val="17"/>
+              </w:rPr>
+              <w:t xml:space="preserve">5.79*</w:t>
+            </w:r>
+          </w:p>
+        </w:tc>
+        <w:tc>
+          <w:tcPr/>
+          <w:p>
+            <w:pPr>
+              <w:pStyle w:val="Compact"/>
+              <w:spacing w:before="20" w:after="20" w:line="240" w:lineRule="auto"/>
+              <w:ind w:firstLine="0"/>
+              <w:jc w:val="left"/>
+            </w:pPr>
+            <w:r>
+              <w:rPr>
+                <w:rFonts w:ascii="Times New Roman" w:hAnsi="Times New Roman"/>
+                <w:sz w:val="17"/>
+              </w:rPr>
+              <w:t xml:space="preserve">4.44*</w:t>
+            </w:r>
+          </w:p>
+        </w:tc>
+        <w:tc>
+          <w:tcPr/>
+          <w:p>
+            <w:pPr>
+              <w:pStyle w:val="Compact"/>
+              <w:spacing w:before="20" w:after="20" w:line="240" w:lineRule="auto"/>
+              <w:ind w:firstLine="0"/>
+              <w:jc w:val="left"/>
+            </w:pPr>
+            <w:r>
+              <w:rPr>
+                <w:rFonts w:ascii="Times New Roman" w:hAnsi="Times New Roman"/>
+                <w:sz w:val="17"/>
+              </w:rPr>
+              <w:t xml:space="preserve">0.07*</w:t>
+            </w:r>
+          </w:p>
+        </w:tc>
+        <w:tc>
+          <w:tcPr/>
+          <w:p>
+            <w:pPr>
+              <w:pStyle w:val="Compact"/>
+              <w:spacing w:before="20" w:after="20" w:line="240" w:lineRule="auto"/>
+              <w:ind w:firstLine="0"/>
+              <w:jc w:val="left"/>
+            </w:pPr>
+            <w:r>
+              <w:rPr>
+                <w:rFonts w:ascii="Times New Roman" w:hAnsi="Times New Roman"/>
+                <w:sz w:val="17"/>
+              </w:rPr>
+              <w:t xml:space="preserve">0.59</w:t>
+            </w:r>
+          </w:p>
+        </w:tc>
+      </w:tr>
+      <w:tr>
+        <w:tc>
+          <w:tcPr/>
+          <w:p>
+            <w:pPr>
+              <w:pStyle w:val="Compact"/>
+              <w:spacing w:before="20" w:after="20" w:line="240" w:lineRule="auto"/>
+              <w:ind w:firstLine="0"/>
+              <w:jc w:val="left"/>
+            </w:pPr>
+            <w:r>
+              <w:rPr>
+                <w:rFonts w:ascii="Times New Roman" w:hAnsi="Times New Roman"/>
+                <w:sz w:val="17"/>
+              </w:rPr>
+              <w:t xml:space="preserve">GPT-4o-mini</w:t>
+            </w:r>
+          </w:p>
+        </w:tc>
+        <w:tc>
+          <w:tcPr/>
+          <w:p>
+            <w:pPr>
+              <w:pStyle w:val="Compact"/>
+              <w:spacing w:before="20" w:after="20" w:line="240" w:lineRule="auto"/>
+              <w:ind w:firstLine="0"/>
+              <w:jc w:val="left"/>
+            </w:pPr>
+            <w:r>
+              <w:rPr>
+                <w:rFonts w:ascii="Times New Roman" w:hAnsi="Times New Roman"/>
+                <w:sz w:val="17"/>
+              </w:rPr>
+              <w:t xml:space="preserve">plain</w:t>
+            </w:r>
+          </w:p>
+        </w:tc>
+        <w:tc>
+          <w:tcPr/>
+          <w:p>
+            <w:pPr>
+              <w:pStyle w:val="Compact"/>
+              <w:spacing w:before="20" w:after="20" w:line="240" w:lineRule="auto"/>
+              <w:ind w:firstLine="0"/>
+              <w:jc w:val="left"/>
+            </w:pPr>
+            <w:r>
+              <w:rPr>
+                <w:rFonts w:ascii="Times New Roman" w:hAnsi="Times New Roman"/>
+                <w:sz w:val="17"/>
+              </w:rPr>
+              <w:t xml:space="preserve">D Hybrid</w:t>
+            </w:r>
+          </w:p>
+        </w:tc>
+        <w:tc>
+          <w:tcPr/>
+          <w:p>
+            <w:pPr>
+              <w:pStyle w:val="Compact"/>
+              <w:spacing w:before="20" w:after="20" w:line="240" w:lineRule="auto"/>
+              <w:ind w:firstLine="0"/>
+              <w:jc w:val="left"/>
+            </w:pPr>
+            <w:r>
+              <w:rPr>
+                <w:rFonts w:ascii="Times New Roman" w:hAnsi="Times New Roman"/>
+                <w:sz w:val="17"/>
+              </w:rPr>
+              <w:t xml:space="preserve">6.42*</w:t>
+            </w:r>
+          </w:p>
+        </w:tc>
+        <w:tc>
+          <w:tcPr/>
+          <w:p>
+            <w:pPr>
+              <w:pStyle w:val="Compact"/>
+              <w:spacing w:before="20" w:after="20" w:line="240" w:lineRule="auto"/>
+              <w:ind w:firstLine="0"/>
+              <w:jc w:val="left"/>
+            </w:pPr>
+            <w:r>
+              <w:rPr>
+                <w:rFonts w:ascii="Times New Roman" w:hAnsi="Times New Roman"/>
+                <w:sz w:val="17"/>
+              </w:rPr>
+              <w:t xml:space="preserve">6.28</w:t>
+            </w:r>
+          </w:p>
+        </w:tc>
+        <w:tc>
+          <w:tcPr/>
+          <w:p>
+            <w:pPr>
+              <w:pStyle w:val="Compact"/>
+              <w:spacing w:before="20" w:after="20" w:line="240" w:lineRule="auto"/>
+              <w:ind w:firstLine="0"/>
+              <w:jc w:val="left"/>
+            </w:pPr>
+            <w:r>
+              <w:rPr>
+                <w:rFonts w:ascii="Times New Roman" w:hAnsi="Times New Roman"/>
+                <w:sz w:val="17"/>
+              </w:rPr>
+              <w:t xml:space="preserve">0.07*</w:t>
+            </w:r>
+          </w:p>
+        </w:tc>
+        <w:tc>
+          <w:tcPr/>
+          <w:p>
+            <w:pPr>
+              <w:pStyle w:val="Compact"/>
+              <w:spacing w:before="20" w:after="20" w:line="240" w:lineRule="auto"/>
+              <w:ind w:firstLine="0"/>
+              <w:jc w:val="left"/>
+            </w:pPr>
+            <w:r>
+              <w:rPr>
+                <w:rFonts w:ascii="Times New Roman" w:hAnsi="Times New Roman"/>
+                <w:sz w:val="17"/>
+              </w:rPr>
+              <w:t xml:space="preserve">0.82</w:t>
+            </w:r>
+          </w:p>
+        </w:tc>
+      </w:tr>
+      <w:tr>
+        <w:tc>
+          <w:tcPr/>
+          <w:p>
+            <w:pPr>
+              <w:pStyle w:val="Compact"/>
+              <w:spacing w:before="20" w:after="20" w:line="240" w:lineRule="auto"/>
+              <w:ind w:firstLine="0"/>
+              <w:jc w:val="left"/>
+            </w:pPr>
+            <w:r>
+              <w:rPr>
+                <w:rFonts w:ascii="Times New Roman" w:hAnsi="Times New Roman"/>
+                <w:sz w:val="17"/>
+              </w:rPr>
+              <w:t xml:space="preserve">GPT-4o-mini</w:t>
+            </w:r>
+          </w:p>
+        </w:tc>
+        <w:tc>
+          <w:tcPr/>
+          <w:p>
+            <w:pPr>
+              <w:pStyle w:val="Compact"/>
+              <w:spacing w:before="20" w:after="20" w:line="240" w:lineRule="auto"/>
+              <w:ind w:firstLine="0"/>
+              <w:jc w:val="left"/>
+            </w:pPr>
+            <w:r>
+              <w:rPr>
+                <w:rFonts w:ascii="Times New Roman" w:hAnsi="Times New Roman"/>
+                <w:sz w:val="17"/>
+              </w:rPr>
+              <w:t xml:space="preserve">anchored</w:t>
+            </w:r>
+          </w:p>
+        </w:tc>
+        <w:tc>
+          <w:tcPr/>
+          <w:p>
+            <w:pPr>
+              <w:pStyle w:val="Compact"/>
+              <w:spacing w:before="20" w:after="20" w:line="240" w:lineRule="auto"/>
+              <w:ind w:firstLine="0"/>
+              <w:jc w:val="left"/>
+            </w:pPr>
+            <w:r>
+              <w:rPr>
+                <w:rFonts w:ascii="Times New Roman" w:hAnsi="Times New Roman"/>
+                <w:sz w:val="17"/>
+              </w:rPr>
+              <w:t xml:space="preserve">A Direct</w:t>
+            </w:r>
+          </w:p>
+        </w:tc>
+        <w:tc>
+          <w:tcPr/>
+          <w:p>
+            <w:pPr>
+              <w:pStyle w:val="Compact"/>
+              <w:spacing w:before="20" w:after="20" w:line="240" w:lineRule="auto"/>
+              <w:ind w:firstLine="0"/>
+              <w:jc w:val="left"/>
+            </w:pPr>
+            <w:r>
+              <w:rPr>
+                <w:rFonts w:ascii="Times New Roman" w:hAnsi="Times New Roman"/>
+                <w:sz w:val="17"/>
+              </w:rPr>
+              <w:t xml:space="preserve">8.00*</w:t>
+            </w:r>
+          </w:p>
+        </w:tc>
+        <w:tc>
+          <w:tcPr/>
+          <w:p>
+            <w:pPr>
+              <w:pStyle w:val="Compact"/>
+              <w:spacing w:before="20" w:after="20" w:line="240" w:lineRule="auto"/>
+              <w:ind w:firstLine="0"/>
+              <w:jc w:val="left"/>
+            </w:pPr>
+            <w:r>
+              <w:rPr>
+                <w:rFonts w:ascii="Times New Roman" w:hAnsi="Times New Roman"/>
+                <w:sz w:val="17"/>
+              </w:rPr>
+              <w:t xml:space="preserve">0.00*</w:t>
+            </w:r>
+          </w:p>
+        </w:tc>
+        <w:tc>
+          <w:tcPr/>
+          <w:p>
+            <w:pPr>
+              <w:pStyle w:val="Compact"/>
+              <w:spacing w:before="20" w:after="20" w:line="240" w:lineRule="auto"/>
+              <w:ind w:firstLine="0"/>
+              <w:jc w:val="left"/>
+            </w:pPr>
+            <w:r>
+              <w:rPr>
+                <w:rFonts w:ascii="Times New Roman" w:hAnsi="Times New Roman"/>
+                <w:sz w:val="17"/>
+              </w:rPr>
+              <w:t xml:space="preserve">0.00*</w:t>
+            </w:r>
+          </w:p>
+        </w:tc>
+        <w:tc>
+          <w:tcPr/>
+          <w:p>
+            <w:pPr>
+              <w:pStyle w:val="Compact"/>
+              <w:spacing w:before="20" w:after="20" w:line="240" w:lineRule="auto"/>
+              <w:ind w:firstLine="0"/>
+              <w:jc w:val="left"/>
+            </w:pPr>
+            <w:r>
+              <w:rPr>
+                <w:rFonts w:ascii="Times New Roman" w:hAnsi="Times New Roman"/>
+                <w:sz w:val="17"/>
+              </w:rPr>
+              <w:t xml:space="preserve">-0.12*</w:t>
+            </w:r>
+          </w:p>
+        </w:tc>
+      </w:tr>
+      <w:tr>
+        <w:tc>
+          <w:tcPr/>
+          <w:p>
+            <w:pPr>
+              <w:pStyle w:val="Compact"/>
+              <w:spacing w:before="20" w:after="20" w:line="240" w:lineRule="auto"/>
+              <w:ind w:firstLine="0"/>
+              <w:jc w:val="left"/>
+            </w:pPr>
+            <w:r>
+              <w:rPr>
+                <w:rFonts w:ascii="Times New Roman" w:hAnsi="Times New Roman"/>
+                <w:sz w:val="17"/>
+              </w:rPr>
+              <w:t xml:space="preserve">GPT-4o-mini</w:t>
+            </w:r>
+          </w:p>
+        </w:tc>
+        <w:tc>
+          <w:tcPr/>
+          <w:p>
+            <w:pPr>
+              <w:pStyle w:val="Compact"/>
+              <w:spacing w:before="20" w:after="20" w:line="240" w:lineRule="auto"/>
+              <w:ind w:firstLine="0"/>
+              <w:jc w:val="left"/>
+            </w:pPr>
+            <w:r>
+              <w:rPr>
+                <w:rFonts w:ascii="Times New Roman" w:hAnsi="Times New Roman"/>
+                <w:sz w:val="17"/>
+              </w:rPr>
+              <w:t xml:space="preserve">anchored</w:t>
+            </w:r>
+          </w:p>
+        </w:tc>
+        <w:tc>
+          <w:tcPr/>
+          <w:p>
+            <w:pPr>
+              <w:pStyle w:val="Compact"/>
+              <w:spacing w:before="20" w:after="20" w:line="240" w:lineRule="auto"/>
+              <w:ind w:firstLine="0"/>
+              <w:jc w:val="left"/>
+            </w:pPr>
+            <w:r>
+              <w:rPr>
+                <w:rFonts w:ascii="Times New Roman" w:hAnsi="Times New Roman"/>
+                <w:sz w:val="17"/>
+              </w:rPr>
+              <w:t xml:space="preserve">B Daily</w:t>
+            </w:r>
+          </w:p>
+        </w:tc>
+        <w:tc>
+          <w:tcPr/>
+          <w:p>
+            <w:pPr>
+              <w:pStyle w:val="Compact"/>
+              <w:spacing w:before="20" w:after="20" w:line="240" w:lineRule="auto"/>
+              <w:ind w:firstLine="0"/>
+              <w:jc w:val="left"/>
+            </w:pPr>
+            <w:r>
+              <w:rPr>
+                <w:rFonts w:ascii="Times New Roman" w:hAnsi="Times New Roman"/>
+                <w:sz w:val="17"/>
+              </w:rPr>
+              <w:t xml:space="preserve">17.28*</w:t>
+            </w:r>
+          </w:p>
+        </w:tc>
+        <w:tc>
+          <w:tcPr/>
+          <w:p>
+            <w:pPr>
+              <w:pStyle w:val="Compact"/>
+              <w:spacing w:before="20" w:after="20" w:line="240" w:lineRule="auto"/>
+              <w:ind w:firstLine="0"/>
+              <w:jc w:val="left"/>
+            </w:pPr>
+            <w:r>
+              <w:rPr>
+                <w:rFonts w:ascii="Times New Roman" w:hAnsi="Times New Roman"/>
+                <w:sz w:val="17"/>
+              </w:rPr>
+              <w:t xml:space="preserve">0.15*</w:t>
+            </w:r>
+          </w:p>
+        </w:tc>
+        <w:tc>
+          <w:tcPr/>
+          <w:p>
+            <w:pPr>
+              <w:pStyle w:val="Compact"/>
+              <w:spacing w:before="20" w:after="20" w:line="240" w:lineRule="auto"/>
+              <w:ind w:firstLine="0"/>
+              <w:jc w:val="left"/>
+            </w:pPr>
+            <w:r>
+              <w:rPr>
+                <w:rFonts w:ascii="Times New Roman" w:hAnsi="Times New Roman"/>
+                <w:sz w:val="17"/>
+              </w:rPr>
+              <w:t xml:space="preserve">0.00*</w:t>
+            </w:r>
+          </w:p>
+        </w:tc>
+        <w:tc>
+          <w:tcPr/>
+          <w:p>
+            <w:pPr>
+              <w:pStyle w:val="Compact"/>
+              <w:spacing w:before="20" w:after="20" w:line="240" w:lineRule="auto"/>
+              <w:ind w:firstLine="0"/>
+              <w:jc w:val="left"/>
+            </w:pPr>
+            <w:r>
+              <w:rPr>
+                <w:rFonts w:ascii="Times New Roman" w:hAnsi="Times New Roman"/>
+                <w:sz w:val="17"/>
+              </w:rPr>
+              <w:t xml:space="preserve">-0.05*</w:t>
+            </w:r>
+          </w:p>
+        </w:tc>
+      </w:tr>
+      <w:tr>
+        <w:tc>
+          <w:tcPr/>
+          <w:p>
+            <w:pPr>
+              <w:pStyle w:val="Compact"/>
+              <w:spacing w:before="20" w:after="20" w:line="240" w:lineRule="auto"/>
+              <w:ind w:firstLine="0"/>
+              <w:jc w:val="left"/>
+            </w:pPr>
+            <w:r>
+              <w:rPr>
+                <w:rFonts w:ascii="Times New Roman" w:hAnsi="Times New Roman"/>
+                <w:sz w:val="17"/>
+              </w:rPr>
+              <w:t xml:space="preserve">GPT-4o-mini</w:t>
+            </w:r>
+          </w:p>
+        </w:tc>
+        <w:tc>
+          <w:tcPr/>
+          <w:p>
+            <w:pPr>
+              <w:pStyle w:val="Compact"/>
+              <w:spacing w:before="20" w:after="20" w:line="240" w:lineRule="auto"/>
+              <w:ind w:firstLine="0"/>
+              <w:jc w:val="left"/>
+            </w:pPr>
+            <w:r>
+              <w:rPr>
+                <w:rFonts w:ascii="Times New Roman" w:hAnsi="Times New Roman"/>
+                <w:sz w:val="17"/>
+              </w:rPr>
+              <w:t xml:space="preserve">anchored</w:t>
+            </w:r>
+          </w:p>
+        </w:tc>
+        <w:tc>
+          <w:tcPr/>
+          <w:p>
+            <w:pPr>
+              <w:pStyle w:val="Compact"/>
+              <w:spacing w:before="20" w:after="20" w:line="240" w:lineRule="auto"/>
+              <w:ind w:firstLine="0"/>
+              <w:jc w:val="left"/>
+            </w:pPr>
+            <w:r>
+              <w:rPr>
+                <w:rFonts w:ascii="Times New Roman" w:hAnsi="Times New Roman"/>
+                <w:sz w:val="17"/>
+              </w:rPr>
+              <w:t xml:space="preserve">C Describe</w:t>
+            </w:r>
+          </w:p>
+        </w:tc>
+        <w:tc>
+          <w:tcPr/>
+          <w:p>
+            <w:pPr>
+              <w:pStyle w:val="Compact"/>
+              <w:spacing w:before="20" w:after="20" w:line="240" w:lineRule="auto"/>
+              <w:ind w:firstLine="0"/>
+              <w:jc w:val="left"/>
+            </w:pPr>
+            <w:r>
+              <w:rPr>
+                <w:rFonts w:ascii="Times New Roman" w:hAnsi="Times New Roman"/>
+                <w:sz w:val="17"/>
+              </w:rPr>
+              <w:t xml:space="preserve">6.23*</w:t>
+            </w:r>
+          </w:p>
+        </w:tc>
+        <w:tc>
+          <w:tcPr/>
+          <w:p>
+            <w:pPr>
+              <w:pStyle w:val="Compact"/>
+              <w:spacing w:before="20" w:after="20" w:line="240" w:lineRule="auto"/>
+              <w:ind w:firstLine="0"/>
+              <w:jc w:val="left"/>
+            </w:pPr>
+            <w:r>
+              <w:rPr>
+                <w:rFonts w:ascii="Times New Roman" w:hAnsi="Times New Roman"/>
+                <w:sz w:val="17"/>
+              </w:rPr>
+              <w:t xml:space="preserve">4.17*</w:t>
+            </w:r>
+          </w:p>
+        </w:tc>
+        <w:tc>
+          <w:tcPr/>
+          <w:p>
+            <w:pPr>
+              <w:pStyle w:val="Compact"/>
+              <w:spacing w:before="20" w:after="20" w:line="240" w:lineRule="auto"/>
+              <w:ind w:firstLine="0"/>
+              <w:jc w:val="left"/>
+            </w:pPr>
+            <w:r>
+              <w:rPr>
+                <w:rFonts w:ascii="Times New Roman" w:hAnsi="Times New Roman"/>
+                <w:sz w:val="17"/>
+              </w:rPr>
+              <w:t xml:space="preserve">0.09*</w:t>
+            </w:r>
+          </w:p>
+        </w:tc>
+        <w:tc>
+          <w:tcPr/>
+          <w:p>
+            <w:pPr>
+              <w:pStyle w:val="Compact"/>
+              <w:spacing w:before="20" w:after="20" w:line="240" w:lineRule="auto"/>
+              <w:ind w:firstLine="0"/>
+              <w:jc w:val="left"/>
+            </w:pPr>
+            <w:r>
+              <w:rPr>
+                <w:rFonts w:ascii="Times New Roman" w:hAnsi="Times New Roman"/>
+                <w:sz w:val="17"/>
+              </w:rPr>
+              <w:t xml:space="preserve">0.51*</w:t>
+            </w:r>
+          </w:p>
+        </w:tc>
+      </w:tr>
+      <w:tr>
+        <w:tc>
+          <w:tcPr/>
+          <w:p>
+            <w:pPr>
+              <w:pStyle w:val="Compact"/>
+              <w:spacing w:before="20" w:after="20" w:line="240" w:lineRule="auto"/>
+              <w:ind w:firstLine="0"/>
+              <w:jc w:val="left"/>
+            </w:pPr>
+            <w:r>
+              <w:rPr>
+                <w:rFonts w:ascii="Times New Roman" w:hAnsi="Times New Roman"/>
+                <w:sz w:val="17"/>
+              </w:rPr>
+              <w:t xml:space="preserve">GPT-4o-mini</w:t>
+            </w:r>
+          </w:p>
+        </w:tc>
+        <w:tc>
+          <w:tcPr/>
+          <w:p>
+            <w:pPr>
+              <w:pStyle w:val="Compact"/>
+              <w:spacing w:before="20" w:after="20" w:line="240" w:lineRule="auto"/>
+              <w:ind w:firstLine="0"/>
+              <w:jc w:val="left"/>
+            </w:pPr>
+            <w:r>
+              <w:rPr>
+                <w:rFonts w:ascii="Times New Roman" w:hAnsi="Times New Roman"/>
+                <w:sz w:val="17"/>
+              </w:rPr>
+              <w:t xml:space="preserve">anchored</w:t>
+            </w:r>
+          </w:p>
+        </w:tc>
+        <w:tc>
+          <w:tcPr/>
+          <w:p>
+            <w:pPr>
+              <w:pStyle w:val="Compact"/>
+              <w:spacing w:before="20" w:after="20" w:line="240" w:lineRule="auto"/>
+              <w:ind w:firstLine="0"/>
+              <w:jc w:val="left"/>
+            </w:pPr>
+            <w:r>
+              <w:rPr>
+                <w:rFonts w:ascii="Times New Roman" w:hAnsi="Times New Roman"/>
+                <w:sz w:val="17"/>
+              </w:rPr>
+              <w:t xml:space="preserve">D Hybrid</w:t>
+            </w:r>
+          </w:p>
+        </w:tc>
+        <w:tc>
+          <w:tcPr/>
+          <w:p>
+            <w:pPr>
+              <w:pStyle w:val="Compact"/>
+              <w:spacing w:before="20" w:after="20" w:line="240" w:lineRule="auto"/>
+              <w:ind w:firstLine="0"/>
+              <w:jc w:val="left"/>
+            </w:pPr>
+            <w:r>
+              <w:rPr>
+                <w:rFonts w:ascii="Times New Roman" w:hAnsi="Times New Roman"/>
+                <w:sz w:val="17"/>
+              </w:rPr>
+              <w:t xml:space="preserve">7.04</w:t>
+            </w:r>
+          </w:p>
+        </w:tc>
+        <w:tc>
+          <w:tcPr/>
+          <w:p>
+            <w:pPr>
+              <w:pStyle w:val="Compact"/>
+              <w:spacing w:before="20" w:after="20" w:line="240" w:lineRule="auto"/>
+              <w:ind w:firstLine="0"/>
+              <w:jc w:val="left"/>
+            </w:pPr>
+            <w:r>
+              <w:rPr>
+                <w:rFonts w:ascii="Times New Roman" w:hAnsi="Times New Roman"/>
+                <w:sz w:val="17"/>
+              </w:rPr>
+              <w:t xml:space="preserve">6.19</w:t>
+            </w:r>
+          </w:p>
+        </w:tc>
+        <w:tc>
+          <w:tcPr/>
+          <w:p>
+            <w:pPr>
+              <w:pStyle w:val="Compact"/>
+              <w:spacing w:before="20" w:after="20" w:line="240" w:lineRule="auto"/>
+              <w:ind w:firstLine="0"/>
+              <w:jc w:val="left"/>
+            </w:pPr>
+            <w:r>
+              <w:rPr>
+                <w:rFonts w:ascii="Times New Roman" w:hAnsi="Times New Roman"/>
+                <w:sz w:val="17"/>
+              </w:rPr>
+              <w:t xml:space="preserve">0.07*</w:t>
+            </w:r>
+          </w:p>
+        </w:tc>
+        <w:tc>
+          <w:tcPr/>
+          <w:p>
+            <w:pPr>
+              <w:pStyle w:val="Compact"/>
+              <w:spacing w:before="20" w:after="20" w:line="240" w:lineRule="auto"/>
+              <w:ind w:firstLine="0"/>
+              <w:jc w:val="left"/>
+            </w:pPr>
+            <w:r>
+              <w:rPr>
+                <w:rFonts w:ascii="Times New Roman" w:hAnsi="Times New Roman"/>
+                <w:sz w:val="17"/>
+              </w:rPr>
+              <w:t xml:space="preserve">0.74</w:t>
+            </w:r>
+          </w:p>
+        </w:tc>
+      </w:tr>
+      <w:tr>
+        <w:tc>
+          <w:tcPr/>
+          <w:p>
+            <w:pPr>
+              <w:pStyle w:val="Compact"/>
+              <w:spacing w:before="20" w:after="20" w:line="240" w:lineRule="auto"/>
+              <w:ind w:firstLine="0"/>
+              <w:jc w:val="left"/>
+            </w:pPr>
+            <w:r>
+              <w:rPr>
+                <w:rFonts w:ascii="Times New Roman" w:hAnsi="Times New Roman"/>
+                <w:sz w:val="17"/>
+              </w:rPr>
+              <w:t xml:space="preserve">Llama-3.3-70B</w:t>
+            </w:r>
+          </w:p>
+        </w:tc>
+        <w:tc>
+          <w:tcPr/>
+          <w:p>
+            <w:pPr>
+              <w:pStyle w:val="Compact"/>
+              <w:spacing w:before="20" w:after="20" w:line="240" w:lineRule="auto"/>
+              <w:ind w:firstLine="0"/>
+              <w:jc w:val="left"/>
+            </w:pPr>
+            <w:r>
+              <w:rPr>
+                <w:rFonts w:ascii="Times New Roman" w:hAnsi="Times New Roman"/>
+                <w:sz w:val="17"/>
+              </w:rPr>
+              <w:t xml:space="preserve">plain</w:t>
+            </w:r>
+          </w:p>
+        </w:tc>
+        <w:tc>
+          <w:tcPr/>
+          <w:p>
+            <w:pPr>
+              <w:pStyle w:val="Compact"/>
+              <w:spacing w:before="20" w:after="20" w:line="240" w:lineRule="auto"/>
+              <w:ind w:firstLine="0"/>
+              <w:jc w:val="left"/>
+            </w:pPr>
+            <w:r>
+              <w:rPr>
+                <w:rFonts w:ascii="Times New Roman" w:hAnsi="Times New Roman"/>
+                <w:sz w:val="17"/>
+              </w:rPr>
+              <w:t xml:space="preserve">A Direct</w:t>
+            </w:r>
+          </w:p>
+        </w:tc>
+        <w:tc>
+          <w:tcPr/>
+          <w:p>
+            <w:pPr>
+              <w:pStyle w:val="Compact"/>
+              <w:spacing w:before="20" w:after="20" w:line="240" w:lineRule="auto"/>
+              <w:ind w:firstLine="0"/>
+              <w:jc w:val="left"/>
+            </w:pPr>
+            <w:r>
+              <w:rPr>
+                <w:rFonts w:ascii="Times New Roman" w:hAnsi="Times New Roman"/>
+                <w:sz w:val="17"/>
+              </w:rPr>
+              <w:t xml:space="preserve">7.97*</w:t>
+            </w:r>
+          </w:p>
+        </w:tc>
+        <w:tc>
+          <w:tcPr/>
+          <w:p>
+            <w:pPr>
+              <w:pStyle w:val="Compact"/>
+              <w:spacing w:before="20" w:after="20" w:line="240" w:lineRule="auto"/>
+              <w:ind w:firstLine="0"/>
+              <w:jc w:val="left"/>
+            </w:pPr>
+            <w:r>
+              <w:rPr>
+                <w:rFonts w:ascii="Times New Roman" w:hAnsi="Times New Roman"/>
+                <w:sz w:val="17"/>
+              </w:rPr>
+              <w:t xml:space="preserve">0.01*</w:t>
+            </w:r>
+          </w:p>
+        </w:tc>
+        <w:tc>
+          <w:tcPr/>
+          <w:p>
+            <w:pPr>
+              <w:pStyle w:val="Compact"/>
+              <w:spacing w:before="20" w:after="20" w:line="240" w:lineRule="auto"/>
+              <w:ind w:firstLine="0"/>
+              <w:jc w:val="left"/>
+            </w:pPr>
+            <w:r>
+              <w:rPr>
+                <w:rFonts w:ascii="Times New Roman" w:hAnsi="Times New Roman"/>
+                <w:sz w:val="17"/>
+              </w:rPr>
+              <w:t xml:space="preserve">0.00*</w:t>
+            </w:r>
+          </w:p>
+        </w:tc>
+        <w:tc>
+          <w:tcPr/>
+          <w:p>
+            <w:pPr>
+              <w:pStyle w:val="Compact"/>
+              <w:spacing w:before="20" w:after="20" w:line="240" w:lineRule="auto"/>
+              <w:ind w:firstLine="0"/>
+              <w:jc w:val="left"/>
+            </w:pPr>
+            <w:r>
+              <w:rPr>
+                <w:rFonts w:ascii="Times New Roman" w:hAnsi="Times New Roman"/>
+                <w:sz w:val="17"/>
+              </w:rPr>
+              <w:t xml:space="preserve">-0.12*</w:t>
+            </w:r>
+          </w:p>
+        </w:tc>
+      </w:tr>
+      <w:tr>
+        <w:tc>
+          <w:tcPr/>
+          <w:p>
+            <w:pPr>
+              <w:pStyle w:val="Compact"/>
+              <w:spacing w:before="20" w:after="20" w:line="240" w:lineRule="auto"/>
+              <w:ind w:firstLine="0"/>
+              <w:jc w:val="left"/>
+            </w:pPr>
+            <w:r>
+              <w:rPr>
+                <w:rFonts w:ascii="Times New Roman" w:hAnsi="Times New Roman"/>
+                <w:sz w:val="17"/>
+              </w:rPr>
+              <w:t xml:space="preserve">Llama-3.3-70B</w:t>
+            </w:r>
+          </w:p>
+        </w:tc>
+        <w:tc>
+          <w:tcPr/>
+          <w:p>
+            <w:pPr>
+              <w:pStyle w:val="Compact"/>
+              <w:spacing w:before="20" w:after="20" w:line="240" w:lineRule="auto"/>
+              <w:ind w:firstLine="0"/>
+              <w:jc w:val="left"/>
+            </w:pPr>
+            <w:r>
+              <w:rPr>
+                <w:rFonts w:ascii="Times New Roman" w:hAnsi="Times New Roman"/>
+                <w:sz w:val="17"/>
+              </w:rPr>
+              <w:t xml:space="preserve">plain</w:t>
+            </w:r>
+          </w:p>
+        </w:tc>
+        <w:tc>
+          <w:tcPr/>
+          <w:p>
+            <w:pPr>
+              <w:pStyle w:val="Compact"/>
+              <w:spacing w:before="20" w:after="20" w:line="240" w:lineRule="auto"/>
+              <w:ind w:firstLine="0"/>
+              <w:jc w:val="left"/>
+            </w:pPr>
+            <w:r>
+              <w:rPr>
+                <w:rFonts w:ascii="Times New Roman" w:hAnsi="Times New Roman"/>
+                <w:sz w:val="17"/>
+              </w:rPr>
+              <w:t xml:space="preserve">B Daily</w:t>
+            </w:r>
+          </w:p>
+        </w:tc>
+        <w:tc>
+          <w:tcPr/>
+          <w:p>
+            <w:pPr>
+              <w:pStyle w:val="Compact"/>
+              <w:spacing w:before="20" w:after="20" w:line="240" w:lineRule="auto"/>
+              <w:ind w:firstLine="0"/>
+              <w:jc w:val="left"/>
+            </w:pPr>
+            <w:r>
+              <w:rPr>
+                <w:rFonts w:ascii="Times New Roman" w:hAnsi="Times New Roman"/>
+                <w:sz w:val="17"/>
+              </w:rPr>
+              <w:t xml:space="preserve">9.27*</w:t>
+            </w:r>
+          </w:p>
+        </w:tc>
+        <w:tc>
+          <w:tcPr/>
+          <w:p>
+            <w:pPr>
+              <w:pStyle w:val="Compact"/>
+              <w:spacing w:before="20" w:after="20" w:line="240" w:lineRule="auto"/>
+              <w:ind w:firstLine="0"/>
+              <w:jc w:val="left"/>
+            </w:pPr>
+            <w:r>
+              <w:rPr>
+                <w:rFonts w:ascii="Times New Roman" w:hAnsi="Times New Roman"/>
+                <w:sz w:val="17"/>
+              </w:rPr>
+              <w:t xml:space="preserve">0.19*</w:t>
+            </w:r>
+          </w:p>
+        </w:tc>
+        <w:tc>
+          <w:tcPr/>
+          <w:p>
+            <w:pPr>
+              <w:pStyle w:val="Compact"/>
+              <w:spacing w:before="20" w:after="20" w:line="240" w:lineRule="auto"/>
+              <w:ind w:firstLine="0"/>
+              <w:jc w:val="left"/>
+            </w:pPr>
+            <w:r>
+              <w:rPr>
+                <w:rFonts w:ascii="Times New Roman" w:hAnsi="Times New Roman"/>
+                <w:sz w:val="17"/>
+              </w:rPr>
+              <w:t xml:space="preserve">0.00*</w:t>
+            </w:r>
+          </w:p>
+        </w:tc>
+        <w:tc>
+          <w:tcPr/>
+          <w:p>
+            <w:pPr>
+              <w:pStyle w:val="Compact"/>
+              <w:spacing w:before="20" w:after="20" w:line="240" w:lineRule="auto"/>
+              <w:ind w:firstLine="0"/>
+              <w:jc w:val="left"/>
+            </w:pPr>
+            <w:r>
+              <w:rPr>
+                <w:rFonts w:ascii="Times New Roman" w:hAnsi="Times New Roman"/>
+                <w:sz w:val="17"/>
+              </w:rPr>
+              <w:t xml:space="preserve">-0.09*</w:t>
+            </w:r>
+          </w:p>
+        </w:tc>
+      </w:tr>
+      <w:tr>
+        <w:tc>
+          <w:tcPr/>
+          <w:p>
+            <w:pPr>
+              <w:pStyle w:val="Compact"/>
+              <w:spacing w:before="20" w:after="20" w:line="240" w:lineRule="auto"/>
+              <w:ind w:firstLine="0"/>
+              <w:jc w:val="left"/>
+            </w:pPr>
+            <w:r>
+              <w:rPr>
+                <w:rFonts w:ascii="Times New Roman" w:hAnsi="Times New Roman"/>
+                <w:sz w:val="17"/>
+              </w:rPr>
+              <w:t xml:space="preserve">Llama-3.3-70B</w:t>
+            </w:r>
+          </w:p>
+        </w:tc>
+        <w:tc>
+          <w:tcPr/>
+          <w:p>
+            <w:pPr>
+              <w:pStyle w:val="Compact"/>
+              <w:spacing w:before="20" w:after="20" w:line="240" w:lineRule="auto"/>
+              <w:ind w:firstLine="0"/>
+              <w:jc w:val="left"/>
+            </w:pPr>
+            <w:r>
+              <w:rPr>
+                <w:rFonts w:ascii="Times New Roman" w:hAnsi="Times New Roman"/>
+                <w:sz w:val="17"/>
+              </w:rPr>
+              <w:t xml:space="preserve">plain</w:t>
+            </w:r>
+          </w:p>
+        </w:tc>
+        <w:tc>
+          <w:tcPr/>
+          <w:p>
+            <w:pPr>
+              <w:pStyle w:val="Compact"/>
+              <w:spacing w:before="20" w:after="20" w:line="240" w:lineRule="auto"/>
+              <w:ind w:firstLine="0"/>
+              <w:jc w:val="left"/>
+            </w:pPr>
+            <w:r>
+              <w:rPr>
+                <w:rFonts w:ascii="Times New Roman" w:hAnsi="Times New Roman"/>
+                <w:sz w:val="17"/>
+              </w:rPr>
+              <w:t xml:space="preserve">C Describe</w:t>
+            </w:r>
+          </w:p>
+        </w:tc>
+        <w:tc>
+          <w:tcPr/>
+          <w:p>
+            <w:pPr>
+              <w:pStyle w:val="Compact"/>
+              <w:spacing w:before="20" w:after="20" w:line="240" w:lineRule="auto"/>
+              <w:ind w:firstLine="0"/>
+              <w:jc w:val="left"/>
+            </w:pPr>
+            <w:r>
+              <w:rPr>
+                <w:rFonts w:ascii="Times New Roman" w:hAnsi="Times New Roman"/>
+                <w:sz w:val="17"/>
+              </w:rPr>
+              <w:t xml:space="preserve">6.24*</w:t>
+            </w:r>
+          </w:p>
+        </w:tc>
+        <w:tc>
+          <w:tcPr/>
+          <w:p>
+            <w:pPr>
+              <w:pStyle w:val="Compact"/>
+              <w:spacing w:before="20" w:after="20" w:line="240" w:lineRule="auto"/>
+              <w:ind w:firstLine="0"/>
+              <w:jc w:val="left"/>
+            </w:pPr>
+            <w:r>
+              <w:rPr>
+                <w:rFonts w:ascii="Times New Roman" w:hAnsi="Times New Roman"/>
+                <w:sz w:val="17"/>
+              </w:rPr>
+              <w:t xml:space="preserve">3.70*</w:t>
+            </w:r>
+          </w:p>
+        </w:tc>
+        <w:tc>
+          <w:tcPr/>
+          <w:p>
+            <w:pPr>
+              <w:pStyle w:val="Compact"/>
+              <w:spacing w:before="20" w:after="20" w:line="240" w:lineRule="auto"/>
+              <w:ind w:firstLine="0"/>
+              <w:jc w:val="left"/>
+            </w:pPr>
+            <w:r>
+              <w:rPr>
+                <w:rFonts w:ascii="Times New Roman" w:hAnsi="Times New Roman"/>
+                <w:sz w:val="17"/>
+              </w:rPr>
+              <w:t xml:space="preserve">0.03</w:t>
+            </w:r>
+          </w:p>
+        </w:tc>
+        <w:tc>
+          <w:tcPr/>
+          <w:p>
+            <w:pPr>
+              <w:pStyle w:val="Compact"/>
+              <w:spacing w:before="20" w:after="20" w:line="240" w:lineRule="auto"/>
+              <w:ind w:firstLine="0"/>
+              <w:jc w:val="left"/>
+            </w:pPr>
+            <w:r>
+              <w:rPr>
+                <w:rFonts w:ascii="Times New Roman" w:hAnsi="Times New Roman"/>
+                <w:sz w:val="17"/>
+              </w:rPr>
+              <w:t xml:space="preserve">0.43*</w:t>
+            </w:r>
+          </w:p>
+        </w:tc>
+      </w:tr>
+      <w:tr>
+        <w:tc>
+          <w:tcPr/>
+          <w:p>
+            <w:pPr>
+              <w:pStyle w:val="Compact"/>
+              <w:spacing w:before="20" w:after="20" w:line="240" w:lineRule="auto"/>
+              <w:ind w:firstLine="0"/>
+              <w:jc w:val="left"/>
+            </w:pPr>
+            <w:r>
+              <w:rPr>
+                <w:rFonts w:ascii="Times New Roman" w:hAnsi="Times New Roman"/>
+                <w:sz w:val="17"/>
+              </w:rPr>
+              <w:t xml:space="preserve">Llama-3.3-70B</w:t>
+            </w:r>
+          </w:p>
+        </w:tc>
+        <w:tc>
+          <w:tcPr/>
+          <w:p>
+            <w:pPr>
+              <w:pStyle w:val="Compact"/>
+              <w:spacing w:before="20" w:after="20" w:line="240" w:lineRule="auto"/>
+              <w:ind w:firstLine="0"/>
+              <w:jc w:val="left"/>
+            </w:pPr>
+            <w:r>
+              <w:rPr>
+                <w:rFonts w:ascii="Times New Roman" w:hAnsi="Times New Roman"/>
+                <w:sz w:val="17"/>
+              </w:rPr>
+              <w:t xml:space="preserve">plain</w:t>
+            </w:r>
+          </w:p>
+        </w:tc>
+        <w:tc>
+          <w:tcPr/>
+          <w:p>
+            <w:pPr>
+              <w:pStyle w:val="Compact"/>
+              <w:spacing w:before="20" w:after="20" w:line="240" w:lineRule="auto"/>
+              <w:ind w:firstLine="0"/>
+              <w:jc w:val="left"/>
+            </w:pPr>
+            <w:r>
+              <w:rPr>
+                <w:rFonts w:ascii="Times New Roman" w:hAnsi="Times New Roman"/>
+                <w:sz w:val="17"/>
+              </w:rPr>
+              <w:t xml:space="preserve">D Hybrid</w:t>
+            </w:r>
+          </w:p>
+        </w:tc>
+        <w:tc>
+          <w:tcPr/>
+          <w:p>
+            <w:pPr>
+              <w:pStyle w:val="Compact"/>
+              <w:spacing w:before="20" w:after="20" w:line="240" w:lineRule="auto"/>
+              <w:ind w:firstLine="0"/>
+              <w:jc w:val="left"/>
+            </w:pPr>
+            <w:r>
+              <w:rPr>
+                <w:rFonts w:ascii="Times New Roman" w:hAnsi="Times New Roman"/>
+                <w:sz w:val="17"/>
+              </w:rPr>
+              <w:t xml:space="preserve">4.73*</w:t>
+            </w:r>
+          </w:p>
+        </w:tc>
+        <w:tc>
+          <w:tcPr/>
+          <w:p>
+            <w:pPr>
+              <w:pStyle w:val="Compact"/>
+              <w:spacing w:before="20" w:after="20" w:line="240" w:lineRule="auto"/>
+              <w:ind w:firstLine="0"/>
+              <w:jc w:val="left"/>
+            </w:pPr>
+            <w:r>
+              <w:rPr>
+                <w:rFonts w:ascii="Times New Roman" w:hAnsi="Times New Roman"/>
+                <w:sz w:val="17"/>
+              </w:rPr>
+              <w:t xml:space="preserve">5.21</w:t>
+            </w:r>
+          </w:p>
+        </w:tc>
+        <w:tc>
+          <w:tcPr/>
+          <w:p>
+            <w:pPr>
+              <w:pStyle w:val="Compact"/>
+              <w:spacing w:before="20" w:after="20" w:line="240" w:lineRule="auto"/>
+              <w:ind w:firstLine="0"/>
+              <w:jc w:val="left"/>
+            </w:pPr>
+            <w:r>
+              <w:rPr>
+                <w:rFonts w:ascii="Times New Roman" w:hAnsi="Times New Roman"/>
+                <w:sz w:val="17"/>
+              </w:rPr>
+              <w:t xml:space="preserve">0.12*</w:t>
+            </w:r>
+          </w:p>
+        </w:tc>
+        <w:tc>
+          <w:tcPr/>
+          <w:p>
+            <w:pPr>
+              <w:pStyle w:val="Compact"/>
+              <w:spacing w:before="20" w:after="20" w:line="240" w:lineRule="auto"/>
+              <w:ind w:firstLine="0"/>
+              <w:jc w:val="left"/>
+            </w:pPr>
+            <w:r>
+              <w:rPr>
+                <w:rFonts w:ascii="Times New Roman" w:hAnsi="Times New Roman"/>
+                <w:sz w:val="17"/>
+              </w:rPr>
+              <w:t xml:space="preserve">0.89</w:t>
+            </w:r>
+          </w:p>
+        </w:tc>
+      </w:tr>
+      <w:tr>
+        <w:tc>
+          <w:tcPr/>
+          <w:p>
+            <w:pPr>
+              <w:pStyle w:val="Compact"/>
+              <w:spacing w:before="20" w:after="20" w:line="240" w:lineRule="auto"/>
+              <w:ind w:firstLine="0"/>
+              <w:jc w:val="left"/>
+            </w:pPr>
+            <w:r>
+              <w:rPr>
+                <w:rFonts w:ascii="Times New Roman" w:hAnsi="Times New Roman"/>
+                <w:sz w:val="17"/>
+              </w:rPr>
+              <w:t xml:space="preserve">Llama-3.3-70B</w:t>
+            </w:r>
+          </w:p>
+        </w:tc>
+        <w:tc>
+          <w:tcPr/>
+          <w:p>
+            <w:pPr>
+              <w:pStyle w:val="Compact"/>
+              <w:spacing w:before="20" w:after="20" w:line="240" w:lineRule="auto"/>
+              <w:ind w:firstLine="0"/>
+              <w:jc w:val="left"/>
+            </w:pPr>
+            <w:r>
+              <w:rPr>
+                <w:rFonts w:ascii="Times New Roman" w:hAnsi="Times New Roman"/>
+                <w:sz w:val="17"/>
+              </w:rPr>
+              <w:t xml:space="preserve">anchored</w:t>
+            </w:r>
+          </w:p>
+        </w:tc>
+        <w:tc>
+          <w:tcPr/>
+          <w:p>
+            <w:pPr>
+              <w:pStyle w:val="Compact"/>
+              <w:spacing w:before="20" w:after="20" w:line="240" w:lineRule="auto"/>
+              <w:ind w:firstLine="0"/>
+              <w:jc w:val="left"/>
+            </w:pPr>
+            <w:r>
+              <w:rPr>
+                <w:rFonts w:ascii="Times New Roman" w:hAnsi="Times New Roman"/>
+                <w:sz w:val="17"/>
+              </w:rPr>
+              <w:t xml:space="preserve">A Direct</w:t>
+            </w:r>
+          </w:p>
+        </w:tc>
+        <w:tc>
+          <w:tcPr/>
+          <w:p>
+            <w:pPr>
+              <w:pStyle w:val="Compact"/>
+              <w:spacing w:before="20" w:after="20" w:line="240" w:lineRule="auto"/>
+              <w:ind w:firstLine="0"/>
+              <w:jc w:val="left"/>
+            </w:pPr>
+            <w:r>
+              <w:rPr>
+                <w:rFonts w:ascii="Times New Roman" w:hAnsi="Times New Roman"/>
+                <w:sz w:val="17"/>
+              </w:rPr>
+              <w:t xml:space="preserve">6.09*</w:t>
+            </w:r>
+          </w:p>
+        </w:tc>
+        <w:tc>
+          <w:tcPr/>
+          <w:p>
+            <w:pPr>
+              <w:pStyle w:val="Compact"/>
+              <w:spacing w:before="20" w:after="20" w:line="240" w:lineRule="auto"/>
+              <w:ind w:firstLine="0"/>
+              <w:jc w:val="left"/>
+            </w:pPr>
+            <w:r>
+              <w:rPr>
+                <w:rFonts w:ascii="Times New Roman" w:hAnsi="Times New Roman"/>
+                <w:sz w:val="17"/>
+              </w:rPr>
+              <w:t xml:space="preserve">0.04*</w:t>
+            </w:r>
+          </w:p>
+        </w:tc>
+        <w:tc>
+          <w:tcPr/>
+          <w:p>
+            <w:pPr>
+              <w:pStyle w:val="Compact"/>
+              <w:spacing w:before="20" w:after="20" w:line="240" w:lineRule="auto"/>
+              <w:ind w:firstLine="0"/>
+              <w:jc w:val="left"/>
+            </w:pPr>
+            <w:r>
+              <w:rPr>
+                <w:rFonts w:ascii="Times New Roman" w:hAnsi="Times New Roman"/>
+                <w:sz w:val="17"/>
+              </w:rPr>
+              <w:t xml:space="preserve">0.00*</w:t>
+            </w:r>
+          </w:p>
+        </w:tc>
+        <w:tc>
+          <w:tcPr/>
+          <w:p>
+            <w:pPr>
+              <w:pStyle w:val="Compact"/>
+              <w:spacing w:before="20" w:after="20" w:line="240" w:lineRule="auto"/>
+              <w:ind w:firstLine="0"/>
+              <w:jc w:val="left"/>
+            </w:pPr>
+            <w:r>
+              <w:rPr>
+                <w:rFonts w:ascii="Times New Roman" w:hAnsi="Times New Roman"/>
+                <w:sz w:val="17"/>
+              </w:rPr>
+              <w:t xml:space="preserve">-0.16*</w:t>
+            </w:r>
+          </w:p>
+        </w:tc>
+      </w:tr>
+      <w:tr>
+        <w:tc>
+          <w:tcPr/>
+          <w:p>
+            <w:pPr>
+              <w:pStyle w:val="Compact"/>
+              <w:spacing w:before="20" w:after="20" w:line="240" w:lineRule="auto"/>
+              <w:ind w:firstLine="0"/>
+              <w:jc w:val="left"/>
+            </w:pPr>
+            <w:r>
+              <w:rPr>
+                <w:rFonts w:ascii="Times New Roman" w:hAnsi="Times New Roman"/>
+                <w:sz w:val="17"/>
+              </w:rPr>
+              <w:t xml:space="preserve">Llama-3.3-70B</w:t>
+            </w:r>
+          </w:p>
+        </w:tc>
+        <w:tc>
+          <w:tcPr/>
+          <w:p>
+            <w:pPr>
+              <w:pStyle w:val="Compact"/>
+              <w:spacing w:before="20" w:after="20" w:line="240" w:lineRule="auto"/>
+              <w:ind w:firstLine="0"/>
+              <w:jc w:val="left"/>
+            </w:pPr>
+            <w:r>
+              <w:rPr>
+                <w:rFonts w:ascii="Times New Roman" w:hAnsi="Times New Roman"/>
+                <w:sz w:val="17"/>
+              </w:rPr>
+              <w:t xml:space="preserve">anchored</w:t>
+            </w:r>
+          </w:p>
+        </w:tc>
+        <w:tc>
+          <w:tcPr/>
+          <w:p>
+            <w:pPr>
+              <w:pStyle w:val="Compact"/>
+              <w:spacing w:before="20" w:after="20" w:line="240" w:lineRule="auto"/>
+              <w:ind w:firstLine="0"/>
+              <w:jc w:val="left"/>
+            </w:pPr>
+            <w:r>
+              <w:rPr>
+                <w:rFonts w:ascii="Times New Roman" w:hAnsi="Times New Roman"/>
+                <w:sz w:val="17"/>
+              </w:rPr>
+              <w:t xml:space="preserve">B Daily</w:t>
+            </w:r>
+          </w:p>
+        </w:tc>
+        <w:tc>
+          <w:tcPr/>
+          <w:p>
+            <w:pPr>
+              <w:pStyle w:val="Compact"/>
+              <w:spacing w:before="20" w:after="20" w:line="240" w:lineRule="auto"/>
+              <w:ind w:firstLine="0"/>
+              <w:jc w:val="left"/>
+            </w:pPr>
+            <w:r>
+              <w:rPr>
+                <w:rFonts w:ascii="Times New Roman" w:hAnsi="Times New Roman"/>
+                <w:sz w:val="17"/>
+              </w:rPr>
+              <w:t xml:space="preserve">8.20*</w:t>
+            </w:r>
+          </w:p>
+        </w:tc>
+        <w:tc>
+          <w:tcPr/>
+          <w:p>
+            <w:pPr>
+              <w:pStyle w:val="Compact"/>
+              <w:spacing w:before="20" w:after="20" w:line="240" w:lineRule="auto"/>
+              <w:ind w:firstLine="0"/>
+              <w:jc w:val="left"/>
+            </w:pPr>
+            <w:r>
+              <w:rPr>
+                <w:rFonts w:ascii="Times New Roman" w:hAnsi="Times New Roman"/>
+                <w:sz w:val="17"/>
+              </w:rPr>
+              <w:t xml:space="preserve">0.15*</w:t>
+            </w:r>
+          </w:p>
+        </w:tc>
+        <w:tc>
+          <w:tcPr/>
+          <w:p>
+            <w:pPr>
+              <w:pStyle w:val="Compact"/>
+              <w:spacing w:before="20" w:after="20" w:line="240" w:lineRule="auto"/>
+              <w:ind w:firstLine="0"/>
+              <w:jc w:val="left"/>
+            </w:pPr>
+            <w:r>
+              <w:rPr>
+                <w:rFonts w:ascii="Times New Roman" w:hAnsi="Times New Roman"/>
+                <w:sz w:val="17"/>
+              </w:rPr>
+              <w:t xml:space="preserve">0.00*</w:t>
+            </w:r>
+          </w:p>
+        </w:tc>
+        <w:tc>
+          <w:tcPr/>
+          <w:p>
+            <w:pPr>
+              <w:pStyle w:val="Compact"/>
+              <w:spacing w:before="20" w:after="20" w:line="240" w:lineRule="auto"/>
+              <w:ind w:firstLine="0"/>
+              <w:jc w:val="left"/>
+            </w:pPr>
+            <w:r>
+              <w:rPr>
+                <w:rFonts w:ascii="Times New Roman" w:hAnsi="Times New Roman"/>
+                <w:sz w:val="17"/>
+              </w:rPr>
+              <w:t xml:space="preserve">-0.10*</w:t>
+            </w:r>
+          </w:p>
+        </w:tc>
+      </w:tr>
+      <w:tr>
+        <w:tc>
+          <w:tcPr/>
+          <w:p>
+            <w:pPr>
+              <w:pStyle w:val="Compact"/>
+              <w:spacing w:before="20" w:after="20" w:line="240" w:lineRule="auto"/>
+              <w:ind w:firstLine="0"/>
+              <w:jc w:val="left"/>
+            </w:pPr>
+            <w:r>
+              <w:rPr>
+                <w:rFonts w:ascii="Times New Roman" w:hAnsi="Times New Roman"/>
+                <w:sz w:val="17"/>
+              </w:rPr>
+              <w:t xml:space="preserve">Llama-3.3-70B</w:t>
+            </w:r>
+          </w:p>
+        </w:tc>
+        <w:tc>
+          <w:tcPr/>
+          <w:p>
+            <w:pPr>
+              <w:pStyle w:val="Compact"/>
+              <w:spacing w:before="20" w:after="20" w:line="240" w:lineRule="auto"/>
+              <w:ind w:firstLine="0"/>
+              <w:jc w:val="left"/>
+            </w:pPr>
+            <w:r>
+              <w:rPr>
+                <w:rFonts w:ascii="Times New Roman" w:hAnsi="Times New Roman"/>
+                <w:sz w:val="17"/>
+              </w:rPr>
+              <w:t xml:space="preserve">anchored</w:t>
+            </w:r>
+          </w:p>
+        </w:tc>
+        <w:tc>
+          <w:tcPr/>
+          <w:p>
+            <w:pPr>
+              <w:pStyle w:val="Compact"/>
+              <w:spacing w:before="20" w:after="20" w:line="240" w:lineRule="auto"/>
+              <w:ind w:firstLine="0"/>
+              <w:jc w:val="left"/>
+            </w:pPr>
+            <w:r>
+              <w:rPr>
+                <w:rFonts w:ascii="Times New Roman" w:hAnsi="Times New Roman"/>
+                <w:sz w:val="17"/>
+              </w:rPr>
+              <w:t xml:space="preserve">C Describe</w:t>
+            </w:r>
+          </w:p>
+        </w:tc>
+        <w:tc>
+          <w:tcPr/>
+          <w:p>
+            <w:pPr>
+              <w:pStyle w:val="Compact"/>
+              <w:spacing w:before="20" w:after="20" w:line="240" w:lineRule="auto"/>
+              <w:ind w:firstLine="0"/>
+              <w:jc w:val="left"/>
+            </w:pPr>
+            <w:r>
+              <w:rPr>
+                <w:rFonts w:ascii="Times New Roman" w:hAnsi="Times New Roman"/>
+                <w:sz w:val="17"/>
+              </w:rPr>
+              <w:t xml:space="preserve">6.82*</w:t>
+            </w:r>
+          </w:p>
+        </w:tc>
+        <w:tc>
+          <w:tcPr/>
+          <w:p>
+            <w:pPr>
+              <w:pStyle w:val="Compact"/>
+              <w:spacing w:before="20" w:after="20" w:line="240" w:lineRule="auto"/>
+              <w:ind w:firstLine="0"/>
+              <w:jc w:val="left"/>
+            </w:pPr>
+            <w:r>
+              <w:rPr>
+                <w:rFonts w:ascii="Times New Roman" w:hAnsi="Times New Roman"/>
+                <w:sz w:val="17"/>
+              </w:rPr>
+              <w:t xml:space="preserve">4.97*</w:t>
+            </w:r>
+          </w:p>
+        </w:tc>
+        <w:tc>
+          <w:tcPr/>
+          <w:p>
+            <w:pPr>
+              <w:pStyle w:val="Compact"/>
+              <w:spacing w:before="20" w:after="20" w:line="240" w:lineRule="auto"/>
+              <w:ind w:firstLine="0"/>
+              <w:jc w:val="left"/>
+            </w:pPr>
+            <w:r>
+              <w:rPr>
+                <w:rFonts w:ascii="Times New Roman" w:hAnsi="Times New Roman"/>
+                <w:sz w:val="17"/>
+              </w:rPr>
+              <w:t xml:space="preserve">0.04</w:t>
+            </w:r>
+          </w:p>
+        </w:tc>
+        <w:tc>
+          <w:tcPr/>
+          <w:p>
+            <w:pPr>
+              <w:pStyle w:val="Compact"/>
+              <w:spacing w:before="20" w:after="20" w:line="240" w:lineRule="auto"/>
+              <w:ind w:firstLine="0"/>
+              <w:jc w:val="left"/>
+            </w:pPr>
+            <w:r>
+              <w:rPr>
+                <w:rFonts w:ascii="Times New Roman" w:hAnsi="Times New Roman"/>
+                <w:sz w:val="17"/>
+              </w:rPr>
+              <w:t xml:space="preserve">0.58</w:t>
+            </w:r>
+          </w:p>
+        </w:tc>
+      </w:tr>
+      <w:tr>
+        <w:tc>
+          <w:tcPr/>
+          <w:p>
+            <w:pPr>
+              <w:pStyle w:val="Compact"/>
+              <w:spacing w:before="20" w:after="20" w:line="240" w:lineRule="auto"/>
+              <w:ind w:firstLine="0"/>
+              <w:jc w:val="left"/>
+            </w:pPr>
+            <w:r>
+              <w:rPr>
+                <w:rFonts w:ascii="Times New Roman" w:hAnsi="Times New Roman"/>
+                <w:sz w:val="17"/>
+              </w:rPr>
+              <w:t xml:space="preserve">Llama-3.3-70B</w:t>
+            </w:r>
+          </w:p>
+        </w:tc>
+        <w:tc>
+          <w:tcPr/>
+          <w:p>
+            <w:pPr>
+              <w:pStyle w:val="Compact"/>
+              <w:spacing w:before="20" w:after="20" w:line="240" w:lineRule="auto"/>
+              <w:ind w:firstLine="0"/>
+              <w:jc w:val="left"/>
+            </w:pPr>
+            <w:r>
+              <w:rPr>
+                <w:rFonts w:ascii="Times New Roman" w:hAnsi="Times New Roman"/>
+                <w:sz w:val="17"/>
+              </w:rPr>
+              <w:t xml:space="preserve">anchored</w:t>
+            </w:r>
+          </w:p>
+        </w:tc>
+        <w:tc>
+          <w:tcPr/>
+          <w:p>
+            <w:pPr>
+              <w:pStyle w:val="Compact"/>
+              <w:spacing w:before="20" w:after="20" w:line="240" w:lineRule="auto"/>
+              <w:ind w:firstLine="0"/>
+              <w:jc w:val="left"/>
+            </w:pPr>
+            <w:r>
+              <w:rPr>
+                <w:rFonts w:ascii="Times New Roman" w:hAnsi="Times New Roman"/>
+                <w:sz w:val="17"/>
+              </w:rPr>
+              <w:t xml:space="preserve">D Hybrid</w:t>
+            </w:r>
+          </w:p>
+        </w:tc>
+        <w:tc>
+          <w:tcPr/>
+          <w:p>
+            <w:pPr>
+              <w:pStyle w:val="Compact"/>
+              <w:spacing w:before="20" w:after="20" w:line="240" w:lineRule="auto"/>
+              <w:ind w:firstLine="0"/>
+              <w:jc w:val="left"/>
+            </w:pPr>
+            <w:r>
+              <w:rPr>
+                <w:rFonts w:ascii="Times New Roman" w:hAnsi="Times New Roman"/>
+                <w:sz w:val="17"/>
+              </w:rPr>
+              <w:t xml:space="preserve">6.08*</w:t>
+            </w:r>
+          </w:p>
+        </w:tc>
+        <w:tc>
+          <w:tcPr/>
+          <w:p>
+            <w:pPr>
+              <w:pStyle w:val="Compact"/>
+              <w:spacing w:before="20" w:after="20" w:line="240" w:lineRule="auto"/>
+              <w:ind w:firstLine="0"/>
+              <w:jc w:val="left"/>
+            </w:pPr>
+            <w:r>
+              <w:rPr>
+                <w:rFonts w:ascii="Times New Roman" w:hAnsi="Times New Roman"/>
+                <w:sz w:val="17"/>
+              </w:rPr>
+              <w:t xml:space="preserve">6.86</w:t>
+            </w:r>
+          </w:p>
+        </w:tc>
+        <w:tc>
+          <w:tcPr/>
+          <w:p>
+            <w:pPr>
+              <w:pStyle w:val="Compact"/>
+              <w:spacing w:before="20" w:after="20" w:line="240" w:lineRule="auto"/>
+              <w:ind w:firstLine="0"/>
+              <w:jc w:val="left"/>
+            </w:pPr>
+            <w:r>
+              <w:rPr>
+                <w:rFonts w:ascii="Times New Roman" w:hAnsi="Times New Roman"/>
+                <w:sz w:val="17"/>
+              </w:rPr>
+              <w:t xml:space="preserve">0.09*</w:t>
+            </w:r>
+          </w:p>
+        </w:tc>
+        <w:tc>
+          <w:tcPr/>
+          <w:p>
+            <w:pPr>
+              <w:pStyle w:val="Compact"/>
+              <w:spacing w:before="20" w:after="20" w:line="240" w:lineRule="auto"/>
+              <w:ind w:firstLine="0"/>
+              <w:jc w:val="left"/>
+            </w:pPr>
+            <w:r>
+              <w:rPr>
+                <w:rFonts w:ascii="Times New Roman" w:hAnsi="Times New Roman"/>
+                <w:sz w:val="17"/>
+              </w:rPr>
+              <w:t xml:space="preserve">0.96</w:t>
+            </w:r>
+          </w:p>
+        </w:tc>
+      </w:tr>
+      <w:tr>
+        <w:tc>
+          <w:tcPr/>
+          <w:p>
+            <w:pPr>
+              <w:pStyle w:val="Compact"/>
+              <w:spacing w:before="20" w:after="20" w:line="240" w:lineRule="auto"/>
+              <w:ind w:firstLine="0"/>
+              <w:jc w:val="left"/>
+            </w:pPr>
+            <w:r>
+              <w:rPr>
+                <w:rFonts w:ascii="Times New Roman" w:hAnsi="Times New Roman"/>
+                <w:sz w:val="17"/>
+              </w:rPr>
+              <w:t xml:space="preserve">Haiku 5.5</w:t>
+            </w:r>
+          </w:p>
+        </w:tc>
+        <w:tc>
+          <w:tcPr/>
+          <w:p>
+            <w:pPr>
+              <w:pStyle w:val="Compact"/>
+              <w:spacing w:before="20" w:after="20" w:line="240" w:lineRule="auto"/>
+              <w:ind w:firstLine="0"/>
+              <w:jc w:val="left"/>
+            </w:pPr>
+            <w:r>
+              <w:rPr>
+                <w:rFonts w:ascii="Times New Roman" w:hAnsi="Times New Roman"/>
+                <w:sz w:val="17"/>
+              </w:rPr>
+              <w:t xml:space="preserve">plain</w:t>
+            </w:r>
+          </w:p>
+        </w:tc>
+        <w:tc>
+          <w:tcPr/>
+          <w:p>
+            <w:pPr>
+              <w:pStyle w:val="Compact"/>
+              <w:spacing w:before="20" w:after="20" w:line="240" w:lineRule="auto"/>
+              <w:ind w:firstLine="0"/>
+              <w:jc w:val="left"/>
+            </w:pPr>
+            <w:r>
+              <w:rPr>
+                <w:rFonts w:ascii="Times New Roman" w:hAnsi="Times New Roman"/>
+                <w:sz w:val="17"/>
+              </w:rPr>
+              <w:t xml:space="preserve">A Direct</w:t>
+            </w:r>
+          </w:p>
+        </w:tc>
+        <w:tc>
+          <w:tcPr/>
+          <w:p>
+            <w:pPr>
+              <w:pStyle w:val="Compact"/>
+              <w:spacing w:before="20" w:after="20" w:line="240" w:lineRule="auto"/>
+              <w:ind w:firstLine="0"/>
+              <w:jc w:val="left"/>
+            </w:pPr>
+            <w:r>
+              <w:rPr>
+                <w:rFonts w:ascii="Times New Roman" w:hAnsi="Times New Roman"/>
+                <w:sz w:val="17"/>
+              </w:rPr>
+              <w:t xml:space="preserve">8.12*</w:t>
+            </w:r>
+          </w:p>
+        </w:tc>
+        <w:tc>
+          <w:tcPr/>
+          <w:p>
+            <w:pPr>
+              <w:pStyle w:val="Compact"/>
+              <w:spacing w:before="20" w:after="20" w:line="240" w:lineRule="auto"/>
+              <w:ind w:firstLine="0"/>
+              <w:jc w:val="left"/>
+            </w:pPr>
+            <w:r>
+              <w:rPr>
+                <w:rFonts w:ascii="Times New Roman" w:hAnsi="Times New Roman"/>
+                <w:sz w:val="17"/>
+              </w:rPr>
+              <w:t xml:space="preserve">0.39*</w:t>
+            </w:r>
+          </w:p>
+        </w:tc>
+        <w:tc>
+          <w:tcPr/>
+          <w:p>
+            <w:pPr>
+              <w:pStyle w:val="Compact"/>
+              <w:spacing w:before="20" w:after="20" w:line="240" w:lineRule="auto"/>
+              <w:ind w:firstLine="0"/>
+              <w:jc w:val="left"/>
+            </w:pPr>
+            <w:r>
+              <w:rPr>
+                <w:rFonts w:ascii="Times New Roman" w:hAnsi="Times New Roman"/>
+                <w:sz w:val="17"/>
+              </w:rPr>
+              <w:t xml:space="preserve">0.00*</w:t>
+            </w:r>
+          </w:p>
+        </w:tc>
+        <w:tc>
+          <w:tcPr/>
+          <w:p>
+            <w:pPr>
+              <w:pStyle w:val="Compact"/>
+              <w:spacing w:before="20" w:after="20" w:line="240" w:lineRule="auto"/>
+              <w:ind w:firstLine="0"/>
+              <w:jc w:val="left"/>
+            </w:pPr>
+            <w:r>
+              <w:rPr>
+                <w:rFonts w:ascii="Times New Roman" w:hAnsi="Times New Roman"/>
+                <w:sz w:val="17"/>
+              </w:rPr>
+              <w:t xml:space="preserve">-0.08*</w:t>
+            </w:r>
+          </w:p>
+        </w:tc>
+      </w:tr>
+      <w:tr>
+        <w:tc>
+          <w:tcPr/>
+          <w:p>
+            <w:pPr>
+              <w:pStyle w:val="Compact"/>
+              <w:spacing w:before="20" w:after="20" w:line="240" w:lineRule="auto"/>
+              <w:ind w:firstLine="0"/>
+              <w:jc w:val="left"/>
+            </w:pPr>
+            <w:r>
+              <w:rPr>
+                <w:rFonts w:ascii="Times New Roman" w:hAnsi="Times New Roman"/>
+                <w:sz w:val="17"/>
+              </w:rPr>
+              <w:t xml:space="preserve">Haiku 5.5</w:t>
+            </w:r>
+          </w:p>
+        </w:tc>
+        <w:tc>
+          <w:tcPr/>
+          <w:p>
+            <w:pPr>
+              <w:pStyle w:val="Compact"/>
+              <w:spacing w:before="20" w:after="20" w:line="240" w:lineRule="auto"/>
+              <w:ind w:firstLine="0"/>
+              <w:jc w:val="left"/>
+            </w:pPr>
+            <w:r>
+              <w:rPr>
+                <w:rFonts w:ascii="Times New Roman" w:hAnsi="Times New Roman"/>
+                <w:sz w:val="17"/>
+              </w:rPr>
+              <w:t xml:space="preserve">plain</w:t>
+            </w:r>
+          </w:p>
+        </w:tc>
+        <w:tc>
+          <w:tcPr/>
+          <w:p>
+            <w:pPr>
+              <w:pStyle w:val="Compact"/>
+              <w:spacing w:before="20" w:after="20" w:line="240" w:lineRule="auto"/>
+              <w:ind w:firstLine="0"/>
+              <w:jc w:val="left"/>
+            </w:pPr>
+            <w:r>
+              <w:rPr>
+                <w:rFonts w:ascii="Times New Roman" w:hAnsi="Times New Roman"/>
+                <w:sz w:val="17"/>
+              </w:rPr>
+              <w:t xml:space="preserve">B Daily</w:t>
+            </w:r>
+          </w:p>
+        </w:tc>
+        <w:tc>
+          <w:tcPr/>
+          <w:p>
+            <w:pPr>
+              <w:pStyle w:val="Compact"/>
+              <w:spacing w:before="20" w:after="20" w:line="240" w:lineRule="auto"/>
+              <w:ind w:firstLine="0"/>
+              <w:jc w:val="left"/>
+            </w:pPr>
+            <w:r>
+              <w:rPr>
+                <w:rFonts w:ascii="Times New Roman" w:hAnsi="Times New Roman"/>
+                <w:sz w:val="17"/>
+              </w:rPr>
+              <w:t xml:space="preserve">11.84*</w:t>
+            </w:r>
+          </w:p>
+        </w:tc>
+        <w:tc>
+          <w:tcPr/>
+          <w:p>
+            <w:pPr>
+              <w:pStyle w:val="Compact"/>
+              <w:spacing w:before="20" w:after="20" w:line="240" w:lineRule="auto"/>
+              <w:ind w:firstLine="0"/>
+              <w:jc w:val="left"/>
+            </w:pPr>
+            <w:r>
+              <w:rPr>
+                <w:rFonts w:ascii="Times New Roman" w:hAnsi="Times New Roman"/>
+                <w:sz w:val="17"/>
+              </w:rPr>
+              <w:t xml:space="preserve">0.17*</w:t>
+            </w:r>
+          </w:p>
+        </w:tc>
+        <w:tc>
+          <w:tcPr/>
+          <w:p>
+            <w:pPr>
+              <w:pStyle w:val="Compact"/>
+              <w:spacing w:before="20" w:after="20" w:line="240" w:lineRule="auto"/>
+              <w:ind w:firstLine="0"/>
+              <w:jc w:val="left"/>
+            </w:pPr>
+            <w:r>
+              <w:rPr>
+                <w:rFonts w:ascii="Times New Roman" w:hAnsi="Times New Roman"/>
+                <w:sz w:val="17"/>
+              </w:rPr>
+              <w:t xml:space="preserve">0.00*</w:t>
+            </w:r>
+          </w:p>
+        </w:tc>
+        <w:tc>
+          <w:tcPr/>
+          <w:p>
+            <w:pPr>
+              <w:pStyle w:val="Compact"/>
+              <w:spacing w:before="20" w:after="20" w:line="240" w:lineRule="auto"/>
+              <w:ind w:firstLine="0"/>
+              <w:jc w:val="left"/>
+            </w:pPr>
+            <w:r>
+              <w:rPr>
+                <w:rFonts w:ascii="Times New Roman" w:hAnsi="Times New Roman"/>
+                <w:sz w:val="17"/>
+              </w:rPr>
+              <w:t xml:space="preserve">-0.07*</w:t>
+            </w:r>
+          </w:p>
+        </w:tc>
+      </w:tr>
+      <w:tr>
+        <w:tc>
+          <w:tcPr/>
+          <w:p>
+            <w:pPr>
+              <w:pStyle w:val="Compact"/>
+              <w:spacing w:before="20" w:after="20" w:line="240" w:lineRule="auto"/>
+              <w:ind w:firstLine="0"/>
+              <w:jc w:val="left"/>
+            </w:pPr>
+            <w:r>
+              <w:rPr>
+                <w:rFonts w:ascii="Times New Roman" w:hAnsi="Times New Roman"/>
+                <w:sz w:val="17"/>
+              </w:rPr>
+              <w:t xml:space="preserve">Haiku 5.5</w:t>
+            </w:r>
+          </w:p>
+        </w:tc>
+        <w:tc>
+          <w:tcPr/>
+          <w:p>
+            <w:pPr>
+              <w:pStyle w:val="Compact"/>
+              <w:spacing w:before="20" w:after="20" w:line="240" w:lineRule="auto"/>
+              <w:ind w:firstLine="0"/>
+              <w:jc w:val="left"/>
+            </w:pPr>
+            <w:r>
+              <w:rPr>
+                <w:rFonts w:ascii="Times New Roman" w:hAnsi="Times New Roman"/>
+                <w:sz w:val="17"/>
+              </w:rPr>
+              <w:t xml:space="preserve">plain</w:t>
+            </w:r>
+          </w:p>
+        </w:tc>
+        <w:tc>
+          <w:tcPr/>
+          <w:p>
+            <w:pPr>
+              <w:pStyle w:val="Compact"/>
+              <w:spacing w:before="20" w:after="20" w:line="240" w:lineRule="auto"/>
+              <w:ind w:firstLine="0"/>
+              <w:jc w:val="left"/>
+            </w:pPr>
+            <w:r>
+              <w:rPr>
+                <w:rFonts w:ascii="Times New Roman" w:hAnsi="Times New Roman"/>
+                <w:sz w:val="17"/>
+              </w:rPr>
+              <w:t xml:space="preserve">C Describe</w:t>
+            </w:r>
+          </w:p>
+        </w:tc>
+        <w:tc>
+          <w:tcPr/>
+          <w:p>
+            <w:pPr>
+              <w:pStyle w:val="Compact"/>
+              <w:spacing w:before="20" w:after="20" w:line="240" w:lineRule="auto"/>
+              <w:ind w:firstLine="0"/>
+              <w:jc w:val="left"/>
+            </w:pPr>
+            <w:r>
+              <w:rPr>
+                <w:rFonts w:ascii="Times New Roman" w:hAnsi="Times New Roman"/>
+                <w:sz w:val="17"/>
+              </w:rPr>
+              <w:t xml:space="preserve">6.22*</w:t>
+            </w:r>
+          </w:p>
+        </w:tc>
+        <w:tc>
+          <w:tcPr/>
+          <w:p>
+            <w:pPr>
+              <w:pStyle w:val="Compact"/>
+              <w:spacing w:before="20" w:after="20" w:line="240" w:lineRule="auto"/>
+              <w:ind w:firstLine="0"/>
+              <w:jc w:val="left"/>
+            </w:pPr>
+            <w:r>
+              <w:rPr>
+                <w:rFonts w:ascii="Times New Roman" w:hAnsi="Times New Roman"/>
+                <w:sz w:val="17"/>
+              </w:rPr>
+              <w:t xml:space="preserve">3.80*</w:t>
+            </w:r>
+          </w:p>
+        </w:tc>
+        <w:tc>
+          <w:tcPr/>
+          <w:p>
+            <w:pPr>
+              <w:pStyle w:val="Compact"/>
+              <w:spacing w:before="20" w:after="20" w:line="240" w:lineRule="auto"/>
+              <w:ind w:firstLine="0"/>
+              <w:jc w:val="left"/>
+            </w:pPr>
+            <w:r>
+              <w:rPr>
+                <w:rFonts w:ascii="Times New Roman" w:hAnsi="Times New Roman"/>
+                <w:sz w:val="17"/>
+              </w:rPr>
+              <w:t xml:space="preserve">0.03</w:t>
+            </w:r>
+          </w:p>
+        </w:tc>
+        <w:tc>
+          <w:tcPr/>
+          <w:p>
+            <w:pPr>
+              <w:pStyle w:val="Compact"/>
+              <w:spacing w:before="20" w:after="20" w:line="240" w:lineRule="auto"/>
+              <w:ind w:firstLine="0"/>
+              <w:jc w:val="left"/>
+            </w:pPr>
+            <w:r>
+              <w:rPr>
+                <w:rFonts w:ascii="Times New Roman" w:hAnsi="Times New Roman"/>
+                <w:sz w:val="17"/>
+              </w:rPr>
+              <w:t xml:space="preserve">0.45*</w:t>
+            </w:r>
+          </w:p>
+        </w:tc>
+      </w:tr>
+      <w:tr>
+        <w:tc>
+          <w:tcPr/>
+          <w:p>
+            <w:pPr>
+              <w:pStyle w:val="Compact"/>
+              <w:spacing w:before="20" w:after="20" w:line="240" w:lineRule="auto"/>
+              <w:ind w:firstLine="0"/>
+              <w:jc w:val="left"/>
+            </w:pPr>
+            <w:r>
+              <w:rPr>
+                <w:rFonts w:ascii="Times New Roman" w:hAnsi="Times New Roman"/>
+                <w:sz w:val="17"/>
+              </w:rPr>
+              <w:t xml:space="preserve">Haiku 5.5</w:t>
+            </w:r>
+          </w:p>
+        </w:tc>
+        <w:tc>
+          <w:tcPr/>
+          <w:p>
+            <w:pPr>
+              <w:pStyle w:val="Compact"/>
+              <w:spacing w:before="20" w:after="20" w:line="240" w:lineRule="auto"/>
+              <w:ind w:firstLine="0"/>
+              <w:jc w:val="left"/>
+            </w:pPr>
+            <w:r>
+              <w:rPr>
+                <w:rFonts w:ascii="Times New Roman" w:hAnsi="Times New Roman"/>
+                <w:sz w:val="17"/>
+              </w:rPr>
+              <w:t xml:space="preserve">plain</w:t>
+            </w:r>
+          </w:p>
+        </w:tc>
+        <w:tc>
+          <w:tcPr/>
+          <w:p>
+            <w:pPr>
+              <w:pStyle w:val="Compact"/>
+              <w:spacing w:before="20" w:after="20" w:line="240" w:lineRule="auto"/>
+              <w:ind w:firstLine="0"/>
+              <w:jc w:val="left"/>
+            </w:pPr>
+            <w:r>
+              <w:rPr>
+                <w:rFonts w:ascii="Times New Roman" w:hAnsi="Times New Roman"/>
+                <w:sz w:val="17"/>
+              </w:rPr>
+              <w:t xml:space="preserve">D Hybrid</w:t>
+            </w:r>
+          </w:p>
+        </w:tc>
+        <w:tc>
+          <w:tcPr/>
+          <w:p>
+            <w:pPr>
+              <w:pStyle w:val="Compact"/>
+              <w:spacing w:before="20" w:after="20" w:line="240" w:lineRule="auto"/>
+              <w:ind w:firstLine="0"/>
+              <w:jc w:val="left"/>
+            </w:pPr>
+            <w:r>
+              <w:rPr>
+                <w:rFonts w:ascii="Times New Roman" w:hAnsi="Times New Roman"/>
+                <w:sz w:val="17"/>
+              </w:rPr>
+              <w:t xml:space="preserve">5.03*</w:t>
+            </w:r>
+          </w:p>
+        </w:tc>
+        <w:tc>
+          <w:tcPr/>
+          <w:p>
+            <w:pPr>
+              <w:pStyle w:val="Compact"/>
+              <w:spacing w:before="20" w:after="20" w:line="240" w:lineRule="auto"/>
+              <w:ind w:firstLine="0"/>
+              <w:jc w:val="left"/>
+            </w:pPr>
+            <w:r>
+              <w:rPr>
+                <w:rFonts w:ascii="Times New Roman" w:hAnsi="Times New Roman"/>
+                <w:sz w:val="17"/>
+              </w:rPr>
+              <w:t xml:space="preserve">6.06</w:t>
+            </w:r>
+          </w:p>
+        </w:tc>
+        <w:tc>
+          <w:tcPr/>
+          <w:p>
+            <w:pPr>
+              <w:pStyle w:val="Compact"/>
+              <w:spacing w:before="20" w:after="20" w:line="240" w:lineRule="auto"/>
+              <w:ind w:firstLine="0"/>
+              <w:jc w:val="left"/>
+            </w:pPr>
+            <w:r>
+              <w:rPr>
+                <w:rFonts w:ascii="Times New Roman" w:hAnsi="Times New Roman"/>
+                <w:sz w:val="17"/>
+              </w:rPr>
+              <w:t xml:space="preserve">0.12*</w:t>
+            </w:r>
+          </w:p>
+        </w:tc>
+        <w:tc>
+          <w:tcPr/>
+          <w:p>
+            <w:pPr>
+              <w:pStyle w:val="Compact"/>
+              <w:spacing w:before="20" w:after="20" w:line="240" w:lineRule="auto"/>
+              <w:ind w:firstLine="0"/>
+              <w:jc w:val="left"/>
+            </w:pPr>
+            <w:r>
+              <w:rPr>
+                <w:rFonts w:ascii="Times New Roman" w:hAnsi="Times New Roman"/>
+                <w:sz w:val="17"/>
+              </w:rPr>
+              <w:t xml:space="preserve">1.01</w:t>
+            </w:r>
+          </w:p>
+        </w:tc>
+      </w:tr>
+      <w:tr>
+        <w:tc>
+          <w:tcPr/>
+          <w:p>
+            <w:pPr>
+              <w:pStyle w:val="Compact"/>
+              <w:spacing w:before="20" w:after="20" w:line="240" w:lineRule="auto"/>
+              <w:ind w:firstLine="0"/>
+              <w:jc w:val="left"/>
+            </w:pPr>
+            <w:r>
+              <w:rPr>
+                <w:rFonts w:ascii="Times New Roman" w:hAnsi="Times New Roman"/>
+                <w:sz w:val="17"/>
+              </w:rPr>
+              <w:t xml:space="preserve">Haiku 5.5</w:t>
+            </w:r>
+          </w:p>
+        </w:tc>
+        <w:tc>
+          <w:tcPr/>
+          <w:p>
+            <w:pPr>
+              <w:pStyle w:val="Compact"/>
+              <w:spacing w:before="20" w:after="20" w:line="240" w:lineRule="auto"/>
+              <w:ind w:firstLine="0"/>
+              <w:jc w:val="left"/>
+            </w:pPr>
+            <w:r>
+              <w:rPr>
+                <w:rFonts w:ascii="Times New Roman" w:hAnsi="Times New Roman"/>
+                <w:sz w:val="17"/>
+              </w:rPr>
+              <w:t xml:space="preserve">anchored</w:t>
+            </w:r>
+          </w:p>
+        </w:tc>
+        <w:tc>
+          <w:tcPr/>
+          <w:p>
+            <w:pPr>
+              <w:pStyle w:val="Compact"/>
+              <w:spacing w:before="20" w:after="20" w:line="240" w:lineRule="auto"/>
+              <w:ind w:firstLine="0"/>
+              <w:jc w:val="left"/>
+            </w:pPr>
+            <w:r>
+              <w:rPr>
+                <w:rFonts w:ascii="Times New Roman" w:hAnsi="Times New Roman"/>
+                <w:sz w:val="17"/>
+              </w:rPr>
+              <w:t xml:space="preserve">A Direct</w:t>
+            </w:r>
+          </w:p>
+        </w:tc>
+        <w:tc>
+          <w:tcPr/>
+          <w:p>
+            <w:pPr>
+              <w:pStyle w:val="Compact"/>
+              <w:spacing w:before="20" w:after="20" w:line="240" w:lineRule="auto"/>
+              <w:ind w:firstLine="0"/>
+              <w:jc w:val="left"/>
+            </w:pPr>
+            <w:r>
+              <w:rPr>
+                <w:rFonts w:ascii="Times New Roman" w:hAnsi="Times New Roman"/>
+                <w:sz w:val="17"/>
+              </w:rPr>
+              <w:t xml:space="preserve">7.22*</w:t>
+            </w:r>
+          </w:p>
+        </w:tc>
+        <w:tc>
+          <w:tcPr/>
+          <w:p>
+            <w:pPr>
+              <w:pStyle w:val="Compact"/>
+              <w:spacing w:before="20" w:after="20" w:line="240" w:lineRule="auto"/>
+              <w:ind w:firstLine="0"/>
+              <w:jc w:val="left"/>
+            </w:pPr>
+            <w:r>
+              <w:rPr>
+                <w:rFonts w:ascii="Times New Roman" w:hAnsi="Times New Roman"/>
+                <w:sz w:val="17"/>
+              </w:rPr>
+              <w:t xml:space="preserve">0.11*</w:t>
+            </w:r>
+          </w:p>
+        </w:tc>
+        <w:tc>
+          <w:tcPr/>
+          <w:p>
+            <w:pPr>
+              <w:pStyle w:val="Compact"/>
+              <w:spacing w:before="20" w:after="20" w:line="240" w:lineRule="auto"/>
+              <w:ind w:firstLine="0"/>
+              <w:jc w:val="left"/>
+            </w:pPr>
+            <w:r>
+              <w:rPr>
+                <w:rFonts w:ascii="Times New Roman" w:hAnsi="Times New Roman"/>
+                <w:sz w:val="17"/>
+              </w:rPr>
+              <w:t xml:space="preserve">0.00*</w:t>
+            </w:r>
+          </w:p>
+        </w:tc>
+        <w:tc>
+          <w:tcPr/>
+          <w:p>
+            <w:pPr>
+              <w:pStyle w:val="Compact"/>
+              <w:spacing w:before="20" w:after="20" w:line="240" w:lineRule="auto"/>
+              <w:ind w:firstLine="0"/>
+              <w:jc w:val="left"/>
+            </w:pPr>
+            <w:r>
+              <w:rPr>
+                <w:rFonts w:ascii="Times New Roman" w:hAnsi="Times New Roman"/>
+                <w:sz w:val="17"/>
+              </w:rPr>
+              <w:t xml:space="preserve">-0.12*</w:t>
+            </w:r>
+          </w:p>
+        </w:tc>
+      </w:tr>
+      <w:tr>
+        <w:tc>
+          <w:tcPr/>
+          <w:p>
+            <w:pPr>
+              <w:pStyle w:val="Compact"/>
+              <w:spacing w:before="20" w:after="20" w:line="240" w:lineRule="auto"/>
+              <w:ind w:firstLine="0"/>
+              <w:jc w:val="left"/>
+            </w:pPr>
+            <w:r>
+              <w:rPr>
+                <w:rFonts w:ascii="Times New Roman" w:hAnsi="Times New Roman"/>
+                <w:sz w:val="17"/>
+              </w:rPr>
+              <w:t xml:space="preserve">Haiku 5.5</w:t>
+            </w:r>
+          </w:p>
+        </w:tc>
+        <w:tc>
+          <w:tcPr/>
+          <w:p>
+            <w:pPr>
+              <w:pStyle w:val="Compact"/>
+              <w:spacing w:before="20" w:after="20" w:line="240" w:lineRule="auto"/>
+              <w:ind w:firstLine="0"/>
+              <w:jc w:val="left"/>
+            </w:pPr>
+            <w:r>
+              <w:rPr>
+                <w:rFonts w:ascii="Times New Roman" w:hAnsi="Times New Roman"/>
+                <w:sz w:val="17"/>
+              </w:rPr>
+              <w:t xml:space="preserve">anchored</w:t>
+            </w:r>
+          </w:p>
+        </w:tc>
+        <w:tc>
+          <w:tcPr/>
+          <w:p>
+            <w:pPr>
+              <w:pStyle w:val="Compact"/>
+              <w:spacing w:before="20" w:after="20" w:line="240" w:lineRule="auto"/>
+              <w:ind w:firstLine="0"/>
+              <w:jc w:val="left"/>
+            </w:pPr>
+            <w:r>
+              <w:rPr>
+                <w:rFonts w:ascii="Times New Roman" w:hAnsi="Times New Roman"/>
+                <w:sz w:val="17"/>
+              </w:rPr>
+              <w:t xml:space="preserve">B Daily</w:t>
+            </w:r>
+          </w:p>
+        </w:tc>
+        <w:tc>
+          <w:tcPr/>
+          <w:p>
+            <w:pPr>
+              <w:pStyle w:val="Compact"/>
+              <w:spacing w:before="20" w:after="20" w:line="240" w:lineRule="auto"/>
+              <w:ind w:firstLine="0"/>
+              <w:jc w:val="left"/>
+            </w:pPr>
+            <w:r>
+              <w:rPr>
+                <w:rFonts w:ascii="Times New Roman" w:hAnsi="Times New Roman"/>
+                <w:sz w:val="17"/>
+              </w:rPr>
+              <w:t xml:space="preserve">11.14*</w:t>
+            </w:r>
+          </w:p>
+        </w:tc>
+        <w:tc>
+          <w:tcPr/>
+          <w:p>
+            <w:pPr>
+              <w:pStyle w:val="Compact"/>
+              <w:spacing w:before="20" w:after="20" w:line="240" w:lineRule="auto"/>
+              <w:ind w:firstLine="0"/>
+              <w:jc w:val="left"/>
+            </w:pPr>
+            <w:r>
+              <w:rPr>
+                <w:rFonts w:ascii="Times New Roman" w:hAnsi="Times New Roman"/>
+                <w:sz w:val="17"/>
+              </w:rPr>
+              <w:t xml:space="preserve">0.14*</w:t>
+            </w:r>
+          </w:p>
+        </w:tc>
+        <w:tc>
+          <w:tcPr/>
+          <w:p>
+            <w:pPr>
+              <w:pStyle w:val="Compact"/>
+              <w:spacing w:before="20" w:after="20" w:line="240" w:lineRule="auto"/>
+              <w:ind w:firstLine="0"/>
+              <w:jc w:val="left"/>
+            </w:pPr>
+            <w:r>
+              <w:rPr>
+                <w:rFonts w:ascii="Times New Roman" w:hAnsi="Times New Roman"/>
+                <w:sz w:val="17"/>
+              </w:rPr>
+              <w:t xml:space="preserve">0.00*</w:t>
+            </w:r>
+          </w:p>
+        </w:tc>
+        <w:tc>
+          <w:tcPr/>
+          <w:p>
+            <w:pPr>
+              <w:pStyle w:val="Compact"/>
+              <w:spacing w:before="20" w:after="20" w:line="240" w:lineRule="auto"/>
+              <w:ind w:firstLine="0"/>
+              <w:jc w:val="left"/>
+            </w:pPr>
+            <w:r>
+              <w:rPr>
+                <w:rFonts w:ascii="Times New Roman" w:hAnsi="Times New Roman"/>
+                <w:sz w:val="17"/>
+              </w:rPr>
+              <w:t xml:space="preserve">-0.08*</w:t>
+            </w:r>
+          </w:p>
+        </w:tc>
+      </w:tr>
+      <w:tr>
+        <w:tc>
+          <w:tcPr/>
+          <w:p>
+            <w:pPr>
+              <w:pStyle w:val="Compact"/>
+              <w:spacing w:before="20" w:after="20" w:line="240" w:lineRule="auto"/>
+              <w:ind w:firstLine="0"/>
+              <w:jc w:val="left"/>
+            </w:pPr>
+            <w:r>
+              <w:rPr>
+                <w:rFonts w:ascii="Times New Roman" w:hAnsi="Times New Roman"/>
+                <w:sz w:val="17"/>
+              </w:rPr>
+              <w:t xml:space="preserve">Haiku 5.5</w:t>
+            </w:r>
+          </w:p>
+        </w:tc>
+        <w:tc>
+          <w:tcPr/>
+          <w:p>
+            <w:pPr>
+              <w:pStyle w:val="Compact"/>
+              <w:spacing w:before="20" w:after="20" w:line="240" w:lineRule="auto"/>
+              <w:ind w:firstLine="0"/>
+              <w:jc w:val="left"/>
+            </w:pPr>
+            <w:r>
+              <w:rPr>
+                <w:rFonts w:ascii="Times New Roman" w:hAnsi="Times New Roman"/>
+                <w:sz w:val="17"/>
+              </w:rPr>
+              <w:t xml:space="preserve">anchored</w:t>
+            </w:r>
+          </w:p>
+        </w:tc>
+        <w:tc>
+          <w:tcPr/>
+          <w:p>
+            <w:pPr>
+              <w:pStyle w:val="Compact"/>
+              <w:spacing w:before="20" w:after="20" w:line="240" w:lineRule="auto"/>
+              <w:ind w:firstLine="0"/>
+              <w:jc w:val="left"/>
+            </w:pPr>
+            <w:r>
+              <w:rPr>
+                <w:rFonts w:ascii="Times New Roman" w:hAnsi="Times New Roman"/>
+                <w:sz w:val="17"/>
+              </w:rPr>
+              <w:t xml:space="preserve">C Describe</w:t>
+            </w:r>
+          </w:p>
+        </w:tc>
+        <w:tc>
+          <w:tcPr/>
+          <w:p>
+            <w:pPr>
+              <w:pStyle w:val="Compact"/>
+              <w:spacing w:before="20" w:after="20" w:line="240" w:lineRule="auto"/>
+              <w:ind w:firstLine="0"/>
+              <w:jc w:val="left"/>
+            </w:pPr>
+            <w:r>
+              <w:rPr>
+                <w:rFonts w:ascii="Times New Roman" w:hAnsi="Times New Roman"/>
+                <w:sz w:val="17"/>
+              </w:rPr>
+              <w:t xml:space="preserve">6.92*</w:t>
+            </w:r>
+          </w:p>
+        </w:tc>
+        <w:tc>
+          <w:tcPr/>
+          <w:p>
+            <w:pPr>
+              <w:pStyle w:val="Compact"/>
+              <w:spacing w:before="20" w:after="20" w:line="240" w:lineRule="auto"/>
+              <w:ind w:firstLine="0"/>
+              <w:jc w:val="left"/>
+            </w:pPr>
+            <w:r>
+              <w:rPr>
+                <w:rFonts w:ascii="Times New Roman" w:hAnsi="Times New Roman"/>
+                <w:sz w:val="17"/>
+              </w:rPr>
+              <w:t xml:space="preserve">5.05*</w:t>
+            </w:r>
+          </w:p>
+        </w:tc>
+        <w:tc>
+          <w:tcPr/>
+          <w:p>
+            <w:pPr>
+              <w:pStyle w:val="Compact"/>
+              <w:spacing w:before="20" w:after="20" w:line="240" w:lineRule="auto"/>
+              <w:ind w:firstLine="0"/>
+              <w:jc w:val="left"/>
+            </w:pPr>
+            <w:r>
+              <w:rPr>
+                <w:rFonts w:ascii="Times New Roman" w:hAnsi="Times New Roman"/>
+                <w:sz w:val="17"/>
+              </w:rPr>
+              <w:t xml:space="preserve">0.07*</w:t>
+            </w:r>
+          </w:p>
+        </w:tc>
+        <w:tc>
+          <w:tcPr/>
+          <w:p>
+            <w:pPr>
+              <w:pStyle w:val="Compact"/>
+              <w:spacing w:before="20" w:after="20" w:line="240" w:lineRule="auto"/>
+              <w:ind w:firstLine="0"/>
+              <w:jc w:val="left"/>
+            </w:pPr>
+            <w:r>
+              <w:rPr>
+                <w:rFonts w:ascii="Times New Roman" w:hAnsi="Times New Roman"/>
+                <w:sz w:val="17"/>
+              </w:rPr>
+              <w:t xml:space="preserve">0.58</w:t>
+            </w:r>
+          </w:p>
+        </w:tc>
+      </w:tr>
+      <w:tr>
+        <w:tc>
+          <w:tcPr/>
+          <w:p>
+            <w:pPr>
+              <w:pStyle w:val="Compact"/>
+              <w:spacing w:before="20" w:after="20" w:line="240" w:lineRule="auto"/>
+              <w:ind w:firstLine="0"/>
+              <w:jc w:val="left"/>
+            </w:pPr>
+            <w:r>
+              <w:rPr>
+                <w:rFonts w:ascii="Times New Roman" w:hAnsi="Times New Roman"/>
+                <w:sz w:val="17"/>
+              </w:rPr>
+              <w:t xml:space="preserve">Haiku 5.5</w:t>
+            </w:r>
+          </w:p>
+        </w:tc>
+        <w:tc>
+          <w:tcPr/>
+          <w:p>
+            <w:pPr>
+              <w:pStyle w:val="Compact"/>
+              <w:spacing w:before="20" w:after="20" w:line="240" w:lineRule="auto"/>
+              <w:ind w:firstLine="0"/>
+              <w:jc w:val="left"/>
+            </w:pPr>
+            <w:r>
+              <w:rPr>
+                <w:rFonts w:ascii="Times New Roman" w:hAnsi="Times New Roman"/>
+                <w:sz w:val="17"/>
+              </w:rPr>
+              <w:t xml:space="preserve">anchored</w:t>
+            </w:r>
+          </w:p>
+        </w:tc>
+        <w:tc>
+          <w:tcPr/>
+          <w:p>
+            <w:pPr>
+              <w:pStyle w:val="Compact"/>
+              <w:spacing w:before="20" w:after="20" w:line="240" w:lineRule="auto"/>
+              <w:ind w:firstLine="0"/>
+              <w:jc w:val="left"/>
+            </w:pPr>
+            <w:r>
+              <w:rPr>
+                <w:rFonts w:ascii="Times New Roman" w:hAnsi="Times New Roman"/>
+                <w:sz w:val="17"/>
+              </w:rPr>
+              <w:t xml:space="preserve">D Hybrid</w:t>
+            </w:r>
+          </w:p>
+        </w:tc>
+        <w:tc>
+          <w:tcPr/>
+          <w:p>
+            <w:pPr>
+              <w:pStyle w:val="Compact"/>
+              <w:spacing w:before="20" w:after="20" w:line="240" w:lineRule="auto"/>
+              <w:ind w:firstLine="0"/>
+              <w:jc w:val="left"/>
+            </w:pPr>
+            <w:r>
+              <w:rPr>
+                <w:rFonts w:ascii="Times New Roman" w:hAnsi="Times New Roman"/>
+                <w:sz w:val="17"/>
+              </w:rPr>
+              <w:t xml:space="preserve">5.47*</w:t>
+            </w:r>
+          </w:p>
+        </w:tc>
+        <w:tc>
+          <w:tcPr/>
+          <w:p>
+            <w:pPr>
+              <w:pStyle w:val="Compact"/>
+              <w:spacing w:before="20" w:after="20" w:line="240" w:lineRule="auto"/>
+              <w:ind w:firstLine="0"/>
+              <w:jc w:val="left"/>
+            </w:pPr>
+            <w:r>
+              <w:rPr>
+                <w:rFonts w:ascii="Times New Roman" w:hAnsi="Times New Roman"/>
+                <w:sz w:val="17"/>
+              </w:rPr>
+              <w:t xml:space="preserve">7.26</w:t>
+            </w:r>
+          </w:p>
+        </w:tc>
+        <w:tc>
+          <w:tcPr/>
+          <w:p>
+            <w:pPr>
+              <w:pStyle w:val="Compact"/>
+              <w:spacing w:before="20" w:after="20" w:line="240" w:lineRule="auto"/>
+              <w:ind w:firstLine="0"/>
+              <w:jc w:val="left"/>
+            </w:pPr>
+            <w:r>
+              <w:rPr>
+                <w:rFonts w:ascii="Times New Roman" w:hAnsi="Times New Roman"/>
+                <w:sz w:val="17"/>
+              </w:rPr>
+              <w:t xml:space="preserve">0.11*</w:t>
+            </w:r>
+          </w:p>
+        </w:tc>
+        <w:tc>
+          <w:tcPr/>
+          <w:p>
+            <w:pPr>
+              <w:pStyle w:val="Compact"/>
+              <w:spacing w:before="20" w:after="20" w:line="240" w:lineRule="auto"/>
+              <w:ind w:firstLine="0"/>
+              <w:jc w:val="left"/>
+            </w:pPr>
+            <w:r>
+              <w:rPr>
+                <w:rFonts w:ascii="Times New Roman" w:hAnsi="Times New Roman"/>
+                <w:sz w:val="17"/>
+              </w:rPr>
+              <w:t xml:space="preserve">1.14</w:t>
+            </w:r>
+          </w:p>
+        </w:tc>
+      </w:tr>
+    </w:tbl>
+    <w:p>
+      <w:pPr>
+        <w:pStyle w:val="BodyText"/>
+        <w:spacing w:line="240" w:lineRule="auto"/>
+        <w:ind w:firstLine="0"/>
+      </w:pPr>
+      <w:r>
+        <w:rPr>
+          <w:iCs/>
+          <w:i/>
+        </w:rPr>
+        <w:t xml:space="preserve">Table B3. Persona experiment with real household demographics, 200 households per cell. Reference row: real distribution of the 801 households (10,413 household-windows). * the 95% bootstrap interval excludes the reference value.</w:t>
+      </w:r>
+    </w:p>
+    <w:bookmarkEnd w:id="59"/>
+    <w:bookmarkStart w:id="60" w:name="appendix-c.-reproducibility"/>
     <w:p>
       <w:pPr>
         <w:pStyle w:val="Heading1"/>
@@ -16259,7 +20742,7 @@
         <w:pStyle w:val="FirstParagraph"/>
       </w:pPr>
       <w:r>
-        <w:t xml:space="preserve">All code, the pilot grid runner, the analysis scripts, and the tables and figures used here are in the project repository (</w:t>
+        <w:t xml:space="preserve">All code, the pilot grid runner, the demographic-ceiling script, the analysis scripts, and the tables and figures used here are in the project repository (</w:t>
       </w:r>
       <w:r>
         <w:rPr>
@@ -16283,7 +20766,7 @@
         <w:t xml:space="preserve">). Raw model responses are saved with each run. Household-level Complete Journey data are not redistributed; the code reads them from the public package files.</w:t>
       </w:r>
     </w:p>
-    <w:bookmarkEnd w:id="59"/>
+    <w:bookmarkEnd w:id="60"/>
     <w:sectPr/>
   </w:body>
 </w:document>

</xml_diff>

<commit_message>
Manuscript: information-systems framing (IT artifact, task-technology fit), design principles, decision illustration
Co-Authored-By: Claude Sonnet 5.5 <noreply@anthropic.com>
Claude-Session: https://claude.ai/code/session_01VRbK37d38KZhVAbWS4xw4x
</commit_message>
<xml_diff>
--- a/llm-count-study/ISR_manuscript_draft.docx
+++ b/llm-count-study/ISR_manuscript_draft.docx
@@ -51,7 +51,7 @@
         <w:pStyle w:val="BodyText"/>
       </w:pPr>
       <w:r>
-        <w:t xml:space="preserve">Large language models (LLMs) are increasingly used to create synthetic customers for pre-testing marketing decisions, but evaluations have concentrated on ratings, choices, and stated willingness to pay. We study an output that customer analytics depends on more directly: the number of purchases a customer makes in a period. Building on the Poisson–gamma account of purchase counts, we show analytically that overdispersion measures unobserved customer heterogeneity, derive how much of it a persona-conditioned simulator can carry, and show how a hybrid design avoids double counting. We evaluate four elicitation designs across eight LLMs in public transaction settings (mean counts of about 0.5, 4.8, and 7.8) and in a randomized email experiment. Direct and day-by-day designs collapse toward a single value in nearly every model and setting, and larger, more recent models do not change this. Describing a distribution recovers part of the dispersion but under-produces zero counts where zeros are common. Personas built from real household demographics change nothing, because those demographics explain about 1% of the heterogeneity in counts. The hybrid matches dispersion only when the model’s mean is accurate. Promotion effects have the right sign in most settings, yet their size varies by an order of magnitude with model and prompt, and the absolute lift in purchase probability is overstated in 15 of 16 configurations (median about tenfold). We offer a diagnostic protocol for practitioners who consider synthetic customers for decision support.</w:t>
+        <w:t xml:space="preserve">Large language models (LLMs) are increasingly used to create synthetic customers for pre-testing marketing decisions, but evaluations have concentrated on ratings, choices, and stated willingness to pay. We study an output that customer analytics depends on more directly: the number of purchases a customer makes in a period. Building on the Poisson–gamma account of purchase counts, we show analytically that overdispersion measures unobserved customer heterogeneity, derive how much of it a persona-conditioned simulator can carry, and show how a hybrid design avoids double counting. We evaluate four elicitation designs across eight LLMs in public transaction settings (mean counts of about 0.5, 4.8, and 7.8) and in a randomized email experiment. Direct and day-by-day designs collapse toward a single value in nearly every model and setting, and larger, more recent models do not change this. Describing a distribution recovers part of the dispersion but under-produces zero counts where zeros are common. Personas built from real household demographics change nothing, because those demographics explain about 1% of the heterogeneity in counts. The hybrid matches dispersion only when the model’s mean is accurate. Promotion effects have the right sign in most settings, yet their size varies by an order of magnitude with model and prompt, and the absolute lift in purchase probability is overstated in 15 of 16 configurations (median about tenfold). Treating the simulator as a decision-support artifact, we derive design principles and an evaluation protocol, and we show that the overstated lifts would lead a firm to approve promotions that a randomized test rejects.</w:t>
       </w:r>
     </w:p>
     <w:p>
@@ -69,7 +69,7 @@
         <w:t xml:space="preserve"> </w:t>
       </w:r>
       <w:r>
-        <w:t xml:space="preserve">synthetic customers, large language models, purchase counts, overdispersion, customer heterogeneity, decision support, digital twins</w:t>
+        <w:t xml:space="preserve">synthetic customers, large language models, IT artifact, decision support systems, design science, purchase counts, overdispersion, customer heterogeneity, digital twins</w:t>
       </w:r>
     </w:p>
     <w:bookmarkStart w:id="20" w:name="introduction"/>
@@ -128,7 +128,7 @@
         <w:pStyle w:val="BodyText"/>
       </w:pPr>
       <w:r>
-        <w:t xml:space="preserve">We ask four questions. Does the per-period purchase-count distribution of synthetic customers match the real one in mean, dispersion, zero share, and tail (RQ1)? Does variance collapse appear in count data as underdispersion (RQ2)? Do the elicitation and sampling design change fidelity (RQ3)? And does the promotion effect estimated with synthetic customers agree with a randomized experiment in direction and size (RQ4)? To answer them we compare four elicitation designs, run with eight LLMs and two prompt variants, against public transaction data sets whose mean counts differ by a factor of ten or more, and we test the same models against a randomized email experiment.</w:t>
+        <w:t xml:space="preserve">The question is also one for information systems research. A synthetic-customer simulator is an IT artifact in the sense of a system that organizations design, deploy, and use to support decisions (Orlikowski and Iacono 2001, Hevner et al. 2004). Its value does not lie in the language model itself but in the decisions it supports, so the relevant test is task–technology fit (Goodhue and Thompson 1995): does the artifact reproduce the properties of customer behavior on which the decision depends? For promotion planning, those properties are the share of customers who do not buy, the weight of heavy buyers, and the absolute size of an effect. We therefore treat the elicitation design, meaning how the model is asked, how its answers become counts, and where heterogeneity comes from, as the artifact’s design variable, and ask which designs fit which decisions.</w:t>
       </w:r>
     </w:p>
     <w:p>
@@ -136,7 +136,7 @@
         <w:pStyle w:val="BodyText"/>
       </w:pPr>
       <w:r>
-        <w:t xml:space="preserve">The study makes four contributions. First, we give a short analytical account of how much heterogeneity a persona-conditioned simulator can carry, and of how an externally injected heterogeneity term must be calibrated to avoid double counting (Propositions 1 and 2). Second, we provide evidence across designs, models, and settings that direct and day-by-day designs collapse, that describing a distribution only partly repairs the problem, and that a hybrid design reproduces dispersion only when the model supplies an accurate mean. Third, in the experimental setting we show that relative and absolute effects can tell different stories when the simulated base rate is wrong, and that the absolute lift in purchase probability is overstated in 15 of the 16 configurations we tested. Fourth, we translate these findings into a diagnostic protocol for practitioners.</w:t>
+        <w:t xml:space="preserve">We ask four questions. Does the per-period purchase-count distribution of synthetic customers match the real one in mean, dispersion, zero share, and tail (RQ1)? Does variance collapse appear in count data as underdispersion (RQ2)? Do the elicitation and sampling design change fidelity (RQ3)? And does the promotion effect estimated with synthetic customers agree with a randomized experiment in direction and size (RQ4)? To answer them we compare four elicitation designs, run with eight LLMs and two prompt variants, against public transaction data sets whose mean counts differ by a factor of ten or more, and we test the same models against a randomized email experiment.</w:t>
       </w:r>
     </w:p>
     <w:p>
@@ -144,11 +144,19 @@
         <w:pStyle w:val="BodyText"/>
       </w:pPr>
       <w:r>
+        <w:t xml:space="preserve">The study makes four contributions. First, we give a short analytical account of how much heterogeneity a persona-conditioned simulator can carry, and of how an externally injected heterogeneity term must be calibrated to avoid double counting (Propositions 1 and 2). Second, we provide evidence across designs, models, and settings that direct and day-by-day designs collapse, that describing a distribution only partly repairs the problem, and that a hybrid design reproduces dispersion only when the model supplies an accurate mean. Third, in the experimental setting we show that relative and absolute effects can tell different stories when the simulated base rate is wrong, and that the absolute lift in purchase probability is overstated in 15 of the 16 configurations we tested. Fourth, we translate these findings into design principles for synthetic-customer systems and a diagnostic evaluation protocol, and we show in a stylized example how the overstated lifts would change a go/no-go decision.</w:t>
+      </w:r>
+    </w:p>
+    <w:p>
+      <w:pPr>
+        <w:pStyle w:val="BodyText"/>
+      </w:pPr>
+      <w:r>
         <w:t xml:space="preserve">The remainder of the paper is organized as follows. Section 2 reviews the literature and states the gap. Section 3 develops the framework and hypotheses. Section 4 describes the data, designs, and measures. Section 5 reports results, Section 6 discusses implications and limitations, and Section 7 concludes.</w:t>
       </w:r>
     </w:p>
     <w:bookmarkEnd w:id="20"/>
-    <w:bookmarkStart w:id="25" w:name="related-literature"/>
+    <w:bookmarkStart w:id="26" w:name="related-literature"/>
     <w:p>
       <w:pPr>
         <w:pStyle w:val="Heading1"/>
@@ -211,13 +219,13 @@
       </w:r>
     </w:p>
     <w:bookmarkEnd w:id="23"/>
-    <w:bookmarkStart w:id="24" w:name="research-gap"/>
+    <w:bookmarkStart w:id="24" w:name="X737c6f800fdfd3e733d717eecbdedd1fc69ef31"/>
     <w:p>
       <w:pPr>
         <w:pStyle w:val="Heading2"/>
       </w:pPr>
       <w:r>
-        <w:t xml:space="preserve">2.4 Research gap</w:t>
+        <w:t xml:space="preserve">2.4 Synthetic customers as decision-support artifacts</w:t>
       </w:r>
     </w:p>
     <w:p>
@@ -225,12 +233,48 @@
         <w:pStyle w:val="FirstParagraph"/>
       </w:pPr>
       <w:r>
-        <w:t xml:space="preserve">The studies closest to ours stop short of this question. Huang and Wang (2026) model aggregate demand as a mixture of persona-level purchase probabilities, but within a single period and without repeat counts. Sashihara et al. (2025) use the distribution of purchases per buyer as a validation metric for a simulated marketplace, without testing it against Poisson or negative binomial benchmarks. Chen (2026) compares LLM user simulators with verified payment outcomes and finds that they overstate purchase propensity among customers who ultimately do not buy, but the outcome there is a binary conversion rather than a count. Calibration frameworks such as SYN-DIGITS (Fan et al. 2026) align simulated responses with human ground truth at the individual and distributional level, yet, to our reading, they do not exploit the Poisson–gamma structure that governs count data. To our knowledge, and within the scope of our search, no prior study evaluates whether LLM-generated per-customer purchase counts reproduce the dispersion, zero proportion, and tail behavior of observed count data, or examines how the way heterogeneity is injected affects that fidelity.</w:t>
+        <w:t xml:space="preserve">Information systems research has long treated decision-support tools as artifacts whose worth must be shown by evaluation against the decisions they serve, not by internal consistency alone (Hevner et al. 2004, Gregor and Hevner 2013). Design science separates the design of an artifact, here the elicitation procedure, the persona schema, and the calibration step of a simulator, from its evaluation, here the comparison with observed behavior. Task–technology fit supplies the criterion: a technology improves performance when its capabilities match the demands of the task (Goodhue and Thompson 1995). Promotion pre-testing demands four capabilities of a simulated customer base: a plausible average, a plausible spread across customers, a plausible share of non-buyers, and a plausible absolute effect size. Existing evaluations of synthetic respondents mostly check the first and, through ratings, a crude version of the second. We therefore frame our four designs as alternative instantiations of one artifact class and our measures as the fit criteria that this task imposes. The artifact view also clarifies what is not at stake. The question is not whether language models</w:t>
+      </w:r>
+      <w:r>
+        <w:t xml:space="preserve"> </w:t>
+      </w:r>
+      <w:r>
+        <w:t xml:space="preserve">“</w:t>
+      </w:r>
+      <w:r>
+        <w:t xml:space="preserve">understand</w:t>
+      </w:r>
+      <w:r>
+        <w:t xml:space="preserve">”</w:t>
+      </w:r>
+      <w:r>
+        <w:t xml:space="preserve"> </w:t>
+      </w:r>
+      <w:r>
+        <w:t xml:space="preserve">customers, but whether a particular system built on them supports a particular decision (Orlikowski and Iacono 2001).</w:t>
       </w:r>
     </w:p>
     <w:bookmarkEnd w:id="24"/>
+    <w:bookmarkStart w:id="25" w:name="research-gap"/>
+    <w:p>
+      <w:pPr>
+        <w:pStyle w:val="Heading2"/>
+      </w:pPr>
+      <w:r>
+        <w:t xml:space="preserve">2.5 Research gap</w:t>
+      </w:r>
+    </w:p>
+    <w:p>
+      <w:pPr>
+        <w:pStyle w:val="FirstParagraph"/>
+      </w:pPr>
+      <w:r>
+        <w:t xml:space="preserve">The studies closest to ours stop short of this question. Huang and Wang (2026) model aggregate demand as a mixture of persona-level purchase probabilities, but within a single period and without repeat counts. Sashihara et al. (2025) use the distribution of purchases per buyer as a validation metric for a simulated marketplace, without testing it against Poisson or negative binomial benchmarks. Chen (2026) compares LLM user simulators with verified payment outcomes and finds that they overstate purchase propensity among customers who ultimately do not buy, but the outcome there is a binary conversion rather than a count. Calibration frameworks such as SYN-DIGITS (Fan et al. 2026) align simulated responses with human ground truth at the individual and distributional level, yet, to our reading, they do not exploit the Poisson–gamma structure that governs count data. To our knowledge, and within the scope of our search, no prior study evaluates whether LLM-generated per-customer purchase counts reproduce the dispersion, zero proportion, and tail behavior of observed count data, or examines how the way heterogeneity is injected affects that fidelity.</w:t>
+      </w:r>
+    </w:p>
     <w:bookmarkEnd w:id="25"/>
-    <w:bookmarkStart w:id="32" w:name="theoretical-framework-and-hypotheses"/>
+    <w:bookmarkEnd w:id="26"/>
+    <w:bookmarkStart w:id="33" w:name="theoretical-framework-and-hypotheses"/>
     <w:p>
       <w:pPr>
         <w:pStyle w:val="Heading1"/>
@@ -239,7 +283,7 @@
         <w:t xml:space="preserve">3. Theoretical Framework and Hypotheses</w:t>
       </w:r>
     </w:p>
-    <w:bookmarkStart w:id="26" w:name="X44757cbbfc69edf67c20f029e2f98c3663af43b"/>
+    <w:bookmarkStart w:id="27" w:name="X44757cbbfc69edf67c20f029e2f98c3663af43b"/>
     <w:p>
       <w:pPr>
         <w:pStyle w:val="Heading2"/>
@@ -746,8 +790,8 @@
         <w:t xml:space="preserve">permits comparison across settings with different means.</w:t>
       </w:r>
     </w:p>
-    <w:bookmarkEnd w:id="26"/>
-    <w:bookmarkStart w:id="27" w:name="X8ffb213eec56793788cf252e1b3bc8a9865741b"/>
+    <w:bookmarkEnd w:id="27"/>
+    <w:bookmarkStart w:id="28" w:name="X8ffb213eec56793788cf252e1b3bc8a9865741b"/>
     <w:p>
       <w:pPr>
         <w:pStyle w:val="Heading2"/>
@@ -2040,8 +2084,8 @@
         <w:t xml:space="preserve">is rarely small, and collapse toward a single answer is the expected outcome rather than an anomaly.</w:t>
       </w:r>
     </w:p>
-    <w:bookmarkEnd w:id="27"/>
-    <w:bookmarkStart w:id="28" w:name="X601aa6a68c4a3a69ba1b8bb976bf0674268e480"/>
+    <w:bookmarkEnd w:id="28"/>
+    <w:bookmarkStart w:id="29" w:name="X601aa6a68c4a3a69ba1b8bb976bf0674268e480"/>
     <w:p>
       <w:pPr>
         <w:pStyle w:val="Heading2"/>
@@ -3022,8 +3066,8 @@
         <w:t xml:space="preserve">.</w:t>
       </w:r>
     </w:p>
-    <w:bookmarkEnd w:id="28"/>
-    <w:bookmarkStart w:id="29" w:name="describing-a-distribution-and-a-ceiling"/>
+    <w:bookmarkEnd w:id="29"/>
+    <w:bookmarkStart w:id="30" w:name="describing-a-distribution-and-a-ceiling"/>
     <w:p>
       <w:pPr>
         <w:pStyle w:val="Heading2"/>
@@ -3068,8 +3112,8 @@
         <w:t xml:space="preserve">of 1.18) in the high-mean setting, against real values of 2.49 and 7.85. Comparisons for this design are therefore made against the ceiling as well as against the real value.</w:t>
       </w:r>
     </w:p>
-    <w:bookmarkEnd w:id="29"/>
-    <w:bookmarkStart w:id="30" w:name="relative-and-absolute-effects"/>
+    <w:bookmarkEnd w:id="30"/>
+    <w:bookmarkStart w:id="31" w:name="relative-and-absolute-effects"/>
     <w:p>
       <w:pPr>
         <w:pStyle w:val="Heading2"/>
@@ -3184,8 +3228,8 @@
         <w:t xml:space="preserve">, evaluating a simulator on risk ratios alone can lead to opposite conclusions from evaluating it on lifts.</w:t>
       </w:r>
     </w:p>
-    <w:bookmarkEnd w:id="30"/>
-    <w:bookmarkStart w:id="31" w:name="hypotheses"/>
+    <w:bookmarkEnd w:id="31"/>
+    <w:bookmarkStart w:id="32" w:name="hypotheses"/>
     <w:p>
       <w:pPr>
         <w:pStyle w:val="Heading2"/>
@@ -3298,9 +3342,9 @@
         <w:t xml:space="preserve">We also ask, as an exploratory question, whether collapse is specific to settings with low mean counts, as one might expect if the model rounds small expected counts to 0, 1, or 2.</w:t>
       </w:r>
     </w:p>
-    <w:bookmarkEnd w:id="31"/>
     <w:bookmarkEnd w:id="32"/>
-    <w:bookmarkStart w:id="37" w:name="research-design"/>
+    <w:bookmarkEnd w:id="33"/>
+    <w:bookmarkStart w:id="38" w:name="research-design"/>
     <w:p>
       <w:pPr>
         <w:pStyle w:val="Heading1"/>
@@ -3309,7 +3353,7 @@
         <w:t xml:space="preserve">4. Research Design</w:t>
       </w:r>
     </w:p>
-    <w:bookmarkStart w:id="33" w:name="settings-and-reference-data"/>
+    <w:bookmarkStart w:id="34" w:name="settings-and-reference-data"/>
     <w:p>
       <w:pPr>
         <w:pStyle w:val="Heading2"/>
@@ -4024,8 +4068,8 @@
         <w:t xml:space="preserve">Table 1. Reference settings.</w:t>
       </w:r>
     </w:p>
-    <w:bookmarkEnd w:id="33"/>
-    <w:bookmarkStart w:id="34" w:name="elicitation-designs"/>
+    <w:bookmarkEnd w:id="34"/>
+    <w:bookmarkStart w:id="35" w:name="elicitation-designs"/>
     <w:p>
       <w:pPr>
         <w:pStyle w:val="Heading2"/>
@@ -4218,8 +4262,8 @@
         <w:t xml:space="preserve">variant it is told the base rate (about 0.5 purchases per 4 weeks and that most customers make none; or about 5 shopping trips per 4 weeks and that some make none).</w:t>
       </w:r>
     </w:p>
-    <w:bookmarkEnd w:id="34"/>
-    <w:bookmarkStart w:id="35" w:name="models-runs-and-measures"/>
+    <w:bookmarkEnd w:id="35"/>
+    <w:bookmarkStart w:id="36" w:name="models-runs-and-measures"/>
     <w:p>
       <w:pPr>
         <w:pStyle w:val="Heading2"/>
@@ -4247,8 +4291,8 @@
         <w:t xml:space="preserve">, with 95% bootstrap intervals over customers. An asterisk marks an interval that excludes the reference value. Parsing failed for 5% or less of the responses in all cells but two: DeepSeek-V4-Pro returned unusable answers for about 10% of the daily-simulation prompts in the high-mean setting, and those cells are computed from the parsed responses only.</w:t>
       </w:r>
     </w:p>
-    <w:bookmarkEnd w:id="35"/>
-    <w:bookmarkStart w:id="36" w:name="email-experiment"/>
+    <w:bookmarkEnd w:id="36"/>
+    <w:bookmarkStart w:id="37" w:name="email-experiment"/>
     <w:p>
       <w:pPr>
         <w:pStyle w:val="Heading2"/>
@@ -4265,9 +4309,9 @@
         <w:t xml:space="preserve">For each of 300 customers sampled from the real data (a new sample for each seed) we asked, in separate independent calls, for the probability (0 to 100 percent) that the customer would visit the website, and that it would make a purchase, in the next two weeks, under each of three conditions: no email, a men’s email, and a women’s email. We report the risk ratio and the absolute lift (the probability with the email minus the probability without it), the latter with paired bootstrap intervals over customers. Yes/no answers and Bernoulli draws from the elicited probabilities were also collected and are discussed where relevant. Because each call sees only one condition, the design mimics random assignment but does not equal it.</w:t>
       </w:r>
     </w:p>
-    <w:bookmarkEnd w:id="36"/>
     <w:bookmarkEnd w:id="37"/>
-    <w:bookmarkStart w:id="51" w:name="results"/>
+    <w:bookmarkEnd w:id="38"/>
+    <w:bookmarkStart w:id="52" w:name="results"/>
     <w:p>
       <w:pPr>
         <w:pStyle w:val="Heading1"/>
@@ -4276,7 +4320,7 @@
         <w:t xml:space="preserve">5. Results</w:t>
       </w:r>
     </w:p>
-    <w:bookmarkStart w:id="41" w:name="overview"/>
+    <w:bookmarkStart w:id="42" w:name="overview"/>
     <w:p>
       <w:pPr>
         <w:pStyle w:val="Heading2"/>
@@ -5600,18 +5644,18 @@
           <wp:inline>
             <wp:extent cx="5334000" cy="6029739"/>
             <wp:effectExtent b="0" l="0" r="0" t="0"/>
-            <wp:docPr descr="Figure 1. Variance-to-mean ratio of simulated purchase counts with 95% intervals, by design (columns), model (rows), and setting (a: low mean; b: high mean; c: real household demographics). The dashed line is the real value; the dotted line is the largest value that design C can reach with its count bins. Filled markers: plain prompt; hollow markers: anchored prompt." title="" id="39" name="Picture"/>
+            <wp:docPr descr="Figure 1. Variance-to-mean ratio of simulated purchase counts with 95% intervals, by design (columns), model (rows), and setting (a: low mean; b: high mean; c: real household demographics). The dashed line is the real value; the dotted line is the largest value that design C can reach with its count bins. Filled markers: plain prompt; hollow markers: anchored prompt." title="" id="40" name="Picture"/>
             <a:graphic>
               <a:graphicData uri="http://schemas.openxmlformats.org/drawingml/2006/picture">
                 <pic:pic>
                   <pic:nvPicPr>
-                    <pic:cNvPr descr="fig1_dispersion.png" id="40" name="Picture"/>
+                    <pic:cNvPr descr="fig1_dispersion.png" id="41" name="Picture"/>
                     <pic:cNvPicPr>
                       <a:picLocks noChangeArrowheads="1" noChangeAspect="1"/>
                     </pic:cNvPicPr>
                   </pic:nvPicPr>
                   <pic:blipFill>
-                    <a:blip r:embed="rId38"/>
+                    <a:blip r:embed="rId39"/>
                     <a:stretch>
                       <a:fillRect/>
                     </a:stretch>
@@ -5646,8 +5690,8 @@
         <w:t xml:space="preserve">Figure 1. Variance-to-mean ratio of simulated purchase counts with 95% intervals, by design (columns), model (rows), and setting (a: low mean; b: high mean; c: real household demographics). The dashed line is the real value; the dotted line is the largest value that design C can reach with its count bins. Filled markers: plain prompt; hollow markers: anchored prompt.</w:t>
       </w:r>
     </w:p>
-    <w:bookmarkEnd w:id="41"/>
-    <w:bookmarkStart w:id="42" w:name="low-mean-setting"/>
+    <w:bookmarkEnd w:id="42"/>
+    <w:bookmarkStart w:id="43" w:name="low-mean-setting"/>
     <w:p>
       <w:pPr>
         <w:pStyle w:val="Heading2"/>
@@ -5774,8 +5818,8 @@
         <w:t xml:space="preserve">is right. Agreement on dispersion is partly by construction, because the gamma multiplier injects it; what the model contributes is the mean, which is almost twice the reference for Llama with the anchor (0.93 against 0.49).</w:t>
       </w:r>
     </w:p>
-    <w:bookmarkEnd w:id="42"/>
-    <w:bookmarkStart w:id="43" w:name="high-mean-setting"/>
+    <w:bookmarkEnd w:id="43"/>
+    <w:bookmarkStart w:id="44" w:name="high-mean-setting"/>
     <w:p>
       <w:pPr>
         <w:pStyle w:val="Heading2"/>
@@ -5858,8 +5902,8 @@
         <w:t xml:space="preserve">in 5: Haiku 5.5 without the anchor, GPT-4o-mini with it, Sonnet 5 in both variants, and Gemini 3.1 Flash-Lite with it. The remaining cells fail because the model’s mean is wrong, for example 3.09 for Mistral Large 4 with the anchor and 7.87 for DeepSeek-V4-Pro without it.</w:t>
       </w:r>
     </w:p>
-    <w:bookmarkEnd w:id="43"/>
-    <w:bookmarkStart w:id="44" w:name="is-collapse-specific-to-low-means"/>
+    <w:bookmarkEnd w:id="44"/>
+    <w:bookmarkStart w:id="45" w:name="is-collapse-specific-to-low-means"/>
     <w:p>
       <w:pPr>
         <w:pStyle w:val="Heading2"/>
@@ -5891,8 +5935,8 @@
         <w:t xml:space="preserve">, and one (DeepSeek-V4-Pro without the anchor) is overdispersed; at a mean of 4.8 the ratio is at most 0.76 in 15 of 16 cells, and at a mean of 7.8 it is at most 1.32. In every setting several models return one value for practically every customer. Collapse of direct answers is therefore not a rounding artifact of low means. Nor do larger or more recent models escape it: the ratios of Sonnet 5 and GPT-5.6-terra in the two high-mean settings lie between 0.02 and 0.31 for direct and daily designs.</w:t>
       </w:r>
     </w:p>
-    <w:bookmarkEnd w:id="44"/>
-    <w:bookmarkStart w:id="45" w:name="Xe23f2af77092521160ea0caefb57b398689219a"/>
+    <w:bookmarkEnd w:id="45"/>
+    <w:bookmarkStart w:id="46" w:name="Xe23f2af77092521160ea0caefb57b398689219a"/>
     <w:p>
       <w:pPr>
         <w:pStyle w:val="Heading2"/>
@@ -6955,8 +6999,8 @@
         <w:t xml:space="preserve">in design D correlates between -0.05 and +0.05 with the real count, and none of its 16 intervals excludes zero. With 79 intervals, about four exclusions are expected by chance at the 5% level. Design C is the only design whose correlations are mostly positive (14 of 16 cells, median +0.06), but the models were run on overlapping samples of household-windows, so the cells are not independent evidence. On the first sample the demographic regression itself has a rank correlation of -0.03 (interval -0.17 to +0.10); on the two further samples of 200 household-windows it reaches +0.19 and -0.02, which shows how much a single sample can move these correlations. Because the demographics predict the real count with a rank correlation of only 0.04 across all households, this result does not show that the models ignore information; it shows that these personas contain almost no information for any simulator to use. It is the empirical counterpart of Proposition 1: richer observable personas cannot supply the heterogeneity that counts contain.</w:t>
       </w:r>
     </w:p>
-    <w:bookmarkEnd w:id="45"/>
-    <w:bookmarkStart w:id="49" w:name="randomized-email-experiment"/>
+    <w:bookmarkEnd w:id="46"/>
+    <w:bookmarkStart w:id="50" w:name="randomized-email-experiment"/>
     <w:p>
       <w:pPr>
         <w:pStyle w:val="Heading2"/>
@@ -12758,18 +12802,18 @@
           <wp:inline>
             <wp:extent cx="5334000" cy="3710608"/>
             <wp:effectExtent b="0" l="0" r="0" t="0"/>
-            <wp:docPr descr="Figure 2. Absolute lift in the probability of a visit and of a purchase after a men’s email (elicited-probability design). Bars are 95% intervals; the dashed line and band are the real lift and its 95% interval. Note the logarithmic axis in panel b." title="" id="47" name="Picture"/>
+            <wp:docPr descr="Figure 2. Absolute lift in the probability of a visit and of a purchase after a men’s email (elicited-probability design). Bars are 95% intervals; the dashed line and band are the real lift and its 95% interval. Note the logarithmic axis in panel b." title="" id="48" name="Picture"/>
             <a:graphic>
               <a:graphicData uri="http://schemas.openxmlformats.org/drawingml/2006/picture">
                 <pic:pic>
                   <pic:nvPicPr>
-                    <pic:cNvPr descr="fig2_lift.png" id="48" name="Picture"/>
+                    <pic:cNvPr descr="fig2_lift.png" id="49" name="Picture"/>
                     <pic:cNvPicPr>
                       <a:picLocks noChangeArrowheads="1" noChangeAspect="1"/>
                     </pic:cNvPicPr>
                   </pic:nvPicPr>
                   <pic:blipFill>
-                    <a:blip r:embed="rId46"/>
+                    <a:blip r:embed="rId47"/>
                     <a:stretch>
                       <a:fillRect/>
                     </a:stretch>
@@ -12943,8 +12987,8 @@
         <w:t xml:space="preserve">for about half with one). The yes/no visit lifts range from -0.31 to +0.55, and the purchase lifts from +0.007 to +0.55, up to 80 times the real lift.</w:t>
       </w:r>
     </w:p>
-    <w:bookmarkEnd w:id="49"/>
-    <w:bookmarkStart w:id="50" w:name="summary-of-hypotheses"/>
+    <w:bookmarkEnd w:id="50"/>
+    <w:bookmarkStart w:id="51" w:name="summary-of-hypotheses"/>
     <w:p>
       <w:pPr>
         <w:pStyle w:val="Heading2"/>
@@ -13437,9 +13481,9 @@
         <w:t xml:space="preserve">Table 5. Hypotheses and evidence.</w:t>
       </w:r>
     </w:p>
-    <w:bookmarkEnd w:id="50"/>
     <w:bookmarkEnd w:id="51"/>
-    <w:bookmarkStart w:id="55" w:name="discussion"/>
+    <w:bookmarkEnd w:id="52"/>
+    <w:bookmarkStart w:id="57" w:name="discussion"/>
     <w:p>
       <w:pPr>
         <w:pStyle w:val="Heading1"/>
@@ -13448,7 +13492,7 @@
         <w:t xml:space="preserve">6. Discussion</w:t>
       </w:r>
     </w:p>
-    <w:bookmarkStart w:id="52" w:name="theoretical-contributions"/>
+    <w:bookmarkStart w:id="53" w:name="theoretical-contributions"/>
     <w:p>
       <w:pPr>
         <w:pStyle w:val="Heading2"/>
@@ -13558,14 +13602,130 @@
         <w:t xml:space="preserve">shows that errors in the simulated base rate and errors in the simulated lift are confounded in the risk ratio, and our data contain cases in which the two readings of the same output disagree.</w:t>
       </w:r>
     </w:p>
-    <w:bookmarkEnd w:id="52"/>
-    <w:bookmarkStart w:id="53" w:name="implications-for-practice"/>
+    <w:bookmarkEnd w:id="53"/>
+    <w:bookmarkStart w:id="54" w:name="X65830c8ffcd303230289e3fa99b65d240227f6e"/>
     <w:p>
       <w:pPr>
         <w:pStyle w:val="Heading2"/>
       </w:pPr>
       <w:r>
-        <w:t xml:space="preserve">6.2 Implications for practice</w:t>
+        <w:t xml:space="preserve">6.2 Design principles for synthetic-customer systems</w:t>
+      </w:r>
+    </w:p>
+    <w:p>
+      <w:pPr>
+        <w:pStyle w:val="FirstParagraph"/>
+      </w:pPr>
+      <w:r>
+        <w:t xml:space="preserve">Design science asks that an evaluation lead to prescriptive knowledge about how the artifact should be built (Gregor and Hevner 2013). The evidence supports five design principles. They are derived from our experiments and analytical results and have not been tested as an intervention, so they should be read as hypotheses for design rather than as established prescriptions.</w:t>
+      </w:r>
+    </w:p>
+    <w:p>
+      <w:pPr>
+        <w:pStyle w:val="BodyText"/>
+      </w:pPr>
+      <w:r>
+        <w:rPr>
+          <w:iCs/>
+          <w:i/>
+        </w:rPr>
+        <w:t xml:space="preserve">Principle 1: Separate the level from the spread.</w:t>
+      </w:r>
+      <w:r>
+        <w:t xml:space="preserve"> </w:t>
+      </w:r>
+      <w:r>
+        <w:t xml:space="preserve">Take the expected rate of a customer from the model and take the dispersion across customers from an external, calibrated source (Proposition 2). Designs that let the model produce the spread itself collapsed, while the hybrid design matched the reference dispersion in 35 of 48 cells.</w:t>
+      </w:r>
+    </w:p>
+    <w:p>
+      <w:pPr>
+        <w:pStyle w:val="BodyText"/>
+      </w:pPr>
+      <w:r>
+        <w:rPr>
+          <w:iCs/>
+          <w:i/>
+        </w:rPr>
+        <w:t xml:space="preserve">Principle 2: Do not let the model produce the final integer or the daily draw.</w:t>
+      </w:r>
+      <w:r>
+        <w:t xml:space="preserve"> </w:t>
+      </w:r>
+      <w:r>
+        <w:t xml:space="preserve">Direct integer answers and day-by-day simulation returned nearly constant values in almost every cell, and their errors were not random but systematic (Section 5).</w:t>
+      </w:r>
+    </w:p>
+    <w:p>
+      <w:pPr>
+        <w:pStyle w:val="BodyText"/>
+      </w:pPr>
+      <w:r>
+        <w:rPr>
+          <w:iCs/>
+          <w:i/>
+        </w:rPr>
+        <w:t xml:space="preserve">Principle 3: Calibrate the level before use.</w:t>
+      </w:r>
+      <w:r>
+        <w:t xml:space="preserve"> </w:t>
+      </w:r>
+      <w:r>
+        <w:t xml:space="preserve">The mean from the model was the bottleneck of the hybrid design (matching the reference in only 20 of 48 cells). A rescaling of the model’s rate against a historical customer file is a natural step that we did not test.</w:t>
+      </w:r>
+    </w:p>
+    <w:p>
+      <w:pPr>
+        <w:pStyle w:val="BodyText"/>
+      </w:pPr>
+      <w:r>
+        <w:rPr>
+          <w:iCs/>
+          <w:i/>
+        </w:rPr>
+        <w:t xml:space="preserve">Principle 4: Treat context and wording as design parameters that must be validated.</w:t>
+      </w:r>
+      <w:r>
+        <w:t xml:space="preserve"> </w:t>
+      </w:r>
+      <w:r>
+        <w:t xml:space="preserve">A stated base rate changed some outputs by an order of magnitude, and in several cells it made the model repeat the stated number for every customer. Wording of the prompt is a design parameter in the same sense.</w:t>
+      </w:r>
+    </w:p>
+    <w:p>
+      <w:pPr>
+        <w:pStyle w:val="BodyText"/>
+      </w:pPr>
+      <w:r>
+        <w:rPr>
+          <w:iCs/>
+          <w:i/>
+        </w:rPr>
+        <w:t xml:space="preserve">Principle 5: Evaluate on absolute effects against a randomized benchmark.</w:t>
+      </w:r>
+      <w:r>
+        <w:t xml:space="preserve"> </w:t>
+      </w:r>
+      <w:r>
+        <w:t xml:space="preserve">Risk ratios hid errors in the simulated base rate (Section 5.6).</w:t>
+      </w:r>
+    </w:p>
+    <w:p>
+      <w:pPr>
+        <w:pStyle w:val="BodyText"/>
+      </w:pPr>
+      <w:r>
+        <w:t xml:space="preserve">A further observation concerns use. The simulators’ output looked plausible: the sign of the promotion effect was right in nearly all cells, and the answers were fluent and well formed. Errors of the kind we document, such as a compressed spread or a tenfold lift, cannot be seen by inspecting the output, which is why an explicit evaluation protocol is needed before such a system is adopted for decisions.</w:t>
+      </w:r>
+    </w:p>
+    <w:bookmarkEnd w:id="54"/>
+    <w:bookmarkStart w:id="55" w:name="implications-for-practice"/>
+    <w:p>
+      <w:pPr>
+        <w:pStyle w:val="Heading2"/>
+      </w:pPr>
+      <w:r>
+        <w:t xml:space="preserve">6.3 Implications for practice</w:t>
       </w:r>
     </w:p>
     <w:p>
@@ -13697,14 +13857,22 @@
         <w:t xml:space="preserve">Report the simulated base rate and the absolute lift next to the risk ratio, and compare both with a past randomized test before any revenue calculation.</w:t>
       </w:r>
     </w:p>
-    <w:bookmarkEnd w:id="53"/>
-    <w:bookmarkStart w:id="54" w:name="limitations-and-future-research"/>
+    <w:p>
+      <w:pPr>
+        <w:pStyle w:val="FirstParagraph"/>
+      </w:pPr>
+      <w:r>
+        <w:t xml:space="preserve">The consequence for a decision can be shown in a stylized example. A firm launches a promotion if the expected gain per targeted customer exceeds its cost, that is, if the lift in purchase probability exceeds the ratio of cost to margin. Suppose a promotion costs 1 monetary unit per targeted customer and each purchase earns a margin of 50, so the ratio is 0.02. The real lift in purchase probability from the men’s email was 0.0068, below 0.02, so the randomized test says not to launch. The simulated lift exceeded 0.02 in 13 of the 16 configurations (the median was 0.065, and the real value was exceeded in 15), so a firm that relied on those simulators would have launched. The stylized numbers are ours and are not taken from the retailer, and the email test does not involve a discount, but the example shows how an overstated absolute lift turns directly into a wrong go decision.</w:t>
+      </w:r>
+    </w:p>
+    <w:bookmarkEnd w:id="55"/>
+    <w:bookmarkStart w:id="56" w:name="limitations-and-future-research"/>
     <w:p>
       <w:pPr>
         <w:pStyle w:val="Heading2"/>
       </w:pPr>
       <w:r>
-        <w:t xml:space="preserve">6.3 Limitations and future research</w:t>
+        <w:t xml:space="preserve">6.4 Limitations and future research</w:t>
       </w:r>
     </w:p>
     <w:p>
@@ -13750,9 +13918,9 @@
         <w:t xml:space="preserve">), so that test marks the limit of observable personas rather than a limit of particular models; settings in which observable attributes, such as purchase histories, are more predictive of purchase frequency would be a stronger test of Proposition 1. In the Complete Journey data campaigns were targeted rather than randomized, so only the email experiment supports a causal comparison. Design C truncates its top bin, which lowers the dispersion it can reach; we quantified this ceiling but did not remove it. Public data may also be part of the models’ training data. Future work should evaluate the hybrid design with a calibrated mean, test prompts that elicit several candidate answers with probabilities, and use a randomized promotion data set with purchase counts, for example from a partner firm, so that the count-distribution and treatment-effect questions can be studied on the same customers.</w:t>
       </w:r>
     </w:p>
-    <w:bookmarkEnd w:id="54"/>
-    <w:bookmarkEnd w:id="55"/>
-    <w:bookmarkStart w:id="56" w:name="conclusion"/>
+    <w:bookmarkEnd w:id="56"/>
+    <w:bookmarkEnd w:id="57"/>
+    <w:bookmarkStart w:id="58" w:name="conclusion"/>
     <w:p>
       <w:pPr>
         <w:pStyle w:val="Heading1"/>
@@ -13766,11 +13934,11 @@
         <w:pStyle w:val="FirstParagraph"/>
       </w:pPr>
       <w:r>
-        <w:t xml:space="preserve">Synthetic customers built from language models do not yet reproduce the shape of real purchase-count distributions or the size of real promotion effects. Direct and day-by-day designs collapse toward a single value whether the mean is 0.5, 4.8, or 7.8, and larger, more recent models do not change this; describing a distribution repairs part of the damage but loses zeros; and a hybrid that takes only the mean from the model matches the dispersion when that mean is accurate. In a randomized email test the models usually get the sign of the effect right, but the absolute lift in purchase probability is overstated in 15 of 16 configurations and similar treatments are not told apart. Practitioners who use synthetic customers should check dispersion and zero share against their own data, rely on the model for means only, and validate absolute effects before they act on them.</w:t>
+        <w:t xml:space="preserve">Synthetic customers built from language models do not yet reproduce the shape of real purchase-count distributions or the size of real promotion effects. Direct and day-by-day designs collapse toward a single value whether the mean is 0.5, 4.8, or 7.8, and larger, more recent models do not change this; describing a distribution repairs part of the damage but loses zeros; and a hybrid that takes only the mean from the model matches the dispersion when that mean is accurate. In a randomized email test the models usually get the sign of the effect right, but the absolute lift in purchase probability is overstated in 15 of 16 configurations and similar treatments are not told apart. Practitioners who use synthetic customers should check dispersion and zero share against their own data, rely on the model for means only, and validate absolute effects before they act on them. For the design of such systems, the evidence points to separating the level, which the model can supply, from the spread, which must come from an external calibrated source, and to evaluating the artifact against the decision it is meant to support.</w:t>
       </w:r>
     </w:p>
-    <w:bookmarkEnd w:id="56"/>
-    <w:bookmarkStart w:id="57" w:name="references"/>
+    <w:bookmarkEnd w:id="58"/>
+    <w:bookmarkStart w:id="59" w:name="references"/>
     <w:p>
       <w:pPr>
         <w:pStyle w:val="Heading1"/>
@@ -13922,7 +14090,23 @@
         <w:pStyle w:val="BodyText"/>
       </w:pPr>
       <w:r>
-        <w:t xml:space="preserve">Goli A, Singh A (2023) Can LLMs capture human preferences? Preprint, submitted May 4, arXiv:2305.02531.</w:t>
+        <w:t xml:space="preserve">Goodhue DL, Thompson RL (1995) Task-technology fit and individual performance.</w:t>
+      </w:r>
+      <w:r>
+        <w:t xml:space="preserve"> </w:t>
+      </w:r>
+      <w:r>
+        <w:rPr>
+          <w:iCs/>
+          <w:i/>
+        </w:rPr>
+        <w:t xml:space="preserve">MIS Quart.</w:t>
+      </w:r>
+      <w:r>
+        <w:t xml:space="preserve"> </w:t>
+      </w:r>
+      <w:r>
+        <w:t xml:space="preserve">19(2):213–236.</w:t>
       </w:r>
     </w:p>
     <w:p>
@@ -13930,7 +14114,7 @@
         <w:pStyle w:val="BodyText"/>
       </w:pPr>
       <w:r>
-        <w:t xml:space="preserve">Gu J, Pang L, Shen H, Cheng X (2024) Do LLMs play dice? Exploring probability distribution sampling in large language models for behavioral simulation. Preprint, submitted April 13, arXiv:2404.09043.</w:t>
+        <w:t xml:space="preserve">Goli A, Singh A (2023) Can LLMs capture human preferences? Preprint, submitted May 4, arXiv:2305.02531.</w:t>
       </w:r>
     </w:p>
     <w:p>
@@ -13938,7 +14122,7 @@
         <w:pStyle w:val="BodyText"/>
       </w:pPr>
       <w:r>
-        <w:t xml:space="preserve">Hewitt L, Ashokkumar A, Ghezae I, Willer R (2024) Predicting results of social science experiments using large language models. Working paper, Stanford University, Stanford, CA.</w:t>
+        <w:t xml:space="preserve">Gu J, Pang L, Shen H, Cheng X (2024) Do LLMs play dice? Exploring probability distribution sampling in large language models for behavioral simulation. Preprint, submitted April 13, arXiv:2404.09043.</w:t>
       </w:r>
     </w:p>
     <w:p>
@@ -13946,7 +14130,23 @@
         <w:pStyle w:val="BodyText"/>
       </w:pPr>
       <w:r>
-        <w:t xml:space="preserve">Hillstrom K (2008) The MineThatData e-mail analytics and data mining challenge. Blog post, March 20, http://blog.minethatdata.com.</w:t>
+        <w:t xml:space="preserve">Gregor S, Hevner AR (2013) Positioning and presenting design science research for maximum impact.</w:t>
+      </w:r>
+      <w:r>
+        <w:t xml:space="preserve"> </w:t>
+      </w:r>
+      <w:r>
+        <w:rPr>
+          <w:iCs/>
+          <w:i/>
+        </w:rPr>
+        <w:t xml:space="preserve">MIS Quart.</w:t>
+      </w:r>
+      <w:r>
+        <w:t xml:space="preserve"> </w:t>
+      </w:r>
+      <w:r>
+        <w:t xml:space="preserve">37(2):337–355.</w:t>
       </w:r>
     </w:p>
     <w:p>
@@ -13954,7 +14154,23 @@
         <w:pStyle w:val="BodyText"/>
       </w:pPr>
       <w:r>
-        <w:t xml:space="preserve">Horton JJ (2023) Large language models as simulated economic agents: What can we learn from Homo silicus? Preprint, submitted January 18, arXiv:2301.07543.</w:t>
+        <w:t xml:space="preserve">Hevner AR, March ST, Park J, Ram S (2004) Design science in information systems research.</w:t>
+      </w:r>
+      <w:r>
+        <w:t xml:space="preserve"> </w:t>
+      </w:r>
+      <w:r>
+        <w:rPr>
+          <w:iCs/>
+          <w:i/>
+        </w:rPr>
+        <w:t xml:space="preserve">MIS Quart.</w:t>
+      </w:r>
+      <w:r>
+        <w:t xml:space="preserve"> </w:t>
+      </w:r>
+      <w:r>
+        <w:t xml:space="preserve">28(1):75–105.</w:t>
       </w:r>
     </w:p>
     <w:p>
@@ -13962,7 +14178,7 @@
         <w:pStyle w:val="BodyText"/>
       </w:pPr>
       <w:r>
-        <w:t xml:space="preserve">Huang C, Wang K (2026) LLM-powered virtual population for demand simulation and pricing. Preprint, submitted June 15, arXiv:2606.16183.</w:t>
+        <w:t xml:space="preserve">Hewitt L, Ashokkumar A, Ghezae I, Willer R (2024) Predicting results of social science experiments using large language models. Working paper, Stanford University, Stanford, CA.</w:t>
       </w:r>
     </w:p>
     <w:p>
@@ -13970,7 +14186,7 @@
         <w:pStyle w:val="BodyText"/>
       </w:pPr>
       <w:r>
-        <w:t xml:space="preserve">Jang C, Lee D, Kim J (2026) Instruction-tuned language models cannot sample from distributions they can describe. Preprint, submitted July 28, arXiv:2607.25292.</w:t>
+        <w:t xml:space="preserve">Hillstrom K (2008) The MineThatData e-mail analytics and data mining challenge. Blog post, March 20, http://blog.minethatdata.com.</w:t>
       </w:r>
     </w:p>
     <w:p>
@@ -13978,7 +14194,7 @@
         <w:pStyle w:val="BodyText"/>
       </w:pPr>
       <w:r>
-        <w:t xml:space="preserve">Li D, Li L, Qiu HS (2025) ChatGPT is not a man but Das Man: Representativeness and structural consistency of silicon samples generated by large language models. Preprint, submitted June 25, arXiv:2507.02919.</w:t>
+        <w:t xml:space="preserve">Horton JJ (2023) Large language models as simulated economic agents: What can we learn from Homo silicus? Preprint, submitted January 18, arXiv:2301.07543.</w:t>
       </w:r>
     </w:p>
     <w:p>
@@ -13986,7 +14202,7 @@
         <w:pStyle w:val="BodyText"/>
       </w:pPr>
       <w:r>
-        <w:t xml:space="preserve">Maier BF, Aslak U, Fiaschi L, et al. (2025) LLMs reproduce human purchase intent via semantic similarity elicitation of Likert ratings. Preprint, submitted October 9, arXiv:2510.08338.</w:t>
+        <w:t xml:space="preserve">Huang C, Wang K (2026) LLM-powered virtual population for demand simulation and pricing. Preprint, submitted June 15, arXiv:2606.16183.</w:t>
       </w:r>
     </w:p>
     <w:p>
@@ -13994,7 +14210,7 @@
         <w:pStyle w:val="BodyText"/>
       </w:pPr>
       <w:r>
-        <w:t xml:space="preserve">Sashihara J, Fujita Y, Nakamura K, et al. (2025) LLM-based multi-agent system for simulating strategic and goal-oriented data marketplaces. Preprint, submitted November 17, arXiv:2511.13233.</w:t>
+        <w:t xml:space="preserve">Jang C, Lee D, Kim J (2026) Instruction-tuned language models cannot sample from distributions they can describe. Preprint, submitted July 28, arXiv:2607.25292.</w:t>
       </w:r>
     </w:p>
     <w:p>
@@ -14002,6 +14218,72 @@
         <w:pStyle w:val="BodyText"/>
       </w:pPr>
       <w:r>
+        <w:t xml:space="preserve">Li D, Li L, Qiu HS (2025) ChatGPT is not a man but Das Man: Representativeness and structural consistency of silicon samples generated by large language models. Preprint, submitted June 25, arXiv:2507.02919.</w:t>
+      </w:r>
+    </w:p>
+    <w:p>
+      <w:pPr>
+        <w:pStyle w:val="BodyText"/>
+      </w:pPr>
+      <w:r>
+        <w:t xml:space="preserve">Maier BF, Aslak U, Fiaschi L, et al. (2025) LLMs reproduce human purchase intent via semantic similarity elicitation of Likert ratings. Preprint, submitted October 9, arXiv:2510.08338.</w:t>
+      </w:r>
+    </w:p>
+    <w:p>
+      <w:pPr>
+        <w:pStyle w:val="BodyText"/>
+      </w:pPr>
+      <w:r>
+        <w:t xml:space="preserve">Orlikowski WJ, Iacono CS (2001) Research commentary: Desperately seeking the</w:t>
+      </w:r>
+      <w:r>
+        <w:t xml:space="preserve"> </w:t>
+      </w:r>
+      <w:r>
+        <w:t xml:space="preserve">“</w:t>
+      </w:r>
+      <w:r>
+        <w:t xml:space="preserve">IT</w:t>
+      </w:r>
+      <w:r>
+        <w:t xml:space="preserve">”</w:t>
+      </w:r>
+      <w:r>
+        <w:t xml:space="preserve"> </w:t>
+      </w:r>
+      <w:r>
+        <w:t xml:space="preserve">in IT research—A call to theorizing the IT artifact.</w:t>
+      </w:r>
+      <w:r>
+        <w:t xml:space="preserve"> </w:t>
+      </w:r>
+      <w:r>
+        <w:rPr>
+          <w:iCs/>
+          <w:i/>
+        </w:rPr>
+        <w:t xml:space="preserve">Inform. Systems Res.</w:t>
+      </w:r>
+      <w:r>
+        <w:t xml:space="preserve"> </w:t>
+      </w:r>
+      <w:r>
+        <w:t xml:space="preserve">12(2):121–134.</w:t>
+      </w:r>
+    </w:p>
+    <w:p>
+      <w:pPr>
+        <w:pStyle w:val="BodyText"/>
+      </w:pPr>
+      <w:r>
+        <w:t xml:space="preserve">Sashihara J, Fujita Y, Nakamura K, et al. (2025) LLM-based multi-agent system for simulating strategic and goal-oriented data marketplaces. Preprint, submitted November 17, arXiv:2511.13233.</w:t>
+      </w:r>
+    </w:p>
+    <w:p>
+      <w:pPr>
+        <w:pStyle w:val="BodyText"/>
+      </w:pPr>
+      <w:r>
         <w:t xml:space="preserve">Schmittlein DC, Morrison DG, Colombo R (1987) Counting your customers: Who are they and what will they do next?</w:t>
       </w:r>
       <w:r>
@@ -14045,8 +14327,8 @@
         <w:t xml:space="preserve">Zhang R, Zhang X, Zhao M (2025b) Predicting effects, missing distributions: Evaluating LLMs as human behavior simulators in operations management. Preprint, submitted September 30, arXiv:2510.03310.</w:t>
       </w:r>
     </w:p>
-    <w:bookmarkEnd w:id="57"/>
-    <w:bookmarkStart w:id="58" w:name="appendix-a.-prompt-templates"/>
+    <w:bookmarkEnd w:id="59"/>
+    <w:bookmarkStart w:id="60" w:name="appendix-a.-prompt-templates"/>
     <w:p>
       <w:pPr>
         <w:pStyle w:val="Heading1"/>
@@ -14223,8 +14505,8 @@
         <w:t xml:space="preserve">”</w:t>
       </w:r>
     </w:p>
-    <w:bookmarkEnd w:id="58"/>
-    <w:bookmarkStart w:id="59" w:name="appendix-b.-full-results"/>
+    <w:bookmarkEnd w:id="60"/>
+    <w:bookmarkStart w:id="61" w:name="appendix-b.-full-results"/>
     <w:p>
       <w:pPr>
         <w:pStyle w:val="Heading1"/>
@@ -39667,8 +39949,8 @@
         <w:t xml:space="preserve">Table B3. Persona experiment with real household demographics, 200 households per cell. Reference row: real distribution of the 801 households (10,413 household-windows). * the 95% bootstrap interval excludes the reference value.</w:t>
       </w:r>
     </w:p>
-    <w:bookmarkEnd w:id="59"/>
-    <w:bookmarkStart w:id="60" w:name="appendix-c.-reproducibility"/>
+    <w:bookmarkEnd w:id="61"/>
+    <w:bookmarkStart w:id="62" w:name="appendix-c.-reproducibility"/>
     <w:p>
       <w:pPr>
         <w:pStyle w:val="Heading1"/>
@@ -39706,7 +39988,7 @@
         <w:t xml:space="preserve">). Raw model responses are saved with each run. Household-level Complete Journey data are not redistributed; the code reads them from the public package files.</w:t>
       </w:r>
     </w:p>
-    <w:bookmarkEnd w:id="60"/>
+    <w:bookmarkEnd w:id="62"/>
     <w:sectPr/>
   </w:body>
 </w:document>

</xml_diff>

<commit_message>
Manuscript: stronger IS framing (digital-twin limits, IS-marketing interface, propositions as system mechanisms, organizational implications)
Co-Authored-By: Claude Sonnet 5.5 <noreply@anthropic.com>
Claude-Session: https://claude.ai/code/session_01VRbK37d38KZhVAbWS4xw4x
</commit_message>
<xml_diff>
--- a/llm-count-study/ISR_manuscript_draft.docx
+++ b/llm-count-study/ISR_manuscript_draft.docx
@@ -51,7 +51,7 @@
         <w:pStyle w:val="BodyText"/>
       </w:pPr>
       <w:r>
-        <w:t xml:space="preserve">Large language models (LLMs) are increasingly used to create synthetic customers for pre-testing marketing decisions, but evaluations have concentrated on ratings, choices, and stated willingness to pay. We study an output that customer analytics depends on more directly: the number of purchases a customer makes in a period. Building on the Poisson–gamma account of purchase counts, we show analytically that overdispersion measures unobserved customer heterogeneity, derive how much of it a persona-conditioned simulator can carry, and show how a hybrid design avoids double counting. We evaluate four elicitation designs across eight LLMs in public transaction settings (mean counts of about 0.5, 4.8, and 7.8) and in a randomized email experiment. Direct and day-by-day designs collapse toward a single value in nearly every model and setting, and larger, more recent models do not change this. Describing a distribution recovers part of the dispersion but under-produces zero counts where zeros are common. Personas built from real household demographics change nothing, because those demographics explain about 1% of the heterogeneity in counts. The hybrid matches dispersion only when the model’s mean is accurate. Promotion effects have the right sign in most settings, yet their size varies by an order of magnitude with model and prompt, and the absolute lift in purchase probability is overstated in 15 of 16 configurations (median about tenfold). Treating the simulator as a decision-support artifact, we derive design principles and an evaluation protocol, and we show that the overstated lifts would lead a firm to approve promotions that a randomized test rejects.</w:t>
+        <w:t xml:space="preserve">Large language models (LLMs) are increasingly used to create synthetic customers for pre-testing marketing decisions, but evaluations have concentrated on ratings, choices, and stated willingness to pay. We study an output that customer analytics depends on more directly: the number of purchases a customer makes in a period. Building on the Poisson–gamma account of purchase counts, we show analytically that overdispersion measures unobserved customer heterogeneity, derive how much of it a persona-conditioned simulator can carry, and show how a hybrid design avoids double counting. We evaluate four elicitation designs across eight LLMs in public transaction settings (mean counts of about 0.5, 4.8, and 7.8) and in a randomized email experiment. Direct and day-by-day designs collapse toward a single value in nearly every model and setting, and larger, more recent models do not change this. Describing a distribution recovers part of the dispersion but under-produces zero counts where zeros are common. Personas built from real household demographics change nothing, because those demographics explain about 1% of the heterogeneity in counts. The hybrid matches dispersion only when the model’s mean is accurate. Promotion effects have the right sign in most settings, yet their size varies by an order of magnitude with model and prompt, and the absolute lift in purchase probability is overstated in 15 of 16 configurations (median about tenfold). Treating the simulator as a decision-support artifact at the interface of information systems and marketing analytics, we read the two propositions as design constraints and a calibration mechanism, derive design principles and an evaluation protocol, and show that the overstated lifts would lead a firm to approve promotions that a randomized test rejects. We close with organizational implications for validating and governing synthetic data in analytics systems.</w:t>
       </w:r>
     </w:p>
     <w:p>
@@ -129,6 +129,32 @@
       </w:pPr>
       <w:r>
         <w:t xml:space="preserve">The question is also one for information systems research. A synthetic-customer simulator is an IT artifact in the sense of a system that organizations design, deploy, and use to support decisions (Orlikowski and Iacono 2001, Hevner et al. 2004). Its value does not lie in the language model itself but in the decisions it supports, so the relevant test is task–technology fit (Goodhue and Thompson 1995): does the artifact reproduce the properties of customer behavior on which the decision depends? For promotion planning, those properties are the share of customers who do not buy, the weight of heavy buyers, and the absolute size of an effect. We therefore treat the elicitation design, meaning how the model is asked, how its answers become counts, and where heterogeneity comes from, as the artifact’s design variable, and ask which designs fit which decisions.</w:t>
+      </w:r>
+    </w:p>
+    <w:p>
+      <w:pPr>
+        <w:pStyle w:val="BodyText"/>
+      </w:pPr>
+      <w:r>
+        <w:t xml:space="preserve">The question sits at the interface of information systems and marketing. Marketing analytics has become a systems problem: data are collected, transformed, and fed into models and dashboards that shape budgets and campaigns (Wedel and Kannan 2016), and the design, validation, and governance of those systems fall to information systems functions as much as to marketing. Generative AI adds a new component to this pipeline, the synthetic customer, which is marketed as a</w:t>
+      </w:r>
+      <w:r>
+        <w:t xml:space="preserve"> </w:t>
+      </w:r>
+      <w:r>
+        <w:t xml:space="preserve">“</w:t>
+      </w:r>
+      <w:r>
+        <w:t xml:space="preserve">digital twin</w:t>
+      </w:r>
+      <w:r>
+        <w:t xml:space="preserve">”</w:t>
+      </w:r>
+      <w:r>
+        <w:t xml:space="preserve"> </w:t>
+      </w:r>
+      <w:r>
+        <w:t xml:space="preserve">of a customer base. A twin is only as useful as the properties it preserves. If it preserves averages but not the spread of behavior, the systems built on it inherit a bias that looks like data but is not. Fluent, plausible output also invites reliance beyond what the system warrants (Lee and See 2004), so the limits of AI-based decision support are not a technical footnote but a question of how organizations should validate and use such outputs. We contribute to that question by showing, for a quantity that analytics systems depend on, which design choices preserve the property that matters and which do not.</w:t>
       </w:r>
     </w:p>
     <w:p>
@@ -233,7 +259,7 @@
         <w:pStyle w:val="FirstParagraph"/>
       </w:pPr>
       <w:r>
-        <w:t xml:space="preserve">Information systems research has long treated decision-support tools as artifacts whose worth must be shown by evaluation against the decisions they serve, not by internal consistency alone (Hevner et al. 2004, Gregor and Hevner 2013). Design science separates the design of an artifact, here the elicitation procedure, the persona schema, and the calibration step of a simulator, from its evaluation, here the comparison with observed behavior. Task–technology fit supplies the criterion: a technology improves performance when its capabilities match the demands of the task (Goodhue and Thompson 1995). Promotion pre-testing demands four capabilities of a simulated customer base: a plausible average, a plausible spread across customers, a plausible share of non-buyers, and a plausible absolute effect size. Existing evaluations of synthetic respondents mostly check the first and, through ratings, a crude version of the second. We therefore frame our four designs as alternative instantiations of one artifact class and our measures as the fit criteria that this task imposes. The artifact view also clarifies what is not at stake. The question is not whether language models</w:t>
+        <w:t xml:space="preserve">Information systems research has long treated decision-support tools as artifacts whose worth must be shown by evaluation against the decisions they serve, not by internal consistency alone (Hevner et al. 2004, Gregor and Hevner 2013). Design science separates the design of an artifact, here the elicitation procedure, the persona schema, and the calibration step of a simulator, from its evaluation, here the comparison with observed behavior. Task–technology fit supplies the criterion: a technology improves performance when its capabilities match the demands of the task (Goodhue and Thompson 1995). Promotion pre-testing demands four capabilities of a simulated customer base: a plausible average, a plausible spread across customers, a plausible share of non-buyers, and a plausible absolute effect size. Existing evaluations of synthetic respondents mostly check the first and, through ratings, a crude version of the second. We therefore frame our four designs as alternative instantiations of one artifact class and our measures as the fit criteria that this task imposes. The artifact view also locates the topic at the interface of information systems and marketing analytics, where the design of the data and model pipeline determines which marketing decisions are well supported (Wedel and Kannan 2016). Hybrid arrangements in which a model supplies part of a judgment and a statistical procedure supplies another (Dellermann et al. 2019) are one response, and the design we call hybrid is an instance. The artifact view also clarifies what is not at stake. The question is not whether language models</w:t>
       </w:r>
       <w:r>
         <w:t xml:space="preserve"> </w:t>
@@ -274,7 +300,7 @@
     </w:p>
     <w:bookmarkEnd w:id="25"/>
     <w:bookmarkEnd w:id="26"/>
-    <w:bookmarkStart w:id="33" w:name="theoretical-framework-and-hypotheses"/>
+    <w:bookmarkStart w:id="34" w:name="theoretical-framework-and-hypotheses"/>
     <w:p>
       <w:pPr>
         <w:pStyle w:val="Heading1"/>
@@ -3343,8 +3369,114 @@
       </w:r>
     </w:p>
     <w:bookmarkEnd w:id="32"/>
+    <w:bookmarkStart w:id="33" w:name="from-propositions-to-system-mechanisms"/>
+    <w:p>
+      <w:pPr>
+        <w:pStyle w:val="Heading2"/>
+      </w:pPr>
+      <w:r>
+        <w:t xml:space="preserve">3.7 From propositions to system mechanisms</w:t>
+      </w:r>
+    </w:p>
+    <w:p>
+      <w:pPr>
+        <w:pStyle w:val="FirstParagraph"/>
+      </w:pPr>
+      <w:r>
+        <w:t xml:space="preserve">The two propositions can be read as statements about how to build the artifact, not only about count distributions. Proposition 1 is a design constraint: a component that returns a deterministic answer for each persona can transmit only the heterogeneity that the persona describes, so the remainder must come from a different component. Proposition 2 is a calibration mechanism. It allocates a variance budget between two sources, the model’s persona-conditioned rates and an external noise generator, so that their combination matches the dispersion observed in the organization’s own data,</w:t>
+      </w:r>
+      <w:r>
+        <w:t xml:space="preserve"> </w:t>
+      </w:r>
+      <m:oMath>
+        <m:r>
+          <m:t>1</m:t>
+        </m:r>
+        <m:r>
+          <m:rPr>
+            <m:sty m:val="p"/>
+          </m:rPr>
+          <m:t>+</m:t>
+        </m:r>
+        <m:r>
+          <m:t>α</m:t>
+        </m:r>
+        <m:r>
+          <m:rPr>
+            <m:sty m:val="p"/>
+          </m:rPr>
+          <m:t>=</m:t>
+        </m:r>
+        <m:d>
+          <m:dPr>
+            <m:begChr m:val="("/>
+            <m:endChr m:val=")"/>
+            <m:sepChr m:val=""/>
+            <m:grow/>
+          </m:dPr>
+          <m:e>
+            <m:r>
+              <m:t>1</m:t>
+            </m:r>
+            <m:r>
+              <m:rPr>
+                <m:sty m:val="p"/>
+              </m:rPr>
+              <m:t>+</m:t>
+            </m:r>
+            <m:sSup>
+              <m:e>
+                <m:r>
+                  <m:t>c</m:t>
+                </m:r>
+              </m:e>
+              <m:sup>
+                <m:r>
+                  <m:t>2</m:t>
+                </m:r>
+              </m:sup>
+            </m:sSup>
+          </m:e>
+        </m:d>
+        <m:d>
+          <m:dPr>
+            <m:begChr m:val="("/>
+            <m:endChr m:val=")"/>
+            <m:sepChr m:val=""/>
+            <m:grow/>
+          </m:dPr>
+          <m:e>
+            <m:r>
+              <m:t>1</m:t>
+            </m:r>
+            <m:r>
+              <m:rPr>
+                <m:sty m:val="p"/>
+              </m:rPr>
+              <m:t>+</m:t>
+            </m:r>
+            <m:sSub>
+              <m:e>
+                <m:r>
+                  <m:t>α</m:t>
+                </m:r>
+              </m:e>
+              <m:sub>
+                <m:r>
+                  <m:t>w</m:t>
+                </m:r>
+              </m:sub>
+            </m:sSub>
+          </m:e>
+        </m:d>
+      </m:oMath>
+      <w:r>
+        <w:t xml:space="preserve">. The mechanism has three properties that matter for a system. It is explicit, because the allocation is computed rather than tuned by hand. It is auditable, because the target dispersion comes from a named historical data set. And it is modular, because the model can be replaced without changing the calibration step, although the step must then be recomputed. Proposition 1 and Proposition 2 therefore correspond to a separation of responsibilities between the language model, which supplies the level of a customer’s expected behavior, and the statistical layer, which supplies and calibrates the spread.</w:t>
+      </w:r>
+    </w:p>
     <w:bookmarkEnd w:id="33"/>
-    <w:bookmarkStart w:id="38" w:name="research-design"/>
+    <w:bookmarkEnd w:id="34"/>
+    <w:bookmarkStart w:id="39" w:name="research-design"/>
     <w:p>
       <w:pPr>
         <w:pStyle w:val="Heading1"/>
@@ -3353,7 +3485,7 @@
         <w:t xml:space="preserve">4. Research Design</w:t>
       </w:r>
     </w:p>
-    <w:bookmarkStart w:id="34" w:name="settings-and-reference-data"/>
+    <w:bookmarkStart w:id="35" w:name="settings-and-reference-data"/>
     <w:p>
       <w:pPr>
         <w:pStyle w:val="Heading2"/>
@@ -4068,8 +4200,8 @@
         <w:t xml:space="preserve">Table 1. Reference settings.</w:t>
       </w:r>
     </w:p>
-    <w:bookmarkEnd w:id="34"/>
-    <w:bookmarkStart w:id="35" w:name="elicitation-designs"/>
+    <w:bookmarkEnd w:id="35"/>
+    <w:bookmarkStart w:id="36" w:name="elicitation-designs"/>
     <w:p>
       <w:pPr>
         <w:pStyle w:val="Heading2"/>
@@ -4262,8 +4394,8 @@
         <w:t xml:space="preserve">variant it is told the base rate (about 0.5 purchases per 4 weeks and that most customers make none; or about 5 shopping trips per 4 weeks and that some make none).</w:t>
       </w:r>
     </w:p>
-    <w:bookmarkEnd w:id="35"/>
-    <w:bookmarkStart w:id="36" w:name="models-runs-and-measures"/>
+    <w:bookmarkEnd w:id="36"/>
+    <w:bookmarkStart w:id="37" w:name="models-runs-and-measures"/>
     <w:p>
       <w:pPr>
         <w:pStyle w:val="Heading2"/>
@@ -4291,8 +4423,8 @@
         <w:t xml:space="preserve">, with 95% bootstrap intervals over customers. An asterisk marks an interval that excludes the reference value. Parsing failed for 5% or less of the responses in all cells but two: DeepSeek-V4-Pro returned unusable answers for about 10% of the daily-simulation prompts in the high-mean setting, and those cells are computed from the parsed responses only.</w:t>
       </w:r>
     </w:p>
-    <w:bookmarkEnd w:id="36"/>
-    <w:bookmarkStart w:id="37" w:name="email-experiment"/>
+    <w:bookmarkEnd w:id="37"/>
+    <w:bookmarkStart w:id="38" w:name="email-experiment"/>
     <w:p>
       <w:pPr>
         <w:pStyle w:val="Heading2"/>
@@ -4309,9 +4441,9 @@
         <w:t xml:space="preserve">For each of 300 customers sampled from the real data (a new sample for each seed) we asked, in separate independent calls, for the probability (0 to 100 percent) that the customer would visit the website, and that it would make a purchase, in the next two weeks, under each of three conditions: no email, a men’s email, and a women’s email. We report the risk ratio and the absolute lift (the probability with the email minus the probability without it), the latter with paired bootstrap intervals over customers. Yes/no answers and Bernoulli draws from the elicited probabilities were also collected and are discussed where relevant. Because each call sees only one condition, the design mimics random assignment but does not equal it.</w:t>
       </w:r>
     </w:p>
-    <w:bookmarkEnd w:id="37"/>
     <w:bookmarkEnd w:id="38"/>
-    <w:bookmarkStart w:id="52" w:name="results"/>
+    <w:bookmarkEnd w:id="39"/>
+    <w:bookmarkStart w:id="53" w:name="results"/>
     <w:p>
       <w:pPr>
         <w:pStyle w:val="Heading1"/>
@@ -4320,7 +4452,7 @@
         <w:t xml:space="preserve">5. Results</w:t>
       </w:r>
     </w:p>
-    <w:bookmarkStart w:id="42" w:name="overview"/>
+    <w:bookmarkStart w:id="43" w:name="overview"/>
     <w:p>
       <w:pPr>
         <w:pStyle w:val="Heading2"/>
@@ -5644,18 +5776,18 @@
           <wp:inline>
             <wp:extent cx="5334000" cy="6029739"/>
             <wp:effectExtent b="0" l="0" r="0" t="0"/>
-            <wp:docPr descr="Figure 1. Variance-to-mean ratio of simulated purchase counts with 95% intervals, by design (columns), model (rows), and setting (a: low mean; b: high mean; c: real household demographics). The dashed line is the real value; the dotted line is the largest value that design C can reach with its count bins. Filled markers: plain prompt; hollow markers: anchored prompt." title="" id="40" name="Picture"/>
+            <wp:docPr descr="Figure 1. Variance-to-mean ratio of simulated purchase counts with 95% intervals, by design (columns), model (rows), and setting (a: low mean; b: high mean; c: real household demographics). The dashed line is the real value; the dotted line is the largest value that design C can reach with its count bins. Filled markers: plain prompt; hollow markers: anchored prompt." title="" id="41" name="Picture"/>
             <a:graphic>
               <a:graphicData uri="http://schemas.openxmlformats.org/drawingml/2006/picture">
                 <pic:pic>
                   <pic:nvPicPr>
-                    <pic:cNvPr descr="fig1_dispersion.png" id="41" name="Picture"/>
+                    <pic:cNvPr descr="fig1_dispersion.png" id="42" name="Picture"/>
                     <pic:cNvPicPr>
                       <a:picLocks noChangeArrowheads="1" noChangeAspect="1"/>
                     </pic:cNvPicPr>
                   </pic:nvPicPr>
                   <pic:blipFill>
-                    <a:blip r:embed="rId39"/>
+                    <a:blip r:embed="rId40"/>
                     <a:stretch>
                       <a:fillRect/>
                     </a:stretch>
@@ -5690,8 +5822,8 @@
         <w:t xml:space="preserve">Figure 1. Variance-to-mean ratio of simulated purchase counts with 95% intervals, by design (columns), model (rows), and setting (a: low mean; b: high mean; c: real household demographics). The dashed line is the real value; the dotted line is the largest value that design C can reach with its count bins. Filled markers: plain prompt; hollow markers: anchored prompt.</w:t>
       </w:r>
     </w:p>
-    <w:bookmarkEnd w:id="42"/>
-    <w:bookmarkStart w:id="43" w:name="low-mean-setting"/>
+    <w:bookmarkEnd w:id="43"/>
+    <w:bookmarkStart w:id="44" w:name="low-mean-setting"/>
     <w:p>
       <w:pPr>
         <w:pStyle w:val="Heading2"/>
@@ -5818,8 +5950,8 @@
         <w:t xml:space="preserve">is right. Agreement on dispersion is partly by construction, because the gamma multiplier injects it; what the model contributes is the mean, which is almost twice the reference for Llama with the anchor (0.93 against 0.49).</w:t>
       </w:r>
     </w:p>
-    <w:bookmarkEnd w:id="43"/>
-    <w:bookmarkStart w:id="44" w:name="high-mean-setting"/>
+    <w:bookmarkEnd w:id="44"/>
+    <w:bookmarkStart w:id="45" w:name="high-mean-setting"/>
     <w:p>
       <w:pPr>
         <w:pStyle w:val="Heading2"/>
@@ -5902,8 +6034,8 @@
         <w:t xml:space="preserve">in 5: Haiku 5.5 without the anchor, GPT-4o-mini with it, Sonnet 5 in both variants, and Gemini 3.1 Flash-Lite with it. The remaining cells fail because the model’s mean is wrong, for example 3.09 for Mistral Large 4 with the anchor and 7.87 for DeepSeek-V4-Pro without it.</w:t>
       </w:r>
     </w:p>
-    <w:bookmarkEnd w:id="44"/>
-    <w:bookmarkStart w:id="45" w:name="is-collapse-specific-to-low-means"/>
+    <w:bookmarkEnd w:id="45"/>
+    <w:bookmarkStart w:id="46" w:name="is-collapse-specific-to-low-means"/>
     <w:p>
       <w:pPr>
         <w:pStyle w:val="Heading2"/>
@@ -5935,8 +6067,8 @@
         <w:t xml:space="preserve">, and one (DeepSeek-V4-Pro without the anchor) is overdispersed; at a mean of 4.8 the ratio is at most 0.76 in 15 of 16 cells, and at a mean of 7.8 it is at most 1.32. In every setting several models return one value for practically every customer. Collapse of direct answers is therefore not a rounding artifact of low means. Nor do larger or more recent models escape it: the ratios of Sonnet 5 and GPT-5.6-terra in the two high-mean settings lie between 0.02 and 0.31 for direct and daily designs.</w:t>
       </w:r>
     </w:p>
-    <w:bookmarkEnd w:id="45"/>
-    <w:bookmarkStart w:id="46" w:name="Xe23f2af77092521160ea0caefb57b398689219a"/>
+    <w:bookmarkEnd w:id="46"/>
+    <w:bookmarkStart w:id="47" w:name="Xe23f2af77092521160ea0caefb57b398689219a"/>
     <w:p>
       <w:pPr>
         <w:pStyle w:val="Heading2"/>
@@ -6999,8 +7131,8 @@
         <w:t xml:space="preserve">in design D correlates between -0.05 and +0.05 with the real count, and none of its 16 intervals excludes zero. With 79 intervals, about four exclusions are expected by chance at the 5% level. Design C is the only design whose correlations are mostly positive (14 of 16 cells, median +0.06), but the models were run on overlapping samples of household-windows, so the cells are not independent evidence. On the first sample the demographic regression itself has a rank correlation of -0.03 (interval -0.17 to +0.10); on the two further samples of 200 household-windows it reaches +0.19 and -0.02, which shows how much a single sample can move these correlations. Because the demographics predict the real count with a rank correlation of only 0.04 across all households, this result does not show that the models ignore information; it shows that these personas contain almost no information for any simulator to use. It is the empirical counterpart of Proposition 1: richer observable personas cannot supply the heterogeneity that counts contain.</w:t>
       </w:r>
     </w:p>
-    <w:bookmarkEnd w:id="46"/>
-    <w:bookmarkStart w:id="50" w:name="randomized-email-experiment"/>
+    <w:bookmarkEnd w:id="47"/>
+    <w:bookmarkStart w:id="51" w:name="randomized-email-experiment"/>
     <w:p>
       <w:pPr>
         <w:pStyle w:val="Heading2"/>
@@ -12802,18 +12934,18 @@
           <wp:inline>
             <wp:extent cx="5334000" cy="3710608"/>
             <wp:effectExtent b="0" l="0" r="0" t="0"/>
-            <wp:docPr descr="Figure 2. Absolute lift in the probability of a visit and of a purchase after a men’s email (elicited-probability design). Bars are 95% intervals; the dashed line and band are the real lift and its 95% interval. Note the logarithmic axis in panel b." title="" id="48" name="Picture"/>
+            <wp:docPr descr="Figure 2. Absolute lift in the probability of a visit and of a purchase after a men’s email (elicited-probability design). Bars are 95% intervals; the dashed line and band are the real lift and its 95% interval. Note the logarithmic axis in panel b." title="" id="49" name="Picture"/>
             <a:graphic>
               <a:graphicData uri="http://schemas.openxmlformats.org/drawingml/2006/picture">
                 <pic:pic>
                   <pic:nvPicPr>
-                    <pic:cNvPr descr="fig2_lift.png" id="49" name="Picture"/>
+                    <pic:cNvPr descr="fig2_lift.png" id="50" name="Picture"/>
                     <pic:cNvPicPr>
                       <a:picLocks noChangeArrowheads="1" noChangeAspect="1"/>
                     </pic:cNvPicPr>
                   </pic:nvPicPr>
                   <pic:blipFill>
-                    <a:blip r:embed="rId47"/>
+                    <a:blip r:embed="rId48"/>
                     <a:stretch>
                       <a:fillRect/>
                     </a:stretch>
@@ -12987,8 +13119,8 @@
         <w:t xml:space="preserve">for about half with one). The yes/no visit lifts range from -0.31 to +0.55, and the purchase lifts from +0.007 to +0.55, up to 80 times the real lift.</w:t>
       </w:r>
     </w:p>
-    <w:bookmarkEnd w:id="50"/>
-    <w:bookmarkStart w:id="51" w:name="summary-of-hypotheses"/>
+    <w:bookmarkEnd w:id="51"/>
+    <w:bookmarkStart w:id="52" w:name="summary-of-hypotheses"/>
     <w:p>
       <w:pPr>
         <w:pStyle w:val="Heading2"/>
@@ -13481,9 +13613,9 @@
         <w:t xml:space="preserve">Table 5. Hypotheses and evidence.</w:t>
       </w:r>
     </w:p>
-    <w:bookmarkEnd w:id="51"/>
     <w:bookmarkEnd w:id="52"/>
-    <w:bookmarkStart w:id="57" w:name="discussion"/>
+    <w:bookmarkEnd w:id="53"/>
+    <w:bookmarkStart w:id="59" w:name="discussion"/>
     <w:p>
       <w:pPr>
         <w:pStyle w:val="Heading1"/>
@@ -13492,7 +13624,7 @@
         <w:t xml:space="preserve">6. Discussion</w:t>
       </w:r>
     </w:p>
-    <w:bookmarkStart w:id="53" w:name="theoretical-contributions"/>
+    <w:bookmarkStart w:id="54" w:name="theoretical-contributions"/>
     <w:p>
       <w:pPr>
         <w:pStyle w:val="Heading2"/>
@@ -13602,8 +13734,34 @@
         <w:t xml:space="preserve">shows that errors in the simulated base rate and errors in the simulated lift are confounded in the risk ratio, and our data contain cases in which the two readings of the same output disagree.</w:t>
       </w:r>
     </w:p>
-    <w:bookmarkEnd w:id="53"/>
-    <w:bookmarkStart w:id="54" w:name="X65830c8ffcd303230289e3fa99b65d240227f6e"/>
+    <w:p>
+      <w:pPr>
+        <w:pStyle w:val="BodyText"/>
+      </w:pPr>
+      <w:r>
+        <w:t xml:space="preserve">A further implication concerns the limits of AI-based decision support and of the</w:t>
+      </w:r>
+      <w:r>
+        <w:t xml:space="preserve"> </w:t>
+      </w:r>
+      <w:r>
+        <w:t xml:space="preserve">“</w:t>
+      </w:r>
+      <w:r>
+        <w:t xml:space="preserve">digital twin</w:t>
+      </w:r>
+      <w:r>
+        <w:t xml:space="preserve">”</w:t>
+      </w:r>
+      <w:r>
+        <w:t xml:space="preserve"> </w:t>
+      </w:r>
+      <w:r>
+        <w:t xml:space="preserve">idea. A twin is usually understood as a replica that can stand in for the original in a decision. Our evidence supports a narrower reading. At the level of the individual customer, the demographic personas carried almost no information about real counts (rank correlations between -0.17 and +0.16), so a customer-level replica is not supported by these data. At the level of the population, the distribution of counts and the size of effects are reproduced only by designs in which the dispersion is supplied from outside the model and the level is checked against data. The claim that a simulated population is a twin of a real one is therefore a claim about specific properties, and it has to be tested property by property: the share of zeros, the spread, the tail, and the absolute size of an effect. We view this as the main point for information systems research on generative AI in decision support. Evaluation should be stated in terms of the decision-relevant properties of the artifact’s output, because fluency and aggregate plausibility, which are what users see, do not indicate them.</w:t>
+      </w:r>
+    </w:p>
+    <w:bookmarkEnd w:id="54"/>
+    <w:bookmarkStart w:id="55" w:name="X65830c8ffcd303230289e3fa99b65d240227f6e"/>
     <w:p>
       <w:pPr>
         <w:pStyle w:val="Heading2"/>
@@ -13635,7 +13793,7 @@
         <w:t xml:space="preserve"> </w:t>
       </w:r>
       <w:r>
-        <w:t xml:space="preserve">Take the expected rate of a customer from the model and take the dispersion across customers from an external, calibrated source (Proposition 2). Designs that let the model produce the spread itself collapsed, while the hybrid design matched the reference dispersion in 35 of 48 cells.</w:t>
+        <w:t xml:space="preserve">Take the expected rate of a customer from the model and take the dispersion across customers from an external, calibrated source (Proposition 2). In system terms this places a statistical calibration layer behind the language model, with the variance budget of Section 3.7 as its rule. Designs that let the model produce the spread itself collapsed, while the hybrid design matched the reference dispersion in 35 of 48 cells.</w:t>
       </w:r>
     </w:p>
     <w:p>
@@ -13718,8 +13876,8 @@
         <w:t xml:space="preserve">A further observation concerns use. The simulators’ output looked plausible: the sign of the promotion effect was right in nearly all cells, and the answers were fluent and well formed. Errors of the kind we document, such as a compressed spread or a tenfold lift, cannot be seen by inspecting the output, which is why an explicit evaluation protocol is needed before such a system is adopted for decisions.</w:t>
       </w:r>
     </w:p>
-    <w:bookmarkEnd w:id="54"/>
-    <w:bookmarkStart w:id="55" w:name="implications-for-practice"/>
+    <w:bookmarkEnd w:id="55"/>
+    <w:bookmarkStart w:id="56" w:name="implications-for-practice"/>
     <w:p>
       <w:pPr>
         <w:pStyle w:val="Heading2"/>
@@ -13865,14 +14023,140 @@
         <w:t xml:space="preserve">The consequence for a decision can be shown in a stylized example. A firm launches a promotion if the expected gain per targeted customer exceeds its cost, that is, if the lift in purchase probability exceeds the ratio of cost to margin. Suppose a promotion costs 1 monetary unit per targeted customer and each purchase earns a margin of 50, so the ratio is 0.02. The real lift in purchase probability from the men’s email was 0.0068, below 0.02, so the randomized test says not to launch. The simulated lift exceeded 0.02 in 13 of the 16 configurations (the median was 0.065, and the real value was exceeded in 15), so a firm that relied on those simulators would have launched. The stylized numbers are ours and are not taken from the retailer, and the email test does not involve a discount, but the example shows how an overstated absolute lift turns directly into a wrong go decision.</w:t>
       </w:r>
     </w:p>
-    <w:bookmarkEnd w:id="55"/>
-    <w:bookmarkStart w:id="56" w:name="limitations-and-future-research"/>
+    <w:bookmarkEnd w:id="56"/>
+    <w:bookmarkStart w:id="57" w:name="X94616b3a30dccc1fe21684587130f01609b39ab"/>
     <w:p>
       <w:pPr>
         <w:pStyle w:val="Heading2"/>
       </w:pPr>
       <w:r>
-        <w:t xml:space="preserve">6.4 Limitations and future research</w:t>
+        <w:t xml:space="preserve">6.4 Organizational implications: validating and using synthetic data in marketing analytics systems</w:t>
+      </w:r>
+    </w:p>
+    <w:p>
+      <w:pPr>
+        <w:pStyle w:val="FirstParagraph"/>
+      </w:pPr>
+      <w:r>
+        <w:t xml:space="preserve">The findings have implications for how organizations that run marketing analytics systems should treat synthetic customers. We state them as recommendations that follow from our evidence and from the artifact view; we did not test them in an organization.</w:t>
+      </w:r>
+    </w:p>
+    <w:p>
+      <w:pPr>
+        <w:pStyle w:val="BodyText"/>
+      </w:pPr>
+      <w:r>
+        <w:rPr>
+          <w:iCs/>
+          <w:i/>
+        </w:rPr>
+        <w:t xml:space="preserve">Treat validation as an acceptance gate, not an afterthought.</w:t>
+      </w:r>
+      <w:r>
+        <w:t xml:space="preserve"> </w:t>
+      </w:r>
+      <w:r>
+        <w:t xml:space="preserve">Before synthetic customers enter a planning process, the system should pass a standing acceptance test against the organization’s own history: level, variance-to-mean ratio, zero share, and, where a past randomized test exists, the absolute lift. The reference values come from the customer file and the experiment archive that the marketing analytics team already holds. This puts a concrete interface between two functions. The marketing team owns the reference data and the decision requirements, and the information systems team owns the pipeline, the model versions, and the calibration step.</w:t>
+      </w:r>
+    </w:p>
+    <w:p>
+      <w:pPr>
+        <w:pStyle w:val="BodyText"/>
+      </w:pPr>
+      <w:r>
+        <w:rPr>
+          <w:iCs/>
+          <w:i/>
+        </w:rPr>
+        <w:t xml:space="preserve">Re-validate when the model changes.</w:t>
+      </w:r>
+      <w:r>
+        <w:t xml:space="preserve"> </w:t>
+      </w:r>
+      <w:r>
+        <w:t xml:space="preserve">The eight models we tested differed widely in the same design, for example in the mean they implied and in how they reacted to a stated base rate, and the same model reacted differently to different prompt context. A vendor update or a switch of model or provider should therefore trigger the acceptance test again, in the same way that a schema change triggers regression tests in other systems. The same applies to changes in the prompt template.</w:t>
+      </w:r>
+    </w:p>
+    <w:p>
+      <w:pPr>
+        <w:pStyle w:val="BodyText"/>
+      </w:pPr>
+      <w:r>
+        <w:rPr>
+          <w:iCs/>
+          <w:i/>
+        </w:rPr>
+        <w:t xml:space="preserve">Use synthetic data where its errors do the least harm.</w:t>
+      </w:r>
+      <w:r>
+        <w:t xml:space="preserve"> </w:t>
+      </w:r>
+      <w:r>
+        <w:t xml:space="preserve">The designs we studied reproduced the sign of a promotion effect in nearly all cases, but not its size. Synthetic customers are therefore better suited to screening and ranking options, or to generating hypotheses, than to sizing a campaign or computing revenue. A randomized holdout test remains the standard for the latter, and the stylized example in Section 6.3 shows what is at risk if that standard is skipped.</w:t>
+      </w:r>
+    </w:p>
+    <w:p>
+      <w:pPr>
+        <w:pStyle w:val="BodyText"/>
+      </w:pPr>
+      <w:r>
+        <w:rPr>
+          <w:iCs/>
+          <w:i/>
+        </w:rPr>
+        <w:t xml:space="preserve">Keep synthetic data separate from real data.</w:t>
+      </w:r>
+      <w:r>
+        <w:t xml:space="preserve"> </w:t>
+      </w:r>
+      <w:r>
+        <w:t xml:space="preserve">Synthetic records that share a schema with customer records can end up in dashboards, forecasts, or training sets for other models, where their compressed spread is no longer visible. Provenance labels, separate storage, and a rule against pooling synthetic and real records in estimation are inexpensive safeguards. We did not study this risk empirically; it follows from the finding that the spread is the property that is lost.</w:t>
+      </w:r>
+    </w:p>
+    <w:p>
+      <w:pPr>
+        <w:pStyle w:val="BodyText"/>
+      </w:pPr>
+      <w:r>
+        <w:rPr>
+          <w:iCs/>
+          <w:i/>
+        </w:rPr>
+        <w:t xml:space="preserve">Weigh the savings against the cost of a wrong decision.</w:t>
+      </w:r>
+      <w:r>
+        <w:t xml:space="preserve"> </w:t>
+      </w:r>
+      <w:r>
+        <w:t xml:space="preserve">The runs themselves are cheap: about 25,600 calls cost under one US dollar with the least expensive models and about eleven US dollars with the most expensive of the four we priced, at list prices at the time of our runs. The relevant cost is therefore not the simulation but the decision made on its output, and the governance effort should be proportional to the value of that decision.</w:t>
+      </w:r>
+    </w:p>
+    <w:p>
+      <w:pPr>
+        <w:pStyle w:val="BodyText"/>
+      </w:pPr>
+      <w:r>
+        <w:rPr>
+          <w:iCs/>
+          <w:i/>
+        </w:rPr>
+        <w:t xml:space="preserve">Build the loop that corrects the system.</w:t>
+      </w:r>
+      <w:r>
+        <w:t xml:space="preserve"> </w:t>
+      </w:r>
+      <w:r>
+        <w:t xml:space="preserve">Each randomized test that the organization runs is also a calibration data point for its simulator. A system that stores the simulated and the realized lift for each past campaign can track its own bias over time and adjust the calibration step, which turns an occasional validation into a continuing feedback process.</w:t>
+      </w:r>
+    </w:p>
+    <w:bookmarkEnd w:id="57"/>
+    <w:bookmarkStart w:id="58" w:name="limitations-and-future-research"/>
+    <w:p>
+      <w:pPr>
+        <w:pStyle w:val="Heading2"/>
+      </w:pPr>
+      <w:r>
+        <w:t xml:space="preserve">6.5 Limitations and future research</w:t>
       </w:r>
     </w:p>
     <w:p>
@@ -13918,9 +14202,9 @@
         <w:t xml:space="preserve">), so that test marks the limit of observable personas rather than a limit of particular models; settings in which observable attributes, such as purchase histories, are more predictive of purchase frequency would be a stronger test of Proposition 1. In the Complete Journey data campaigns were targeted rather than randomized, so only the email experiment supports a causal comparison. Design C truncates its top bin, which lowers the dispersion it can reach; we quantified this ceiling but did not remove it. Public data may also be part of the models’ training data. Future work should evaluate the hybrid design with a calibrated mean, test prompts that elicit several candidate answers with probabilities, and use a randomized promotion data set with purchase counts, for example from a partner firm, so that the count-distribution and treatment-effect questions can be studied on the same customers.</w:t>
       </w:r>
     </w:p>
-    <w:bookmarkEnd w:id="56"/>
-    <w:bookmarkEnd w:id="57"/>
-    <w:bookmarkStart w:id="58" w:name="conclusion"/>
+    <w:bookmarkEnd w:id="58"/>
+    <w:bookmarkEnd w:id="59"/>
+    <w:bookmarkStart w:id="60" w:name="conclusion"/>
     <w:p>
       <w:pPr>
         <w:pStyle w:val="Heading1"/>
@@ -13937,8 +14221,8 @@
         <w:t xml:space="preserve">Synthetic customers built from language models do not yet reproduce the shape of real purchase-count distributions or the size of real promotion effects. Direct and day-by-day designs collapse toward a single value whether the mean is 0.5, 4.8, or 7.8, and larger, more recent models do not change this; describing a distribution repairs part of the damage but loses zeros; and a hybrid that takes only the mean from the model matches the dispersion when that mean is accurate. In a randomized email test the models usually get the sign of the effect right, but the absolute lift in purchase probability is overstated in 15 of 16 configurations and similar treatments are not told apart. Practitioners who use synthetic customers should check dispersion and zero share against their own data, rely on the model for means only, and validate absolute effects before they act on them. For the design of such systems, the evidence points to separating the level, which the model can supply, from the spread, which must come from an external calibrated source, and to evaluating the artifact against the decision it is meant to support.</w:t>
       </w:r>
     </w:p>
-    <w:bookmarkEnd w:id="58"/>
-    <w:bookmarkStart w:id="59" w:name="references"/>
+    <w:bookmarkEnd w:id="60"/>
+    <w:bookmarkStart w:id="61" w:name="references"/>
     <w:p>
       <w:pPr>
         <w:pStyle w:val="Heading1"/>
@@ -14154,6 +14438,30 @@
         <w:pStyle w:val="BodyText"/>
       </w:pPr>
       <w:r>
+        <w:t xml:space="preserve">Dellermann D, Ebel P, Söllner M, Leimeister JM (2019) Hybrid intelligence.</w:t>
+      </w:r>
+      <w:r>
+        <w:t xml:space="preserve"> </w:t>
+      </w:r>
+      <w:r>
+        <w:rPr>
+          <w:iCs/>
+          <w:i/>
+        </w:rPr>
+        <w:t xml:space="preserve">Bus. Inform. Systems Engrg.</w:t>
+      </w:r>
+      <w:r>
+        <w:t xml:space="preserve"> </w:t>
+      </w:r>
+      <w:r>
+        <w:t xml:space="preserve">61(5):637–643.</w:t>
+      </w:r>
+    </w:p>
+    <w:p>
+      <w:pPr>
+        <w:pStyle w:val="BodyText"/>
+      </w:pPr>
+      <w:r>
         <w:t xml:space="preserve">Hevner AR, March ST, Park J, Ram S (2004) Design science in information systems research.</w:t>
       </w:r>
       <w:r>
@@ -14308,7 +14616,23 @@
         <w:pStyle w:val="BodyText"/>
       </w:pPr>
       <w:r>
-        <w:t xml:space="preserve">Tigre R, Souto HG (2026) When can you trust your synthetic users? Diagnostics and corrections for LLM consumer panels. Preprint, submitted June 3, arXiv:2609.13148.</w:t>
+        <w:t xml:space="preserve">Lee JD, See KA (2004) Trust in automation: Designing for appropriate reliance.</w:t>
+      </w:r>
+      <w:r>
+        <w:t xml:space="preserve"> </w:t>
+      </w:r>
+      <w:r>
+        <w:rPr>
+          <w:iCs/>
+          <w:i/>
+        </w:rPr>
+        <w:t xml:space="preserve">Human Factors</w:t>
+      </w:r>
+      <w:r>
+        <w:t xml:space="preserve"> </w:t>
+      </w:r>
+      <w:r>
+        <w:t xml:space="preserve">46(1):50–80.</w:t>
       </w:r>
     </w:p>
     <w:p>
@@ -14316,7 +14640,7 @@
         <w:pStyle w:val="BodyText"/>
       </w:pPr>
       <w:r>
-        <w:t xml:space="preserve">Zhang J, Yu S, Chong D, et al. (2025a) Verbalized sampling: How to mitigate mode collapse and unlock LLM diversity. Preprint, submitted October 1, arXiv:2510.01171.</w:t>
+        <w:t xml:space="preserve">Tigre R, Souto HG (2026) When can you trust your synthetic users? Diagnostics and corrections for LLM consumer panels. Preprint, submitted June 3, arXiv:2609.13148.</w:t>
       </w:r>
     </w:p>
     <w:p>
@@ -14324,11 +14648,43 @@
         <w:pStyle w:val="BodyText"/>
       </w:pPr>
       <w:r>
+        <w:t xml:space="preserve">Wedel M, Kannan PK (2016) Marketing analytics for data-rich environments.</w:t>
+      </w:r>
+      <w:r>
+        <w:t xml:space="preserve"> </w:t>
+      </w:r>
+      <w:r>
+        <w:rPr>
+          <w:iCs/>
+          <w:i/>
+        </w:rPr>
+        <w:t xml:space="preserve">J. Marketing</w:t>
+      </w:r>
+      <w:r>
+        <w:t xml:space="preserve"> </w:t>
+      </w:r>
+      <w:r>
+        <w:t xml:space="preserve">80(6):97–121.</w:t>
+      </w:r>
+    </w:p>
+    <w:p>
+      <w:pPr>
+        <w:pStyle w:val="BodyText"/>
+      </w:pPr>
+      <w:r>
+        <w:t xml:space="preserve">Zhang J, Yu S, Chong D, et al. (2025a) Verbalized sampling: How to mitigate mode collapse and unlock LLM diversity. Preprint, submitted October 1, arXiv:2510.01171.</w:t>
+      </w:r>
+    </w:p>
+    <w:p>
+      <w:pPr>
+        <w:pStyle w:val="BodyText"/>
+      </w:pPr>
+      <w:r>
         <w:t xml:space="preserve">Zhang R, Zhang X, Zhao M (2025b) Predicting effects, missing distributions: Evaluating LLMs as human behavior simulators in operations management. Preprint, submitted September 30, arXiv:2510.03310.</w:t>
       </w:r>
     </w:p>
-    <w:bookmarkEnd w:id="59"/>
-    <w:bookmarkStart w:id="60" w:name="appendix-a.-prompt-templates"/>
+    <w:bookmarkEnd w:id="61"/>
+    <w:bookmarkStart w:id="62" w:name="appendix-a.-prompt-templates"/>
     <w:p>
       <w:pPr>
         <w:pStyle w:val="Heading1"/>
@@ -14505,8 +14861,8 @@
         <w:t xml:space="preserve">”</w:t>
       </w:r>
     </w:p>
-    <w:bookmarkEnd w:id="60"/>
-    <w:bookmarkStart w:id="61" w:name="appendix-b.-full-results"/>
+    <w:bookmarkEnd w:id="62"/>
+    <w:bookmarkStart w:id="63" w:name="appendix-b.-full-results"/>
     <w:p>
       <w:pPr>
         <w:pStyle w:val="Heading1"/>
@@ -39949,8 +40305,8 @@
         <w:t xml:space="preserve">Table B3. Persona experiment with real household demographics, 200 households per cell. Reference row: real distribution of the 801 households (10,413 household-windows). * the 95% bootstrap interval excludes the reference value.</w:t>
       </w:r>
     </w:p>
-    <w:bookmarkEnd w:id="61"/>
-    <w:bookmarkStart w:id="62" w:name="appendix-c.-reproducibility"/>
+    <w:bookmarkEnd w:id="63"/>
+    <w:bookmarkStart w:id="64" w:name="appendix-c.-reproducibility"/>
     <w:p>
       <w:pPr>
         <w:pStyle w:val="Heading1"/>
@@ -39988,7 +40344,7 @@
         <w:t xml:space="preserve">). Raw model responses are saved with each run. Household-level Complete Journey data are not redistributed; the code reads them from the public package files.</w:t>
       </w:r>
     </w:p>
-    <w:bookmarkEnd w:id="62"/>
+    <w:bookmarkEnd w:id="64"/>
     <w:sectPr/>
   </w:body>
 </w:document>

</xml_diff>

<commit_message>
Manuscript: theory deepening (Section 3.8, Proposition 3), cost-of-uncritical-trust section; concentration.py
Co-Authored-By: Claude Sonnet 5.5 <noreply@anthropic.com>
Claude-Session: https://claude.ai/code/session_01VRbK37d38KZhVAbWS4xw4x
</commit_message>
<xml_diff>
--- a/llm-count-study/ISR_manuscript_draft.docx
+++ b/llm-count-study/ISR_manuscript_draft.docx
@@ -51,7 +51,7 @@
         <w:pStyle w:val="BodyText"/>
       </w:pPr>
       <w:r>
-        <w:t xml:space="preserve">Large language models (LLMs) are increasingly used to create synthetic customers for pre-testing marketing decisions, but evaluations have concentrated on ratings, choices, and stated willingness to pay. We study an output that customer analytics depends on more directly: the number of purchases a customer makes in a period. Building on the Poisson–gamma account of purchase counts, we show analytically that overdispersion measures unobserved customer heterogeneity, derive how much of it a persona-conditioned simulator can carry, and show how a hybrid design avoids double counting. We evaluate four elicitation designs across eight LLMs in public transaction settings (mean counts of about 0.5, 4.8, and 7.8) and in a randomized email experiment. Direct and day-by-day designs collapse toward a single value in nearly every model and setting, and larger, more recent models do not change this. Describing a distribution recovers part of the dispersion but under-produces zero counts where zeros are common. Personas built from real household demographics change nothing, because those demographics explain about 1% of the heterogeneity in counts. The hybrid matches dispersion only when the model’s mean is accurate. Promotion effects have the right sign in most settings, yet their size varies by an order of magnitude with model and prompt, and the absolute lift in purchase probability is overstated in 15 of 16 configurations (median about tenfold). Treating the simulator as a decision-support artifact at the interface of information systems and marketing analytics, we read the two propositions as design constraints and a calibration mechanism, derive design principles and an evaluation protocol, and show that the overstated lifts would lead a firm to approve promotions that a randomized test rejects. We close with organizational implications for validating and governing synthetic data in analytics systems.</w:t>
+        <w:t xml:space="preserve">Large language models (LLMs) are increasingly used to create synthetic customers for pre-testing marketing decisions, but evaluations have concentrated on ratings, choices, and stated willingness to pay. We study an output that customer analytics depends on more directly: the number of purchases a customer makes in a period. Building on the Poisson–gamma account of purchase counts, we show analytically that overdispersion measures unobserved customer heterogeneity, derive how much of it a persona-conditioned simulator can carry, and show how a hybrid design avoids double counting. We evaluate four elicitation designs across eight LLMs in public transaction settings (mean counts of about 0.5, 4.8, and 7.8) and in a randomized email experiment. Direct and day-by-day designs collapse toward a single value in nearly every model and setting, and larger, more recent models do not change this. Describing a distribution recovers part of the dispersion but under-produces zero counts where zeros are common. Personas built from real household demographics change nothing, because those demographics explain about 1% of the heterogeneity in counts. The hybrid matches dispersion only when the model’s mean is accurate. Promotion effects have the right sign in most settings, yet their size varies by an order of magnitude with model and prompt, and the absolute lift in purchase probability is overstated in 15 of 16 configurations (median about tenfold). Treating the simulator as a decision-support artifact at the interface of information systems and marketing analytics, we show why the Poisson–gamma result becomes a managerial problem when heterogeneity is generated instead of estimated, read the propositions as design constraints and a calibration mechanism, derive design principles and an evaluation protocol, and show that the overstated lifts would lead a firm to approve promotions that a randomized test rejects. We close with organizational implications for validating and governing synthetic data in analytics systems.</w:t>
       </w:r>
     </w:p>
     <w:p>
@@ -170,7 +170,7 @@
         <w:pStyle w:val="BodyText"/>
       </w:pPr>
       <w:r>
-        <w:t xml:space="preserve">The study makes four contributions. First, we give a short analytical account of how much heterogeneity a persona-conditioned simulator can carry, and of how an externally injected heterogeneity term must be calibrated to avoid double counting (Propositions 1 and 2). Second, we provide evidence across designs, models, and settings that direct and day-by-day designs collapse, that describing a distribution only partly repairs the problem, and that a hybrid design reproduces dispersion only when the model supplies an accurate mean. Third, in the experimental setting we show that relative and absolute effects can tell different stories when the simulated base rate is wrong, and that the absolute lift in purchase probability is overstated in 15 of the 16 configurations we tested. Fourth, we translate these findings into design principles for synthetic-customer systems and a diagnostic evaluation protocol, and we show in a stylized example how the overstated lifts would change a go/no-go decision.</w:t>
+        <w:t xml:space="preserve">The study makes five contributions. First, we give a short analytical account of how much heterogeneity a persona-conditioned simulator can carry, and of how an externally injected heterogeneity term must be calibrated to avoid double counting (Propositions 1 and 2). Second, we provide evidence across designs, models, and settings that direct and day-by-day designs collapse, that describing a distribution only partly repairs the problem, and that a hybrid design reproduces dispersion only when the model supplies an accurate mean. Third, in the experimental setting we show that relative and absolute effects can tell different stories when the simulated base rate is wrong, and that the absolute lift in purchase probability is overstated in 15 of the 16 configurations we tested. Fourth, we explain why a familiar statistical result becomes a new managerial problem when behavior is generated rather than estimated (a bound set by the firm’s data assets, a validation paradox, silent failure, and shifting components), and we add a result on customer concentration (Proposition 3). Fifth, we translate these findings into design principles for synthetic-customer systems and a diagnostic evaluation protocol, and we show in a stylized example how the overstated lifts would change a go/no-go decision.</w:t>
       </w:r>
     </w:p>
     <w:p>
@@ -300,7 +300,7 @@
     </w:p>
     <w:bookmarkEnd w:id="25"/>
     <w:bookmarkEnd w:id="26"/>
-    <w:bookmarkStart w:id="34" w:name="theoretical-framework-and-hypotheses"/>
+    <w:bookmarkStart w:id="35" w:name="theoretical-framework-and-hypotheses"/>
     <w:p>
       <w:pPr>
         <w:pStyle w:val="Heading1"/>
@@ -3475,8 +3475,988 @@
       </w:r>
     </w:p>
     <w:bookmarkEnd w:id="33"/>
+    <w:bookmarkStart w:id="34" w:name="X407dae61d11665e7490932e0ac85ab0ce53a5fe"/>
+    <w:p>
+      <w:pPr>
+        <w:pStyle w:val="Heading2"/>
+      </w:pPr>
+      <w:r>
+        <w:t xml:space="preserve">3.8 Why a familiar statistic becomes a managerial problem</w:t>
+      </w:r>
+    </w:p>
+    <w:p>
+      <w:pPr>
+        <w:pStyle w:val="FirstParagraph"/>
+      </w:pPr>
+      <w:r>
+        <w:t xml:space="preserve">Propositions 1 and 2 follow from the Poisson–gamma model, and a reader may ask whether they say anything beyond it. The model is not new. What is new is the setting in which its implication becomes a problem for organizations, and we argue that it changes in four ways when behavior is generated by a language model instead of estimated from data.</w:t>
+      </w:r>
+    </w:p>
+    <w:p>
+      <w:pPr>
+        <w:pStyle w:val="BodyText"/>
+      </w:pPr>
+      <w:r>
+        <w:rPr>
+          <w:iCs/>
+          <w:i/>
+        </w:rPr>
+        <w:t xml:space="preserve">From estimated to generated heterogeneity.</w:t>
+      </w:r>
+      <w:r>
+        <w:t xml:space="preserve"> </w:t>
+      </w:r>
+      <w:r>
+        <w:t xml:space="preserve">In the stochastic customer-base models of marketing science, heterogeneity is a latent quantity that the analyst infers from observed behavior, so its magnitude is disciplined by the organization’s own data. In a synthetic-customer system behavior is generated by a pretrained model, and nothing in the generation process ties the spread of the output to the organization’s customers. Proposition 1 shows that this tie cannot be restored through the prompt: a deterministic function of the persona carries only the heterogeneity that the persona describes, and no rewording, persona enrichment, or choice of model changes the bound</w:t>
+      </w:r>
+      <w:r>
+        <w:t xml:space="preserve"> </w:t>
+      </w:r>
+      <m:oMath>
+        <m:sSup>
+          <m:e>
+            <m:r>
+              <m:t>α</m:t>
+            </m:r>
+          </m:e>
+          <m:sup>
+            <m:r>
+              <m:rPr>
+                <m:sty m:val="p"/>
+              </m:rPr>
+              <m:t>*</m:t>
+            </m:r>
+          </m:sup>
+        </m:sSup>
+        <m:r>
+          <m:rPr>
+            <m:sty m:val="p"/>
+          </m:rPr>
+          <m:t>=</m:t>
+        </m:r>
+        <m:sSup>
+          <m:e>
+            <m:r>
+              <m:t>c</m:t>
+            </m:r>
+          </m:e>
+          <m:sup>
+            <m:r>
+              <m:t>2</m:t>
+            </m:r>
+          </m:sup>
+        </m:sSup>
+        <m:r>
+          <m:rPr>
+            <m:sty m:val="p"/>
+          </m:rPr>
+          <m:t>−</m:t>
+        </m:r>
+        <m:r>
+          <m:t>1</m:t>
+        </m:r>
+        <m:r>
+          <m:rPr>
+            <m:sty m:val="p"/>
+          </m:rPr>
+          <m:t>/</m:t>
+        </m:r>
+        <m:r>
+          <m:t>μ</m:t>
+        </m:r>
+      </m:oMath>
+      <w:r>
+        <w:t xml:space="preserve">. The spread is therefore a property of the system’s architecture rather than of its inputs, and it has to be supplied by a component that is connected to data.</w:t>
+      </w:r>
+    </w:p>
+    <w:p>
+      <w:pPr>
+        <w:pStyle w:val="BodyText"/>
+      </w:pPr>
+      <w:r>
+        <w:rPr>
+          <w:iCs/>
+          <w:i/>
+        </w:rPr>
+        <w:t xml:space="preserve">A bound set by the organization’s data assets.</w:t>
+      </w:r>
+      <w:r>
+        <w:t xml:space="preserve"> </w:t>
+      </w:r>
+      <w:r>
+        <w:t xml:space="preserve">Proposition 1 also says where the limit lies. The share of heterogeneity a simulator can carry is the share explained by the persona, and the persona can contain only what the organization knows about its customers. In our demographic experiment that share was about 1%. This is a statement of complementarity between a generative model and the firm’s data assets, a theme familiar from research on IT business value (Melville et al. 2004), with a sharp form: more capable models cannot compensate for uninformative customer data, and the value of a synthetic-customer system is bounded by the explanatory power of first-party data. A common managerial assumption is the opposite, namely that a more capable model will substitute for the missing data.</w:t>
+      </w:r>
+    </w:p>
+    <w:p>
+      <w:pPr>
+        <w:pStyle w:val="BodyText"/>
+      </w:pPr>
+      <w:r>
+        <w:rPr>
+          <w:iCs/>
+          <w:i/>
+        </w:rPr>
+        <w:t xml:space="preserve">The validation paradox.</w:t>
+      </w:r>
+      <w:r>
+        <w:t xml:space="preserve"> </w:t>
+      </w:r>
+      <w:r>
+        <w:t xml:space="preserve">Synthetic customers are adopted where real data are scarce or costly. Yet the quantity that Proposition 1 shows to be lost, the unexplained part</w:t>
+      </w:r>
+      <w:r>
+        <w:t xml:space="preserve"> </w:t>
+      </w:r>
+      <m:oMath>
+        <m:r>
+          <m:t>R</m:t>
+        </m:r>
+      </m:oMath>
+      <w:r>
+        <w:t xml:space="preserve"> </w:t>
+      </w:r>
+      <w:r>
+        <w:t xml:space="preserve">of the heterogeneity, is invisible inside the system and can be detected only against real data on the same distributional properties. The evidence that would reveal the error is the evidence the system was meant to economize. This is a validation paradox. It is resolved only by partial validation, in which a small amount of real data, such as a historical customer file and a few past randomized tests, is used to calibrate and audit a large amount of synthetic data. Proposition 2 provides the calibration step for such an arrangement.</w:t>
+      </w:r>
+    </w:p>
+    <w:p>
+      <w:pPr>
+        <w:pStyle w:val="BodyText"/>
+      </w:pPr>
+      <w:r>
+        <w:rPr>
+          <w:iCs/>
+          <w:i/>
+        </w:rPr>
+        <w:t xml:space="preserve">Silent failure and shifting components.</w:t>
+      </w:r>
+      <w:r>
+        <w:t xml:space="preserve"> </w:t>
+      </w:r>
+      <w:r>
+        <w:t xml:space="preserve">Output that is fluent and has the right sign gives the user no signal of failure. A compressed spread does not show up in a mean or in a headline result, and a decision that is wrong because of it, such as a launch that does not pay, becomes visible only after several campaign cycles, if at all. In addition the component that generates the behavior is outside the organization’s control. Model versions and providers change, and in our runs eight models produced very different levels and spreads for the same prompt. Whereas a statistical model that the organization owns is calibrated once, a model that the organization rents has to be re-validated whenever it changes, which makes validation a continuing governance task.</w:t>
+      </w:r>
+    </w:p>
+    <w:p>
+      <w:pPr>
+        <w:pStyle w:val="BodyText"/>
+      </w:pPr>
+      <w:r>
+        <w:t xml:space="preserve">The consequence of a lost spread is not limited to a statistical summary. It affects decisions that depend on concentration, as the following result shows.</w:t>
+      </w:r>
+    </w:p>
+    <w:p>
+      <w:pPr>
+        <w:pStyle w:val="BodyText"/>
+      </w:pPr>
+      <w:r>
+        <w:rPr>
+          <w:bCs/>
+          <w:b/>
+        </w:rPr>
+        <w:t xml:space="preserve">Proposition 3 (concentration).</w:t>
+      </w:r>
+      <w:r>
+        <w:t xml:space="preserve"> </w:t>
+      </w:r>
+      <w:r>
+        <w:t xml:space="preserve">Let customer rates be gamma distributed with mean</w:t>
+      </w:r>
+      <w:r>
+        <w:t xml:space="preserve"> </w:t>
+      </w:r>
+      <m:oMath>
+        <m:r>
+          <m:t>μ</m:t>
+        </m:r>
+      </m:oMath>
+      <w:r>
+        <w:t xml:space="preserve"> </w:t>
+      </w:r>
+      <w:r>
+        <w:t xml:space="preserve">and squared coefficient of variation</w:t>
+      </w:r>
+      <w:r>
+        <w:t xml:space="preserve"> </w:t>
+      </w:r>
+      <m:oMath>
+        <m:r>
+          <m:t>α</m:t>
+        </m:r>
+      </m:oMath>
+      <w:r>
+        <w:t xml:space="preserve">, and let</w:t>
+      </w:r>
+      <w:r>
+        <w:t xml:space="preserve"> </w:t>
+      </w:r>
+      <m:oMath>
+        <m:sSub>
+          <m:e>
+            <m:r>
+              <m:t>S</m:t>
+            </m:r>
+          </m:e>
+          <m:sub>
+            <m:r>
+              <m:t>q</m:t>
+            </m:r>
+          </m:sub>
+        </m:sSub>
+        <m:d>
+          <m:dPr>
+            <m:begChr m:val="("/>
+            <m:endChr m:val=")"/>
+            <m:sepChr m:val=""/>
+            <m:grow/>
+          </m:dPr>
+          <m:e>
+            <m:r>
+              <m:t>α</m:t>
+            </m:r>
+          </m:e>
+        </m:d>
+      </m:oMath>
+      <w:r>
+        <w:t xml:space="preserve"> </w:t>
+      </w:r>
+      <w:r>
+        <w:t xml:space="preserve">denote the share of all expected purchases made by the fraction</w:t>
+      </w:r>
+      <w:r>
+        <w:t xml:space="preserve"> </w:t>
+      </w:r>
+      <m:oMath>
+        <m:r>
+          <m:t>q</m:t>
+        </m:r>
+      </m:oMath>
+      <w:r>
+        <w:t xml:space="preserve"> </w:t>
+      </w:r>
+      <w:r>
+        <w:t xml:space="preserve">of customers with the highest rates. With shape</w:t>
+      </w:r>
+      <w:r>
+        <w:t xml:space="preserve"> </w:t>
+      </w:r>
+      <m:oMath>
+        <m:r>
+          <m:t>k</m:t>
+        </m:r>
+        <m:r>
+          <m:rPr>
+            <m:sty m:val="p"/>
+          </m:rPr>
+          <m:t>=</m:t>
+        </m:r>
+        <m:r>
+          <m:t>1</m:t>
+        </m:r>
+        <m:r>
+          <m:rPr>
+            <m:sty m:val="p"/>
+          </m:rPr>
+          <m:t>/</m:t>
+        </m:r>
+        <m:r>
+          <m:t>α</m:t>
+        </m:r>
+      </m:oMath>
+      <w:r>
+        <w:t xml:space="preserve">,</w:t>
+      </w:r>
+      <w:r>
+        <w:t xml:space="preserve"> </w:t>
+      </w:r>
+      <m:oMath>
+        <m:sSub>
+          <m:e>
+            <m:r>
+              <m:t>S</m:t>
+            </m:r>
+          </m:e>
+          <m:sub>
+            <m:r>
+              <m:t>q</m:t>
+            </m:r>
+          </m:sub>
+        </m:sSub>
+        <m:d>
+          <m:dPr>
+            <m:begChr m:val="("/>
+            <m:endChr m:val=")"/>
+            <m:sepChr m:val=""/>
+            <m:grow/>
+          </m:dPr>
+          <m:e>
+            <m:r>
+              <m:t>α</m:t>
+            </m:r>
+          </m:e>
+        </m:d>
+        <m:r>
+          <m:rPr>
+            <m:sty m:val="p"/>
+          </m:rPr>
+          <m:t>=</m:t>
+        </m:r>
+        <m:r>
+          <m:t>1</m:t>
+        </m:r>
+        <m:r>
+          <m:rPr>
+            <m:sty m:val="p"/>
+          </m:rPr>
+          <m:t>−</m:t>
+        </m:r>
+        <m:sSub>
+          <m:e>
+            <m:r>
+              <m:t>F</m:t>
+            </m:r>
+          </m:e>
+          <m:sub>
+            <m:r>
+              <m:t>k</m:t>
+            </m:r>
+            <m:r>
+              <m:rPr>
+                <m:sty m:val="p"/>
+              </m:rPr>
+              <m:t>+</m:t>
+            </m:r>
+            <m:r>
+              <m:t>1</m:t>
+            </m:r>
+          </m:sub>
+        </m:sSub>
+        <m:d>
+          <m:dPr>
+            <m:begChr m:val="("/>
+            <m:endChr m:val=")"/>
+            <m:sepChr m:val=""/>
+            <m:grow/>
+          </m:dPr>
+          <m:e>
+            <m:sSubSup>
+              <m:e>
+                <m:r>
+                  <m:t>F</m:t>
+                </m:r>
+              </m:e>
+              <m:sub>
+                <m:r>
+                  <m:t>k</m:t>
+                </m:r>
+              </m:sub>
+              <m:sup>
+                <m:r>
+                  <m:rPr>
+                    <m:sty m:val="p"/>
+                  </m:rPr>
+                  <m:t>−</m:t>
+                </m:r>
+                <m:r>
+                  <m:t>1</m:t>
+                </m:r>
+              </m:sup>
+            </m:sSubSup>
+            <m:d>
+              <m:dPr>
+                <m:begChr m:val="("/>
+                <m:endChr m:val=")"/>
+                <m:sepChr m:val=""/>
+                <m:grow/>
+              </m:dPr>
+              <m:e>
+                <m:r>
+                  <m:t>1</m:t>
+                </m:r>
+                <m:r>
+                  <m:rPr>
+                    <m:sty m:val="p"/>
+                  </m:rPr>
+                  <m:t>−</m:t>
+                </m:r>
+                <m:r>
+                  <m:t>q</m:t>
+                </m:r>
+              </m:e>
+            </m:d>
+          </m:e>
+        </m:d>
+      </m:oMath>
+      <w:r>
+        <w:t xml:space="preserve">, where</w:t>
+      </w:r>
+      <w:r>
+        <w:t xml:space="preserve"> </w:t>
+      </w:r>
+      <m:oMath>
+        <m:sSub>
+          <m:e>
+            <m:r>
+              <m:t>F</m:t>
+            </m:r>
+          </m:e>
+          <m:sub>
+            <m:r>
+              <m:t>k</m:t>
+            </m:r>
+          </m:sub>
+        </m:sSub>
+      </m:oMath>
+      <w:r>
+        <w:t xml:space="preserve"> </w:t>
+      </w:r>
+      <w:r>
+        <w:t xml:space="preserve">is the gamma distribution function with shape</w:t>
+      </w:r>
+      <w:r>
+        <w:t xml:space="preserve"> </w:t>
+      </w:r>
+      <m:oMath>
+        <m:r>
+          <m:t>k</m:t>
+        </m:r>
+      </m:oMath>
+      <w:r>
+        <w:t xml:space="preserve"> </w:t>
+      </w:r>
+      <w:r>
+        <w:t xml:space="preserve">and unit scale.</w:t>
+      </w:r>
+      <w:r>
+        <w:t xml:space="preserve"> </w:t>
+      </w:r>
+      <m:oMath>
+        <m:sSub>
+          <m:e>
+            <m:r>
+              <m:t>S</m:t>
+            </m:r>
+          </m:e>
+          <m:sub>
+            <m:r>
+              <m:t>q</m:t>
+            </m:r>
+          </m:sub>
+        </m:sSub>
+      </m:oMath>
+      <w:r>
+        <w:t xml:space="preserve"> </w:t>
+      </w:r>
+      <w:r>
+        <w:t xml:space="preserve">increases in</w:t>
+      </w:r>
+      <w:r>
+        <w:t xml:space="preserve"> </w:t>
+      </w:r>
+      <m:oMath>
+        <m:r>
+          <m:t>α</m:t>
+        </m:r>
+      </m:oMath>
+      <w:r>
+        <w:t xml:space="preserve"> </w:t>
+      </w:r>
+      <w:r>
+        <w:t xml:space="preserve">and tends to</w:t>
+      </w:r>
+      <w:r>
+        <w:t xml:space="preserve"> </w:t>
+      </w:r>
+      <m:oMath>
+        <m:r>
+          <m:t>q</m:t>
+        </m:r>
+      </m:oMath>
+      <w:r>
+        <w:t xml:space="preserve"> </w:t>
+      </w:r>
+      <w:r>
+        <w:t xml:space="preserve">as</w:t>
+      </w:r>
+      <w:r>
+        <w:t xml:space="preserve"> </w:t>
+      </w:r>
+      <m:oMath>
+        <m:r>
+          <m:t>α</m:t>
+        </m:r>
+        <m:r>
+          <m:rPr>
+            <m:sty m:val="p"/>
+          </m:rPr>
+          <m:t>→</m:t>
+        </m:r>
+        <m:r>
+          <m:t>0</m:t>
+        </m:r>
+      </m:oMath>
+      <w:r>
+        <w:t xml:space="preserve">. A deterministic persona-conditioned simulator has</w:t>
+      </w:r>
+      <w:r>
+        <w:t xml:space="preserve"> </w:t>
+      </w:r>
+      <m:oMath>
+        <m:sSup>
+          <m:e>
+            <m:r>
+              <m:t>α</m:t>
+            </m:r>
+          </m:e>
+          <m:sup>
+            <m:r>
+              <m:rPr>
+                <m:sty m:val="p"/>
+              </m:rPr>
+              <m:t>*</m:t>
+            </m:r>
+          </m:sup>
+        </m:sSup>
+        <m:r>
+          <m:rPr>
+            <m:sty m:val="p"/>
+          </m:rPr>
+          <m:t>=</m:t>
+        </m:r>
+        <m:sSup>
+          <m:e>
+            <m:r>
+              <m:t>c</m:t>
+            </m:r>
+          </m:e>
+          <m:sup>
+            <m:r>
+              <m:t>2</m:t>
+            </m:r>
+          </m:sup>
+        </m:sSup>
+        <m:r>
+          <m:rPr>
+            <m:sty m:val="p"/>
+          </m:rPr>
+          <m:t>−</m:t>
+        </m:r>
+        <m:r>
+          <m:t>1</m:t>
+        </m:r>
+        <m:r>
+          <m:rPr>
+            <m:sty m:val="p"/>
+          </m:rPr>
+          <m:t>/</m:t>
+        </m:r>
+        <m:r>
+          <m:t>μ</m:t>
+        </m:r>
+        <m:r>
+          <m:rPr>
+            <m:sty m:val="p"/>
+          </m:rPr>
+          <m:t>&lt;</m:t>
+        </m:r>
+        <m:sSup>
+          <m:e>
+            <m:r>
+              <m:t>c</m:t>
+            </m:r>
+          </m:e>
+          <m:sup>
+            <m:r>
+              <m:t>2</m:t>
+            </m:r>
+          </m:sup>
+        </m:sSup>
+      </m:oMath>
+      <w:r>
+        <w:t xml:space="preserve"> </w:t>
+      </w:r>
+      <w:r>
+        <w:t xml:space="preserve">(Proposition 1), so the concentration it can represent is at most</w:t>
+      </w:r>
+      <w:r>
+        <w:t xml:space="preserve"> </w:t>
+      </w:r>
+      <m:oMath>
+        <m:sSub>
+          <m:e>
+            <m:r>
+              <m:t>S</m:t>
+            </m:r>
+          </m:e>
+          <m:sub>
+            <m:r>
+              <m:t>q</m:t>
+            </m:r>
+          </m:sub>
+        </m:sSub>
+        <m:d>
+          <m:dPr>
+            <m:begChr m:val="("/>
+            <m:endChr m:val=")"/>
+            <m:sepChr m:val=""/>
+            <m:grow/>
+          </m:dPr>
+          <m:e>
+            <m:sSup>
+              <m:e>
+                <m:r>
+                  <m:t>c</m:t>
+                </m:r>
+              </m:e>
+              <m:sup>
+                <m:r>
+                  <m:t>2</m:t>
+                </m:r>
+              </m:sup>
+            </m:sSup>
+          </m:e>
+        </m:d>
+      </m:oMath>
+      <w:r>
+        <w:t xml:space="preserve">.</w:t>
+      </w:r>
+    </w:p>
+    <w:p>
+      <w:pPr>
+        <w:pStyle w:val="BodyText"/>
+      </w:pPr>
+      <w:r>
+        <w:rPr>
+          <w:iCs/>
+          <w:i/>
+        </w:rPr>
+        <w:t xml:space="preserve">Proof.</w:t>
+      </w:r>
+      <w:r>
+        <w:t xml:space="preserve"> </w:t>
+      </w:r>
+      <w:r>
+        <w:t xml:space="preserve">The expected purchases contributed by customers with rate above</w:t>
+      </w:r>
+      <w:r>
+        <w:t xml:space="preserve"> </w:t>
+      </w:r>
+      <m:oMath>
+        <m:r>
+          <m:t>x</m:t>
+        </m:r>
+      </m:oMath>
+      <w:r>
+        <w:t xml:space="preserve"> </w:t>
+      </w:r>
+      <w:r>
+        <w:t xml:space="preserve">are proportional to</w:t>
+      </w:r>
+      <w:r>
+        <w:t xml:space="preserve"> </w:t>
+      </w:r>
+      <m:oMath>
+        <m:nary>
+          <m:naryPr>
+            <m:chr m:val="∫"/>
+            <m:limLoc m:val="subSup"/>
+            <m:subHide m:val="off"/>
+            <m:supHide m:val="off"/>
+          </m:naryPr>
+          <m:sub>
+            <m:r>
+              <m:t>x</m:t>
+            </m:r>
+          </m:sub>
+          <m:sup>
+            <m:r>
+              <m:rPr>
+                <m:sty m:val="p"/>
+              </m:rPr>
+              <m:t>∞</m:t>
+            </m:r>
+          </m:sup>
+          <m:e>
+            <m:r>
+              <m:t>λ</m:t>
+            </m:r>
+          </m:e>
+        </m:nary>
+        <m:r>
+          <m:t> </m:t>
+        </m:r>
+        <m:sSub>
+          <m:e>
+            <m:r>
+              <m:t>f</m:t>
+            </m:r>
+          </m:e>
+          <m:sub>
+            <m:r>
+              <m:t>k</m:t>
+            </m:r>
+          </m:sub>
+        </m:sSub>
+        <m:d>
+          <m:dPr>
+            <m:begChr m:val="("/>
+            <m:endChr m:val=")"/>
+            <m:sepChr m:val=""/>
+            <m:grow/>
+          </m:dPr>
+          <m:e>
+            <m:r>
+              <m:t>λ</m:t>
+            </m:r>
+          </m:e>
+        </m:d>
+        <m:r>
+          <m:t> </m:t>
+        </m:r>
+        <m:r>
+          <m:t>d</m:t>
+        </m:r>
+        <m:r>
+          <m:t>λ</m:t>
+        </m:r>
+      </m:oMath>
+      <w:r>
+        <w:t xml:space="preserve">, and</w:t>
+      </w:r>
+      <w:r>
+        <w:t xml:space="preserve"> </w:t>
+      </w:r>
+      <m:oMath>
+        <m:r>
+          <m:t>λ</m:t>
+        </m:r>
+        <m:sSub>
+          <m:e>
+            <m:r>
+              <m:t>f</m:t>
+            </m:r>
+          </m:e>
+          <m:sub>
+            <m:r>
+              <m:t>k</m:t>
+            </m:r>
+          </m:sub>
+        </m:sSub>
+        <m:d>
+          <m:dPr>
+            <m:begChr m:val="("/>
+            <m:endChr m:val=")"/>
+            <m:sepChr m:val=""/>
+            <m:grow/>
+          </m:dPr>
+          <m:e>
+            <m:r>
+              <m:t>λ</m:t>
+            </m:r>
+          </m:e>
+        </m:d>
+      </m:oMath>
+      <w:r>
+        <w:t xml:space="preserve"> </w:t>
+      </w:r>
+      <w:r>
+        <w:t xml:space="preserve">is proportional to the gamma density with shape</w:t>
+      </w:r>
+      <w:r>
+        <w:t xml:space="preserve"> </w:t>
+      </w:r>
+      <m:oMath>
+        <m:r>
+          <m:t>k</m:t>
+        </m:r>
+        <m:r>
+          <m:rPr>
+            <m:sty m:val="p"/>
+          </m:rPr>
+          <m:t>+</m:t>
+        </m:r>
+        <m:r>
+          <m:t>1</m:t>
+        </m:r>
+      </m:oMath>
+      <w:r>
+        <w:t xml:space="preserve">, which gives the stated form. Monotonicity in</w:t>
+      </w:r>
+      <w:r>
+        <w:t xml:space="preserve"> </w:t>
+      </w:r>
+      <m:oMath>
+        <m:r>
+          <m:t>α</m:t>
+        </m:r>
+      </m:oMath>
+      <w:r>
+        <w:t xml:space="preserve"> </w:t>
+      </w:r>
+      <w:r>
+        <w:t xml:space="preserve">follows because a gamma distribution with a smaller shape is larger in the convex (Lorenz) order, and the limit follows from the degeneracy of the rate distribution as</w:t>
+      </w:r>
+      <w:r>
+        <w:t xml:space="preserve"> </w:t>
+      </w:r>
+      <m:oMath>
+        <m:r>
+          <m:t>k</m:t>
+        </m:r>
+        <m:r>
+          <m:rPr>
+            <m:sty m:val="p"/>
+          </m:rPr>
+          <m:t>→</m:t>
+        </m:r>
+        <m:r>
+          <m:rPr>
+            <m:sty m:val="p"/>
+          </m:rPr>
+          <m:t>∞</m:t>
+        </m:r>
+      </m:oMath>
+      <w:r>
+        <w:t xml:space="preserve">. The last statement applies Proposition 1.</w:t>
+      </w:r>
+      <w:r>
+        <w:t xml:space="preserve"> </w:t>
+      </w:r>
+      <m:oMath>
+        <m:r>
+          <m:rPr>
+            <m:sty m:val="p"/>
+          </m:rPr>
+          <m:t>▫</m:t>
+        </m:r>
+      </m:oMath>
+    </w:p>
+    <w:p>
+      <w:pPr>
+        <w:pStyle w:val="BodyText"/>
+      </w:pPr>
+      <w:r>
+        <w:t xml:space="preserve">For the three reference settings, with</w:t>
+      </w:r>
+      <w:r>
+        <w:t xml:space="preserve"> </w:t>
+      </w:r>
+      <m:oMath>
+        <m:r>
+          <m:t>q</m:t>
+        </m:r>
+        <m:r>
+          <m:rPr>
+            <m:sty m:val="p"/>
+          </m:rPr>
+          <m:t>=</m:t>
+        </m:r>
+        <m:r>
+          <m:t>0.1</m:t>
+        </m:r>
+      </m:oMath>
+      <w:r>
+        <w:t xml:space="preserve">, the top tenth of customers account for 52% of expected purchases when</w:t>
+      </w:r>
+      <w:r>
+        <w:t xml:space="preserve"> </w:t>
+      </w:r>
+      <m:oMath>
+        <m:r>
+          <m:t>α</m:t>
+        </m:r>
+        <m:r>
+          <m:rPr>
+            <m:sty m:val="p"/>
+          </m:rPr>
+          <m:t>=</m:t>
+        </m:r>
+        <m:r>
+          <m:t>3.05</m:t>
+        </m:r>
+      </m:oMath>
+      <w:r>
+        <w:t xml:space="preserve"> </w:t>
+      </w:r>
+      <w:r>
+        <w:t xml:space="preserve">(low-mean setting), 38% when</w:t>
+      </w:r>
+      <w:r>
+        <w:t xml:space="preserve"> </w:t>
+      </w:r>
+      <m:oMath>
+        <m:r>
+          <m:t>α</m:t>
+        </m:r>
+        <m:r>
+          <m:rPr>
+            <m:sty m:val="p"/>
+          </m:rPr>
+          <m:t>=</m:t>
+        </m:r>
+        <m:r>
+          <m:t>1.42</m:t>
+        </m:r>
+      </m:oMath>
+      <w:r>
+        <w:t xml:space="preserve"> </w:t>
+      </w:r>
+      <w:r>
+        <w:t xml:space="preserve">(high-mean setting), and 29% when</w:t>
+      </w:r>
+      <w:r>
+        <w:t xml:space="preserve"> </w:t>
+      </w:r>
+      <m:oMath>
+        <m:r>
+          <m:t>α</m:t>
+        </m:r>
+        <m:r>
+          <m:rPr>
+            <m:sty m:val="p"/>
+          </m:rPr>
+          <m:t>=</m:t>
+        </m:r>
+        <m:r>
+          <m:t>0.71</m:t>
+        </m:r>
+      </m:oMath>
+      <w:r>
+        <w:t xml:space="preserve"> </w:t>
+      </w:r>
+      <w:r>
+        <w:t xml:space="preserve">(demographic households), against 10% for a population without heterogeneity. A simulator that carries only the persona-described heterogeneity of the demographic experiment (</w:t>
+      </w:r>
+      <m:oMath>
+        <m:sSup>
+          <m:e>
+            <m:r>
+              <m:t>c</m:t>
+            </m:r>
+          </m:e>
+          <m:sup>
+            <m:r>
+              <m:t>2</m:t>
+            </m:r>
+          </m:sup>
+        </m:sSup>
+        <m:r>
+          <m:rPr>
+            <m:sty m:val="p"/>
+          </m:rPr>
+          <m:t>=</m:t>
+        </m:r>
+        <m:r>
+          <m:t>0.006</m:t>
+        </m:r>
+      </m:oMath>
+      <w:r>
+        <w:t xml:space="preserve">) represents a share of 11%. Decisions that depend on concentration, such as how deeply to target a promotion, how to set loyalty tiers, or how to size a budget ceiling for heavy buyers, are therefore biased in a known direction when the spread is lost. The direction of the bias, not only its size, is predictable, which is what makes the problem manageable by design.</w:t>
+      </w:r>
+    </w:p>
     <w:bookmarkEnd w:id="34"/>
-    <w:bookmarkStart w:id="39" w:name="research-design"/>
+    <w:bookmarkEnd w:id="35"/>
+    <w:bookmarkStart w:id="40" w:name="research-design"/>
     <w:p>
       <w:pPr>
         <w:pStyle w:val="Heading1"/>
@@ -3485,7 +4465,7 @@
         <w:t xml:space="preserve">4. Research Design</w:t>
       </w:r>
     </w:p>
-    <w:bookmarkStart w:id="35" w:name="settings-and-reference-data"/>
+    <w:bookmarkStart w:id="36" w:name="settings-and-reference-data"/>
     <w:p>
       <w:pPr>
         <w:pStyle w:val="Heading2"/>
@@ -4200,8 +5180,8 @@
         <w:t xml:space="preserve">Table 1. Reference settings.</w:t>
       </w:r>
     </w:p>
-    <w:bookmarkEnd w:id="35"/>
-    <w:bookmarkStart w:id="36" w:name="elicitation-designs"/>
+    <w:bookmarkEnd w:id="36"/>
+    <w:bookmarkStart w:id="37" w:name="elicitation-designs"/>
     <w:p>
       <w:pPr>
         <w:pStyle w:val="Heading2"/>
@@ -4394,8 +5374,8 @@
         <w:t xml:space="preserve">variant it is told the base rate (about 0.5 purchases per 4 weeks and that most customers make none; or about 5 shopping trips per 4 weeks and that some make none).</w:t>
       </w:r>
     </w:p>
-    <w:bookmarkEnd w:id="36"/>
-    <w:bookmarkStart w:id="37" w:name="models-runs-and-measures"/>
+    <w:bookmarkEnd w:id="37"/>
+    <w:bookmarkStart w:id="38" w:name="models-runs-and-measures"/>
     <w:p>
       <w:pPr>
         <w:pStyle w:val="Heading2"/>
@@ -4423,8 +5403,8 @@
         <w:t xml:space="preserve">, with 95% bootstrap intervals over customers. An asterisk marks an interval that excludes the reference value. Parsing failed for 5% or less of the responses in all cells but two: DeepSeek-V4-Pro returned unusable answers for about 10% of the daily-simulation prompts in the high-mean setting, and those cells are computed from the parsed responses only.</w:t>
       </w:r>
     </w:p>
-    <w:bookmarkEnd w:id="37"/>
-    <w:bookmarkStart w:id="38" w:name="email-experiment"/>
+    <w:bookmarkEnd w:id="38"/>
+    <w:bookmarkStart w:id="39" w:name="email-experiment"/>
     <w:p>
       <w:pPr>
         <w:pStyle w:val="Heading2"/>
@@ -4441,9 +5421,9 @@
         <w:t xml:space="preserve">For each of 300 customers sampled from the real data (a new sample for each seed) we asked, in separate independent calls, for the probability (0 to 100 percent) that the customer would visit the website, and that it would make a purchase, in the next two weeks, under each of three conditions: no email, a men’s email, and a women’s email. We report the risk ratio and the absolute lift (the probability with the email minus the probability without it), the latter with paired bootstrap intervals over customers. Yes/no answers and Bernoulli draws from the elicited probabilities were also collected and are discussed where relevant. Because each call sees only one condition, the design mimics random assignment but does not equal it.</w:t>
       </w:r>
     </w:p>
-    <w:bookmarkEnd w:id="38"/>
     <w:bookmarkEnd w:id="39"/>
-    <w:bookmarkStart w:id="53" w:name="results"/>
+    <w:bookmarkEnd w:id="40"/>
+    <w:bookmarkStart w:id="54" w:name="results"/>
     <w:p>
       <w:pPr>
         <w:pStyle w:val="Heading1"/>
@@ -4452,7 +5432,7 @@
         <w:t xml:space="preserve">5. Results</w:t>
       </w:r>
     </w:p>
-    <w:bookmarkStart w:id="43" w:name="overview"/>
+    <w:bookmarkStart w:id="44" w:name="overview"/>
     <w:p>
       <w:pPr>
         <w:pStyle w:val="Heading2"/>
@@ -5776,18 +6756,18 @@
           <wp:inline>
             <wp:extent cx="5334000" cy="6029739"/>
             <wp:effectExtent b="0" l="0" r="0" t="0"/>
-            <wp:docPr descr="Figure 1. Variance-to-mean ratio of simulated purchase counts with 95% intervals, by design (columns), model (rows), and setting (a: low mean; b: high mean; c: real household demographics). The dashed line is the real value; the dotted line is the largest value that design C can reach with its count bins. Filled markers: plain prompt; hollow markers: anchored prompt." title="" id="41" name="Picture"/>
+            <wp:docPr descr="Figure 1. Variance-to-mean ratio of simulated purchase counts with 95% intervals, by design (columns), model (rows), and setting (a: low mean; b: high mean; c: real household demographics). The dashed line is the real value; the dotted line is the largest value that design C can reach with its count bins. Filled markers: plain prompt; hollow markers: anchored prompt." title="" id="42" name="Picture"/>
             <a:graphic>
               <a:graphicData uri="http://schemas.openxmlformats.org/drawingml/2006/picture">
                 <pic:pic>
                   <pic:nvPicPr>
-                    <pic:cNvPr descr="fig1_dispersion.png" id="42" name="Picture"/>
+                    <pic:cNvPr descr="fig1_dispersion.png" id="43" name="Picture"/>
                     <pic:cNvPicPr>
                       <a:picLocks noChangeArrowheads="1" noChangeAspect="1"/>
                     </pic:cNvPicPr>
                   </pic:nvPicPr>
                   <pic:blipFill>
-                    <a:blip r:embed="rId40"/>
+                    <a:blip r:embed="rId41"/>
                     <a:stretch>
                       <a:fillRect/>
                     </a:stretch>
@@ -5822,8 +6802,8 @@
         <w:t xml:space="preserve">Figure 1. Variance-to-mean ratio of simulated purchase counts with 95% intervals, by design (columns), model (rows), and setting (a: low mean; b: high mean; c: real household demographics). The dashed line is the real value; the dotted line is the largest value that design C can reach with its count bins. Filled markers: plain prompt; hollow markers: anchored prompt.</w:t>
       </w:r>
     </w:p>
-    <w:bookmarkEnd w:id="43"/>
-    <w:bookmarkStart w:id="44" w:name="low-mean-setting"/>
+    <w:bookmarkEnd w:id="44"/>
+    <w:bookmarkStart w:id="45" w:name="low-mean-setting"/>
     <w:p>
       <w:pPr>
         <w:pStyle w:val="Heading2"/>
@@ -5950,8 +6930,8 @@
         <w:t xml:space="preserve">is right. Agreement on dispersion is partly by construction, because the gamma multiplier injects it; what the model contributes is the mean, which is almost twice the reference for Llama with the anchor (0.93 against 0.49).</w:t>
       </w:r>
     </w:p>
-    <w:bookmarkEnd w:id="44"/>
-    <w:bookmarkStart w:id="45" w:name="high-mean-setting"/>
+    <w:bookmarkEnd w:id="45"/>
+    <w:bookmarkStart w:id="46" w:name="high-mean-setting"/>
     <w:p>
       <w:pPr>
         <w:pStyle w:val="Heading2"/>
@@ -6034,8 +7014,8 @@
         <w:t xml:space="preserve">in 5: Haiku 5.5 without the anchor, GPT-4o-mini with it, Sonnet 5 in both variants, and Gemini 3.1 Flash-Lite with it. The remaining cells fail because the model’s mean is wrong, for example 3.09 for Mistral Large 4 with the anchor and 7.87 for DeepSeek-V4-Pro without it.</w:t>
       </w:r>
     </w:p>
-    <w:bookmarkEnd w:id="45"/>
-    <w:bookmarkStart w:id="46" w:name="is-collapse-specific-to-low-means"/>
+    <w:bookmarkEnd w:id="46"/>
+    <w:bookmarkStart w:id="47" w:name="is-collapse-specific-to-low-means"/>
     <w:p>
       <w:pPr>
         <w:pStyle w:val="Heading2"/>
@@ -6067,8 +7047,8 @@
         <w:t xml:space="preserve">, and one (DeepSeek-V4-Pro without the anchor) is overdispersed; at a mean of 4.8 the ratio is at most 0.76 in 15 of 16 cells, and at a mean of 7.8 it is at most 1.32. In every setting several models return one value for practically every customer. Collapse of direct answers is therefore not a rounding artifact of low means. Nor do larger or more recent models escape it: the ratios of Sonnet 5 and GPT-5.6-terra in the two high-mean settings lie between 0.02 and 0.31 for direct and daily designs.</w:t>
       </w:r>
     </w:p>
-    <w:bookmarkEnd w:id="46"/>
-    <w:bookmarkStart w:id="47" w:name="Xe23f2af77092521160ea0caefb57b398689219a"/>
+    <w:bookmarkEnd w:id="47"/>
+    <w:bookmarkStart w:id="48" w:name="Xe23f2af77092521160ea0caefb57b398689219a"/>
     <w:p>
       <w:pPr>
         <w:pStyle w:val="Heading2"/>
@@ -7131,8 +8111,8 @@
         <w:t xml:space="preserve">in design D correlates between -0.05 and +0.05 with the real count, and none of its 16 intervals excludes zero. With 79 intervals, about four exclusions are expected by chance at the 5% level. Design C is the only design whose correlations are mostly positive (14 of 16 cells, median +0.06), but the models were run on overlapping samples of household-windows, so the cells are not independent evidence. On the first sample the demographic regression itself has a rank correlation of -0.03 (interval -0.17 to +0.10); on the two further samples of 200 household-windows it reaches +0.19 and -0.02, which shows how much a single sample can move these correlations. Because the demographics predict the real count with a rank correlation of only 0.04 across all households, this result does not show that the models ignore information; it shows that these personas contain almost no information for any simulator to use. It is the empirical counterpart of Proposition 1: richer observable personas cannot supply the heterogeneity that counts contain.</w:t>
       </w:r>
     </w:p>
-    <w:bookmarkEnd w:id="47"/>
-    <w:bookmarkStart w:id="51" w:name="randomized-email-experiment"/>
+    <w:bookmarkEnd w:id="48"/>
+    <w:bookmarkStart w:id="52" w:name="randomized-email-experiment"/>
     <w:p>
       <w:pPr>
         <w:pStyle w:val="Heading2"/>
@@ -12934,18 +13914,18 @@
           <wp:inline>
             <wp:extent cx="5334000" cy="3710608"/>
             <wp:effectExtent b="0" l="0" r="0" t="0"/>
-            <wp:docPr descr="Figure 2. Absolute lift in the probability of a visit and of a purchase after a men’s email (elicited-probability design). Bars are 95% intervals; the dashed line and band are the real lift and its 95% interval. Note the logarithmic axis in panel b." title="" id="49" name="Picture"/>
+            <wp:docPr descr="Figure 2. Absolute lift in the probability of a visit and of a purchase after a men’s email (elicited-probability design). Bars are 95% intervals; the dashed line and band are the real lift and its 95% interval. Note the logarithmic axis in panel b." title="" id="50" name="Picture"/>
             <a:graphic>
               <a:graphicData uri="http://schemas.openxmlformats.org/drawingml/2006/picture">
                 <pic:pic>
                   <pic:nvPicPr>
-                    <pic:cNvPr descr="fig2_lift.png" id="50" name="Picture"/>
+                    <pic:cNvPr descr="fig2_lift.png" id="51" name="Picture"/>
                     <pic:cNvPicPr>
                       <a:picLocks noChangeArrowheads="1" noChangeAspect="1"/>
                     </pic:cNvPicPr>
                   </pic:nvPicPr>
                   <pic:blipFill>
-                    <a:blip r:embed="rId48"/>
+                    <a:blip r:embed="rId49"/>
                     <a:stretch>
                       <a:fillRect/>
                     </a:stretch>
@@ -13119,8 +14099,8 @@
         <w:t xml:space="preserve">for about half with one). The yes/no visit lifts range from -0.31 to +0.55, and the purchase lifts from +0.007 to +0.55, up to 80 times the real lift.</w:t>
       </w:r>
     </w:p>
-    <w:bookmarkEnd w:id="51"/>
-    <w:bookmarkStart w:id="52" w:name="summary-of-hypotheses"/>
+    <w:bookmarkEnd w:id="52"/>
+    <w:bookmarkStart w:id="53" w:name="summary-of-hypotheses"/>
     <w:p>
       <w:pPr>
         <w:pStyle w:val="Heading2"/>
@@ -13613,9 +14593,9 @@
         <w:t xml:space="preserve">Table 5. Hypotheses and evidence.</w:t>
       </w:r>
     </w:p>
-    <w:bookmarkEnd w:id="52"/>
     <w:bookmarkEnd w:id="53"/>
-    <w:bookmarkStart w:id="59" w:name="discussion"/>
+    <w:bookmarkEnd w:id="54"/>
+    <w:bookmarkStart w:id="61" w:name="discussion"/>
     <w:p>
       <w:pPr>
         <w:pStyle w:val="Heading1"/>
@@ -13624,7 +14604,7 @@
         <w:t xml:space="preserve">6. Discussion</w:t>
       </w:r>
     </w:p>
-    <w:bookmarkStart w:id="54" w:name="theoretical-contributions"/>
+    <w:bookmarkStart w:id="55" w:name="theoretical-contributions"/>
     <w:p>
       <w:pPr>
         <w:pStyle w:val="Heading2"/>
@@ -13760,8 +14740,8 @@
         <w:t xml:space="preserve">idea. A twin is usually understood as a replica that can stand in for the original in a decision. Our evidence supports a narrower reading. At the level of the individual customer, the demographic personas carried almost no information about real counts (rank correlations between -0.17 and +0.16), so a customer-level replica is not supported by these data. At the level of the population, the distribution of counts and the size of effects are reproduced only by designs in which the dispersion is supplied from outside the model and the level is checked against data. The claim that a simulated population is a twin of a real one is therefore a claim about specific properties, and it has to be tested property by property: the share of zeros, the spread, the tail, and the absolute size of an effect. We view this as the main point for information systems research on generative AI in decision support. Evaluation should be stated in terms of the decision-relevant properties of the artifact’s output, because fluency and aggregate plausibility, which are what users see, do not indicate them.</w:t>
       </w:r>
     </w:p>
-    <w:bookmarkEnd w:id="54"/>
-    <w:bookmarkStart w:id="55" w:name="X65830c8ffcd303230289e3fa99b65d240227f6e"/>
+    <w:bookmarkEnd w:id="55"/>
+    <w:bookmarkStart w:id="56" w:name="X65830c8ffcd303230289e3fa99b65d240227f6e"/>
     <w:p>
       <w:pPr>
         <w:pStyle w:val="Heading2"/>
@@ -13823,13 +14803,13 @@
           <w:iCs/>
           <w:i/>
         </w:rPr>
-        <w:t xml:space="preserve">Principle 3: Calibrate the level before use.</w:t>
+        <w:t xml:space="preserve">Principle 3: Calibrate the level before use, and invest in customer data before model capability.</w:t>
       </w:r>
       <w:r>
         <w:t xml:space="preserve"> </w:t>
       </w:r>
       <w:r>
-        <w:t xml:space="preserve">The mean from the model was the bottleneck of the hybrid design (matching the reference in only 20 of 48 cells). A rescaling of the model’s rate against a historical customer file is a natural step that we did not test.</w:t>
+        <w:t xml:space="preserve">Because the persona bounds what the model can carry (Section 3.8), the data assets that feed the persona matter more than the choice of model. The mean from the model was the bottleneck of the hybrid design (matching the reference in only 20 of 48 cells). A rescaling of the model’s rate against a historical customer file is a natural step that we did not test.</w:t>
       </w:r>
     </w:p>
     <w:p>
@@ -13876,8 +14856,8 @@
         <w:t xml:space="preserve">A further observation concerns use. The simulators’ output looked plausible: the sign of the promotion effect was right in nearly all cells, and the answers were fluent and well formed. Errors of the kind we document, such as a compressed spread or a tenfold lift, cannot be seen by inspecting the output, which is why an explicit evaluation protocol is needed before such a system is adopted for decisions.</w:t>
       </w:r>
     </w:p>
-    <w:bookmarkEnd w:id="55"/>
-    <w:bookmarkStart w:id="56" w:name="implications-for-practice"/>
+    <w:bookmarkEnd w:id="56"/>
+    <w:bookmarkStart w:id="57" w:name="implications-for-practice"/>
     <w:p>
       <w:pPr>
         <w:pStyle w:val="Heading2"/>
@@ -14023,14 +15003,14 @@
         <w:t xml:space="preserve">The consequence for a decision can be shown in a stylized example. A firm launches a promotion if the expected gain per targeted customer exceeds its cost, that is, if the lift in purchase probability exceeds the ratio of cost to margin. Suppose a promotion costs 1 monetary unit per targeted customer and each purchase earns a margin of 50, so the ratio is 0.02. The real lift in purchase probability from the men’s email was 0.0068, below 0.02, so the randomized test says not to launch. The simulated lift exceeded 0.02 in 13 of the 16 configurations (the median was 0.065, and the real value was exceeded in 15), so a firm that relied on those simulators would have launched. The stylized numbers are ours and are not taken from the retailer, and the email test does not involve a discount, but the example shows how an overstated absolute lift turns directly into a wrong go decision.</w:t>
       </w:r>
     </w:p>
-    <w:bookmarkEnd w:id="56"/>
-    <w:bookmarkStart w:id="57" w:name="X94616b3a30dccc1fe21684587130f01609b39ab"/>
+    <w:bookmarkEnd w:id="57"/>
+    <w:bookmarkStart w:id="58" w:name="the-cost-of-uncritical-trust"/>
     <w:p>
       <w:pPr>
         <w:pStyle w:val="Heading2"/>
       </w:pPr>
       <w:r>
-        <w:t xml:space="preserve">6.4 Organizational implications: validating and using synthetic data in marketing analytics systems</w:t>
+        <w:t xml:space="preserve">6.4 The cost of uncritical trust</w:t>
       </w:r>
     </w:p>
     <w:p>
@@ -14038,7 +15018,7 @@
         <w:pStyle w:val="FirstParagraph"/>
       </w:pPr>
       <w:r>
-        <w:t xml:space="preserve">The findings have implications for how organizations that run marketing analytics systems should treat synthetic customers. We state them as recommendations that follow from our evidence and from the artifact view; we did not test them in an organization.</w:t>
+        <w:t xml:space="preserve">The central managerial risk is not that synthetic customers are useless but that they are trusted without being tested. Our evidence points to five specific ways in which that trust becomes costly.</w:t>
       </w:r>
     </w:p>
     <w:p>
@@ -14050,13 +15030,80 @@
           <w:iCs/>
           <w:i/>
         </w:rPr>
-        <w:t xml:space="preserve">Treat validation as an acceptance gate, not an afterthought.</w:t>
+        <w:t xml:space="preserve">Confident, wrong sizing.</w:t>
       </w:r>
       <w:r>
         <w:t xml:space="preserve"> </w:t>
       </w:r>
       <w:r>
-        <w:t xml:space="preserve">Before synthetic customers enter a planning process, the system should pass a standing acceptance test against the organization’s own history: level, variance-to-mean ratio, zero share, and, where a past randomized test exists, the absolute lift. The reference values come from the customer file and the experiment archive that the marketing analytics team already holds. This puts a concrete interface between two functions. The marketing team owns the reference data and the decision requirements, and the information systems team owns the pipeline, the model versions, and the calibration step.</w:t>
+        <w:t xml:space="preserve">The simulated purchase lift for the men’s email was overstated in 15 of 16 configurations, with a median of about ten times the randomized value. In the stylized example of Section 6.3, with a cost of 1 and a margin of 50 per purchase, a campaign to 100,000 customers has a real expected result of</w:t>
+      </w:r>
+      <w:r>
+        <w:t xml:space="preserve"> </w:t>
+      </w:r>
+      <m:oMath>
+        <m:r>
+          <m:t>0.0068</m:t>
+        </m:r>
+        <m:r>
+          <m:rPr>
+            <m:sty m:val="p"/>
+          </m:rPr>
+          <m:t>×</m:t>
+        </m:r>
+        <m:r>
+          <m:t>50</m:t>
+        </m:r>
+        <m:r>
+          <m:rPr>
+            <m:sty m:val="p"/>
+          </m:rPr>
+          <m:t>−</m:t>
+        </m:r>
+        <m:r>
+          <m:t>1</m:t>
+        </m:r>
+        <m:r>
+          <m:rPr>
+            <m:sty m:val="p"/>
+          </m:rPr>
+          <m:t>=</m:t>
+        </m:r>
+        <m:r>
+          <m:rPr>
+            <m:sty m:val="p"/>
+          </m:rPr>
+          <m:t>−</m:t>
+        </m:r>
+        <m:r>
+          <m:t>0.66</m:t>
+        </m:r>
+      </m:oMath>
+      <w:r>
+        <w:t xml:space="preserve"> </w:t>
+      </w:r>
+      <w:r>
+        <w:t xml:space="preserve">per customer, a loss of about 66,000. The median simulated lift of 0.065 predicts</w:t>
+      </w:r>
+      <w:r>
+        <w:t xml:space="preserve"> </w:t>
+      </w:r>
+      <m:oMath>
+        <m:r>
+          <m:rPr>
+            <m:sty m:val="p"/>
+          </m:rPr>
+          <m:t>+</m:t>
+        </m:r>
+        <m:r>
+          <m:t>2.25</m:t>
+        </m:r>
+      </m:oMath>
+      <w:r>
+        <w:t xml:space="preserve"> </w:t>
+      </w:r>
+      <w:r>
+        <w:t xml:space="preserve">per customer, a profit of about 225,000. The gap between forecast and outcome is therefore about 290,000 for a single campaign, and it has a sign that favors launching. The error is systematic, not noisy, so it does not average out over campaigns.</w:t>
       </w:r>
     </w:p>
     <w:p>
@@ -14068,13 +15115,13 @@
           <w:iCs/>
           <w:i/>
         </w:rPr>
-        <w:t xml:space="preserve">Re-validate when the model changes.</w:t>
+        <w:t xml:space="preserve">False precision.</w:t>
       </w:r>
       <w:r>
         <w:t xml:space="preserve"> </w:t>
       </w:r>
       <w:r>
-        <w:t xml:space="preserve">The eight models we tested differed widely in the same design, for example in the mean they implied and in how they reacted to a stated base rate, and the same model reacted differently to different prompt context. A vendor update or a switch of model or provider should therefore trigger the acceptance test again, in the same way that a schema change triggers regression tests in other systems. The same applies to changes in the prompt template.</w:t>
+        <w:t xml:space="preserve">The simulated lifts often came with narrow intervals, and the intervals excluded the real value in most configurations. A system that reports a tight interval around a wrong number invites more confidence than one that reports a wide one. Statistical precision, which a synthetic population gives cheaply because the sample size is limited only by the budget for calls, must not be mistaken for validity.</w:t>
       </w:r>
     </w:p>
     <w:p>
@@ -14086,13 +15133,13 @@
           <w:iCs/>
           <w:i/>
         </w:rPr>
-        <w:t xml:space="preserve">Use synthetic data where its errors do the least harm.</w:t>
+        <w:t xml:space="preserve">Erosion of the evidence base.</w:t>
       </w:r>
       <w:r>
         <w:t xml:space="preserve"> </w:t>
       </w:r>
       <w:r>
-        <w:t xml:space="preserve">The designs we studied reproduced the sign of a promotion effect in nearly all cases, but not its size. Synthetic customers are therefore better suited to screening and ranking options, or to generating hypotheses, than to sizing a campaign or computing revenue. A randomized holdout test remains the standard for the latter, and the stylized example in Section 6.3 shows what is at risk if that standard is skipped.</w:t>
+        <w:t xml:space="preserve">If synthetic results replace randomized tests because they are faster and cheaper, the organization loses the data that would reveal the error and that its calibration step needs (Section 3.8). The failure is then self-concealing. We did not observe this process, but it follows from the validation paradox, and it is the reason why we recommend that synthetic pre-tests be paired with a continuing stream of real tests and not substitute for it.</w:t>
       </w:r>
     </w:p>
     <w:p>
@@ -14104,13 +15151,13 @@
           <w:iCs/>
           <w:i/>
         </w:rPr>
-        <w:t xml:space="preserve">Keep synthetic data separate from real data.</w:t>
+        <w:t xml:space="preserve">Propagation.</w:t>
       </w:r>
       <w:r>
         <w:t xml:space="preserve"> </w:t>
       </w:r>
       <w:r>
-        <w:t xml:space="preserve">Synthetic records that share a schema with customer records can end up in dashboards, forecasts, or training sets for other models, where their compressed spread is no longer visible. Provenance labels, separate storage, and a rule against pooling synthetic and real records in estimation are inexpensive safeguards. We did not study this risk empirically; it follows from the finding that the spread is the property that is lost.</w:t>
+        <w:t xml:space="preserve">Synthetic customers that are used as inputs to forecasts, budget models, or other learned systems carry their compressed spread with them. Concentration is lost (Proposition 3), the share of non-buyers is distorted, and the result enters downstream decisions as if it were observed data. The cost is then not one wrong decision but a bias built into the planning system, whose source is hard to trace afterward.</w:t>
       </w:r>
     </w:p>
     <w:p>
@@ -14122,13 +15169,13 @@
           <w:iCs/>
           <w:i/>
         </w:rPr>
-        <w:t xml:space="preserve">Weigh the savings against the cost of a wrong decision.</w:t>
+        <w:t xml:space="preserve">Unassigned accountability.</w:t>
       </w:r>
       <w:r>
         <w:t xml:space="preserve"> </w:t>
       </w:r>
       <w:r>
-        <w:t xml:space="preserve">The runs themselves are cheap: about 25,600 calls cost under one US dollar with the least expensive models and about eleven US dollars with the most expensive of the four we priced, at list prices at the time of our runs. The relevant cost is therefore not the simulation but the decision made on its output, and the governance effort should be proportional to the value of that decision.</w:t>
+        <w:t xml:space="preserve">When a decision rests on a vendor’s model, a prompt written by an analyst, and a calibration step maintained by another team, no one owns the error. The organization should assign responsibility for the acceptance test of Section 6.5 before the system is used, not after the first costly outcome. A digital twin that no one is accountable for validating is a liability presented as an asset.</w:t>
       </w:r>
     </w:p>
     <w:p>
@@ -14136,6 +15183,122 @@
         <w:pStyle w:val="BodyText"/>
       </w:pPr>
       <w:r>
+        <w:t xml:space="preserve">These risks do not argue against the technology. They argue against using it as a replacement for evidence rather than as a complement to it, and against purchasing decisions that are based on demonstrations of fluency and plausible averages, which are the properties our experiments show to be least informative about decision quality.</w:t>
+      </w:r>
+    </w:p>
+    <w:bookmarkEnd w:id="58"/>
+    <w:bookmarkStart w:id="59" w:name="X94616b3a30dccc1fe21684587130f01609b39ab"/>
+    <w:p>
+      <w:pPr>
+        <w:pStyle w:val="Heading2"/>
+      </w:pPr>
+      <w:r>
+        <w:t xml:space="preserve">6.5 Organizational implications: validating and using synthetic data in marketing analytics systems</w:t>
+      </w:r>
+    </w:p>
+    <w:p>
+      <w:pPr>
+        <w:pStyle w:val="FirstParagraph"/>
+      </w:pPr>
+      <w:r>
+        <w:t xml:space="preserve">The findings have implications for how organizations that run marketing analytics systems should treat synthetic customers. We state them as recommendations that follow from our evidence and from the artifact view; we did not test them in an organization.</w:t>
+      </w:r>
+    </w:p>
+    <w:p>
+      <w:pPr>
+        <w:pStyle w:val="BodyText"/>
+      </w:pPr>
+      <w:r>
+        <w:rPr>
+          <w:iCs/>
+          <w:i/>
+        </w:rPr>
+        <w:t xml:space="preserve">Treat validation as an acceptance gate, not an afterthought.</w:t>
+      </w:r>
+      <w:r>
+        <w:t xml:space="preserve"> </w:t>
+      </w:r>
+      <w:r>
+        <w:t xml:space="preserve">Before synthetic customers enter a planning process, the system should pass a standing acceptance test against the organization’s own history: level, variance-to-mean ratio, zero share, and, where a past randomized test exists, the absolute lift. The reference values come from the customer file and the experiment archive that the marketing analytics team already holds. This puts a concrete interface between two functions. The marketing team owns the reference data and the decision requirements, and the information systems team owns the pipeline, the model versions, and the calibration step.</w:t>
+      </w:r>
+    </w:p>
+    <w:p>
+      <w:pPr>
+        <w:pStyle w:val="BodyText"/>
+      </w:pPr>
+      <w:r>
+        <w:rPr>
+          <w:iCs/>
+          <w:i/>
+        </w:rPr>
+        <w:t xml:space="preserve">Re-validate when the model changes.</w:t>
+      </w:r>
+      <w:r>
+        <w:t xml:space="preserve"> </w:t>
+      </w:r>
+      <w:r>
+        <w:t xml:space="preserve">The eight models we tested differed widely in the same design, for example in the mean they implied and in how they reacted to a stated base rate, and the same model reacted differently to different prompt context. A vendor update or a switch of model or provider should therefore trigger the acceptance test again, in the same way that a schema change triggers regression tests in other systems. The same applies to changes in the prompt template.</w:t>
+      </w:r>
+    </w:p>
+    <w:p>
+      <w:pPr>
+        <w:pStyle w:val="BodyText"/>
+      </w:pPr>
+      <w:r>
+        <w:rPr>
+          <w:iCs/>
+          <w:i/>
+        </w:rPr>
+        <w:t xml:space="preserve">Use synthetic data where its errors do the least harm.</w:t>
+      </w:r>
+      <w:r>
+        <w:t xml:space="preserve"> </w:t>
+      </w:r>
+      <w:r>
+        <w:t xml:space="preserve">The designs we studied reproduced the sign of a promotion effect in nearly all cases, but not its size. Synthetic customers are therefore better suited to screening and ranking options, or to generating hypotheses, than to sizing a campaign or computing revenue. A randomized holdout test remains the standard for the latter, and the stylized example in Section 6.3 shows what is at risk if that standard is skipped.</w:t>
+      </w:r>
+    </w:p>
+    <w:p>
+      <w:pPr>
+        <w:pStyle w:val="BodyText"/>
+      </w:pPr>
+      <w:r>
+        <w:rPr>
+          <w:iCs/>
+          <w:i/>
+        </w:rPr>
+        <w:t xml:space="preserve">Keep synthetic data separate from real data.</w:t>
+      </w:r>
+      <w:r>
+        <w:t xml:space="preserve"> </w:t>
+      </w:r>
+      <w:r>
+        <w:t xml:space="preserve">Synthetic records that share a schema with customer records can end up in dashboards, forecasts, or training sets for other models, where their compressed spread is no longer visible. Provenance labels, separate storage, and a rule against pooling synthetic and real records in estimation are inexpensive safeguards. We did not study this risk empirically; it follows from the finding that the spread is the property that is lost.</w:t>
+      </w:r>
+    </w:p>
+    <w:p>
+      <w:pPr>
+        <w:pStyle w:val="BodyText"/>
+      </w:pPr>
+      <w:r>
+        <w:rPr>
+          <w:iCs/>
+          <w:i/>
+        </w:rPr>
+        <w:t xml:space="preserve">Weigh the savings against the cost of a wrong decision.</w:t>
+      </w:r>
+      <w:r>
+        <w:t xml:space="preserve"> </w:t>
+      </w:r>
+      <w:r>
+        <w:t xml:space="preserve">The runs themselves are cheap: about 25,600 calls cost under one US dollar with the least expensive models and about eleven US dollars with the most expensive of the four we priced, at list prices at the time of our runs. The relevant cost is therefore not the simulation but the decision made on its output, and the governance effort should be proportional to the value of that decision.</w:t>
+      </w:r>
+    </w:p>
+    <w:p>
+      <w:pPr>
+        <w:pStyle w:val="BodyText"/>
+      </w:pPr>
+      <w:r>
         <w:rPr>
           <w:iCs/>
           <w:i/>
@@ -14149,14 +15312,14 @@
         <w:t xml:space="preserve">Each randomized test that the organization runs is also a calibration data point for its simulator. A system that stores the simulated and the realized lift for each past campaign can track its own bias over time and adjust the calibration step, which turns an occasional validation into a continuing feedback process.</w:t>
       </w:r>
     </w:p>
-    <w:bookmarkEnd w:id="57"/>
-    <w:bookmarkStart w:id="58" w:name="limitations-and-future-research"/>
+    <w:bookmarkEnd w:id="59"/>
+    <w:bookmarkStart w:id="60" w:name="limitations-and-future-research"/>
     <w:p>
       <w:pPr>
         <w:pStyle w:val="Heading2"/>
       </w:pPr>
       <w:r>
-        <w:t xml:space="preserve">6.5 Limitations and future research</w:t>
+        <w:t xml:space="preserve">6.6 Limitations and future research</w:t>
       </w:r>
     </w:p>
     <w:p>
@@ -14202,9 +15365,9 @@
         <w:t xml:space="preserve">), so that test marks the limit of observable personas rather than a limit of particular models; settings in which observable attributes, such as purchase histories, are more predictive of purchase frequency would be a stronger test of Proposition 1. In the Complete Journey data campaigns were targeted rather than randomized, so only the email experiment supports a causal comparison. Design C truncates its top bin, which lowers the dispersion it can reach; we quantified this ceiling but did not remove it. Public data may also be part of the models’ training data. Future work should evaluate the hybrid design with a calibrated mean, test prompts that elicit several candidate answers with probabilities, and use a randomized promotion data set with purchase counts, for example from a partner firm, so that the count-distribution and treatment-effect questions can be studied on the same customers.</w:t>
       </w:r>
     </w:p>
-    <w:bookmarkEnd w:id="58"/>
-    <w:bookmarkEnd w:id="59"/>
-    <w:bookmarkStart w:id="60" w:name="conclusion"/>
+    <w:bookmarkEnd w:id="60"/>
+    <w:bookmarkEnd w:id="61"/>
+    <w:bookmarkStart w:id="62" w:name="conclusion"/>
     <w:p>
       <w:pPr>
         <w:pStyle w:val="Heading1"/>
@@ -14221,8 +15384,8 @@
         <w:t xml:space="preserve">Synthetic customers built from language models do not yet reproduce the shape of real purchase-count distributions or the size of real promotion effects. Direct and day-by-day designs collapse toward a single value whether the mean is 0.5, 4.8, or 7.8, and larger, more recent models do not change this; describing a distribution repairs part of the damage but loses zeros; and a hybrid that takes only the mean from the model matches the dispersion when that mean is accurate. In a randomized email test the models usually get the sign of the effect right, but the absolute lift in purchase probability is overstated in 15 of 16 configurations and similar treatments are not told apart. Practitioners who use synthetic customers should check dispersion and zero share against their own data, rely on the model for means only, and validate absolute effects before they act on them. For the design of such systems, the evidence points to separating the level, which the model can supply, from the spread, which must come from an external calibrated source, and to evaluating the artifact against the decision it is meant to support.</w:t>
       </w:r>
     </w:p>
-    <w:bookmarkEnd w:id="60"/>
-    <w:bookmarkStart w:id="61" w:name="references"/>
+    <w:bookmarkEnd w:id="62"/>
+    <w:bookmarkStart w:id="63" w:name="references"/>
     <w:p>
       <w:pPr>
         <w:pStyle w:val="Heading1"/>
@@ -14542,6 +15705,30 @@
         <w:pStyle w:val="BodyText"/>
       </w:pPr>
       <w:r>
+        <w:t xml:space="preserve">Melville N, Kraemer K, Gurbaxani V (2004) Review: Information technology and organizational performance: An integrative model of IT business value.</w:t>
+      </w:r>
+      <w:r>
+        <w:t xml:space="preserve"> </w:t>
+      </w:r>
+      <w:r>
+        <w:rPr>
+          <w:iCs/>
+          <w:i/>
+        </w:rPr>
+        <w:t xml:space="preserve">MIS Quart.</w:t>
+      </w:r>
+      <w:r>
+        <w:t xml:space="preserve"> </w:t>
+      </w:r>
+      <w:r>
+        <w:t xml:space="preserve">28(2):283–322.</w:t>
+      </w:r>
+    </w:p>
+    <w:p>
+      <w:pPr>
+        <w:pStyle w:val="BodyText"/>
+      </w:pPr>
+      <w:r>
         <w:t xml:space="preserve">Orlikowski WJ, Iacono CS (2001) Research commentary: Desperately seeking the</w:t>
       </w:r>
       <w:r>
@@ -14683,8 +15870,8 @@
         <w:t xml:space="preserve">Zhang R, Zhang X, Zhao M (2025b) Predicting effects, missing distributions: Evaluating LLMs as human behavior simulators in operations management. Preprint, submitted September 30, arXiv:2510.03310.</w:t>
       </w:r>
     </w:p>
-    <w:bookmarkEnd w:id="61"/>
-    <w:bookmarkStart w:id="62" w:name="appendix-a.-prompt-templates"/>
+    <w:bookmarkEnd w:id="63"/>
+    <w:bookmarkStart w:id="64" w:name="appendix-a.-prompt-templates"/>
     <w:p>
       <w:pPr>
         <w:pStyle w:val="Heading1"/>
@@ -14861,8 +16048,8 @@
         <w:t xml:space="preserve">”</w:t>
       </w:r>
     </w:p>
-    <w:bookmarkEnd w:id="62"/>
-    <w:bookmarkStart w:id="63" w:name="appendix-b.-full-results"/>
+    <w:bookmarkEnd w:id="64"/>
+    <w:bookmarkStart w:id="65" w:name="appendix-b.-full-results"/>
     <w:p>
       <w:pPr>
         <w:pStyle w:val="Heading1"/>
@@ -40305,8 +41492,8 @@
         <w:t xml:space="preserve">Table B3. Persona experiment with real household demographics, 200 households per cell. Reference row: real distribution of the 801 households (10,413 household-windows). * the 95% bootstrap interval excludes the reference value.</w:t>
       </w:r>
     </w:p>
-    <w:bookmarkEnd w:id="63"/>
-    <w:bookmarkStart w:id="64" w:name="appendix-c.-reproducibility"/>
+    <w:bookmarkEnd w:id="65"/>
+    <w:bookmarkStart w:id="66" w:name="appendix-c.-reproducibility"/>
     <w:p>
       <w:pPr>
         <w:pStyle w:val="Heading1"/>
@@ -40344,7 +41531,7 @@
         <w:t xml:space="preserve">). Raw model responses are saved with each run. Household-level Complete Journey data are not redistributed; the code reads them from the public package files.</w:t>
       </w:r>
     </w:p>
-    <w:bookmarkEnd w:id="64"/>
+    <w:bookmarkEnd w:id="66"/>
     <w:sectPr/>
   </w:body>
 </w:document>

</xml_diff>

<commit_message>
Manuscript: customer concentration results (Proposition 3)
Co-Authored-By: Claude Sonnet 5.5 <noreply@anthropic.com>
Claude-Session: https://claude.ai/code/session_01VRbK37d38KZhVAbWS4xw4x
</commit_message>
<xml_diff>
--- a/llm-count-study/ISR_manuscript_draft.docx
+++ b/llm-count-study/ISR_manuscript_draft.docx
@@ -5423,7 +5423,7 @@
     </w:p>
     <w:bookmarkEnd w:id="39"/>
     <w:bookmarkEnd w:id="40"/>
-    <w:bookmarkStart w:id="54" w:name="results"/>
+    <w:bookmarkStart w:id="55" w:name="results"/>
     <w:p>
       <w:pPr>
         <w:pStyle w:val="Heading1"/>
@@ -5448,7 +5448,7 @@
         <w:ind w:firstLine="0"/>
       </w:pPr>
       <w:r>
-        <w:t xml:space="preserve">Table 2 summarizes the low-mean and the high-mean setting by design, and Appendix B gives all cells. The main pattern is that variance collapse is severe in designs A and B in every setting, that design C moves toward the real dispersion but loses zeros where they are common, and that design D matches dispersion in most cells while its mean depends on the model.</w:t>
+        <w:t xml:space="preserve">Table 2 summarizes the low-mean and the high-mean setting by design, and Appendix B gives all cells. The main pattern is that variance collapse is severe in designs A and B in every setting, that design C moves toward the real dispersion but loses zeros where they are common, and that design D matches dispersion in most cells while its mean depends on the model. The loss of dispersion has a direct consequence for the concentration of purchases among heavy buyers (Section 5.7).</w:t>
       </w:r>
     </w:p>
     <w:tbl>
@@ -14100,13 +14100,39 @@
       </w:r>
     </w:p>
     <w:bookmarkEnd w:id="52"/>
-    <w:bookmarkStart w:id="53" w:name="summary-of-hypotheses"/>
+    <w:bookmarkStart w:id="53" w:name="customer-concentration"/>
     <w:p>
       <w:pPr>
         <w:pStyle w:val="Heading2"/>
       </w:pPr>
       <w:r>
-        <w:t xml:space="preserve">5.7 Summary of hypotheses</w:t>
+        <w:t xml:space="preserve">5.7 Customer concentration</w:t>
+      </w:r>
+    </w:p>
+    <w:p>
+      <w:pPr>
+        <w:pStyle w:val="FirstParagraph"/>
+      </w:pPr>
+      <w:r>
+        <w:t xml:space="preserve">Proposition 3 predicts that a simulator without heterogeneity cannot represent the concentration of purchases among heavy buyers, and that the hybrid design, which supplies the spread externally, can. We measured the share of all simulated purchases made by the top tenth of customers (ranked by count) in every cell and compared it with the same share in the reference. In the reference the top tenth account for 65% of purchases in the low-mean setting, 39% in the high-mean setting, and 30% for the demographic households. For a population without heterogeneity the share is 10% or, in the low-mean setting, slightly above because most counts are zero and the counts of the rest are discrete.</w:t>
+      </w:r>
+    </w:p>
+    <w:p>
+      <w:pPr>
+        <w:pStyle w:val="BodyText"/>
+      </w:pPr>
+      <w:r>
+        <w:t xml:space="preserve">The prediction is borne out. Direct answers and daily simulation cannot represent concentration. In the 91 cells of these two designs in which a meaningful share can be computed, the top-decile share is below the reference in every one and the interval excludes the reference. It lies between 0.10 and 0.49 in the low-mean setting (the highest value is the overdispersed DeepSeek-V4-Pro cell for direct answers), between 0.10 and 0.18 in the high-mean setting, and between 0.10 and 0.16 for the demographic households, that is, practically at the 10% that a population without heterogeneity would give. We excluded five low-mean cells in which almost every simulated customer made no purchase, where the share is 1.00 or undefined only because there is almost nothing to distribute. Describing a distribution recovers part of the concentration (0.30 to 0.52 in the low-mean setting against 0.65, and 0.27 to 0.36 in the high-mean setting against 0.39), and its interval excludes the reference in 16 of 16 and 15 of 16 cells. For the demographic households, whose reference concentration is low, it lies within the interval of the reference in 11 of 16 cells. The hybrid design reproduces concentration in 39 of 48 cells (11 of 16, 13 of 16, and 15 of 16 in the three settings), including cells in which the model’s mean is wrong, because the share depends on the dispersion and not on the level. This is the clearest case in which the hybrid design repairs a decision-relevant property that direct elicitation loses entirely.</w:t>
+      </w:r>
+    </w:p>
+    <w:bookmarkEnd w:id="53"/>
+    <w:bookmarkStart w:id="54" w:name="summary-of-hypotheses"/>
+    <w:p>
+      <w:pPr>
+        <w:pStyle w:val="Heading2"/>
+      </w:pPr>
+      <w:r>
+        <w:t xml:space="preserve">5.8 Summary of hypotheses</w:t>
       </w:r>
     </w:p>
     <w:tbl>
@@ -14517,6 +14543,44 @@
                 <w:rFonts w:ascii="Times New Roman" w:hAnsi="Times New Roman"/>
                 <w:sz w:val="17"/>
               </w:rPr>
+              <w:t xml:space="preserve">Exploratory: concentration of purchases among heavy buyers (Proposition 3).</w:t>
+            </w:r>
+          </w:p>
+        </w:tc>
+        <w:tc>
+          <w:tcPr/>
+          <w:p>
+            <w:pPr>
+              <w:pStyle w:val="Compact"/>
+              <w:spacing w:before="20" w:after="20" w:line="240" w:lineRule="auto"/>
+              <w:ind w:firstLine="0"/>
+              <w:jc w:val="left"/>
+            </w:pPr>
+            <w:r>
+              <w:rPr>
+                <w:rFonts w:ascii="Times New Roman" w:hAnsi="Times New Roman"/>
+                <w:sz w:val="17"/>
+              </w:rPr>
+              <w:t xml:space="preserve">Supported. The top-decile share of purchases is practically at the 10% of a homogeneous population for direct and daily designs (below the reference in all 91 interpretable cells), is partly recovered by describing a distribution, and is matched by the hybrid design in 39 of 48 cells.</w:t>
+            </w:r>
+          </w:p>
+        </w:tc>
+      </w:tr>
+      <w:tr>
+        <w:tc>
+          <w:tcPr/>
+          <w:p>
+            <w:pPr>
+              <w:pStyle w:val="Compact"/>
+              <w:spacing w:before="20" w:after="20" w:line="240" w:lineRule="auto"/>
+              <w:ind w:firstLine="0"/>
+              <w:jc w:val="left"/>
+            </w:pPr>
+            <w:r>
+              <w:rPr>
+                <w:rFonts w:ascii="Times New Roman" w:hAnsi="Times New Roman"/>
+                <w:sz w:val="17"/>
+              </w:rPr>
               <w:t xml:space="preserve">Exploratory: richer personas repair collapse.</w:t>
             </w:r>
           </w:p>
@@ -14593,9 +14657,9 @@
         <w:t xml:space="preserve">Table 5. Hypotheses and evidence.</w:t>
       </w:r>
     </w:p>
-    <w:bookmarkEnd w:id="53"/>
     <w:bookmarkEnd w:id="54"/>
-    <w:bookmarkStart w:id="61" w:name="discussion"/>
+    <w:bookmarkEnd w:id="55"/>
+    <w:bookmarkStart w:id="62" w:name="discussion"/>
     <w:p>
       <w:pPr>
         <w:pStyle w:val="Heading1"/>
@@ -14604,7 +14668,7 @@
         <w:t xml:space="preserve">6. Discussion</w:t>
       </w:r>
     </w:p>
-    <w:bookmarkStart w:id="55" w:name="theoretical-contributions"/>
+    <w:bookmarkStart w:id="56" w:name="theoretical-contributions"/>
     <w:p>
       <w:pPr>
         <w:pStyle w:val="Heading2"/>
@@ -14740,8 +14804,8 @@
         <w:t xml:space="preserve">idea. A twin is usually understood as a replica that can stand in for the original in a decision. Our evidence supports a narrower reading. At the level of the individual customer, the demographic personas carried almost no information about real counts (rank correlations between -0.17 and +0.16), so a customer-level replica is not supported by these data. At the level of the population, the distribution of counts and the size of effects are reproduced only by designs in which the dispersion is supplied from outside the model and the level is checked against data. The claim that a simulated population is a twin of a real one is therefore a claim about specific properties, and it has to be tested property by property: the share of zeros, the spread, the tail, and the absolute size of an effect. We view this as the main point for information systems research on generative AI in decision support. Evaluation should be stated in terms of the decision-relevant properties of the artifact’s output, because fluency and aggregate plausibility, which are what users see, do not indicate them.</w:t>
       </w:r>
     </w:p>
-    <w:bookmarkEnd w:id="55"/>
-    <w:bookmarkStart w:id="56" w:name="X65830c8ffcd303230289e3fa99b65d240227f6e"/>
+    <w:bookmarkEnd w:id="56"/>
+    <w:bookmarkStart w:id="57" w:name="X65830c8ffcd303230289e3fa99b65d240227f6e"/>
     <w:p>
       <w:pPr>
         <w:pStyle w:val="Heading2"/>
@@ -14856,8 +14920,8 @@
         <w:t xml:space="preserve">A further observation concerns use. The simulators’ output looked plausible: the sign of the promotion effect was right in nearly all cells, and the answers were fluent and well formed. Errors of the kind we document, such as a compressed spread or a tenfold lift, cannot be seen by inspecting the output, which is why an explicit evaluation protocol is needed before such a system is adopted for decisions.</w:t>
       </w:r>
     </w:p>
-    <w:bookmarkEnd w:id="56"/>
-    <w:bookmarkStart w:id="57" w:name="implications-for-practice"/>
+    <w:bookmarkEnd w:id="57"/>
+    <w:bookmarkStart w:id="58" w:name="implications-for-practice"/>
     <w:p>
       <w:pPr>
         <w:pStyle w:val="Heading2"/>
@@ -15003,8 +15067,8 @@
         <w:t xml:space="preserve">The consequence for a decision can be shown in a stylized example. A firm launches a promotion if the expected gain per targeted customer exceeds its cost, that is, if the lift in purchase probability exceeds the ratio of cost to margin. Suppose a promotion costs 1 monetary unit per targeted customer and each purchase earns a margin of 50, so the ratio is 0.02. The real lift in purchase probability from the men’s email was 0.0068, below 0.02, so the randomized test says not to launch. The simulated lift exceeded 0.02 in 13 of the 16 configurations (the median was 0.065, and the real value was exceeded in 15), so a firm that relied on those simulators would have launched. The stylized numbers are ours and are not taken from the retailer, and the email test does not involve a discount, but the example shows how an overstated absolute lift turns directly into a wrong go decision.</w:t>
       </w:r>
     </w:p>
-    <w:bookmarkEnd w:id="57"/>
-    <w:bookmarkStart w:id="58" w:name="the-cost-of-uncritical-trust"/>
+    <w:bookmarkEnd w:id="58"/>
+    <w:bookmarkStart w:id="59" w:name="the-cost-of-uncritical-trust"/>
     <w:p>
       <w:pPr>
         <w:pStyle w:val="Heading2"/>
@@ -15186,8 +15250,8 @@
         <w:t xml:space="preserve">These risks do not argue against the technology. They argue against using it as a replacement for evidence rather than as a complement to it, and against purchasing decisions that are based on demonstrations of fluency and plausible averages, which are the properties our experiments show to be least informative about decision quality.</w:t>
       </w:r>
     </w:p>
-    <w:bookmarkEnd w:id="58"/>
-    <w:bookmarkStart w:id="59" w:name="X94616b3a30dccc1fe21684587130f01609b39ab"/>
+    <w:bookmarkEnd w:id="59"/>
+    <w:bookmarkStart w:id="60" w:name="X94616b3a30dccc1fe21684587130f01609b39ab"/>
     <w:p>
       <w:pPr>
         <w:pStyle w:val="Heading2"/>
@@ -15312,8 +15376,8 @@
         <w:t xml:space="preserve">Each randomized test that the organization runs is also a calibration data point for its simulator. A system that stores the simulated and the realized lift for each past campaign can track its own bias over time and adjust the calibration step, which turns an occasional validation into a continuing feedback process.</w:t>
       </w:r>
     </w:p>
-    <w:bookmarkEnd w:id="59"/>
-    <w:bookmarkStart w:id="60" w:name="limitations-and-future-research"/>
+    <w:bookmarkEnd w:id="60"/>
+    <w:bookmarkStart w:id="61" w:name="limitations-and-future-research"/>
     <w:p>
       <w:pPr>
         <w:pStyle w:val="Heading2"/>
@@ -15365,9 +15429,9 @@
         <w:t xml:space="preserve">), so that test marks the limit of observable personas rather than a limit of particular models; settings in which observable attributes, such as purchase histories, are more predictive of purchase frequency would be a stronger test of Proposition 1. In the Complete Journey data campaigns were targeted rather than randomized, so only the email experiment supports a causal comparison. Design C truncates its top bin, which lowers the dispersion it can reach; we quantified this ceiling but did not remove it. Public data may also be part of the models’ training data. Future work should evaluate the hybrid design with a calibrated mean, test prompts that elicit several candidate answers with probabilities, and use a randomized promotion data set with purchase counts, for example from a partner firm, so that the count-distribution and treatment-effect questions can be studied on the same customers.</w:t>
       </w:r>
     </w:p>
-    <w:bookmarkEnd w:id="60"/>
     <w:bookmarkEnd w:id="61"/>
-    <w:bookmarkStart w:id="62" w:name="conclusion"/>
+    <w:bookmarkEnd w:id="62"/>
+    <w:bookmarkStart w:id="63" w:name="conclusion"/>
     <w:p>
       <w:pPr>
         <w:pStyle w:val="Heading1"/>
@@ -15384,8 +15448,8 @@
         <w:t xml:space="preserve">Synthetic customers built from language models do not yet reproduce the shape of real purchase-count distributions or the size of real promotion effects. Direct and day-by-day designs collapse toward a single value whether the mean is 0.5, 4.8, or 7.8, and larger, more recent models do not change this; describing a distribution repairs part of the damage but loses zeros; and a hybrid that takes only the mean from the model matches the dispersion when that mean is accurate. In a randomized email test the models usually get the sign of the effect right, but the absolute lift in purchase probability is overstated in 15 of 16 configurations and similar treatments are not told apart. Practitioners who use synthetic customers should check dispersion and zero share against their own data, rely on the model for means only, and validate absolute effects before they act on them. For the design of such systems, the evidence points to separating the level, which the model can supply, from the spread, which must come from an external calibrated source, and to evaluating the artifact against the decision it is meant to support.</w:t>
       </w:r>
     </w:p>
-    <w:bookmarkEnd w:id="62"/>
-    <w:bookmarkStart w:id="63" w:name="references"/>
+    <w:bookmarkEnd w:id="63"/>
+    <w:bookmarkStart w:id="64" w:name="references"/>
     <w:p>
       <w:pPr>
         <w:pStyle w:val="Heading1"/>
@@ -15870,8 +15934,8 @@
         <w:t xml:space="preserve">Zhang R, Zhang X, Zhao M (2025b) Predicting effects, missing distributions: Evaluating LLMs as human behavior simulators in operations management. Preprint, submitted September 30, arXiv:2510.03310.</w:t>
       </w:r>
     </w:p>
-    <w:bookmarkEnd w:id="63"/>
-    <w:bookmarkStart w:id="64" w:name="appendix-a.-prompt-templates"/>
+    <w:bookmarkEnd w:id="64"/>
+    <w:bookmarkStart w:id="65" w:name="appendix-a.-prompt-templates"/>
     <w:p>
       <w:pPr>
         <w:pStyle w:val="Heading1"/>
@@ -16048,8 +16112,8 @@
         <w:t xml:space="preserve">”</w:t>
       </w:r>
     </w:p>
-    <w:bookmarkEnd w:id="64"/>
-    <w:bookmarkStart w:id="65" w:name="appendix-b.-full-results"/>
+    <w:bookmarkEnd w:id="65"/>
+    <w:bookmarkStart w:id="66" w:name="appendix-b.-full-results"/>
     <w:p>
       <w:pPr>
         <w:pStyle w:val="Heading1"/>
@@ -41492,8 +41556,8 @@
         <w:t xml:space="preserve">Table B3. Persona experiment with real household demographics, 600 household-windows per cell. Reference row: real distribution of the 801 households (10,413 household-windows). * the 95% bootstrap interval excludes the reference value.</w:t>
       </w:r>
     </w:p>
-    <w:bookmarkEnd w:id="65"/>
-    <w:bookmarkStart w:id="66" w:name="appendix-c.-reproducibility"/>
+    <w:bookmarkEnd w:id="66"/>
+    <w:bookmarkStart w:id="67" w:name="appendix-c.-reproducibility"/>
     <w:p>
       <w:pPr>
         <w:pStyle w:val="Heading1"/>
@@ -41531,7 +41595,7 @@
         <w:t xml:space="preserve">). Raw model responses are saved with each run. Household-level Complete Journey data are not redistributed; the code reads them from the public package files.</w:t>
       </w:r>
     </w:p>
-    <w:bookmarkEnd w:id="66"/>
+    <w:bookmarkEnd w:id="67"/>
     <w:sectPr/>
   </w:body>
 </w:document>

</xml_diff>

<commit_message>
Manuscript: calibration test of the hybrid design (Section 5.8), abstract/conclusion/principle 3 updated
Co-Authored-By: Claude Sonnet 5.5 <noreply@anthropic.com>
Claude-Session: https://claude.ai/code/session_01VRbK37d38KZhVAbWS4xw4x
</commit_message>
<xml_diff>
--- a/llm-count-study/ISR_manuscript_draft.docx
+++ b/llm-count-study/ISR_manuscript_draft.docx
@@ -51,7 +51,7 @@
         <w:pStyle w:val="BodyText"/>
       </w:pPr>
       <w:r>
-        <w:t xml:space="preserve">Large language models (LLMs) are increasingly used to create synthetic customers for pre-testing marketing decisions, but evaluations have concentrated on ratings, choices, and stated willingness to pay. We study an output that customer analytics depends on more directly: the number of purchases a customer makes in a period. Building on the Poisson–gamma account of purchase counts, we show analytically that overdispersion measures unobserved customer heterogeneity, derive how much of it a persona-conditioned simulator can carry, and show how a hybrid design avoids double counting. We evaluate four elicitation designs across eight LLMs in public transaction settings (mean counts of about 0.5, 4.8, and 7.8) and in a randomized email experiment. Direct and day-by-day designs collapse toward a single value in nearly every model and setting, and larger, more recent models do not change this. Describing a distribution recovers part of the dispersion but under-produces zero counts where zeros are common. Personas built from real household demographics change nothing, because those demographics explain about 1% of the heterogeneity in counts. The hybrid matches dispersion only when the model’s mean is accurate. Promotion effects have the right sign in most settings, yet their size varies by an order of magnitude with model and prompt, and the absolute lift in purchase probability is overstated in 15 of 16 configurations (median about tenfold). Treating the simulator as a decision-support artifact at the interface of information systems and marketing analytics, we show why the Poisson–gamma result becomes a managerial problem when heterogeneity is generated instead of estimated, read the propositions as design constraints and a calibration mechanism, derive design principles and an evaluation protocol, and show that the overstated lifts would lead a firm to approve promotions that a randomized test rejects. We close with organizational implications for validating and governing synthetic data in analytics systems.</w:t>
+        <w:t xml:space="preserve">Large language models (LLMs) are increasingly used to create synthetic customers for pre-testing marketing decisions, but evaluations have concentrated on ratings, choices, and stated willingness to pay. We study an output that customer analytics depends on more directly: the number of purchases a customer makes in a period. Building on the Poisson–gamma account of purchase counts, we show analytically that overdispersion measures unobserved customer heterogeneity, derive how much of it a persona-conditioned simulator can carry, and show how a hybrid design avoids double counting. We evaluate four elicitation designs across eight LLMs in public transaction settings (mean counts of about 0.5, 4.8, and 7.8) and in a randomized email experiment. Direct and day-by-day designs collapse toward a single value in nearly every model and setting, and larger, more recent models do not change this. Describing a distribution recovers part of the dispersion but under-produces zero counts where zeros are common. Personas built from real household demographics change nothing, because those demographics explain about 1% of the heterogeneity in counts. The hybrid matches dispersion only when the model’s mean is accurate; calibrating the mean to a historical average repairs the mean, but a baseline that uses no model information fits as well or better, so in this task the model supplies a level and little else. Promotion effects have the right sign in most settings, yet their size varies by an order of magnitude with model and prompt, and the absolute lift in purchase probability is overstated in 15 of 16 configurations (median about tenfold). Treating the simulator as a decision-support artifact at the interface of information systems and marketing analytics, we show why the Poisson–gamma result becomes a managerial problem when heterogeneity is generated instead of estimated, read the propositions as design constraints and a calibration mechanism, derive design principles and an evaluation protocol, and show that the overstated lifts would lead a firm to approve promotions that a randomized test rejects. We close with organizational implications for validating and governing synthetic data in analytics systems.</w:t>
       </w:r>
     </w:p>
     <w:p>
@@ -5423,7 +5423,7 @@
     </w:p>
     <w:bookmarkEnd w:id="39"/>
     <w:bookmarkEnd w:id="40"/>
-    <w:bookmarkStart w:id="55" w:name="results"/>
+    <w:bookmarkStart w:id="56" w:name="results"/>
     <w:p>
       <w:pPr>
         <w:pStyle w:val="Heading1"/>
@@ -14126,13 +14126,81 @@
       </w:r>
     </w:p>
     <w:bookmarkEnd w:id="53"/>
-    <w:bookmarkStart w:id="54" w:name="summary-of-hypotheses"/>
+    <w:bookmarkStart w:id="54" w:name="X52637fe7e353464fec878db4ec7eccc11e1b40e"/>
     <w:p>
       <w:pPr>
         <w:pStyle w:val="Heading2"/>
       </w:pPr>
       <w:r>
-        <w:t xml:space="preserve">5.8 Summary of hypotheses</w:t>
+        <w:t xml:space="preserve">5.8 Does calibrating the level repair the hybrid design?</w:t>
+      </w:r>
+    </w:p>
+    <w:p>
+      <w:pPr>
+        <w:pStyle w:val="FirstParagraph"/>
+      </w:pPr>
+      <w:r>
+        <w:t xml:space="preserve">The hybrid design inherits the model’s mean, which was often wrong. An obvious repair is to rescale the model’s expected counts so that their average equals the historical mean of the organization’s own customer file, and to keep the external gamma multiplier of Proposition 2. We tested this offline on the stored expected counts of design D, in every model-and-prompt cell, with a fresh simulation of the counts (so the figures differ slightly from those in Sections 5.2 to 5.5). We added a baseline that uses no information from the model: every customer receives the reference mean, and the same gamma multiplier supplies the entire dispersion. This baseline is the reference distribution itself, up to sampling, and it shows what the model adds.</w:t>
+      </w:r>
+    </w:p>
+    <w:p>
+      <w:pPr>
+        <w:pStyle w:val="BodyText"/>
+      </w:pPr>
+      <w:r>
+        <w:t xml:space="preserve">Calibration does what it is meant to do for the mean. The mean matches the reference in 44 of 48 cells after calibration, against 19 of 48 before (13 of 16 against 9 in the low-mean setting, 15 against 6 in the high-mean setting, and 16 against 4 for the demographic households). It does not, however, make the design match the reference on all four statistics at once. The number of cells that match on mean, variance-to-mean ratio, zero share, and</w:t>
+      </w:r>
+      <w:r>
+        <w:t xml:space="preserve"> </w:t>
+      </w:r>
+      <m:oMath>
+        <m:r>
+          <m:t>α</m:t>
+        </m:r>
+      </m:oMath>
+      <w:r>
+        <w:t xml:space="preserve"> </w:t>
+      </w:r>
+      <w:r>
+        <w:t xml:space="preserve">together is 14 of 48 after calibration and 10 of 48 before, and 19 of 48 for the baseline with no model information (low-mean setting: 12, 7, and 15 of 16; high-mean setting: 2, 3, and 4 of 16; demographic households: 0 in all three). The remaining mismatches are mostly in the zero share, and they do not come from the model. A Poisson–gamma distribution with the reference mean and dispersion implies a zero share of 0.23 in the high-mean setting (real 0.19) and of 0.07 for the demographic households (real 0.03), so the parametric family itself misses the zeros of these empirical distributions, and the baseline shows the same misses.</w:t>
+      </w:r>
+    </w:p>
+    <w:p>
+      <w:pPr>
+        <w:pStyle w:val="BodyText"/>
+      </w:pPr>
+      <w:r>
+        <w:t xml:space="preserve">The squared coefficient of variation of the model’s expected counts, which is the heterogeneity that the model contributes, ranged from 0.00 to 0.75 in the low-mean setting (against</w:t>
+      </w:r>
+      <w:r>
+        <w:t xml:space="preserve"> </w:t>
+      </w:r>
+      <m:oMath>
+        <m:r>
+          <m:t>α</m:t>
+        </m:r>
+        <m:r>
+          <m:rPr>
+            <m:sty m:val="p"/>
+          </m:rPr>
+          <m:t>=</m:t>
+        </m:r>
+        <m:r>
+          <m:t>3.05</m:t>
+        </m:r>
+      </m:oMath>
+      <w:r>
+        <w:t xml:space="preserve">), from 0.00 to 1.00 in the high-mean setting (against 1.42; the largest value is Llama with the anchor), and from 0.00 to 0.07 for the demographic households (against 0.71). With rank correlations to real counts near zero (Section 5.5), this heterogeneity is not informative about which customers buy more. The evidence therefore supports a narrow reading of the model’s role. In this task it supplies a level, and a model-free level taken from the organization’s data does as well or better. Whether a model contributes more when the personas carry informative history, such as past purchases, is untested.</w:t>
+      </w:r>
+    </w:p>
+    <w:bookmarkEnd w:id="54"/>
+    <w:bookmarkStart w:id="55" w:name="summary-of-hypotheses"/>
+    <w:p>
+      <w:pPr>
+        <w:pStyle w:val="Heading2"/>
+      </w:pPr>
+      <w:r>
+        <w:t xml:space="preserve">5.9 Summary of hypotheses</w:t>
       </w:r>
     </w:p>
     <w:tbl>
@@ -14543,6 +14611,44 @@
                 <w:rFonts w:ascii="Times New Roman" w:hAnsi="Times New Roman"/>
                 <w:sz w:val="17"/>
               </w:rPr>
+              <w:t xml:space="preserve">Exploratory: calibrating the model’s level repairs the hybrid design.</w:t>
+            </w:r>
+          </w:p>
+        </w:tc>
+        <w:tc>
+          <w:tcPr/>
+          <w:p>
+            <w:pPr>
+              <w:pStyle w:val="Compact"/>
+              <w:spacing w:before="20" w:after="20" w:line="240" w:lineRule="auto"/>
+              <w:ind w:firstLine="0"/>
+              <w:jc w:val="left"/>
+            </w:pPr>
+            <w:r>
+              <w:rPr>
+                <w:rFonts w:ascii="Times New Roman" w:hAnsi="Times New Roman"/>
+                <w:sz w:val="17"/>
+              </w:rPr>
+              <w:t xml:space="preserve">Partly. The mean matches in 44 of 48 cells after calibration (19 before), but the number of cells matching on all four statistics rises only from 10 to 14 of 48, and a baseline that uses no model information matches in 19 of 48.</w:t>
+            </w:r>
+          </w:p>
+        </w:tc>
+      </w:tr>
+      <w:tr>
+        <w:tc>
+          <w:tcPr/>
+          <w:p>
+            <w:pPr>
+              <w:pStyle w:val="Compact"/>
+              <w:spacing w:before="20" w:after="20" w:line="240" w:lineRule="auto"/>
+              <w:ind w:firstLine="0"/>
+              <w:jc w:val="left"/>
+            </w:pPr>
+            <w:r>
+              <w:rPr>
+                <w:rFonts w:ascii="Times New Roman" w:hAnsi="Times New Roman"/>
+                <w:sz w:val="17"/>
+              </w:rPr>
               <w:t xml:space="preserve">Exploratory: concentration of purchases among heavy buyers (Proposition 3).</w:t>
             </w:r>
           </w:p>
@@ -14657,9 +14763,9 @@
         <w:t xml:space="preserve">Table 5. Hypotheses and evidence.</w:t>
       </w:r>
     </w:p>
-    <w:bookmarkEnd w:id="54"/>
     <w:bookmarkEnd w:id="55"/>
-    <w:bookmarkStart w:id="62" w:name="discussion"/>
+    <w:bookmarkEnd w:id="56"/>
+    <w:bookmarkStart w:id="63" w:name="discussion"/>
     <w:p>
       <w:pPr>
         <w:pStyle w:val="Heading1"/>
@@ -14668,7 +14774,7 @@
         <w:t xml:space="preserve">6. Discussion</w:t>
       </w:r>
     </w:p>
-    <w:bookmarkStart w:id="56" w:name="theoretical-contributions"/>
+    <w:bookmarkStart w:id="57" w:name="theoretical-contributions"/>
     <w:p>
       <w:pPr>
         <w:pStyle w:val="Heading2"/>
@@ -14804,8 +14910,8 @@
         <w:t xml:space="preserve">idea. A twin is usually understood as a replica that can stand in for the original in a decision. Our evidence supports a narrower reading. At the level of the individual customer, the demographic personas carried almost no information about real counts (rank correlations between -0.17 and +0.16), so a customer-level replica is not supported by these data. At the level of the population, the distribution of counts and the size of effects are reproduced only by designs in which the dispersion is supplied from outside the model and the level is checked against data. The claim that a simulated population is a twin of a real one is therefore a claim about specific properties, and it has to be tested property by property: the share of zeros, the spread, the tail, and the absolute size of an effect. We view this as the main point for information systems research on generative AI in decision support. Evaluation should be stated in terms of the decision-relevant properties of the artifact’s output, because fluency and aggregate plausibility, which are what users see, do not indicate them.</w:t>
       </w:r>
     </w:p>
-    <w:bookmarkEnd w:id="56"/>
-    <w:bookmarkStart w:id="57" w:name="X65830c8ffcd303230289e3fa99b65d240227f6e"/>
+    <w:bookmarkEnd w:id="57"/>
+    <w:bookmarkStart w:id="58" w:name="X65830c8ffcd303230289e3fa99b65d240227f6e"/>
     <w:p>
       <w:pPr>
         <w:pStyle w:val="Heading2"/>
@@ -14873,7 +14979,7 @@
         <w:t xml:space="preserve"> </w:t>
       </w:r>
       <w:r>
-        <w:t xml:space="preserve">Because the persona bounds what the model can carry (Section 3.8), the data assets that feed the persona matter more than the choice of model. The mean from the model was the bottleneck of the hybrid design (matching the reference in only 13 of 48 cells). A rescaling of the model’s rate against a historical customer file is a natural step that we did not test.</w:t>
+        <w:t xml:space="preserve">Because the persona bounds what the model can carry (Section 3.8), the data assets that feed the persona matter more than the choice of model. The mean from the model was the bottleneck of the hybrid design (matching the reference in only 13 of 48 cells). Rescaling the model’s rates to the historical mean repaired the mean in 44 of 48 cells (Section 5.8), but a baseline that gives every customer the historical mean did as well or better on the joint fit, so calibration should be paired with a test against such a baseline to show what the model adds.</w:t>
       </w:r>
     </w:p>
     <w:p>
@@ -14920,8 +15026,8 @@
         <w:t xml:space="preserve">A further observation concerns use. The simulators’ output looked plausible: the sign of the promotion effect was right in nearly all cells, and the answers were fluent and well formed. Errors of the kind we document, such as a compressed spread or a tenfold lift, cannot be seen by inspecting the output, which is why an explicit evaluation protocol is needed before such a system is adopted for decisions.</w:t>
       </w:r>
     </w:p>
-    <w:bookmarkEnd w:id="57"/>
-    <w:bookmarkStart w:id="58" w:name="implications-for-practice"/>
+    <w:bookmarkEnd w:id="58"/>
+    <w:bookmarkStart w:id="59" w:name="implications-for-practice"/>
     <w:p>
       <w:pPr>
         <w:pStyle w:val="Heading2"/>
@@ -15006,13 +15112,13 @@
           <w:iCs/>
           <w:i/>
         </w:rPr>
-        <w:t xml:space="preserve">If the model is used, use it for the mean only,</w:t>
+        <w:t xml:space="preserve">If the model is used, use it for the level only, calibrate the level, and test the model against a baseline without it.</w:t>
       </w:r>
       <w:r>
         <w:t xml:space="preserve"> </w:t>
       </w:r>
       <w:r>
-        <w:t xml:space="preserve">and inject the remaining heterogeneity externally, calibrated according to Proposition 2 on a historical or pilot sample. Verify that the model’s mean is accurate; the hybrid inherits its errors, and in our data the mean matched the reference in only 13 of 48 hybrid cells.</w:t>
+        <w:t xml:space="preserve">Inject the remaining heterogeneity externally, calibrated according to Proposition 2 on a historical or pilot sample, and rescale the model’s rates to the historical mean. In our data the uncalibrated mean matched the reference in only 13 of 48 hybrid cells, calibration raised this to 44, and a baseline that used the historical mean alone fitted as well or better, so the value of the model has to be shown, not assumed.</w:t>
       </w:r>
     </w:p>
     <w:p>
@@ -15067,8 +15173,8 @@
         <w:t xml:space="preserve">The consequence for a decision can be shown in a stylized example. A firm launches a promotion if the expected gain per targeted customer exceeds its cost, that is, if the lift in purchase probability exceeds the ratio of cost to margin. Suppose a promotion costs 1 monetary unit per targeted customer and each purchase earns a margin of 50, so the ratio is 0.02. The real lift in purchase probability from the men’s email was 0.0068, below 0.02, so the randomized test says not to launch. The simulated lift exceeded 0.02 in 13 of the 16 configurations (the median was 0.065, and the real value was exceeded in 15), so a firm that relied on those simulators would have launched. The stylized numbers are ours and are not taken from the retailer, and the email test does not involve a discount, but the example shows how an overstated absolute lift turns directly into a wrong go decision.</w:t>
       </w:r>
     </w:p>
-    <w:bookmarkEnd w:id="58"/>
-    <w:bookmarkStart w:id="59" w:name="the-cost-of-uncritical-trust"/>
+    <w:bookmarkEnd w:id="59"/>
+    <w:bookmarkStart w:id="60" w:name="the-cost-of-uncritical-trust"/>
     <w:p>
       <w:pPr>
         <w:pStyle w:val="Heading2"/>
@@ -15250,8 +15356,8 @@
         <w:t xml:space="preserve">These risks do not argue against the technology. They argue against using it as a replacement for evidence rather than as a complement to it, and against purchasing decisions that are based on demonstrations of fluency and plausible averages, which are the properties our experiments show to be least informative about decision quality.</w:t>
       </w:r>
     </w:p>
-    <w:bookmarkEnd w:id="59"/>
-    <w:bookmarkStart w:id="60" w:name="X94616b3a30dccc1fe21684587130f01609b39ab"/>
+    <w:bookmarkEnd w:id="60"/>
+    <w:bookmarkStart w:id="61" w:name="X94616b3a30dccc1fe21684587130f01609b39ab"/>
     <w:p>
       <w:pPr>
         <w:pStyle w:val="Heading2"/>
@@ -15376,8 +15482,8 @@
         <w:t xml:space="preserve">Each randomized test that the organization runs is also a calibration data point for its simulator. A system that stores the simulated and the realized lift for each past campaign can track its own bias over time and adjust the calibration step, which turns an occasional validation into a continuing feedback process.</w:t>
       </w:r>
     </w:p>
-    <w:bookmarkEnd w:id="60"/>
-    <w:bookmarkStart w:id="61" w:name="limitations-and-future-research"/>
+    <w:bookmarkEnd w:id="61"/>
+    <w:bookmarkStart w:id="62" w:name="limitations-and-future-research"/>
     <w:p>
       <w:pPr>
         <w:pStyle w:val="Heading2"/>
@@ -15429,9 +15535,9 @@
         <w:t xml:space="preserve">), so that test marks the limit of observable personas rather than a limit of particular models; settings in which observable attributes, such as purchase histories, are more predictive of purchase frequency would be a stronger test of Proposition 1. In the Complete Journey data campaigns were targeted rather than randomized, so only the email experiment supports a causal comparison. Design C truncates its top bin, which lowers the dispersion it can reach; we quantified this ceiling but did not remove it. Public data may also be part of the models’ training data. Future work should evaluate the hybrid design with a calibrated mean, test prompts that elicit several candidate answers with probabilities, and use a randomized promotion data set with purchase counts, for example from a partner firm, so that the count-distribution and treatment-effect questions can be studied on the same customers.</w:t>
       </w:r>
     </w:p>
-    <w:bookmarkEnd w:id="61"/>
     <w:bookmarkEnd w:id="62"/>
-    <w:bookmarkStart w:id="63" w:name="conclusion"/>
+    <w:bookmarkEnd w:id="63"/>
+    <w:bookmarkStart w:id="64" w:name="conclusion"/>
     <w:p>
       <w:pPr>
         <w:pStyle w:val="Heading1"/>
@@ -15445,11 +15551,11 @@
         <w:pStyle w:val="FirstParagraph"/>
       </w:pPr>
       <w:r>
-        <w:t xml:space="preserve">Synthetic customers built from language models do not yet reproduce the shape of real purchase-count distributions or the size of real promotion effects. Direct and day-by-day designs collapse toward a single value whether the mean is 0.5, 4.8, or 7.8, and larger, more recent models do not change this; describing a distribution repairs part of the damage but loses zeros; and a hybrid that takes only the mean from the model matches the dispersion when that mean is accurate. In a randomized email test the models usually get the sign of the effect right, but the absolute lift in purchase probability is overstated in 15 of 16 configurations and similar treatments are not told apart. Practitioners who use synthetic customers should check dispersion and zero share against their own data, rely on the model for means only, and validate absolute effects before they act on them. For the design of such systems, the evidence points to separating the level, which the model can supply, from the spread, which must come from an external calibrated source, and to evaluating the artifact against the decision it is meant to support.</w:t>
+        <w:t xml:space="preserve">Synthetic customers built from language models do not yet reproduce the shape of real purchase-count distributions or the size of real promotion effects. Direct and day-by-day designs collapse toward a single value whether the mean is 0.5, 4.8, or 7.8, and larger, more recent models do not change this; describing a distribution repairs part of the damage but loses zeros; and a hybrid that takes only the mean from the model matches the dispersion when that mean is accurate, although a baseline that uses the historical mean alone does about as well. In a randomized email test the models usually get the sign of the effect right, but the absolute lift in purchase probability is overstated in 15 of 16 configurations and similar treatments are not told apart. Practitioners who use synthetic customers should check dispersion and zero share against their own data, rely on the model for means only, and validate absolute effects before they act on them. For the design of such systems, the evidence points to separating the level, which the model can supply, from the spread, which must come from an external calibrated source, and to evaluating the artifact against the decision it is meant to support.</w:t>
       </w:r>
     </w:p>
-    <w:bookmarkEnd w:id="63"/>
-    <w:bookmarkStart w:id="64" w:name="references"/>
+    <w:bookmarkEnd w:id="64"/>
+    <w:bookmarkStart w:id="65" w:name="references"/>
     <w:p>
       <w:pPr>
         <w:pStyle w:val="Heading1"/>
@@ -15934,8 +16040,8 @@
         <w:t xml:space="preserve">Zhang R, Zhang X, Zhao M (2025b) Predicting effects, missing distributions: Evaluating LLMs as human behavior simulators in operations management. Preprint, submitted September 30, arXiv:2510.03310.</w:t>
       </w:r>
     </w:p>
-    <w:bookmarkEnd w:id="64"/>
-    <w:bookmarkStart w:id="65" w:name="appendix-a.-prompt-templates"/>
+    <w:bookmarkEnd w:id="65"/>
+    <w:bookmarkStart w:id="66" w:name="appendix-a.-prompt-templates"/>
     <w:p>
       <w:pPr>
         <w:pStyle w:val="Heading1"/>
@@ -16112,8 +16218,8 @@
         <w:t xml:space="preserve">”</w:t>
       </w:r>
     </w:p>
-    <w:bookmarkEnd w:id="65"/>
-    <w:bookmarkStart w:id="66" w:name="appendix-b.-full-results"/>
+    <w:bookmarkEnd w:id="66"/>
+    <w:bookmarkStart w:id="67" w:name="appendix-b.-full-results"/>
     <w:p>
       <w:pPr>
         <w:pStyle w:val="Heading1"/>
@@ -41556,8 +41662,8 @@
         <w:t xml:space="preserve">Table B3. Persona experiment with real household demographics, 600 household-windows per cell. Reference row: real distribution of the 801 households (10,413 household-windows). * the 95% bootstrap interval excludes the reference value.</w:t>
       </w:r>
     </w:p>
-    <w:bookmarkEnd w:id="66"/>
-    <w:bookmarkStart w:id="67" w:name="appendix-c.-reproducibility"/>
+    <w:bookmarkEnd w:id="67"/>
+    <w:bookmarkStart w:id="68" w:name="appendix-c.-reproducibility"/>
     <w:p>
       <w:pPr>
         <w:pStyle w:val="Heading1"/>
@@ -41595,7 +41701,7 @@
         <w:t xml:space="preserve">). Raw model responses are saved with each run. Household-level Complete Journey data are not redistributed; the code reads them from the public package files.</w:t>
       </w:r>
     </w:p>
-    <w:bookmarkEnd w:id="67"/>
+    <w:bookmarkEnd w:id="68"/>
     <w:sectPr/>
   </w:body>
 </w:document>

</xml_diff>

<commit_message>
Manuscript: email experiment with eight models on three seeds (Table 4, Section 5.6, hypotheses, decision example)
Co-Authored-By: Claude Sonnet 5.5 <noreply@anthropic.com>
Claude-Session: https://claude.ai/code/session_01VRbK37d38KZhVAbWS4xw4x
</commit_message>
<xml_diff>
--- a/llm-count-study/ISR_manuscript_draft.docx
+++ b/llm-count-study/ISR_manuscript_draft.docx
@@ -51,7 +51,7 @@
         <w:pStyle w:val="BodyText"/>
       </w:pPr>
       <w:r>
-        <w:t xml:space="preserve">Large language models (LLMs) are increasingly used to create synthetic customers for pre-testing marketing decisions, but evaluations have concentrated on ratings, choices, and stated willingness to pay. We study an output that customer analytics depends on more directly: the number of purchases a customer makes in a period. Building on the Poisson–gamma account of purchase counts, we show analytically that overdispersion measures unobserved customer heterogeneity, derive how much of it a persona-conditioned simulator can carry, and show how a hybrid design avoids double counting. We evaluate four elicitation designs across eight LLMs in public transaction settings (mean counts of about 0.5, 4.8, and 7.8) and in a randomized email experiment. Direct and day-by-day designs collapse toward a single value in nearly every model and setting, and larger, more recent models do not change this. Describing a distribution recovers part of the dispersion but under-produces zero counts where zeros are common. Personas built from real household demographics change nothing, because those demographics explain about 1% of the heterogeneity in counts. The hybrid matches dispersion only when the model’s mean is accurate; calibrating the mean to a historical average repairs the mean, but a baseline that uses no model information fits as well or better, so in this task the model supplies a level and little else. Promotion effects have the right sign in most settings, yet their size varies by an order of magnitude with model and prompt, and the absolute lift in purchase probability is overstated in 15 of 16 configurations (median about tenfold). Treating the simulator as a decision-support artifact at the interface of information systems and marketing analytics, we show why the Poisson–gamma result becomes a managerial problem when heterogeneity is generated instead of estimated, read the propositions as design constraints and a calibration mechanism, derive design principles and an evaluation protocol, and show that the overstated lifts would lead a firm to approve promotions that a randomized test rejects. We close with organizational implications for validating and governing synthetic data in analytics systems.</w:t>
+        <w:t xml:space="preserve">Large language models (LLMs) are increasingly used to create synthetic customers for pre-testing marketing decisions, but evaluations have concentrated on ratings, choices, and stated willingness to pay. We study an output that customer analytics depends on more directly: the number of purchases a customer makes in a period. Building on the Poisson–gamma account of purchase counts, we show analytically that overdispersion measures unobserved customer heterogeneity, derive how much of it a persona-conditioned simulator can carry, and show how a hybrid design avoids double counting. We evaluate four elicitation designs across eight LLMs in public transaction settings (mean counts of about 0.5, 4.8, and 7.8) and in a randomized email experiment. Direct and day-by-day designs collapse toward a single value in nearly every model and setting, and larger, more recent models do not change this. Describing a distribution recovers part of the dispersion but under-produces zero counts where zeros are common. Personas built from real household demographics change nothing, because those demographics explain about 1% of the heterogeneity in counts. The hybrid matches dispersion only when the model’s mean is accurate; calibrating the mean to a historical average repairs the mean, but a baseline that uses no model information fits as well or better, so in this task the model supplies a level and little else. Promotion effects have the right sign in most settings, yet their size varies by an order of magnitude with model and prompt, and the absolute lift in purchase probability is overstated in 15 of 16 configurations (median about ninefold). Treating the simulator as a decision-support artifact at the interface of information systems and marketing analytics, we show why the Poisson–gamma result becomes a managerial problem when heterogeneity is generated instead of estimated, read the propositions as design constraints and a calibration mechanism, derive design principles and an evaluation protocol, and show that the overstated lifts would lead a firm to approve promotions that a randomized test rejects. We close with organizational implications for validating and governing synthetic data in analytics systems.</w:t>
       </w:r>
     </w:p>
     <w:p>
@@ -5389,7 +5389,7 @@
         <w:pStyle w:val="FirstParagraph"/>
       </w:pPr>
       <w:r>
-        <w:t xml:space="preserve">We used eight LLMs through the OpenRouter interface: GPT-4o-mini, Llama-3.3-70B-Instruct, and Claude Haiku 5.5 in the first runs, and Claude Sonnet 5, GPT-5.6-terra, DeepSeek-V4-Pro, Gemini 3.1 Flash-Lite, and Mistral Large 4, which were added to test whether larger and more recent models behave differently. All eight models were run on three random seeds, that is, on three independent samples of customers (or household-windows) with new model calls, in the three transaction settings; in the email experiment the first three models were run on three seeds and the five newer models on one. In the low-mean setting GPT-4o-mini and Llama were run at temperatures 0.3, 0.7, and 1.0 in the first seed and at 0.7 in the two further seeds, giving 1,000 customers per cell; the other six models contribute 600 (three seeds of 200). In the two high-mean settings the temperature was fixed at 0.7, with 600 customers or household-windows per cell. In the email experiment each seed uses 300 customers (900 for the three models run on three seeds). Three models (Haiku 5.5, Sonnet 5, and GPT-5.6-terra) do not accept a temperature setting and contribute one run per prompt variant and seed. For every model that allows it, hidden reasoning was switched off so that short answers are not truncated. For each cell we report the mean, the variance-to-mean ratio, the zero share, and</w:t>
+        <w:t xml:space="preserve">We used eight LLMs through the OpenRouter interface: GPT-4o-mini, Llama-3.3-70B-Instruct, and Claude Haiku 5.5 in the first runs, and Claude Sonnet 5, GPT-5.6-terra, DeepSeek-V4-Pro, Gemini 3.1 Flash-Lite, and Mistral Large 4, which were added to test whether larger and more recent models behave differently. All eight models were run on three random seeds, that is, on three independent samples of customers (or household-windows) with new model calls, in the three transaction settings. In the low-mean setting GPT-4o-mini and Llama were run at temperatures 0.3, 0.7, and 1.0 in the first seed and at 0.7 in the two further seeds, giving 1,000 customers per cell; the other six models contribute 600 (three seeds of 200). In the two high-mean settings the temperature was fixed at 0.7, with 600 customers or household-windows per cell. In the email experiment each seed uses 300 customers (900 per model over the three seeds). Three models (Haiku 5.5, Sonnet 5, and GPT-5.6-terra) do not accept a temperature setting and contribute one run per prompt variant and seed. For every model that allows it, hidden reasoning was switched off so that short answers are not truncated. For each cell we report the mean, the variance-to-mean ratio, the zero share, and</w:t>
       </w:r>
       <w:r>
         <w:t xml:space="preserve"> </w:t>
@@ -9695,97 +9695,97 @@
                 <w:rFonts w:ascii="Times New Roman" w:hAnsi="Times New Roman"/>
                 <w:sz w:val="17"/>
               </w:rPr>
-              <w:t xml:space="preserve">0.223</w:t>
-            </w:r>
-          </w:p>
-        </w:tc>
-        <w:tc>
-          <w:tcPr/>
-          <w:p>
-            <w:pPr>
-              <w:pStyle w:val="Compact"/>
-              <w:spacing w:before="20" w:after="20" w:line="240" w:lineRule="auto"/>
-              <w:ind w:firstLine="0"/>
-              <w:jc w:val="left"/>
-            </w:pPr>
-            <w:r>
-              <w:rPr>
-                <w:rFonts w:ascii="Times New Roman" w:hAnsi="Times New Roman"/>
-                <w:sz w:val="17"/>
-              </w:rPr>
-              <w:t xml:space="preserve">+0.137 [+0.120, +0.153]*</w:t>
-            </w:r>
-          </w:p>
-        </w:tc>
-        <w:tc>
-          <w:tcPr/>
-          <w:p>
-            <w:pPr>
-              <w:pStyle w:val="Compact"/>
-              <w:spacing w:before="20" w:after="20" w:line="240" w:lineRule="auto"/>
-              <w:ind w:firstLine="0"/>
-              <w:jc w:val="left"/>
-            </w:pPr>
-            <w:r>
-              <w:rPr>
-                <w:rFonts w:ascii="Times New Roman" w:hAnsi="Times New Roman"/>
-                <w:sz w:val="17"/>
-              </w:rPr>
-              <w:t xml:space="preserve">+0.141 [+0.125, +0.157]*</w:t>
-            </w:r>
-          </w:p>
-        </w:tc>
-        <w:tc>
-          <w:tcPr/>
-          <w:p>
-            <w:pPr>
-              <w:pStyle w:val="Compact"/>
-              <w:spacing w:before="20" w:after="20" w:line="240" w:lineRule="auto"/>
-              <w:ind w:firstLine="0"/>
-              <w:jc w:val="left"/>
-            </w:pPr>
-            <w:r>
-              <w:rPr>
-                <w:rFonts w:ascii="Times New Roman" w:hAnsi="Times New Roman"/>
-                <w:sz w:val="17"/>
-              </w:rPr>
-              <w:t xml:space="preserve">-0.004 [-0.031, +0.024]*</w:t>
-            </w:r>
-          </w:p>
-        </w:tc>
-        <w:tc>
-          <w:tcPr/>
-          <w:p>
-            <w:pPr>
-              <w:pStyle w:val="Compact"/>
-              <w:spacing w:before="20" w:after="20" w:line="240" w:lineRule="auto"/>
-              <w:ind w:firstLine="0"/>
-              <w:jc w:val="left"/>
-            </w:pPr>
-            <w:r>
-              <w:rPr>
-                <w:rFonts w:ascii="Times New Roman" w:hAnsi="Times New Roman"/>
-                <w:sz w:val="17"/>
-              </w:rPr>
-              <w:t xml:space="preserve">1.61*</w:t>
-            </w:r>
-          </w:p>
-        </w:tc>
-        <w:tc>
-          <w:tcPr/>
-          <w:p>
-            <w:pPr>
-              <w:pStyle w:val="Compact"/>
-              <w:spacing w:before="20" w:after="20" w:line="240" w:lineRule="auto"/>
-              <w:ind w:firstLine="0"/>
-              <w:jc w:val="left"/>
-            </w:pPr>
-            <w:r>
-              <w:rPr>
-                <w:rFonts w:ascii="Times New Roman" w:hAnsi="Times New Roman"/>
-                <w:sz w:val="17"/>
-              </w:rPr>
-              <w:t xml:space="preserve">1.63*</w:t>
+              <w:t xml:space="preserve">0.212</w:t>
+            </w:r>
+          </w:p>
+        </w:tc>
+        <w:tc>
+          <w:tcPr/>
+          <w:p>
+            <w:pPr>
+              <w:pStyle w:val="Compact"/>
+              <w:spacing w:before="20" w:after="20" w:line="240" w:lineRule="auto"/>
+              <w:ind w:firstLine="0"/>
+              <w:jc w:val="left"/>
+            </w:pPr>
+            <w:r>
+              <w:rPr>
+                <w:rFonts w:ascii="Times New Roman" w:hAnsi="Times New Roman"/>
+                <w:sz w:val="17"/>
+              </w:rPr>
+              <w:t xml:space="preserve">+0.139 [+0.129, +0.150]*</w:t>
+            </w:r>
+          </w:p>
+        </w:tc>
+        <w:tc>
+          <w:tcPr/>
+          <w:p>
+            <w:pPr>
+              <w:pStyle w:val="Compact"/>
+              <w:spacing w:before="20" w:after="20" w:line="240" w:lineRule="auto"/>
+              <w:ind w:firstLine="0"/>
+              <w:jc w:val="left"/>
+            </w:pPr>
+            <w:r>
+              <w:rPr>
+                <w:rFonts w:ascii="Times New Roman" w:hAnsi="Times New Roman"/>
+                <w:sz w:val="17"/>
+              </w:rPr>
+              <w:t xml:space="preserve">+0.152 [+0.143, +0.162]*</w:t>
+            </w:r>
+          </w:p>
+        </w:tc>
+        <w:tc>
+          <w:tcPr/>
+          <w:p>
+            <w:pPr>
+              <w:pStyle w:val="Compact"/>
+              <w:spacing w:before="20" w:after="20" w:line="240" w:lineRule="auto"/>
+              <w:ind w:firstLine="0"/>
+              <w:jc w:val="left"/>
+            </w:pPr>
+            <w:r>
+              <w:rPr>
+                <w:rFonts w:ascii="Times New Roman" w:hAnsi="Times New Roman"/>
+                <w:sz w:val="17"/>
+              </w:rPr>
+              <w:t xml:space="preserve">-0.013 [-0.028, +0.003]*</w:t>
+            </w:r>
+          </w:p>
+        </w:tc>
+        <w:tc>
+          <w:tcPr/>
+          <w:p>
+            <w:pPr>
+              <w:pStyle w:val="Compact"/>
+              <w:spacing w:before="20" w:after="20" w:line="240" w:lineRule="auto"/>
+              <w:ind w:firstLine="0"/>
+              <w:jc w:val="left"/>
+            </w:pPr>
+            <w:r>
+              <w:rPr>
+                <w:rFonts w:ascii="Times New Roman" w:hAnsi="Times New Roman"/>
+                <w:sz w:val="17"/>
+              </w:rPr>
+              <w:t xml:space="preserve">1.65</w:t>
+            </w:r>
+          </w:p>
+        </w:tc>
+        <w:tc>
+          <w:tcPr/>
+          <w:p>
+            <w:pPr>
+              <w:pStyle w:val="Compact"/>
+              <w:spacing w:before="20" w:after="20" w:line="240" w:lineRule="auto"/>
+              <w:ind w:firstLine="0"/>
+              <w:jc w:val="left"/>
+            </w:pPr>
+            <w:r>
+              <w:rPr>
+                <w:rFonts w:ascii="Times New Roman" w:hAnsi="Times New Roman"/>
+                <w:sz w:val="17"/>
+              </w:rPr>
+              <w:t xml:space="preserve">1.72*</w:t>
             </w:r>
           </w:p>
         </w:tc>
@@ -9859,97 +9859,97 @@
                 <w:rFonts w:ascii="Times New Roman" w:hAnsi="Times New Roman"/>
                 <w:sz w:val="17"/>
               </w:rPr>
-              <w:t xml:space="preserve">0.203</w:t>
-            </w:r>
-          </w:p>
-        </w:tc>
-        <w:tc>
-          <w:tcPr/>
-          <w:p>
-            <w:pPr>
-              <w:pStyle w:val="Compact"/>
-              <w:spacing w:before="20" w:after="20" w:line="240" w:lineRule="auto"/>
-              <w:ind w:firstLine="0"/>
-              <w:jc w:val="left"/>
-            </w:pPr>
-            <w:r>
-              <w:rPr>
-                <w:rFonts w:ascii="Times New Roman" w:hAnsi="Times New Roman"/>
-                <w:sz w:val="17"/>
-              </w:rPr>
-              <w:t xml:space="preserve">+0.025 [+0.012, +0.040]*</w:t>
-            </w:r>
-          </w:p>
-        </w:tc>
-        <w:tc>
-          <w:tcPr/>
-          <w:p>
-            <w:pPr>
-              <w:pStyle w:val="Compact"/>
-              <w:spacing w:before="20" w:after="20" w:line="240" w:lineRule="auto"/>
-              <w:ind w:firstLine="0"/>
-              <w:jc w:val="left"/>
-            </w:pPr>
-            <w:r>
-              <w:rPr>
-                <w:rFonts w:ascii="Times New Roman" w:hAnsi="Times New Roman"/>
-                <w:sz w:val="17"/>
-              </w:rPr>
-              <w:t xml:space="preserve">+0.025 [+0.011, +0.040]*</w:t>
-            </w:r>
-          </w:p>
-        </w:tc>
-        <w:tc>
-          <w:tcPr/>
-          <w:p>
-            <w:pPr>
-              <w:pStyle w:val="Compact"/>
-              <w:spacing w:before="20" w:after="20" w:line="240" w:lineRule="auto"/>
-              <w:ind w:firstLine="0"/>
-              <w:jc w:val="left"/>
-            </w:pPr>
-            <w:r>
-              <w:rPr>
-                <w:rFonts w:ascii="Times New Roman" w:hAnsi="Times New Roman"/>
-                <w:sz w:val="17"/>
-              </w:rPr>
-              <w:t xml:space="preserve">-0.000 [-0.022, +0.020]*</w:t>
-            </w:r>
-          </w:p>
-        </w:tc>
-        <w:tc>
-          <w:tcPr/>
-          <w:p>
-            <w:pPr>
-              <w:pStyle w:val="Compact"/>
-              <w:spacing w:before="20" w:after="20" w:line="240" w:lineRule="auto"/>
-              <w:ind w:firstLine="0"/>
-              <w:jc w:val="left"/>
-            </w:pPr>
-            <w:r>
-              <w:rPr>
-                <w:rFonts w:ascii="Times New Roman" w:hAnsi="Times New Roman"/>
-                <w:sz w:val="17"/>
-              </w:rPr>
-              <w:t xml:space="preserve">1.13*</w:t>
-            </w:r>
-          </w:p>
-        </w:tc>
-        <w:tc>
-          <w:tcPr/>
-          <w:p>
-            <w:pPr>
-              <w:pStyle w:val="Compact"/>
-              <w:spacing w:before="20" w:after="20" w:line="240" w:lineRule="auto"/>
-              <w:ind w:firstLine="0"/>
-              <w:jc w:val="left"/>
-            </w:pPr>
-            <w:r>
-              <w:rPr>
-                <w:rFonts w:ascii="Times New Roman" w:hAnsi="Times New Roman"/>
-                <w:sz w:val="17"/>
-              </w:rPr>
-              <w:t xml:space="preserve">1.13*</w:t>
+              <w:t xml:space="preserve">0.195</w:t>
+            </w:r>
+          </w:p>
+        </w:tc>
+        <w:tc>
+          <w:tcPr/>
+          <w:p>
+            <w:pPr>
+              <w:pStyle w:val="Compact"/>
+              <w:spacing w:before="20" w:after="20" w:line="240" w:lineRule="auto"/>
+              <w:ind w:firstLine="0"/>
+              <w:jc w:val="left"/>
+            </w:pPr>
+            <w:r>
+              <w:rPr>
+                <w:rFonts w:ascii="Times New Roman" w:hAnsi="Times New Roman"/>
+                <w:sz w:val="17"/>
+              </w:rPr>
+              <w:t xml:space="preserve">+0.027 [+0.019, +0.036]*</w:t>
+            </w:r>
+          </w:p>
+        </w:tc>
+        <w:tc>
+          <w:tcPr/>
+          <w:p>
+            <w:pPr>
+              <w:pStyle w:val="Compact"/>
+              <w:spacing w:before="20" w:after="20" w:line="240" w:lineRule="auto"/>
+              <w:ind w:firstLine="0"/>
+              <w:jc w:val="left"/>
+            </w:pPr>
+            <w:r>
+              <w:rPr>
+                <w:rFonts w:ascii="Times New Roman" w:hAnsi="Times New Roman"/>
+                <w:sz w:val="17"/>
+              </w:rPr>
+              <w:t xml:space="preserve">+0.036 [+0.027, +0.045]*</w:t>
+            </w:r>
+          </w:p>
+        </w:tc>
+        <w:tc>
+          <w:tcPr/>
+          <w:p>
+            <w:pPr>
+              <w:pStyle w:val="Compact"/>
+              <w:spacing w:before="20" w:after="20" w:line="240" w:lineRule="auto"/>
+              <w:ind w:firstLine="0"/>
+              <w:jc w:val="left"/>
+            </w:pPr>
+            <w:r>
+              <w:rPr>
+                <w:rFonts w:ascii="Times New Roman" w:hAnsi="Times New Roman"/>
+                <w:sz w:val="17"/>
+              </w:rPr>
+              <w:t xml:space="preserve">-0.009 [-0.022, +0.004]*</w:t>
+            </w:r>
+          </w:p>
+        </w:tc>
+        <w:tc>
+          <w:tcPr/>
+          <w:p>
+            <w:pPr>
+              <w:pStyle w:val="Compact"/>
+              <w:spacing w:before="20" w:after="20" w:line="240" w:lineRule="auto"/>
+              <w:ind w:firstLine="0"/>
+              <w:jc w:val="left"/>
+            </w:pPr>
+            <w:r>
+              <w:rPr>
+                <w:rFonts w:ascii="Times New Roman" w:hAnsi="Times New Roman"/>
+                <w:sz w:val="17"/>
+              </w:rPr>
+              <w:t xml:space="preserve">1.14*</w:t>
+            </w:r>
+          </w:p>
+        </w:tc>
+        <w:tc>
+          <w:tcPr/>
+          <w:p>
+            <w:pPr>
+              <w:pStyle w:val="Compact"/>
+              <w:spacing w:before="20" w:after="20" w:line="240" w:lineRule="auto"/>
+              <w:ind w:firstLine="0"/>
+              <w:jc w:val="left"/>
+            </w:pPr>
+            <w:r>
+              <w:rPr>
+                <w:rFonts w:ascii="Times New Roman" w:hAnsi="Times New Roman"/>
+                <w:sz w:val="17"/>
+              </w:rPr>
+              <w:t xml:space="preserve">1.19*</w:t>
             </w:r>
           </w:p>
         </w:tc>
@@ -10023,61 +10023,61 @@
                 <w:rFonts w:ascii="Times New Roman" w:hAnsi="Times New Roman"/>
                 <w:sz w:val="17"/>
               </w:rPr>
-              <w:t xml:space="preserve">0.282</w:t>
-            </w:r>
-          </w:p>
-        </w:tc>
-        <w:tc>
-          <w:tcPr/>
-          <w:p>
-            <w:pPr>
-              <w:pStyle w:val="Compact"/>
-              <w:spacing w:before="20" w:after="20" w:line="240" w:lineRule="auto"/>
-              <w:ind w:firstLine="0"/>
-              <w:jc w:val="left"/>
-            </w:pPr>
-            <w:r>
-              <w:rPr>
-                <w:rFonts w:ascii="Times New Roman" w:hAnsi="Times New Roman"/>
-                <w:sz w:val="17"/>
-              </w:rPr>
-              <w:t xml:space="preserve">+0.050 [+0.033, +0.069]*</w:t>
-            </w:r>
-          </w:p>
-        </w:tc>
-        <w:tc>
-          <w:tcPr/>
-          <w:p>
-            <w:pPr>
-              <w:pStyle w:val="Compact"/>
-              <w:spacing w:before="20" w:after="20" w:line="240" w:lineRule="auto"/>
-              <w:ind w:firstLine="0"/>
-              <w:jc w:val="left"/>
-            </w:pPr>
-            <w:r>
-              <w:rPr>
-                <w:rFonts w:ascii="Times New Roman" w:hAnsi="Times New Roman"/>
-                <w:sz w:val="17"/>
-              </w:rPr>
-              <w:t xml:space="preserve">+0.052 [+0.035, +0.070]</w:t>
-            </w:r>
-          </w:p>
-        </w:tc>
-        <w:tc>
-          <w:tcPr/>
-          <w:p>
-            <w:pPr>
-              <w:pStyle w:val="Compact"/>
-              <w:spacing w:before="20" w:after="20" w:line="240" w:lineRule="auto"/>
-              <w:ind w:firstLine="0"/>
-              <w:jc w:val="left"/>
-            </w:pPr>
-            <w:r>
-              <w:rPr>
-                <w:rFonts w:ascii="Times New Roman" w:hAnsi="Times New Roman"/>
-                <w:sz w:val="17"/>
-              </w:rPr>
-              <w:t xml:space="preserve">-0.001 [-0.030, +0.027]*</w:t>
+              <w:t xml:space="preserve">0.277</w:t>
+            </w:r>
+          </w:p>
+        </w:tc>
+        <w:tc>
+          <w:tcPr/>
+          <w:p>
+            <w:pPr>
+              <w:pStyle w:val="Compact"/>
+              <w:spacing w:before="20" w:after="20" w:line="240" w:lineRule="auto"/>
+              <w:ind w:firstLine="0"/>
+              <w:jc w:val="left"/>
+            </w:pPr>
+            <w:r>
+              <w:rPr>
+                <w:rFonts w:ascii="Times New Roman" w:hAnsi="Times New Roman"/>
+                <w:sz w:val="17"/>
+              </w:rPr>
+              <w:t xml:space="preserve">+0.049 [+0.038, +0.060]*</w:t>
+            </w:r>
+          </w:p>
+        </w:tc>
+        <w:tc>
+          <w:tcPr/>
+          <w:p>
+            <w:pPr>
+              <w:pStyle w:val="Compact"/>
+              <w:spacing w:before="20" w:after="20" w:line="240" w:lineRule="auto"/>
+              <w:ind w:firstLine="0"/>
+              <w:jc w:val="left"/>
+            </w:pPr>
+            <w:r>
+              <w:rPr>
+                <w:rFonts w:ascii="Times New Roman" w:hAnsi="Times New Roman"/>
+                <w:sz w:val="17"/>
+              </w:rPr>
+              <w:t xml:space="preserve">+0.055 [+0.044, +0.066]</w:t>
+            </w:r>
+          </w:p>
+        </w:tc>
+        <w:tc>
+          <w:tcPr/>
+          <w:p>
+            <w:pPr>
+              <w:pStyle w:val="Compact"/>
+              <w:spacing w:before="20" w:after="20" w:line="240" w:lineRule="auto"/>
+              <w:ind w:firstLine="0"/>
+              <w:jc w:val="left"/>
+            </w:pPr>
+            <w:r>
+              <w:rPr>
+                <w:rFonts w:ascii="Times New Roman" w:hAnsi="Times New Roman"/>
+                <w:sz w:val="17"/>
+              </w:rPr>
+              <w:t xml:space="preserve">-0.006 [-0.021, +0.010]*</w:t>
             </w:r>
           </w:p>
         </w:tc>
@@ -10113,7 +10113,7 @@
                 <w:rFonts w:ascii="Times New Roman" w:hAnsi="Times New Roman"/>
                 <w:sz w:val="17"/>
               </w:rPr>
-              <w:t xml:space="preserve">1.18*</w:t>
+              <w:t xml:space="preserve">1.20*</w:t>
             </w:r>
           </w:p>
         </w:tc>
@@ -10187,61 +10187,61 @@
                 <w:rFonts w:ascii="Times New Roman" w:hAnsi="Times New Roman"/>
                 <w:sz w:val="17"/>
               </w:rPr>
-              <w:t xml:space="preserve">0.102</w:t>
-            </w:r>
-          </w:p>
-        </w:tc>
-        <w:tc>
-          <w:tcPr/>
-          <w:p>
-            <w:pPr>
-              <w:pStyle w:val="Compact"/>
-              <w:spacing w:before="20" w:after="20" w:line="240" w:lineRule="auto"/>
-              <w:ind w:firstLine="0"/>
-              <w:jc w:val="left"/>
-            </w:pPr>
-            <w:r>
-              <w:rPr>
-                <w:rFonts w:ascii="Times New Roman" w:hAnsi="Times New Roman"/>
-                <w:sz w:val="17"/>
-              </w:rPr>
-              <w:t xml:space="preserve">+0.075 [+0.063, +0.087]</w:t>
-            </w:r>
-          </w:p>
-        </w:tc>
-        <w:tc>
-          <w:tcPr/>
-          <w:p>
-            <w:pPr>
-              <w:pStyle w:val="Compact"/>
-              <w:spacing w:before="20" w:after="20" w:line="240" w:lineRule="auto"/>
-              <w:ind w:firstLine="0"/>
-              <w:jc w:val="left"/>
-            </w:pPr>
-            <w:r>
-              <w:rPr>
-                <w:rFonts w:ascii="Times New Roman" w:hAnsi="Times New Roman"/>
-                <w:sz w:val="17"/>
-              </w:rPr>
-              <w:t xml:space="preserve">+0.083 [+0.070, +0.095]*</w:t>
-            </w:r>
-          </w:p>
-        </w:tc>
-        <w:tc>
-          <w:tcPr/>
-          <w:p>
-            <w:pPr>
-              <w:pStyle w:val="Compact"/>
-              <w:spacing w:before="20" w:after="20" w:line="240" w:lineRule="auto"/>
-              <w:ind w:firstLine="0"/>
-              <w:jc w:val="left"/>
-            </w:pPr>
-            <w:r>
-              <w:rPr>
-                <w:rFonts w:ascii="Times New Roman" w:hAnsi="Times New Roman"/>
-                <w:sz w:val="17"/>
-              </w:rPr>
-              <w:t xml:space="preserve">-0.008 [-0.028, +0.013]*</w:t>
+              <w:t xml:space="preserve">0.103</w:t>
+            </w:r>
+          </w:p>
+        </w:tc>
+        <w:tc>
+          <w:tcPr/>
+          <w:p>
+            <w:pPr>
+              <w:pStyle w:val="Compact"/>
+              <w:spacing w:before="20" w:after="20" w:line="240" w:lineRule="auto"/>
+              <w:ind w:firstLine="0"/>
+              <w:jc w:val="left"/>
+            </w:pPr>
+            <w:r>
+              <w:rPr>
+                <w:rFonts w:ascii="Times New Roman" w:hAnsi="Times New Roman"/>
+                <w:sz w:val="17"/>
+              </w:rPr>
+              <w:t xml:space="preserve">+0.075 [+0.068, +0.083]</w:t>
+            </w:r>
+          </w:p>
+        </w:tc>
+        <w:tc>
+          <w:tcPr/>
+          <w:p>
+            <w:pPr>
+              <w:pStyle w:val="Compact"/>
+              <w:spacing w:before="20" w:after="20" w:line="240" w:lineRule="auto"/>
+              <w:ind w:firstLine="0"/>
+              <w:jc w:val="left"/>
+            </w:pPr>
+            <w:r>
+              <w:rPr>
+                <w:rFonts w:ascii="Times New Roman" w:hAnsi="Times New Roman"/>
+                <w:sz w:val="17"/>
+              </w:rPr>
+              <w:t xml:space="preserve">+0.088 [+0.080, +0.096]*</w:t>
+            </w:r>
+          </w:p>
+        </w:tc>
+        <w:tc>
+          <w:tcPr/>
+          <w:p>
+            <w:pPr>
+              <w:pStyle w:val="Compact"/>
+              <w:spacing w:before="20" w:after="20" w:line="240" w:lineRule="auto"/>
+              <w:ind w:firstLine="0"/>
+              <w:jc w:val="left"/>
+            </w:pPr>
+            <w:r>
+              <w:rPr>
+                <w:rFonts w:ascii="Times New Roman" w:hAnsi="Times New Roman"/>
+                <w:sz w:val="17"/>
+              </w:rPr>
+              <w:t xml:space="preserve">-0.013 [-0.025, -0.001]*</w:t>
             </w:r>
           </w:p>
         </w:tc>
@@ -10277,7 +10277,7 @@
                 <w:rFonts w:ascii="Times New Roman" w:hAnsi="Times New Roman"/>
                 <w:sz w:val="17"/>
               </w:rPr>
-              <w:t xml:space="preserve">1.81*</w:t>
+              <w:t xml:space="preserve">1.86*</w:t>
             </w:r>
           </w:p>
         </w:tc>
@@ -10351,97 +10351,97 @@
                 <w:rFonts w:ascii="Times New Roman" w:hAnsi="Times New Roman"/>
                 <w:sz w:val="17"/>
               </w:rPr>
-              <w:t xml:space="preserve">0.203</w:t>
-            </w:r>
-          </w:p>
-        </w:tc>
-        <w:tc>
-          <w:tcPr/>
-          <w:p>
-            <w:pPr>
-              <w:pStyle w:val="Compact"/>
-              <w:spacing w:before="20" w:after="20" w:line="240" w:lineRule="auto"/>
-              <w:ind w:firstLine="0"/>
-              <w:jc w:val="left"/>
-            </w:pPr>
-            <w:r>
-              <w:rPr>
-                <w:rFonts w:ascii="Times New Roman" w:hAnsi="Times New Roman"/>
-                <w:sz w:val="17"/>
-              </w:rPr>
-              <w:t xml:space="preserve">+0.037 [+0.012, +0.058]*</w:t>
-            </w:r>
-          </w:p>
-        </w:tc>
-        <w:tc>
-          <w:tcPr/>
-          <w:p>
-            <w:pPr>
-              <w:pStyle w:val="Compact"/>
-              <w:spacing w:before="20" w:after="20" w:line="240" w:lineRule="auto"/>
-              <w:ind w:firstLine="0"/>
-              <w:jc w:val="left"/>
-            </w:pPr>
-            <w:r>
-              <w:rPr>
-                <w:rFonts w:ascii="Times New Roman" w:hAnsi="Times New Roman"/>
-                <w:sz w:val="17"/>
-              </w:rPr>
-              <w:t xml:space="preserve">+0.035 [+0.010, +0.059]</w:t>
-            </w:r>
-          </w:p>
-        </w:tc>
-        <w:tc>
-          <w:tcPr/>
-          <w:p>
-            <w:pPr>
-              <w:pStyle w:val="Compact"/>
-              <w:spacing w:before="20" w:after="20" w:line="240" w:lineRule="auto"/>
-              <w:ind w:firstLine="0"/>
-              <w:jc w:val="left"/>
-            </w:pPr>
-            <w:r>
-              <w:rPr>
-                <w:rFonts w:ascii="Times New Roman" w:hAnsi="Times New Roman"/>
-                <w:sz w:val="17"/>
-              </w:rPr>
-              <w:t xml:space="preserve">+0.001 [-0.024, +0.026]*</w:t>
-            </w:r>
-          </w:p>
-        </w:tc>
-        <w:tc>
-          <w:tcPr/>
-          <w:p>
-            <w:pPr>
-              <w:pStyle w:val="Compact"/>
-              <w:spacing w:before="20" w:after="20" w:line="240" w:lineRule="auto"/>
-              <w:ind w:firstLine="0"/>
-              <w:jc w:val="left"/>
-            </w:pPr>
-            <w:r>
-              <w:rPr>
-                <w:rFonts w:ascii="Times New Roman" w:hAnsi="Times New Roman"/>
-                <w:sz w:val="17"/>
-              </w:rPr>
-              <w:t xml:space="preserve">1.18*</w:t>
-            </w:r>
-          </w:p>
-        </w:tc>
-        <w:tc>
-          <w:tcPr/>
-          <w:p>
-            <w:pPr>
-              <w:pStyle w:val="Compact"/>
-              <w:spacing w:before="20" w:after="20" w:line="240" w:lineRule="auto"/>
-              <w:ind w:firstLine="0"/>
-              <w:jc w:val="left"/>
-            </w:pPr>
-            <w:r>
-              <w:rPr>
-                <w:rFonts w:ascii="Times New Roman" w:hAnsi="Times New Roman"/>
-                <w:sz w:val="17"/>
-              </w:rPr>
-              <w:t xml:space="preserve">1.17*</w:t>
+              <w:t xml:space="preserve">0.191</w:t>
+            </w:r>
+          </w:p>
+        </w:tc>
+        <w:tc>
+          <w:tcPr/>
+          <w:p>
+            <w:pPr>
+              <w:pStyle w:val="Compact"/>
+              <w:spacing w:before="20" w:after="20" w:line="240" w:lineRule="auto"/>
+              <w:ind w:firstLine="0"/>
+              <w:jc w:val="left"/>
+            </w:pPr>
+            <w:r>
+              <w:rPr>
+                <w:rFonts w:ascii="Times New Roman" w:hAnsi="Times New Roman"/>
+                <w:sz w:val="17"/>
+              </w:rPr>
+              <w:t xml:space="preserve">+0.051 [+0.037, +0.065]*</w:t>
+            </w:r>
+          </w:p>
+        </w:tc>
+        <w:tc>
+          <w:tcPr/>
+          <w:p>
+            <w:pPr>
+              <w:pStyle w:val="Compact"/>
+              <w:spacing w:before="20" w:after="20" w:line="240" w:lineRule="auto"/>
+              <w:ind w:firstLine="0"/>
+              <w:jc w:val="left"/>
+            </w:pPr>
+            <w:r>
+              <w:rPr>
+                <w:rFonts w:ascii="Times New Roman" w:hAnsi="Times New Roman"/>
+                <w:sz w:val="17"/>
+              </w:rPr>
+              <w:t xml:space="preserve">+0.044 [+0.030, +0.057]</w:t>
+            </w:r>
+          </w:p>
+        </w:tc>
+        <w:tc>
+          <w:tcPr/>
+          <w:p>
+            <w:pPr>
+              <w:pStyle w:val="Compact"/>
+              <w:spacing w:before="20" w:after="20" w:line="240" w:lineRule="auto"/>
+              <w:ind w:firstLine="0"/>
+              <w:jc w:val="left"/>
+            </w:pPr>
+            <w:r>
+              <w:rPr>
+                <w:rFonts w:ascii="Times New Roman" w:hAnsi="Times New Roman"/>
+                <w:sz w:val="17"/>
+              </w:rPr>
+              <w:t xml:space="preserve">+0.007 [-0.008, +0.021]*</w:t>
+            </w:r>
+          </w:p>
+        </w:tc>
+        <w:tc>
+          <w:tcPr/>
+          <w:p>
+            <w:pPr>
+              <w:pStyle w:val="Compact"/>
+              <w:spacing w:before="20" w:after="20" w:line="240" w:lineRule="auto"/>
+              <w:ind w:firstLine="0"/>
+              <w:jc w:val="left"/>
+            </w:pPr>
+            <w:r>
+              <w:rPr>
+                <w:rFonts w:ascii="Times New Roman" w:hAnsi="Times New Roman"/>
+                <w:sz w:val="17"/>
+              </w:rPr>
+              <w:t xml:space="preserve">1.27*</w:t>
+            </w:r>
+          </w:p>
+        </w:tc>
+        <w:tc>
+          <w:tcPr/>
+          <w:p>
+            <w:pPr>
+              <w:pStyle w:val="Compact"/>
+              <w:spacing w:before="20" w:after="20" w:line="240" w:lineRule="auto"/>
+              <w:ind w:firstLine="0"/>
+              <w:jc w:val="left"/>
+            </w:pPr>
+            <w:r>
+              <w:rPr>
+                <w:rFonts w:ascii="Times New Roman" w:hAnsi="Times New Roman"/>
+                <w:sz w:val="17"/>
+              </w:rPr>
+              <w:t xml:space="preserve">1.23*</w:t>
             </w:r>
           </w:p>
         </w:tc>
@@ -10515,97 +10515,97 @@
                 <w:rFonts w:ascii="Times New Roman" w:hAnsi="Times New Roman"/>
                 <w:sz w:val="17"/>
               </w:rPr>
-              <w:t xml:space="preserve">0.069</w:t>
-            </w:r>
-          </w:p>
-        </w:tc>
-        <w:tc>
-          <w:tcPr/>
-          <w:p>
-            <w:pPr>
-              <w:pStyle w:val="Compact"/>
-              <w:spacing w:before="20" w:after="20" w:line="240" w:lineRule="auto"/>
-              <w:ind w:firstLine="0"/>
-              <w:jc w:val="left"/>
-            </w:pPr>
-            <w:r>
-              <w:rPr>
-                <w:rFonts w:ascii="Times New Roman" w:hAnsi="Times New Roman"/>
-                <w:sz w:val="17"/>
-              </w:rPr>
-              <w:t xml:space="preserve">+0.196 [+0.178, +0.213]*</w:t>
-            </w:r>
-          </w:p>
-        </w:tc>
-        <w:tc>
-          <w:tcPr/>
-          <w:p>
-            <w:pPr>
-              <w:pStyle w:val="Compact"/>
-              <w:spacing w:before="20" w:after="20" w:line="240" w:lineRule="auto"/>
-              <w:ind w:firstLine="0"/>
-              <w:jc w:val="left"/>
-            </w:pPr>
-            <w:r>
-              <w:rPr>
-                <w:rFonts w:ascii="Times New Roman" w:hAnsi="Times New Roman"/>
-                <w:sz w:val="17"/>
-              </w:rPr>
-              <w:t xml:space="preserve">+0.183 [+0.165, +0.200]*</w:t>
-            </w:r>
-          </w:p>
-        </w:tc>
-        <w:tc>
-          <w:tcPr/>
-          <w:p>
-            <w:pPr>
-              <w:pStyle w:val="Compact"/>
-              <w:spacing w:before="20" w:after="20" w:line="240" w:lineRule="auto"/>
-              <w:ind w:firstLine="0"/>
-              <w:jc w:val="left"/>
-            </w:pPr>
-            <w:r>
-              <w:rPr>
-                <w:rFonts w:ascii="Times New Roman" w:hAnsi="Times New Roman"/>
-                <w:sz w:val="17"/>
-              </w:rPr>
-              <w:t xml:space="preserve">+0.013 [-0.011, +0.036]</w:t>
-            </w:r>
-          </w:p>
-        </w:tc>
-        <w:tc>
-          <w:tcPr/>
-          <w:p>
-            <w:pPr>
-              <w:pStyle w:val="Compact"/>
-              <w:spacing w:before="20" w:after="20" w:line="240" w:lineRule="auto"/>
-              <w:ind w:firstLine="0"/>
-              <w:jc w:val="left"/>
-            </w:pPr>
-            <w:r>
-              <w:rPr>
-                <w:rFonts w:ascii="Times New Roman" w:hAnsi="Times New Roman"/>
-                <w:sz w:val="17"/>
-              </w:rPr>
-              <w:t xml:space="preserve">3.82*</w:t>
-            </w:r>
-          </w:p>
-        </w:tc>
-        <w:tc>
-          <w:tcPr/>
-          <w:p>
-            <w:pPr>
-              <w:pStyle w:val="Compact"/>
-              <w:spacing w:before="20" w:after="20" w:line="240" w:lineRule="auto"/>
-              <w:ind w:firstLine="0"/>
-              <w:jc w:val="left"/>
-            </w:pPr>
-            <w:r>
-              <w:rPr>
-                <w:rFonts w:ascii="Times New Roman" w:hAnsi="Times New Roman"/>
-                <w:sz w:val="17"/>
-              </w:rPr>
-              <w:t xml:space="preserve">3.63*</w:t>
+              <w:t xml:space="preserve">0.068</w:t>
+            </w:r>
+          </w:p>
+        </w:tc>
+        <w:tc>
+          <w:tcPr/>
+          <w:p>
+            <w:pPr>
+              <w:pStyle w:val="Compact"/>
+              <w:spacing w:before="20" w:after="20" w:line="240" w:lineRule="auto"/>
+              <w:ind w:firstLine="0"/>
+              <w:jc w:val="left"/>
+            </w:pPr>
+            <w:r>
+              <w:rPr>
+                <w:rFonts w:ascii="Times New Roman" w:hAnsi="Times New Roman"/>
+                <w:sz w:val="17"/>
+              </w:rPr>
+              <w:t xml:space="preserve">+0.198 [+0.187, +0.208]*</w:t>
+            </w:r>
+          </w:p>
+        </w:tc>
+        <w:tc>
+          <w:tcPr/>
+          <w:p>
+            <w:pPr>
+              <w:pStyle w:val="Compact"/>
+              <w:spacing w:before="20" w:after="20" w:line="240" w:lineRule="auto"/>
+              <w:ind w:firstLine="0"/>
+              <w:jc w:val="left"/>
+            </w:pPr>
+            <w:r>
+              <w:rPr>
+                <w:rFonts w:ascii="Times New Roman" w:hAnsi="Times New Roman"/>
+                <w:sz w:val="17"/>
+              </w:rPr>
+              <w:t xml:space="preserve">+0.183 [+0.173, +0.192]*</w:t>
+            </w:r>
+          </w:p>
+        </w:tc>
+        <w:tc>
+          <w:tcPr/>
+          <w:p>
+            <w:pPr>
+              <w:pStyle w:val="Compact"/>
+              <w:spacing w:before="20" w:after="20" w:line="240" w:lineRule="auto"/>
+              <w:ind w:firstLine="0"/>
+              <w:jc w:val="left"/>
+            </w:pPr>
+            <w:r>
+              <w:rPr>
+                <w:rFonts w:ascii="Times New Roman" w:hAnsi="Times New Roman"/>
+                <w:sz w:val="17"/>
+              </w:rPr>
+              <w:t xml:space="preserve">+0.015 [+0.002, +0.029]*</w:t>
+            </w:r>
+          </w:p>
+        </w:tc>
+        <w:tc>
+          <w:tcPr/>
+          <w:p>
+            <w:pPr>
+              <w:pStyle w:val="Compact"/>
+              <w:spacing w:before="20" w:after="20" w:line="240" w:lineRule="auto"/>
+              <w:ind w:firstLine="0"/>
+              <w:jc w:val="left"/>
+            </w:pPr>
+            <w:r>
+              <w:rPr>
+                <w:rFonts w:ascii="Times New Roman" w:hAnsi="Times New Roman"/>
+                <w:sz w:val="17"/>
+              </w:rPr>
+              <w:t xml:space="preserve">3.90*</w:t>
+            </w:r>
+          </w:p>
+        </w:tc>
+        <w:tc>
+          <w:tcPr/>
+          <w:p>
+            <w:pPr>
+              <w:pStyle w:val="Compact"/>
+              <w:spacing w:before="20" w:after="20" w:line="240" w:lineRule="auto"/>
+              <w:ind w:firstLine="0"/>
+              <w:jc w:val="left"/>
+            </w:pPr>
+            <w:r>
+              <w:rPr>
+                <w:rFonts w:ascii="Times New Roman" w:hAnsi="Times New Roman"/>
+                <w:sz w:val="17"/>
+              </w:rPr>
+              <w:t xml:space="preserve">3.68*</w:t>
             </w:r>
           </w:p>
         </w:tc>
@@ -10679,97 +10679,97 @@
                 <w:rFonts w:ascii="Times New Roman" w:hAnsi="Times New Roman"/>
                 <w:sz w:val="17"/>
               </w:rPr>
-              <w:t xml:space="preserve">0.126</w:t>
-            </w:r>
-          </w:p>
-        </w:tc>
-        <w:tc>
-          <w:tcPr/>
-          <w:p>
-            <w:pPr>
-              <w:pStyle w:val="Compact"/>
-              <w:spacing w:before="20" w:after="20" w:line="240" w:lineRule="auto"/>
-              <w:ind w:firstLine="0"/>
-              <w:jc w:val="left"/>
-            </w:pPr>
-            <w:r>
-              <w:rPr>
-                <w:rFonts w:ascii="Times New Roman" w:hAnsi="Times New Roman"/>
-                <w:sz w:val="17"/>
-              </w:rPr>
-              <w:t xml:space="preserve">+0.050 [+0.035, +0.067]*</w:t>
-            </w:r>
-          </w:p>
-        </w:tc>
-        <w:tc>
-          <w:tcPr/>
-          <w:p>
-            <w:pPr>
-              <w:pStyle w:val="Compact"/>
-              <w:spacing w:before="20" w:after="20" w:line="240" w:lineRule="auto"/>
-              <w:ind w:firstLine="0"/>
-              <w:jc w:val="left"/>
-            </w:pPr>
-            <w:r>
-              <w:rPr>
-                <w:rFonts w:ascii="Times New Roman" w:hAnsi="Times New Roman"/>
-                <w:sz w:val="17"/>
-              </w:rPr>
-              <w:t xml:space="preserve">+0.044 [+0.029, +0.060]</w:t>
-            </w:r>
-          </w:p>
-        </w:tc>
-        <w:tc>
-          <w:tcPr/>
-          <w:p>
-            <w:pPr>
-              <w:pStyle w:val="Compact"/>
-              <w:spacing w:before="20" w:after="20" w:line="240" w:lineRule="auto"/>
-              <w:ind w:firstLine="0"/>
-              <w:jc w:val="left"/>
-            </w:pPr>
-            <w:r>
-              <w:rPr>
-                <w:rFonts w:ascii="Times New Roman" w:hAnsi="Times New Roman"/>
-                <w:sz w:val="17"/>
-              </w:rPr>
-              <w:t xml:space="preserve">+0.006 [-0.022, +0.033]</w:t>
-            </w:r>
-          </w:p>
-        </w:tc>
-        <w:tc>
-          <w:tcPr/>
-          <w:p>
-            <w:pPr>
-              <w:pStyle w:val="Compact"/>
-              <w:spacing w:before="20" w:after="20" w:line="240" w:lineRule="auto"/>
-              <w:ind w:firstLine="0"/>
-              <w:jc w:val="left"/>
-            </w:pPr>
-            <w:r>
-              <w:rPr>
-                <w:rFonts w:ascii="Times New Roman" w:hAnsi="Times New Roman"/>
-                <w:sz w:val="17"/>
-              </w:rPr>
-              <w:t xml:space="preserve">1.39*</w:t>
-            </w:r>
-          </w:p>
-        </w:tc>
-        <w:tc>
-          <w:tcPr/>
-          <w:p>
-            <w:pPr>
-              <w:pStyle w:val="Compact"/>
-              <w:spacing w:before="20" w:after="20" w:line="240" w:lineRule="auto"/>
-              <w:ind w:firstLine="0"/>
-              <w:jc w:val="left"/>
-            </w:pPr>
-            <w:r>
-              <w:rPr>
-                <w:rFonts w:ascii="Times New Roman" w:hAnsi="Times New Roman"/>
-                <w:sz w:val="17"/>
-              </w:rPr>
-              <w:t xml:space="preserve">1.35</w:t>
+              <w:t xml:space="preserve">0.123</w:t>
+            </w:r>
+          </w:p>
+        </w:tc>
+        <w:tc>
+          <w:tcPr/>
+          <w:p>
+            <w:pPr>
+              <w:pStyle w:val="Compact"/>
+              <w:spacing w:before="20" w:after="20" w:line="240" w:lineRule="auto"/>
+              <w:ind w:firstLine="0"/>
+              <w:jc w:val="left"/>
+            </w:pPr>
+            <w:r>
+              <w:rPr>
+                <w:rFonts w:ascii="Times New Roman" w:hAnsi="Times New Roman"/>
+                <w:sz w:val="17"/>
+              </w:rPr>
+              <w:t xml:space="preserve">+0.045 [+0.037, +0.052]*</w:t>
+            </w:r>
+          </w:p>
+        </w:tc>
+        <w:tc>
+          <w:tcPr/>
+          <w:p>
+            <w:pPr>
+              <w:pStyle w:val="Compact"/>
+              <w:spacing w:before="20" w:after="20" w:line="240" w:lineRule="auto"/>
+              <w:ind w:firstLine="0"/>
+              <w:jc w:val="left"/>
+            </w:pPr>
+            <w:r>
+              <w:rPr>
+                <w:rFonts w:ascii="Times New Roman" w:hAnsi="Times New Roman"/>
+                <w:sz w:val="17"/>
+              </w:rPr>
+              <w:t xml:space="preserve">+0.049 [+0.041, +0.057]</w:t>
+            </w:r>
+          </w:p>
+        </w:tc>
+        <w:tc>
+          <w:tcPr/>
+          <w:p>
+            <w:pPr>
+              <w:pStyle w:val="Compact"/>
+              <w:spacing w:before="20" w:after="20" w:line="240" w:lineRule="auto"/>
+              <w:ind w:firstLine="0"/>
+              <w:jc w:val="left"/>
+            </w:pPr>
+            <w:r>
+              <w:rPr>
+                <w:rFonts w:ascii="Times New Roman" w:hAnsi="Times New Roman"/>
+                <w:sz w:val="17"/>
+              </w:rPr>
+              <w:t xml:space="preserve">-0.005 [-0.019, +0.008]*</w:t>
+            </w:r>
+          </w:p>
+        </w:tc>
+        <w:tc>
+          <w:tcPr/>
+          <w:p>
+            <w:pPr>
+              <w:pStyle w:val="Compact"/>
+              <w:spacing w:before="20" w:after="20" w:line="240" w:lineRule="auto"/>
+              <w:ind w:firstLine="0"/>
+              <w:jc w:val="left"/>
+            </w:pPr>
+            <w:r>
+              <w:rPr>
+                <w:rFonts w:ascii="Times New Roman" w:hAnsi="Times New Roman"/>
+                <w:sz w:val="17"/>
+              </w:rPr>
+              <w:t xml:space="preserve">1.36*</w:t>
+            </w:r>
+          </w:p>
+        </w:tc>
+        <w:tc>
+          <w:tcPr/>
+          <w:p>
+            <w:pPr>
+              <w:pStyle w:val="Compact"/>
+              <w:spacing w:before="20" w:after="20" w:line="240" w:lineRule="auto"/>
+              <w:ind w:firstLine="0"/>
+              <w:jc w:val="left"/>
+            </w:pPr>
+            <w:r>
+              <w:rPr>
+                <w:rFonts w:ascii="Times New Roman" w:hAnsi="Times New Roman"/>
+                <w:sz w:val="17"/>
+              </w:rPr>
+              <w:t xml:space="preserve">1.40</w:t>
             </w:r>
           </w:p>
         </w:tc>
@@ -10861,79 +10861,79 @@
                 <w:rFonts w:ascii="Times New Roman" w:hAnsi="Times New Roman"/>
                 <w:sz w:val="17"/>
               </w:rPr>
-              <w:t xml:space="preserve">+0.062 [+0.053, +0.070]*</w:t>
-            </w:r>
-          </w:p>
-        </w:tc>
-        <w:tc>
-          <w:tcPr/>
-          <w:p>
-            <w:pPr>
-              <w:pStyle w:val="Compact"/>
-              <w:spacing w:before="20" w:after="20" w:line="240" w:lineRule="auto"/>
-              <w:ind w:firstLine="0"/>
-              <w:jc w:val="left"/>
-            </w:pPr>
-            <w:r>
-              <w:rPr>
-                <w:rFonts w:ascii="Times New Roman" w:hAnsi="Times New Roman"/>
-                <w:sz w:val="17"/>
-              </w:rPr>
-              <w:t xml:space="preserve">+0.054 [+0.046, +0.063]*</w:t>
-            </w:r>
-          </w:p>
-        </w:tc>
-        <w:tc>
-          <w:tcPr/>
-          <w:p>
-            <w:pPr>
-              <w:pStyle w:val="Compact"/>
-              <w:spacing w:before="20" w:after="20" w:line="240" w:lineRule="auto"/>
-              <w:ind w:firstLine="0"/>
-              <w:jc w:val="left"/>
-            </w:pPr>
-            <w:r>
-              <w:rPr>
-                <w:rFonts w:ascii="Times New Roman" w:hAnsi="Times New Roman"/>
-                <w:sz w:val="17"/>
-              </w:rPr>
-              <w:t xml:space="preserve">+0.008 [-0.007, +0.021]*</w:t>
-            </w:r>
-          </w:p>
-        </w:tc>
-        <w:tc>
-          <w:tcPr/>
-          <w:p>
-            <w:pPr>
-              <w:pStyle w:val="Compact"/>
-              <w:spacing w:before="20" w:after="20" w:line="240" w:lineRule="auto"/>
-              <w:ind w:firstLine="0"/>
-              <w:jc w:val="left"/>
-            </w:pPr>
-            <w:r>
-              <w:rPr>
-                <w:rFonts w:ascii="Times New Roman" w:hAnsi="Times New Roman"/>
-                <w:sz w:val="17"/>
-              </w:rPr>
-              <w:t xml:space="preserve">1.62*</w:t>
-            </w:r>
-          </w:p>
-        </w:tc>
-        <w:tc>
-          <w:tcPr/>
-          <w:p>
-            <w:pPr>
-              <w:pStyle w:val="Compact"/>
-              <w:spacing w:before="20" w:after="20" w:line="240" w:lineRule="auto"/>
-              <w:ind w:firstLine="0"/>
-              <w:jc w:val="left"/>
-            </w:pPr>
-            <w:r>
-              <w:rPr>
-                <w:rFonts w:ascii="Times New Roman" w:hAnsi="Times New Roman"/>
-                <w:sz w:val="17"/>
-              </w:rPr>
-              <w:t xml:space="preserve">1.54*</w:t>
+              <w:t xml:space="preserve">+0.059 [+0.055, +0.064]*</w:t>
+            </w:r>
+          </w:p>
+        </w:tc>
+        <w:tc>
+          <w:tcPr/>
+          <w:p>
+            <w:pPr>
+              <w:pStyle w:val="Compact"/>
+              <w:spacing w:before="20" w:after="20" w:line="240" w:lineRule="auto"/>
+              <w:ind w:firstLine="0"/>
+              <w:jc w:val="left"/>
+            </w:pPr>
+            <w:r>
+              <w:rPr>
+                <w:rFonts w:ascii="Times New Roman" w:hAnsi="Times New Roman"/>
+                <w:sz w:val="17"/>
+              </w:rPr>
+              <w:t xml:space="preserve">+0.058 [+0.053, +0.063]*</w:t>
+            </w:r>
+          </w:p>
+        </w:tc>
+        <w:tc>
+          <w:tcPr/>
+          <w:p>
+            <w:pPr>
+              <w:pStyle w:val="Compact"/>
+              <w:spacing w:before="20" w:after="20" w:line="240" w:lineRule="auto"/>
+              <w:ind w:firstLine="0"/>
+              <w:jc w:val="left"/>
+            </w:pPr>
+            <w:r>
+              <w:rPr>
+                <w:rFonts w:ascii="Times New Roman" w:hAnsi="Times New Roman"/>
+                <w:sz w:val="17"/>
+              </w:rPr>
+              <w:t xml:space="preserve">+0.001 [-0.007, +0.009]*</w:t>
+            </w:r>
+          </w:p>
+        </w:tc>
+        <w:tc>
+          <w:tcPr/>
+          <w:p>
+            <w:pPr>
+              <w:pStyle w:val="Compact"/>
+              <w:spacing w:before="20" w:after="20" w:line="240" w:lineRule="auto"/>
+              <w:ind w:firstLine="0"/>
+              <w:jc w:val="left"/>
+            </w:pPr>
+            <w:r>
+              <w:rPr>
+                <w:rFonts w:ascii="Times New Roman" w:hAnsi="Times New Roman"/>
+                <w:sz w:val="17"/>
+              </w:rPr>
+              <w:t xml:space="preserve">1.59*</w:t>
+            </w:r>
+          </w:p>
+        </w:tc>
+        <w:tc>
+          <w:tcPr/>
+          <w:p>
+            <w:pPr>
+              <w:pStyle w:val="Compact"/>
+              <w:spacing w:before="20" w:after="20" w:line="240" w:lineRule="auto"/>
+              <w:ind w:firstLine="0"/>
+              <w:jc w:val="left"/>
+            </w:pPr>
+            <w:r>
+              <w:rPr>
+                <w:rFonts w:ascii="Times New Roman" w:hAnsi="Times New Roman"/>
+                <w:sz w:val="17"/>
+              </w:rPr>
+              <w:t xml:space="preserve">1.58*</w:t>
             </w:r>
           </w:p>
         </w:tc>
@@ -11007,61 +11007,61 @@
                 <w:rFonts w:ascii="Times New Roman" w:hAnsi="Times New Roman"/>
                 <w:sz w:val="17"/>
               </w:rPr>
-              <w:t xml:space="preserve">0.235</w:t>
-            </w:r>
-          </w:p>
-        </w:tc>
-        <w:tc>
-          <w:tcPr/>
-          <w:p>
-            <w:pPr>
-              <w:pStyle w:val="Compact"/>
-              <w:spacing w:before="20" w:after="20" w:line="240" w:lineRule="auto"/>
-              <w:ind w:firstLine="0"/>
-              <w:jc w:val="left"/>
-            </w:pPr>
-            <w:r>
-              <w:rPr>
-                <w:rFonts w:ascii="Times New Roman" w:hAnsi="Times New Roman"/>
-                <w:sz w:val="17"/>
-              </w:rPr>
-              <w:t xml:space="preserve">+0.080 [+0.058, +0.100]</w:t>
-            </w:r>
-          </w:p>
-        </w:tc>
-        <w:tc>
-          <w:tcPr/>
-          <w:p>
-            <w:pPr>
-              <w:pStyle w:val="Compact"/>
-              <w:spacing w:before="20" w:after="20" w:line="240" w:lineRule="auto"/>
-              <w:ind w:firstLine="0"/>
-              <w:jc w:val="left"/>
-            </w:pPr>
-            <w:r>
-              <w:rPr>
-                <w:rFonts w:ascii="Times New Roman" w:hAnsi="Times New Roman"/>
-                <w:sz w:val="17"/>
-              </w:rPr>
-              <w:t xml:space="preserve">+0.075 [+0.053, +0.095]*</w:t>
-            </w:r>
-          </w:p>
-        </w:tc>
-        <w:tc>
-          <w:tcPr/>
-          <w:p>
-            <w:pPr>
-              <w:pStyle w:val="Compact"/>
-              <w:spacing w:before="20" w:after="20" w:line="240" w:lineRule="auto"/>
-              <w:ind w:firstLine="0"/>
-              <w:jc w:val="left"/>
-            </w:pPr>
-            <w:r>
-              <w:rPr>
-                <w:rFonts w:ascii="Times New Roman" w:hAnsi="Times New Roman"/>
-                <w:sz w:val="17"/>
-              </w:rPr>
-              <w:t xml:space="preserve">+0.005 [-0.033, +0.043]</w:t>
+              <w:t xml:space="preserve">0.230</w:t>
+            </w:r>
+          </w:p>
+        </w:tc>
+        <w:tc>
+          <w:tcPr/>
+          <w:p>
+            <w:pPr>
+              <w:pStyle w:val="Compact"/>
+              <w:spacing w:before="20" w:after="20" w:line="240" w:lineRule="auto"/>
+              <w:ind w:firstLine="0"/>
+              <w:jc w:val="left"/>
+            </w:pPr>
+            <w:r>
+              <w:rPr>
+                <w:rFonts w:ascii="Times New Roman" w:hAnsi="Times New Roman"/>
+                <w:sz w:val="17"/>
+              </w:rPr>
+              <w:t xml:space="preserve">+0.078 [+0.066, +0.089]</w:t>
+            </w:r>
+          </w:p>
+        </w:tc>
+        <w:tc>
+          <w:tcPr/>
+          <w:p>
+            <w:pPr>
+              <w:pStyle w:val="Compact"/>
+              <w:spacing w:before="20" w:after="20" w:line="240" w:lineRule="auto"/>
+              <w:ind w:firstLine="0"/>
+              <w:jc w:val="left"/>
+            </w:pPr>
+            <w:r>
+              <w:rPr>
+                <w:rFonts w:ascii="Times New Roman" w:hAnsi="Times New Roman"/>
+                <w:sz w:val="17"/>
+              </w:rPr>
+              <w:t xml:space="preserve">+0.089 [+0.078, +0.101]*</w:t>
+            </w:r>
+          </w:p>
+        </w:tc>
+        <w:tc>
+          <w:tcPr/>
+          <w:p>
+            <w:pPr>
+              <w:pStyle w:val="Compact"/>
+              <w:spacing w:before="20" w:after="20" w:line="240" w:lineRule="auto"/>
+              <w:ind w:firstLine="0"/>
+              <w:jc w:val="left"/>
+            </w:pPr>
+            <w:r>
+              <w:rPr>
+                <w:rFonts w:ascii="Times New Roman" w:hAnsi="Times New Roman"/>
+                <w:sz w:val="17"/>
+              </w:rPr>
+              <w:t xml:space="preserve">-0.012 [-0.033, +0.008]*</w:t>
             </w:r>
           </w:p>
         </w:tc>
@@ -11097,7 +11097,7 @@
                 <w:rFonts w:ascii="Times New Roman" w:hAnsi="Times New Roman"/>
                 <w:sz w:val="17"/>
               </w:rPr>
-              <w:t xml:space="preserve">1.32*</w:t>
+              <w:t xml:space="preserve">1.39</w:t>
             </w:r>
           </w:p>
         </w:tc>
@@ -11189,79 +11189,79 @@
                 <w:rFonts w:ascii="Times New Roman" w:hAnsi="Times New Roman"/>
                 <w:sz w:val="17"/>
               </w:rPr>
-              <w:t xml:space="preserve">+0.038 [+0.029, +0.049]*</w:t>
-            </w:r>
-          </w:p>
-        </w:tc>
-        <w:tc>
-          <w:tcPr/>
-          <w:p>
-            <w:pPr>
-              <w:pStyle w:val="Compact"/>
-              <w:spacing w:before="20" w:after="20" w:line="240" w:lineRule="auto"/>
-              <w:ind w:firstLine="0"/>
-              <w:jc w:val="left"/>
-            </w:pPr>
-            <w:r>
-              <w:rPr>
-                <w:rFonts w:ascii="Times New Roman" w:hAnsi="Times New Roman"/>
-                <w:sz w:val="17"/>
-              </w:rPr>
-              <w:t xml:space="preserve">+0.030 [+0.021, +0.040]*</w:t>
-            </w:r>
-          </w:p>
-        </w:tc>
-        <w:tc>
-          <w:tcPr/>
-          <w:p>
-            <w:pPr>
-              <w:pStyle w:val="Compact"/>
-              <w:spacing w:before="20" w:after="20" w:line="240" w:lineRule="auto"/>
-              <w:ind w:firstLine="0"/>
-              <w:jc w:val="left"/>
-            </w:pPr>
-            <w:r>
-              <w:rPr>
-                <w:rFonts w:ascii="Times New Roman" w:hAnsi="Times New Roman"/>
-                <w:sz w:val="17"/>
-              </w:rPr>
-              <w:t xml:space="preserve">+0.008 [-0.008, +0.024]*</w:t>
-            </w:r>
-          </w:p>
-        </w:tc>
-        <w:tc>
-          <w:tcPr/>
-          <w:p>
-            <w:pPr>
-              <w:pStyle w:val="Compact"/>
-              <w:spacing w:before="20" w:after="20" w:line="240" w:lineRule="auto"/>
-              <w:ind w:firstLine="0"/>
-              <w:jc w:val="left"/>
-            </w:pPr>
-            <w:r>
-              <w:rPr>
-                <w:rFonts w:ascii="Times New Roman" w:hAnsi="Times New Roman"/>
-                <w:sz w:val="17"/>
-              </w:rPr>
-              <w:t xml:space="preserve">1.38*</w:t>
-            </w:r>
-          </w:p>
-        </w:tc>
-        <w:tc>
-          <w:tcPr/>
-          <w:p>
-            <w:pPr>
-              <w:pStyle w:val="Compact"/>
-              <w:spacing w:before="20" w:after="20" w:line="240" w:lineRule="auto"/>
-              <w:ind w:firstLine="0"/>
-              <w:jc w:val="left"/>
-            </w:pPr>
-            <w:r>
-              <w:rPr>
-                <w:rFonts w:ascii="Times New Roman" w:hAnsi="Times New Roman"/>
-                <w:sz w:val="17"/>
-              </w:rPr>
-              <w:t xml:space="preserve">1.30*</w:t>
+              <w:t xml:space="preserve">+0.041 [+0.035, +0.047]*</w:t>
+            </w:r>
+          </w:p>
+        </w:tc>
+        <w:tc>
+          <w:tcPr/>
+          <w:p>
+            <w:pPr>
+              <w:pStyle w:val="Compact"/>
+              <w:spacing w:before="20" w:after="20" w:line="240" w:lineRule="auto"/>
+              <w:ind w:firstLine="0"/>
+              <w:jc w:val="left"/>
+            </w:pPr>
+            <w:r>
+              <w:rPr>
+                <w:rFonts w:ascii="Times New Roman" w:hAnsi="Times New Roman"/>
+                <w:sz w:val="17"/>
+              </w:rPr>
+              <w:t xml:space="preserve">+0.037 [+0.032, +0.043]*</w:t>
+            </w:r>
+          </w:p>
+        </w:tc>
+        <w:tc>
+          <w:tcPr/>
+          <w:p>
+            <w:pPr>
+              <w:pStyle w:val="Compact"/>
+              <w:spacing w:before="20" w:after="20" w:line="240" w:lineRule="auto"/>
+              <w:ind w:firstLine="0"/>
+              <w:jc w:val="left"/>
+            </w:pPr>
+            <w:r>
+              <w:rPr>
+                <w:rFonts w:ascii="Times New Roman" w:hAnsi="Times New Roman"/>
+                <w:sz w:val="17"/>
+              </w:rPr>
+              <w:t xml:space="preserve">+0.004 [-0.007, +0.014]*</w:t>
+            </w:r>
+          </w:p>
+        </w:tc>
+        <w:tc>
+          <w:tcPr/>
+          <w:p>
+            <w:pPr>
+              <w:pStyle w:val="Compact"/>
+              <w:spacing w:before="20" w:after="20" w:line="240" w:lineRule="auto"/>
+              <w:ind w:firstLine="0"/>
+              <w:jc w:val="left"/>
+            </w:pPr>
+            <w:r>
+              <w:rPr>
+                <w:rFonts w:ascii="Times New Roman" w:hAnsi="Times New Roman"/>
+                <w:sz w:val="17"/>
+              </w:rPr>
+              <w:t xml:space="preserve">1.40*</w:t>
+            </w:r>
+          </w:p>
+        </w:tc>
+        <w:tc>
+          <w:tcPr/>
+          <w:p>
+            <w:pPr>
+              <w:pStyle w:val="Compact"/>
+              <w:spacing w:before="20" w:after="20" w:line="240" w:lineRule="auto"/>
+              <w:ind w:firstLine="0"/>
+              <w:jc w:val="left"/>
+            </w:pPr>
+            <w:r>
+              <w:rPr>
+                <w:rFonts w:ascii="Times New Roman" w:hAnsi="Times New Roman"/>
+                <w:sz w:val="17"/>
+              </w:rPr>
+              <w:t xml:space="preserve">1.37</w:t>
             </w:r>
           </w:p>
         </w:tc>
@@ -12319,97 +12319,97 @@
                 <w:rFonts w:ascii="Times New Roman" w:hAnsi="Times New Roman"/>
                 <w:sz w:val="17"/>
               </w:rPr>
-              <w:t xml:space="preserve">0.094</w:t>
-            </w:r>
-          </w:p>
-        </w:tc>
-        <w:tc>
-          <w:tcPr/>
-          <w:p>
-            <w:pPr>
-              <w:pStyle w:val="Compact"/>
-              <w:spacing w:before="20" w:after="20" w:line="240" w:lineRule="auto"/>
-              <w:ind w:firstLine="0"/>
-              <w:jc w:val="left"/>
-            </w:pPr>
-            <w:r>
-              <w:rPr>
-                <w:rFonts w:ascii="Times New Roman" w:hAnsi="Times New Roman"/>
-                <w:sz w:val="17"/>
-              </w:rPr>
-              <w:t xml:space="preserve">+0.050 [+0.040, +0.060]*</w:t>
-            </w:r>
-          </w:p>
-        </w:tc>
-        <w:tc>
-          <w:tcPr/>
-          <w:p>
-            <w:pPr>
-              <w:pStyle w:val="Compact"/>
-              <w:spacing w:before="20" w:after="20" w:line="240" w:lineRule="auto"/>
-              <w:ind w:firstLine="0"/>
-              <w:jc w:val="left"/>
-            </w:pPr>
-            <w:r>
-              <w:rPr>
-                <w:rFonts w:ascii="Times New Roman" w:hAnsi="Times New Roman"/>
-                <w:sz w:val="17"/>
-              </w:rPr>
-              <w:t xml:space="preserve">+0.054 [+0.045, +0.063]*</w:t>
-            </w:r>
-          </w:p>
-        </w:tc>
-        <w:tc>
-          <w:tcPr/>
-          <w:p>
-            <w:pPr>
-              <w:pStyle w:val="Compact"/>
-              <w:spacing w:before="20" w:after="20" w:line="240" w:lineRule="auto"/>
-              <w:ind w:firstLine="0"/>
-              <w:jc w:val="left"/>
-            </w:pPr>
-            <w:r>
-              <w:rPr>
-                <w:rFonts w:ascii="Times New Roman" w:hAnsi="Times New Roman"/>
-                <w:sz w:val="17"/>
-              </w:rPr>
-              <w:t xml:space="preserve">-0.004 [-0.020, +0.012]</w:t>
-            </w:r>
-          </w:p>
-        </w:tc>
-        <w:tc>
-          <w:tcPr/>
-          <w:p>
-            <w:pPr>
-              <w:pStyle w:val="Compact"/>
-              <w:spacing w:before="20" w:after="20" w:line="240" w:lineRule="auto"/>
-              <w:ind w:firstLine="0"/>
-              <w:jc w:val="left"/>
-            </w:pPr>
-            <w:r>
-              <w:rPr>
-                <w:rFonts w:ascii="Times New Roman" w:hAnsi="Times New Roman"/>
-                <w:sz w:val="17"/>
-              </w:rPr>
-              <w:t xml:space="preserve">1.53*</w:t>
-            </w:r>
-          </w:p>
-        </w:tc>
-        <w:tc>
-          <w:tcPr/>
-          <w:p>
-            <w:pPr>
-              <w:pStyle w:val="Compact"/>
-              <w:spacing w:before="20" w:after="20" w:line="240" w:lineRule="auto"/>
-              <w:ind w:firstLine="0"/>
-              <w:jc w:val="left"/>
-            </w:pPr>
-            <w:r>
-              <w:rPr>
-                <w:rFonts w:ascii="Times New Roman" w:hAnsi="Times New Roman"/>
-                <w:sz w:val="17"/>
-              </w:rPr>
-              <w:t xml:space="preserve">1.57</w:t>
+              <w:t xml:space="preserve">0.093</w:t>
+            </w:r>
+          </w:p>
+        </w:tc>
+        <w:tc>
+          <w:tcPr/>
+          <w:p>
+            <w:pPr>
+              <w:pStyle w:val="Compact"/>
+              <w:spacing w:before="20" w:after="20" w:line="240" w:lineRule="auto"/>
+              <w:ind w:firstLine="0"/>
+              <w:jc w:val="left"/>
+            </w:pPr>
+            <w:r>
+              <w:rPr>
+                <w:rFonts w:ascii="Times New Roman" w:hAnsi="Times New Roman"/>
+                <w:sz w:val="17"/>
+              </w:rPr>
+              <w:t xml:space="preserve">+0.044 [+0.039, +0.050]*</w:t>
+            </w:r>
+          </w:p>
+        </w:tc>
+        <w:tc>
+          <w:tcPr/>
+          <w:p>
+            <w:pPr>
+              <w:pStyle w:val="Compact"/>
+              <w:spacing w:before="20" w:after="20" w:line="240" w:lineRule="auto"/>
+              <w:ind w:firstLine="0"/>
+              <w:jc w:val="left"/>
+            </w:pPr>
+            <w:r>
+              <w:rPr>
+                <w:rFonts w:ascii="Times New Roman" w:hAnsi="Times New Roman"/>
+                <w:sz w:val="17"/>
+              </w:rPr>
+              <w:t xml:space="preserve">+0.058 [+0.053, +0.063]*</w:t>
+            </w:r>
+          </w:p>
+        </w:tc>
+        <w:tc>
+          <w:tcPr/>
+          <w:p>
+            <w:pPr>
+              <w:pStyle w:val="Compact"/>
+              <w:spacing w:before="20" w:after="20" w:line="240" w:lineRule="auto"/>
+              <w:ind w:firstLine="0"/>
+              <w:jc w:val="left"/>
+            </w:pPr>
+            <w:r>
+              <w:rPr>
+                <w:rFonts w:ascii="Times New Roman" w:hAnsi="Times New Roman"/>
+                <w:sz w:val="17"/>
+              </w:rPr>
+              <w:t xml:space="preserve">-0.013 [-0.022, -0.004]*</w:t>
+            </w:r>
+          </w:p>
+        </w:tc>
+        <w:tc>
+          <w:tcPr/>
+          <w:p>
+            <w:pPr>
+              <w:pStyle w:val="Compact"/>
+              <w:spacing w:before="20" w:after="20" w:line="240" w:lineRule="auto"/>
+              <w:ind w:firstLine="0"/>
+              <w:jc w:val="left"/>
+            </w:pPr>
+            <w:r>
+              <w:rPr>
+                <w:rFonts w:ascii="Times New Roman" w:hAnsi="Times New Roman"/>
+                <w:sz w:val="17"/>
+              </w:rPr>
+              <w:t xml:space="preserve">1.48*</w:t>
+            </w:r>
+          </w:p>
+        </w:tc>
+        <w:tc>
+          <w:tcPr/>
+          <w:p>
+            <w:pPr>
+              <w:pStyle w:val="Compact"/>
+              <w:spacing w:before="20" w:after="20" w:line="240" w:lineRule="auto"/>
+              <w:ind w:firstLine="0"/>
+              <w:jc w:val="left"/>
+            </w:pPr>
+            <w:r>
+              <w:rPr>
+                <w:rFonts w:ascii="Times New Roman" w:hAnsi="Times New Roman"/>
+                <w:sz w:val="17"/>
+              </w:rPr>
+              <w:t xml:space="preserve">1.62</w:t>
             </w:r>
           </w:p>
         </w:tc>
@@ -12483,97 +12483,97 @@
                 <w:rFonts w:ascii="Times New Roman" w:hAnsi="Times New Roman"/>
                 <w:sz w:val="17"/>
               </w:rPr>
-              <w:t xml:space="preserve">0.046</w:t>
-            </w:r>
-          </w:p>
-        </w:tc>
-        <w:tc>
-          <w:tcPr/>
-          <w:p>
-            <w:pPr>
-              <w:pStyle w:val="Compact"/>
-              <w:spacing w:before="20" w:after="20" w:line="240" w:lineRule="auto"/>
-              <w:ind w:firstLine="0"/>
-              <w:jc w:val="left"/>
-            </w:pPr>
-            <w:r>
-              <w:rPr>
-                <w:rFonts w:ascii="Times New Roman" w:hAnsi="Times New Roman"/>
-                <w:sz w:val="17"/>
-              </w:rPr>
-              <w:t xml:space="preserve">+0.004 [-0.002, +0.010]</w:t>
-            </w:r>
-          </w:p>
-        </w:tc>
-        <w:tc>
-          <w:tcPr/>
-          <w:p>
-            <w:pPr>
-              <w:pStyle w:val="Compact"/>
-              <w:spacing w:before="20" w:after="20" w:line="240" w:lineRule="auto"/>
-              <w:ind w:firstLine="0"/>
-              <w:jc w:val="left"/>
-            </w:pPr>
-            <w:r>
-              <w:rPr>
-                <w:rFonts w:ascii="Times New Roman" w:hAnsi="Times New Roman"/>
-                <w:sz w:val="17"/>
-              </w:rPr>
-              <w:t xml:space="preserve">+0.006 [-0.001, +0.013]</w:t>
-            </w:r>
-          </w:p>
-        </w:tc>
-        <w:tc>
-          <w:tcPr/>
-          <w:p>
-            <w:pPr>
-              <w:pStyle w:val="Compact"/>
-              <w:spacing w:before="20" w:after="20" w:line="240" w:lineRule="auto"/>
-              <w:ind w:firstLine="0"/>
-              <w:jc w:val="left"/>
-            </w:pPr>
-            <w:r>
-              <w:rPr>
-                <w:rFonts w:ascii="Times New Roman" w:hAnsi="Times New Roman"/>
-                <w:sz w:val="17"/>
-              </w:rPr>
-              <w:t xml:space="preserve">-0.002 [-0.011, +0.007]</w:t>
-            </w:r>
-          </w:p>
-        </w:tc>
-        <w:tc>
-          <w:tcPr/>
-          <w:p>
-            <w:pPr>
-              <w:pStyle w:val="Compact"/>
-              <w:spacing w:before="20" w:after="20" w:line="240" w:lineRule="auto"/>
-              <w:ind w:firstLine="0"/>
-              <w:jc w:val="left"/>
-            </w:pPr>
-            <w:r>
-              <w:rPr>
-                <w:rFonts w:ascii="Times New Roman" w:hAnsi="Times New Roman"/>
-                <w:sz w:val="17"/>
-              </w:rPr>
-              <w:t xml:space="preserve">1.09*</w:t>
-            </w:r>
-          </w:p>
-        </w:tc>
-        <w:tc>
-          <w:tcPr/>
-          <w:p>
-            <w:pPr>
-              <w:pStyle w:val="Compact"/>
-              <w:spacing w:before="20" w:after="20" w:line="240" w:lineRule="auto"/>
-              <w:ind w:firstLine="0"/>
-              <w:jc w:val="left"/>
-            </w:pPr>
-            <w:r>
-              <w:rPr>
-                <w:rFonts w:ascii="Times New Roman" w:hAnsi="Times New Roman"/>
-                <w:sz w:val="17"/>
-              </w:rPr>
-              <w:t xml:space="preserve">1.14*</w:t>
+              <w:t xml:space="preserve">0.045</w:t>
+            </w:r>
+          </w:p>
+        </w:tc>
+        <w:tc>
+          <w:tcPr/>
+          <w:p>
+            <w:pPr>
+              <w:pStyle w:val="Compact"/>
+              <w:spacing w:before="20" w:after="20" w:line="240" w:lineRule="auto"/>
+              <w:ind w:firstLine="0"/>
+              <w:jc w:val="left"/>
+            </w:pPr>
+            <w:r>
+              <w:rPr>
+                <w:rFonts w:ascii="Times New Roman" w:hAnsi="Times New Roman"/>
+                <w:sz w:val="17"/>
+              </w:rPr>
+              <w:t xml:space="preserve">+0.002 [-0.001, +0.006]*</w:t>
+            </w:r>
+          </w:p>
+        </w:tc>
+        <w:tc>
+          <w:tcPr/>
+          <w:p>
+            <w:pPr>
+              <w:pStyle w:val="Compact"/>
+              <w:spacing w:before="20" w:after="20" w:line="240" w:lineRule="auto"/>
+              <w:ind w:firstLine="0"/>
+              <w:jc w:val="left"/>
+            </w:pPr>
+            <w:r>
+              <w:rPr>
+                <w:rFonts w:ascii="Times New Roman" w:hAnsi="Times New Roman"/>
+                <w:sz w:val="17"/>
+              </w:rPr>
+              <w:t xml:space="preserve">+0.009 [+0.006, +0.012]*</w:t>
+            </w:r>
+          </w:p>
+        </w:tc>
+        <w:tc>
+          <w:tcPr/>
+          <w:p>
+            <w:pPr>
+              <w:pStyle w:val="Compact"/>
+              <w:spacing w:before="20" w:after="20" w:line="240" w:lineRule="auto"/>
+              <w:ind w:firstLine="0"/>
+              <w:jc w:val="left"/>
+            </w:pPr>
+            <w:r>
+              <w:rPr>
+                <w:rFonts w:ascii="Times New Roman" w:hAnsi="Times New Roman"/>
+                <w:sz w:val="17"/>
+              </w:rPr>
+              <w:t xml:space="preserve">-0.007 [-0.012, -0.002]*</w:t>
+            </w:r>
+          </w:p>
+        </w:tc>
+        <w:tc>
+          <w:tcPr/>
+          <w:p>
+            <w:pPr>
+              <w:pStyle w:val="Compact"/>
+              <w:spacing w:before="20" w:after="20" w:line="240" w:lineRule="auto"/>
+              <w:ind w:firstLine="0"/>
+              <w:jc w:val="left"/>
+            </w:pPr>
+            <w:r>
+              <w:rPr>
+                <w:rFonts w:ascii="Times New Roman" w:hAnsi="Times New Roman"/>
+                <w:sz w:val="17"/>
+              </w:rPr>
+              <w:t xml:space="preserve">1.05*</w:t>
+            </w:r>
+          </w:p>
+        </w:tc>
+        <w:tc>
+          <w:tcPr/>
+          <w:p>
+            <w:pPr>
+              <w:pStyle w:val="Compact"/>
+              <w:spacing w:before="20" w:after="20" w:line="240" w:lineRule="auto"/>
+              <w:ind w:firstLine="0"/>
+              <w:jc w:val="left"/>
+            </w:pPr>
+            <w:r>
+              <w:rPr>
+                <w:rFonts w:ascii="Times New Roman" w:hAnsi="Times New Roman"/>
+                <w:sz w:val="17"/>
+              </w:rPr>
+              <w:t xml:space="preserve">1.21*</w:t>
             </w:r>
           </w:p>
         </w:tc>
@@ -12647,97 +12647,97 @@
                 <w:rFonts w:ascii="Times New Roman" w:hAnsi="Times New Roman"/>
                 <w:sz w:val="17"/>
               </w:rPr>
-              <w:t xml:space="preserve">0.073</w:t>
-            </w:r>
-          </w:p>
-        </w:tc>
-        <w:tc>
-          <w:tcPr/>
-          <w:p>
-            <w:pPr>
-              <w:pStyle w:val="Compact"/>
-              <w:spacing w:before="20" w:after="20" w:line="240" w:lineRule="auto"/>
-              <w:ind w:firstLine="0"/>
-              <w:jc w:val="left"/>
-            </w:pPr>
-            <w:r>
-              <w:rPr>
-                <w:rFonts w:ascii="Times New Roman" w:hAnsi="Times New Roman"/>
-                <w:sz w:val="17"/>
-              </w:rPr>
-              <w:t xml:space="preserve">+0.115 [+0.103, +0.128]*</w:t>
-            </w:r>
-          </w:p>
-        </w:tc>
-        <w:tc>
-          <w:tcPr/>
-          <w:p>
-            <w:pPr>
-              <w:pStyle w:val="Compact"/>
-              <w:spacing w:before="20" w:after="20" w:line="240" w:lineRule="auto"/>
-              <w:ind w:firstLine="0"/>
-              <w:jc w:val="left"/>
-            </w:pPr>
-            <w:r>
-              <w:rPr>
-                <w:rFonts w:ascii="Times New Roman" w:hAnsi="Times New Roman"/>
-                <w:sz w:val="17"/>
-              </w:rPr>
-              <w:t xml:space="preserve">+0.106 [+0.095, +0.117]*</w:t>
-            </w:r>
-          </w:p>
-        </w:tc>
-        <w:tc>
-          <w:tcPr/>
-          <w:p>
-            <w:pPr>
-              <w:pStyle w:val="Compact"/>
-              <w:spacing w:before="20" w:after="20" w:line="240" w:lineRule="auto"/>
-              <w:ind w:firstLine="0"/>
-              <w:jc w:val="left"/>
-            </w:pPr>
-            <w:r>
-              <w:rPr>
-                <w:rFonts w:ascii="Times New Roman" w:hAnsi="Times New Roman"/>
-                <w:sz w:val="17"/>
-              </w:rPr>
-              <w:t xml:space="preserve">+0.009 [-0.010, +0.027]</w:t>
-            </w:r>
-          </w:p>
-        </w:tc>
-        <w:tc>
-          <w:tcPr/>
-          <w:p>
-            <w:pPr>
-              <w:pStyle w:val="Compact"/>
-              <w:spacing w:before="20" w:after="20" w:line="240" w:lineRule="auto"/>
-              <w:ind w:firstLine="0"/>
-              <w:jc w:val="left"/>
-            </w:pPr>
-            <w:r>
-              <w:rPr>
-                <w:rFonts w:ascii="Times New Roman" w:hAnsi="Times New Roman"/>
-                <w:sz w:val="17"/>
-              </w:rPr>
-              <w:t xml:space="preserve">2.58*</w:t>
-            </w:r>
-          </w:p>
-        </w:tc>
-        <w:tc>
-          <w:tcPr/>
-          <w:p>
-            <w:pPr>
-              <w:pStyle w:val="Compact"/>
-              <w:spacing w:before="20" w:after="20" w:line="240" w:lineRule="auto"/>
-              <w:ind w:firstLine="0"/>
-              <w:jc w:val="left"/>
-            </w:pPr>
-            <w:r>
-              <w:rPr>
-                <w:rFonts w:ascii="Times New Roman" w:hAnsi="Times New Roman"/>
-                <w:sz w:val="17"/>
-              </w:rPr>
-              <w:t xml:space="preserve">2.45*</w:t>
+              <w:t xml:space="preserve">0.069</w:t>
+            </w:r>
+          </w:p>
+        </w:tc>
+        <w:tc>
+          <w:tcPr/>
+          <w:p>
+            <w:pPr>
+              <w:pStyle w:val="Compact"/>
+              <w:spacing w:before="20" w:after="20" w:line="240" w:lineRule="auto"/>
+              <w:ind w:firstLine="0"/>
+              <w:jc w:val="left"/>
+            </w:pPr>
+            <w:r>
+              <w:rPr>
+                <w:rFonts w:ascii="Times New Roman" w:hAnsi="Times New Roman"/>
+                <w:sz w:val="17"/>
+              </w:rPr>
+              <w:t xml:space="preserve">+0.111 [+0.104, +0.118]*</w:t>
+            </w:r>
+          </w:p>
+        </w:tc>
+        <w:tc>
+          <w:tcPr/>
+          <w:p>
+            <w:pPr>
+              <w:pStyle w:val="Compact"/>
+              <w:spacing w:before="20" w:after="20" w:line="240" w:lineRule="auto"/>
+              <w:ind w:firstLine="0"/>
+              <w:jc w:val="left"/>
+            </w:pPr>
+            <w:r>
+              <w:rPr>
+                <w:rFonts w:ascii="Times New Roman" w:hAnsi="Times New Roman"/>
+                <w:sz w:val="17"/>
+              </w:rPr>
+              <w:t xml:space="preserve">+0.110 [+0.103, +0.117]*</w:t>
+            </w:r>
+          </w:p>
+        </w:tc>
+        <w:tc>
+          <w:tcPr/>
+          <w:p>
+            <w:pPr>
+              <w:pStyle w:val="Compact"/>
+              <w:spacing w:before="20" w:after="20" w:line="240" w:lineRule="auto"/>
+              <w:ind w:firstLine="0"/>
+              <w:jc w:val="left"/>
+            </w:pPr>
+            <w:r>
+              <w:rPr>
+                <w:rFonts w:ascii="Times New Roman" w:hAnsi="Times New Roman"/>
+                <w:sz w:val="17"/>
+              </w:rPr>
+              <w:t xml:space="preserve">+0.001 [-0.010, +0.011]</w:t>
+            </w:r>
+          </w:p>
+        </w:tc>
+        <w:tc>
+          <w:tcPr/>
+          <w:p>
+            <w:pPr>
+              <w:pStyle w:val="Compact"/>
+              <w:spacing w:before="20" w:after="20" w:line="240" w:lineRule="auto"/>
+              <w:ind w:firstLine="0"/>
+              <w:jc w:val="left"/>
+            </w:pPr>
+            <w:r>
+              <w:rPr>
+                <w:rFonts w:ascii="Times New Roman" w:hAnsi="Times New Roman"/>
+                <w:sz w:val="17"/>
+              </w:rPr>
+              <w:t xml:space="preserve">2.61*</w:t>
+            </w:r>
+          </w:p>
+        </w:tc>
+        <w:tc>
+          <w:tcPr/>
+          <w:p>
+            <w:pPr>
+              <w:pStyle w:val="Compact"/>
+              <w:spacing w:before="20" w:after="20" w:line="240" w:lineRule="auto"/>
+              <w:ind w:firstLine="0"/>
+              <w:jc w:val="left"/>
+            </w:pPr>
+            <w:r>
+              <w:rPr>
+                <w:rFonts w:ascii="Times New Roman" w:hAnsi="Times New Roman"/>
+                <w:sz w:val="17"/>
+              </w:rPr>
+              <w:t xml:space="preserve">2.60*</w:t>
             </w:r>
           </w:p>
         </w:tc>
@@ -12829,79 +12829,79 @@
                 <w:rFonts w:ascii="Times New Roman" w:hAnsi="Times New Roman"/>
                 <w:sz w:val="17"/>
               </w:rPr>
-              <w:t xml:space="preserve">+0.017 [+0.013, +0.020]*</w:t>
-            </w:r>
-          </w:p>
-        </w:tc>
-        <w:tc>
-          <w:tcPr/>
-          <w:p>
-            <w:pPr>
-              <w:pStyle w:val="Compact"/>
-              <w:spacing w:before="20" w:after="20" w:line="240" w:lineRule="auto"/>
-              <w:ind w:firstLine="0"/>
-              <w:jc w:val="left"/>
-            </w:pPr>
-            <w:r>
-              <w:rPr>
-                <w:rFonts w:ascii="Times New Roman" w:hAnsi="Times New Roman"/>
-                <w:sz w:val="17"/>
-              </w:rPr>
-              <w:t xml:space="preserve">+0.016 [+0.013, +0.019]*</w:t>
-            </w:r>
-          </w:p>
-        </w:tc>
-        <w:tc>
-          <w:tcPr/>
-          <w:p>
-            <w:pPr>
-              <w:pStyle w:val="Compact"/>
-              <w:spacing w:before="20" w:after="20" w:line="240" w:lineRule="auto"/>
-              <w:ind w:firstLine="0"/>
-              <w:jc w:val="left"/>
-            </w:pPr>
-            <w:r>
-              <w:rPr>
-                <w:rFonts w:ascii="Times New Roman" w:hAnsi="Times New Roman"/>
-                <w:sz w:val="17"/>
-              </w:rPr>
-              <w:t xml:space="preserve">+0.001 [-0.005, +0.006]</w:t>
-            </w:r>
-          </w:p>
-        </w:tc>
-        <w:tc>
-          <w:tcPr/>
-          <w:p>
-            <w:pPr>
-              <w:pStyle w:val="Compact"/>
-              <w:spacing w:before="20" w:after="20" w:line="240" w:lineRule="auto"/>
-              <w:ind w:firstLine="0"/>
-              <w:jc w:val="left"/>
-            </w:pPr>
-            <w:r>
-              <w:rPr>
-                <w:rFonts w:ascii="Times New Roman" w:hAnsi="Times New Roman"/>
-                <w:sz w:val="17"/>
-              </w:rPr>
-              <w:t xml:space="preserve">3.15*</w:t>
-            </w:r>
-          </w:p>
-        </w:tc>
-        <w:tc>
-          <w:tcPr/>
-          <w:p>
-            <w:pPr>
-              <w:pStyle w:val="Compact"/>
-              <w:spacing w:before="20" w:after="20" w:line="240" w:lineRule="auto"/>
-              <w:ind w:firstLine="0"/>
-              <w:jc w:val="left"/>
-            </w:pPr>
-            <w:r>
-              <w:rPr>
-                <w:rFonts w:ascii="Times New Roman" w:hAnsi="Times New Roman"/>
-                <w:sz w:val="17"/>
-              </w:rPr>
-              <w:t xml:space="preserve">3.05*</w:t>
+              <w:t xml:space="preserve">+0.016 [+0.014, +0.018]*</w:t>
+            </w:r>
+          </w:p>
+        </w:tc>
+        <w:tc>
+          <w:tcPr/>
+          <w:p>
+            <w:pPr>
+              <w:pStyle w:val="Compact"/>
+              <w:spacing w:before="20" w:after="20" w:line="240" w:lineRule="auto"/>
+              <w:ind w:firstLine="0"/>
+              <w:jc w:val="left"/>
+            </w:pPr>
+            <w:r>
+              <w:rPr>
+                <w:rFonts w:ascii="Times New Roman" w:hAnsi="Times New Roman"/>
+                <w:sz w:val="17"/>
+              </w:rPr>
+              <w:t xml:space="preserve">+0.018 [+0.016, +0.020]*</w:t>
+            </w:r>
+          </w:p>
+        </w:tc>
+        <w:tc>
+          <w:tcPr/>
+          <w:p>
+            <w:pPr>
+              <w:pStyle w:val="Compact"/>
+              <w:spacing w:before="20" w:after="20" w:line="240" w:lineRule="auto"/>
+              <w:ind w:firstLine="0"/>
+              <w:jc w:val="left"/>
+            </w:pPr>
+            <w:r>
+              <w:rPr>
+                <w:rFonts w:ascii="Times New Roman" w:hAnsi="Times New Roman"/>
+                <w:sz w:val="17"/>
+              </w:rPr>
+              <w:t xml:space="preserve">-0.002 [-0.005, +0.001]*</w:t>
+            </w:r>
+          </w:p>
+        </w:tc>
+        <w:tc>
+          <w:tcPr/>
+          <w:p>
+            <w:pPr>
+              <w:pStyle w:val="Compact"/>
+              <w:spacing w:before="20" w:after="20" w:line="240" w:lineRule="auto"/>
+              <w:ind w:firstLine="0"/>
+              <w:jc w:val="left"/>
+            </w:pPr>
+            <w:r>
+              <w:rPr>
+                <w:rFonts w:ascii="Times New Roman" w:hAnsi="Times New Roman"/>
+                <w:sz w:val="17"/>
+              </w:rPr>
+              <w:t xml:space="preserve">3.00*</w:t>
+            </w:r>
+          </w:p>
+        </w:tc>
+        <w:tc>
+          <w:tcPr/>
+          <w:p>
+            <w:pPr>
+              <w:pStyle w:val="Compact"/>
+              <w:spacing w:before="20" w:after="20" w:line="240" w:lineRule="auto"/>
+              <w:ind w:firstLine="0"/>
+              <w:jc w:val="left"/>
+            </w:pPr>
+            <w:r>
+              <w:rPr>
+                <w:rFonts w:ascii="Times New Roman" w:hAnsi="Times New Roman"/>
+                <w:sz w:val="17"/>
+              </w:rPr>
+              <w:t xml:space="preserve">3.26*</w:t>
             </w:r>
           </w:p>
         </w:tc>
@@ -12975,79 +12975,61 @@
                 <w:rFonts w:ascii="Times New Roman" w:hAnsi="Times New Roman"/>
                 <w:sz w:val="17"/>
               </w:rPr>
-              <w:t xml:space="preserve">0.103</w:t>
-            </w:r>
-          </w:p>
-        </w:tc>
-        <w:tc>
-          <w:tcPr/>
-          <w:p>
-            <w:pPr>
-              <w:pStyle w:val="Compact"/>
-              <w:spacing w:before="20" w:after="20" w:line="240" w:lineRule="auto"/>
-              <w:ind w:firstLine="0"/>
-              <w:jc w:val="left"/>
-            </w:pPr>
-            <w:r>
-              <w:rPr>
-                <w:rFonts w:ascii="Times New Roman" w:hAnsi="Times New Roman"/>
-                <w:sz w:val="17"/>
-              </w:rPr>
-              <w:t xml:space="preserve">+0.028 [+0.010, +0.045]*</w:t>
-            </w:r>
-          </w:p>
-        </w:tc>
-        <w:tc>
-          <w:tcPr/>
-          <w:p>
-            <w:pPr>
-              <w:pStyle w:val="Compact"/>
-              <w:spacing w:before="20" w:after="20" w:line="240" w:lineRule="auto"/>
-              <w:ind w:firstLine="0"/>
-              <w:jc w:val="left"/>
-            </w:pPr>
-            <w:r>
-              <w:rPr>
-                <w:rFonts w:ascii="Times New Roman" w:hAnsi="Times New Roman"/>
-                <w:sz w:val="17"/>
-              </w:rPr>
-              <w:t xml:space="preserve">+0.025 [+0.009, +0.042]*</w:t>
-            </w:r>
-          </w:p>
-        </w:tc>
-        <w:tc>
-          <w:tcPr/>
-          <w:p>
-            <w:pPr>
-              <w:pStyle w:val="Compact"/>
-              <w:spacing w:before="20" w:after="20" w:line="240" w:lineRule="auto"/>
-              <w:ind w:firstLine="0"/>
-              <w:jc w:val="left"/>
-            </w:pPr>
-            <w:r>
-              <w:rPr>
-                <w:rFonts w:ascii="Times New Roman" w:hAnsi="Times New Roman"/>
-                <w:sz w:val="17"/>
-              </w:rPr>
-              <w:t xml:space="preserve">+0.003 [-0.016, +0.020]</w:t>
-            </w:r>
-          </w:p>
-        </w:tc>
-        <w:tc>
-          <w:tcPr/>
-          <w:p>
-            <w:pPr>
-              <w:pStyle w:val="Compact"/>
-              <w:spacing w:before="20" w:after="20" w:line="240" w:lineRule="auto"/>
-              <w:ind w:firstLine="0"/>
-              <w:jc w:val="left"/>
-            </w:pPr>
-            <w:r>
-              <w:rPr>
-                <w:rFonts w:ascii="Times New Roman" w:hAnsi="Times New Roman"/>
-                <w:sz w:val="17"/>
-              </w:rPr>
-              <w:t xml:space="preserve">1.27*</w:t>
+              <w:t xml:space="preserve">0.100</w:t>
+            </w:r>
+          </w:p>
+        </w:tc>
+        <w:tc>
+          <w:tcPr/>
+          <w:p>
+            <w:pPr>
+              <w:pStyle w:val="Compact"/>
+              <w:spacing w:before="20" w:after="20" w:line="240" w:lineRule="auto"/>
+              <w:ind w:firstLine="0"/>
+              <w:jc w:val="left"/>
+            </w:pPr>
+            <w:r>
+              <w:rPr>
+                <w:rFonts w:ascii="Times New Roman" w:hAnsi="Times New Roman"/>
+                <w:sz w:val="17"/>
+              </w:rPr>
+              <w:t xml:space="preserve">+0.025 [+0.016, +0.035]*</w:t>
+            </w:r>
+          </w:p>
+        </w:tc>
+        <w:tc>
+          <w:tcPr/>
+          <w:p>
+            <w:pPr>
+              <w:pStyle w:val="Compact"/>
+              <w:spacing w:before="20" w:after="20" w:line="240" w:lineRule="auto"/>
+              <w:ind w:firstLine="0"/>
+              <w:jc w:val="left"/>
+            </w:pPr>
+            <w:r>
+              <w:rPr>
+                <w:rFonts w:ascii="Times New Roman" w:hAnsi="Times New Roman"/>
+                <w:sz w:val="17"/>
+              </w:rPr>
+              <w:t xml:space="preserve">+0.025 [+0.016, +0.035]*</w:t>
+            </w:r>
+          </w:p>
+        </w:tc>
+        <w:tc>
+          <w:tcPr/>
+          <w:p>
+            <w:pPr>
+              <w:pStyle w:val="Compact"/>
+              <w:spacing w:before="20" w:after="20" w:line="240" w:lineRule="auto"/>
+              <w:ind w:firstLine="0"/>
+              <w:jc w:val="left"/>
+            </w:pPr>
+            <w:r>
+              <w:rPr>
+                <w:rFonts w:ascii="Times New Roman" w:hAnsi="Times New Roman"/>
+                <w:sz w:val="17"/>
+              </w:rPr>
+              <w:t xml:space="preserve">-0.000 [-0.010, +0.010]</w:t>
             </w:r>
           </w:p>
         </w:tc>
@@ -13066,6 +13048,24 @@
                 <w:sz w:val="17"/>
               </w:rPr>
               <w:t xml:space="preserve">1.25*</w:t>
+            </w:r>
+          </w:p>
+        </w:tc>
+        <w:tc>
+          <w:tcPr/>
+          <w:p>
+            <w:pPr>
+              <w:pStyle w:val="Compact"/>
+              <w:spacing w:before="20" w:after="20" w:line="240" w:lineRule="auto"/>
+              <w:ind w:firstLine="0"/>
+              <w:jc w:val="left"/>
+            </w:pPr>
+            <w:r>
+              <w:rPr>
+                <w:rFonts w:ascii="Times New Roman" w:hAnsi="Times New Roman"/>
+                <w:sz w:val="17"/>
+              </w:rPr>
+              <w:t xml:space="preserve">1.26*</w:t>
             </w:r>
           </w:p>
         </w:tc>
@@ -13139,97 +13139,97 @@
                 <w:rFonts w:ascii="Times New Roman" w:hAnsi="Times New Roman"/>
                 <w:sz w:val="17"/>
               </w:rPr>
-              <w:t xml:space="preserve">0.076</w:t>
-            </w:r>
-          </w:p>
-        </w:tc>
-        <w:tc>
-          <w:tcPr/>
-          <w:p>
-            <w:pPr>
-              <w:pStyle w:val="Compact"/>
-              <w:spacing w:before="20" w:after="20" w:line="240" w:lineRule="auto"/>
-              <w:ind w:firstLine="0"/>
-              <w:jc w:val="left"/>
-            </w:pPr>
-            <w:r>
-              <w:rPr>
-                <w:rFonts w:ascii="Times New Roman" w:hAnsi="Times New Roman"/>
-                <w:sz w:val="17"/>
-              </w:rPr>
-              <w:t xml:space="preserve">+0.128 [+0.108, +0.150]*</w:t>
-            </w:r>
-          </w:p>
-        </w:tc>
-        <w:tc>
-          <w:tcPr/>
-          <w:p>
-            <w:pPr>
-              <w:pStyle w:val="Compact"/>
-              <w:spacing w:before="20" w:after="20" w:line="240" w:lineRule="auto"/>
-              <w:ind w:firstLine="0"/>
-              <w:jc w:val="left"/>
-            </w:pPr>
-            <w:r>
-              <w:rPr>
-                <w:rFonts w:ascii="Times New Roman" w:hAnsi="Times New Roman"/>
-                <w:sz w:val="17"/>
-              </w:rPr>
-              <w:t xml:space="preserve">+0.105 [+0.088, +0.124]*</w:t>
-            </w:r>
-          </w:p>
-        </w:tc>
-        <w:tc>
-          <w:tcPr/>
-          <w:p>
-            <w:pPr>
-              <w:pStyle w:val="Compact"/>
-              <w:spacing w:before="20" w:after="20" w:line="240" w:lineRule="auto"/>
-              <w:ind w:firstLine="0"/>
-              <w:jc w:val="left"/>
-            </w:pPr>
-            <w:r>
-              <w:rPr>
-                <w:rFonts w:ascii="Times New Roman" w:hAnsi="Times New Roman"/>
-                <w:sz w:val="17"/>
-              </w:rPr>
-              <w:t xml:space="preserve">+0.023 [+0.000, +0.047]</w:t>
-            </w:r>
-          </w:p>
-        </w:tc>
-        <w:tc>
-          <w:tcPr/>
-          <w:p>
-            <w:pPr>
-              <w:pStyle w:val="Compact"/>
-              <w:spacing w:before="20" w:after="20" w:line="240" w:lineRule="auto"/>
-              <w:ind w:firstLine="0"/>
-              <w:jc w:val="left"/>
-            </w:pPr>
-            <w:r>
-              <w:rPr>
-                <w:rFonts w:ascii="Times New Roman" w:hAnsi="Times New Roman"/>
-                <w:sz w:val="17"/>
-              </w:rPr>
-              <w:t xml:space="preserve">2.68*</w:t>
-            </w:r>
-          </w:p>
-        </w:tc>
-        <w:tc>
-          <w:tcPr/>
-          <w:p>
-            <w:pPr>
-              <w:pStyle w:val="Compact"/>
-              <w:spacing w:before="20" w:after="20" w:line="240" w:lineRule="auto"/>
-              <w:ind w:firstLine="0"/>
-              <w:jc w:val="left"/>
-            </w:pPr>
-            <w:r>
-              <w:rPr>
-                <w:rFonts w:ascii="Times New Roman" w:hAnsi="Times New Roman"/>
-                <w:sz w:val="17"/>
-              </w:rPr>
-              <w:t xml:space="preserve">2.37*</w:t>
+              <w:t xml:space="preserve">0.073</w:t>
+            </w:r>
+          </w:p>
+        </w:tc>
+        <w:tc>
+          <w:tcPr/>
+          <w:p>
+            <w:pPr>
+              <w:pStyle w:val="Compact"/>
+              <w:spacing w:before="20" w:after="20" w:line="240" w:lineRule="auto"/>
+              <w:ind w:firstLine="0"/>
+              <w:jc w:val="left"/>
+            </w:pPr>
+            <w:r>
+              <w:rPr>
+                <w:rFonts w:ascii="Times New Roman" w:hAnsi="Times New Roman"/>
+                <w:sz w:val="17"/>
+              </w:rPr>
+              <w:t xml:space="preserve">+0.110 [+0.099, +0.121]*</w:t>
+            </w:r>
+          </w:p>
+        </w:tc>
+        <w:tc>
+          <w:tcPr/>
+          <w:p>
+            <w:pPr>
+              <w:pStyle w:val="Compact"/>
+              <w:spacing w:before="20" w:after="20" w:line="240" w:lineRule="auto"/>
+              <w:ind w:firstLine="0"/>
+              <w:jc w:val="left"/>
+            </w:pPr>
+            <w:r>
+              <w:rPr>
+                <w:rFonts w:ascii="Times New Roman" w:hAnsi="Times New Roman"/>
+                <w:sz w:val="17"/>
+              </w:rPr>
+              <w:t xml:space="preserve">+0.107 [+0.096, +0.118]*</w:t>
+            </w:r>
+          </w:p>
+        </w:tc>
+        <w:tc>
+          <w:tcPr/>
+          <w:p>
+            <w:pPr>
+              <w:pStyle w:val="Compact"/>
+              <w:spacing w:before="20" w:after="20" w:line="240" w:lineRule="auto"/>
+              <w:ind w:firstLine="0"/>
+              <w:jc w:val="left"/>
+            </w:pPr>
+            <w:r>
+              <w:rPr>
+                <w:rFonts w:ascii="Times New Roman" w:hAnsi="Times New Roman"/>
+                <w:sz w:val="17"/>
+              </w:rPr>
+              <w:t xml:space="preserve">+0.003 [-0.010, +0.015]</w:t>
+            </w:r>
+          </w:p>
+        </w:tc>
+        <w:tc>
+          <w:tcPr/>
+          <w:p>
+            <w:pPr>
+              <w:pStyle w:val="Compact"/>
+              <w:spacing w:before="20" w:after="20" w:line="240" w:lineRule="auto"/>
+              <w:ind w:firstLine="0"/>
+              <w:jc w:val="left"/>
+            </w:pPr>
+            <w:r>
+              <w:rPr>
+                <w:rFonts w:ascii="Times New Roman" w:hAnsi="Times New Roman"/>
+                <w:sz w:val="17"/>
+              </w:rPr>
+              <w:t xml:space="preserve">2.52</w:t>
+            </w:r>
+          </w:p>
+        </w:tc>
+        <w:tc>
+          <w:tcPr/>
+          <w:p>
+            <w:pPr>
+              <w:pStyle w:val="Compact"/>
+              <w:spacing w:before="20" w:after="20" w:line="240" w:lineRule="auto"/>
+              <w:ind w:firstLine="0"/>
+              <w:jc w:val="left"/>
+            </w:pPr>
+            <w:r>
+              <w:rPr>
+                <w:rFonts w:ascii="Times New Roman" w:hAnsi="Times New Roman"/>
+                <w:sz w:val="17"/>
+              </w:rPr>
+              <w:t xml:space="preserve">2.47*</w:t>
             </w:r>
           </w:p>
         </w:tc>
@@ -13321,79 +13321,79 @@
                 <w:rFonts w:ascii="Times New Roman" w:hAnsi="Times New Roman"/>
                 <w:sz w:val="17"/>
               </w:rPr>
-              <w:t xml:space="preserve">+0.032 [+0.025, +0.039]*</w:t>
-            </w:r>
-          </w:p>
-        </w:tc>
-        <w:tc>
-          <w:tcPr/>
-          <w:p>
-            <w:pPr>
-              <w:pStyle w:val="Compact"/>
-              <w:spacing w:before="20" w:after="20" w:line="240" w:lineRule="auto"/>
-              <w:ind w:firstLine="0"/>
-              <w:jc w:val="left"/>
-            </w:pPr>
-            <w:r>
-              <w:rPr>
-                <w:rFonts w:ascii="Times New Roman" w:hAnsi="Times New Roman"/>
-                <w:sz w:val="17"/>
-              </w:rPr>
-              <w:t xml:space="preserve">+0.028 [+0.021, +0.035]*</w:t>
-            </w:r>
-          </w:p>
-        </w:tc>
-        <w:tc>
-          <w:tcPr/>
-          <w:p>
-            <w:pPr>
-              <w:pStyle w:val="Compact"/>
-              <w:spacing w:before="20" w:after="20" w:line="240" w:lineRule="auto"/>
-              <w:ind w:firstLine="0"/>
-              <w:jc w:val="left"/>
-            </w:pPr>
-            <w:r>
-              <w:rPr>
-                <w:rFonts w:ascii="Times New Roman" w:hAnsi="Times New Roman"/>
-                <w:sz w:val="17"/>
-              </w:rPr>
-              <w:t xml:space="preserve">+0.004 [-0.008, +0.016]</w:t>
-            </w:r>
-          </w:p>
-        </w:tc>
-        <w:tc>
-          <w:tcPr/>
-          <w:p>
-            <w:pPr>
-              <w:pStyle w:val="Compact"/>
-              <w:spacing w:before="20" w:after="20" w:line="240" w:lineRule="auto"/>
-              <w:ind w:firstLine="0"/>
-              <w:jc w:val="left"/>
-            </w:pPr>
-            <w:r>
-              <w:rPr>
-                <w:rFonts w:ascii="Times New Roman" w:hAnsi="Times New Roman"/>
-                <w:sz w:val="17"/>
-              </w:rPr>
-              <w:t xml:space="preserve">1.45*</w:t>
-            </w:r>
-          </w:p>
-        </w:tc>
-        <w:tc>
-          <w:tcPr/>
-          <w:p>
-            <w:pPr>
-              <w:pStyle w:val="Compact"/>
-              <w:spacing w:before="20" w:after="20" w:line="240" w:lineRule="auto"/>
-              <w:ind w:firstLine="0"/>
-              <w:jc w:val="left"/>
-            </w:pPr>
-            <w:r>
-              <w:rPr>
-                <w:rFonts w:ascii="Times New Roman" w:hAnsi="Times New Roman"/>
-                <w:sz w:val="17"/>
-              </w:rPr>
-              <w:t xml:space="preserve">1.39*</w:t>
+              <w:t xml:space="preserve">+0.029 [+0.025, +0.033]*</w:t>
+            </w:r>
+          </w:p>
+        </w:tc>
+        <w:tc>
+          <w:tcPr/>
+          <w:p>
+            <w:pPr>
+              <w:pStyle w:val="Compact"/>
+              <w:spacing w:before="20" w:after="20" w:line="240" w:lineRule="auto"/>
+              <w:ind w:firstLine="0"/>
+              <w:jc w:val="left"/>
+            </w:pPr>
+            <w:r>
+              <w:rPr>
+                <w:rFonts w:ascii="Times New Roman" w:hAnsi="Times New Roman"/>
+                <w:sz w:val="17"/>
+              </w:rPr>
+              <w:t xml:space="preserve">+0.031 [+0.027, +0.035]*</w:t>
+            </w:r>
+          </w:p>
+        </w:tc>
+        <w:tc>
+          <w:tcPr/>
+          <w:p>
+            <w:pPr>
+              <w:pStyle w:val="Compact"/>
+              <w:spacing w:before="20" w:after="20" w:line="240" w:lineRule="auto"/>
+              <w:ind w:firstLine="0"/>
+              <w:jc w:val="left"/>
+            </w:pPr>
+            <w:r>
+              <w:rPr>
+                <w:rFonts w:ascii="Times New Roman" w:hAnsi="Times New Roman"/>
+                <w:sz w:val="17"/>
+              </w:rPr>
+              <w:t xml:space="preserve">-0.002 [-0.009, +0.005]</w:t>
+            </w:r>
+          </w:p>
+        </w:tc>
+        <w:tc>
+          <w:tcPr/>
+          <w:p>
+            <w:pPr>
+              <w:pStyle w:val="Compact"/>
+              <w:spacing w:before="20" w:after="20" w:line="240" w:lineRule="auto"/>
+              <w:ind w:firstLine="0"/>
+              <w:jc w:val="left"/>
+            </w:pPr>
+            <w:r>
+              <w:rPr>
+                <w:rFonts w:ascii="Times New Roman" w:hAnsi="Times New Roman"/>
+                <w:sz w:val="17"/>
+              </w:rPr>
+              <w:t xml:space="preserve">1.40*</w:t>
+            </w:r>
+          </w:p>
+        </w:tc>
+        <w:tc>
+          <w:tcPr/>
+          <w:p>
+            <w:pPr>
+              <w:pStyle w:val="Compact"/>
+              <w:spacing w:before="20" w:after="20" w:line="240" w:lineRule="auto"/>
+              <w:ind w:firstLine="0"/>
+              <w:jc w:val="left"/>
+            </w:pPr>
+            <w:r>
+              <w:rPr>
+                <w:rFonts w:ascii="Times New Roman" w:hAnsi="Times New Roman"/>
+                <w:sz w:val="17"/>
+              </w:rPr>
+              <w:t xml:space="preserve">1.43</w:t>
             </w:r>
           </w:p>
         </w:tc>
@@ -13485,79 +13485,79 @@
                 <w:rFonts w:ascii="Times New Roman" w:hAnsi="Times New Roman"/>
                 <w:sz w:val="17"/>
               </w:rPr>
-              <w:t xml:space="preserve">+0.015 [+0.013, +0.018]*</w:t>
-            </w:r>
-          </w:p>
-        </w:tc>
-        <w:tc>
-          <w:tcPr/>
-          <w:p>
-            <w:pPr>
-              <w:pStyle w:val="Compact"/>
-              <w:spacing w:before="20" w:after="20" w:line="240" w:lineRule="auto"/>
-              <w:ind w:firstLine="0"/>
-              <w:jc w:val="left"/>
-            </w:pPr>
-            <w:r>
-              <w:rPr>
-                <w:rFonts w:ascii="Times New Roman" w:hAnsi="Times New Roman"/>
-                <w:sz w:val="17"/>
-              </w:rPr>
-              <w:t xml:space="preserve">+0.011 [+0.009, +0.014]*</w:t>
-            </w:r>
-          </w:p>
-        </w:tc>
-        <w:tc>
-          <w:tcPr/>
-          <w:p>
-            <w:pPr>
-              <w:pStyle w:val="Compact"/>
-              <w:spacing w:before="20" w:after="20" w:line="240" w:lineRule="auto"/>
-              <w:ind w:firstLine="0"/>
-              <w:jc w:val="left"/>
-            </w:pPr>
-            <w:r>
-              <w:rPr>
-                <w:rFonts w:ascii="Times New Roman" w:hAnsi="Times New Roman"/>
-                <w:sz w:val="17"/>
-              </w:rPr>
-              <w:t xml:space="preserve">+0.004 [-0.001, +0.009]</w:t>
-            </w:r>
-          </w:p>
-        </w:tc>
-        <w:tc>
-          <w:tcPr/>
-          <w:p>
-            <w:pPr>
-              <w:pStyle w:val="Compact"/>
-              <w:spacing w:before="20" w:after="20" w:line="240" w:lineRule="auto"/>
-              <w:ind w:firstLine="0"/>
-              <w:jc w:val="left"/>
-            </w:pPr>
-            <w:r>
-              <w:rPr>
-                <w:rFonts w:ascii="Times New Roman" w:hAnsi="Times New Roman"/>
-                <w:sz w:val="17"/>
-              </w:rPr>
-              <w:t xml:space="preserve">2.54*</w:t>
-            </w:r>
-          </w:p>
-        </w:tc>
-        <w:tc>
-          <w:tcPr/>
-          <w:p>
-            <w:pPr>
-              <w:pStyle w:val="Compact"/>
-              <w:spacing w:before="20" w:after="20" w:line="240" w:lineRule="auto"/>
-              <w:ind w:firstLine="0"/>
-              <w:jc w:val="left"/>
-            </w:pPr>
-            <w:r>
-              <w:rPr>
-                <w:rFonts w:ascii="Times New Roman" w:hAnsi="Times New Roman"/>
-                <w:sz w:val="17"/>
-              </w:rPr>
-              <w:t xml:space="preserve">2.16*</w:t>
+              <w:t xml:space="preserve">+0.014 [+0.012, +0.015]*</w:t>
+            </w:r>
+          </w:p>
+        </w:tc>
+        <w:tc>
+          <w:tcPr/>
+          <w:p>
+            <w:pPr>
+              <w:pStyle w:val="Compact"/>
+              <w:spacing w:before="20" w:after="20" w:line="240" w:lineRule="auto"/>
+              <w:ind w:firstLine="0"/>
+              <w:jc w:val="left"/>
+            </w:pPr>
+            <w:r>
+              <w:rPr>
+                <w:rFonts w:ascii="Times New Roman" w:hAnsi="Times New Roman"/>
+                <w:sz w:val="17"/>
+              </w:rPr>
+              <w:t xml:space="preserve">+0.014 [+0.012, +0.015]*</w:t>
+            </w:r>
+          </w:p>
+        </w:tc>
+        <w:tc>
+          <w:tcPr/>
+          <w:p>
+            <w:pPr>
+              <w:pStyle w:val="Compact"/>
+              <w:spacing w:before="20" w:after="20" w:line="240" w:lineRule="auto"/>
+              <w:ind w:firstLine="0"/>
+              <w:jc w:val="left"/>
+            </w:pPr>
+            <w:r>
+              <w:rPr>
+                <w:rFonts w:ascii="Times New Roman" w:hAnsi="Times New Roman"/>
+                <w:sz w:val="17"/>
+              </w:rPr>
+              <w:t xml:space="preserve">+0.000 [-0.002, +0.003]*</w:t>
+            </w:r>
+          </w:p>
+        </w:tc>
+        <w:tc>
+          <w:tcPr/>
+          <w:p>
+            <w:pPr>
+              <w:pStyle w:val="Compact"/>
+              <w:spacing w:before="20" w:after="20" w:line="240" w:lineRule="auto"/>
+              <w:ind w:firstLine="0"/>
+              <w:jc w:val="left"/>
+            </w:pPr>
+            <w:r>
+              <w:rPr>
+                <w:rFonts w:ascii="Times New Roman" w:hAnsi="Times New Roman"/>
+                <w:sz w:val="17"/>
+              </w:rPr>
+              <w:t xml:space="preserve">2.41</w:t>
+            </w:r>
+          </w:p>
+        </w:tc>
+        <w:tc>
+          <w:tcPr/>
+          <w:p>
+            <w:pPr>
+              <w:pStyle w:val="Compact"/>
+              <w:spacing w:before="20" w:after="20" w:line="240" w:lineRule="auto"/>
+              <w:ind w:firstLine="0"/>
+              <w:jc w:val="left"/>
+            </w:pPr>
+            <w:r>
+              <w:rPr>
+                <w:rFonts w:ascii="Times New Roman" w:hAnsi="Times New Roman"/>
+                <w:sz w:val="17"/>
+              </w:rPr>
+              <w:t xml:space="preserve">2.39*</w:t>
             </w:r>
           </w:p>
         </w:tc>
@@ -13631,97 +13631,97 @@
                 <w:rFonts w:ascii="Times New Roman" w:hAnsi="Times New Roman"/>
                 <w:sz w:val="17"/>
               </w:rPr>
-              <w:t xml:space="preserve">0.124</w:t>
-            </w:r>
-          </w:p>
-        </w:tc>
-        <w:tc>
-          <w:tcPr/>
-          <w:p>
-            <w:pPr>
-              <w:pStyle w:val="Compact"/>
-              <w:spacing w:before="20" w:after="20" w:line="240" w:lineRule="auto"/>
-              <w:ind w:firstLine="0"/>
-              <w:jc w:val="left"/>
-            </w:pPr>
-            <w:r>
-              <w:rPr>
-                <w:rFonts w:ascii="Times New Roman" w:hAnsi="Times New Roman"/>
-                <w:sz w:val="17"/>
-              </w:rPr>
-              <w:t xml:space="preserve">+0.103 [+0.089, +0.118]*</w:t>
-            </w:r>
-          </w:p>
-        </w:tc>
-        <w:tc>
-          <w:tcPr/>
-          <w:p>
-            <w:pPr>
-              <w:pStyle w:val="Compact"/>
-              <w:spacing w:before="20" w:after="20" w:line="240" w:lineRule="auto"/>
-              <w:ind w:firstLine="0"/>
-              <w:jc w:val="left"/>
-            </w:pPr>
-            <w:r>
-              <w:rPr>
-                <w:rFonts w:ascii="Times New Roman" w:hAnsi="Times New Roman"/>
-                <w:sz w:val="17"/>
-              </w:rPr>
-              <w:t xml:space="preserve">+0.099 [+0.083, +0.115]*</w:t>
-            </w:r>
-          </w:p>
-        </w:tc>
-        <w:tc>
-          <w:tcPr/>
-          <w:p>
-            <w:pPr>
-              <w:pStyle w:val="Compact"/>
-              <w:spacing w:before="20" w:after="20" w:line="240" w:lineRule="auto"/>
-              <w:ind w:firstLine="0"/>
-              <w:jc w:val="left"/>
-            </w:pPr>
-            <w:r>
-              <w:rPr>
-                <w:rFonts w:ascii="Times New Roman" w:hAnsi="Times New Roman"/>
-                <w:sz w:val="17"/>
-              </w:rPr>
-              <w:t xml:space="preserve">+0.004 [-0.022, +0.030]</w:t>
-            </w:r>
-          </w:p>
-        </w:tc>
-        <w:tc>
-          <w:tcPr/>
-          <w:p>
-            <w:pPr>
-              <w:pStyle w:val="Compact"/>
-              <w:spacing w:before="20" w:after="20" w:line="240" w:lineRule="auto"/>
-              <w:ind w:firstLine="0"/>
-              <w:jc w:val="left"/>
-            </w:pPr>
-            <w:r>
-              <w:rPr>
-                <w:rFonts w:ascii="Times New Roman" w:hAnsi="Times New Roman"/>
-                <w:sz w:val="17"/>
-              </w:rPr>
-              <w:t xml:space="preserve">1.83*</w:t>
-            </w:r>
-          </w:p>
-        </w:tc>
-        <w:tc>
-          <w:tcPr/>
-          <w:p>
-            <w:pPr>
-              <w:pStyle w:val="Compact"/>
-              <w:spacing w:before="20" w:after="20" w:line="240" w:lineRule="auto"/>
-              <w:ind w:firstLine="0"/>
-              <w:jc w:val="left"/>
-            </w:pPr>
-            <w:r>
-              <w:rPr>
-                <w:rFonts w:ascii="Times New Roman" w:hAnsi="Times New Roman"/>
-                <w:sz w:val="17"/>
-              </w:rPr>
-              <w:t xml:space="preserve">1.80*</w:t>
+              <w:t xml:space="preserve">0.119</w:t>
+            </w:r>
+          </w:p>
+        </w:tc>
+        <w:tc>
+          <w:tcPr/>
+          <w:p>
+            <w:pPr>
+              <w:pStyle w:val="Compact"/>
+              <w:spacing w:before="20" w:after="20" w:line="240" w:lineRule="auto"/>
+              <w:ind w:firstLine="0"/>
+              <w:jc w:val="left"/>
+            </w:pPr>
+            <w:r>
+              <w:rPr>
+                <w:rFonts w:ascii="Times New Roman" w:hAnsi="Times New Roman"/>
+                <w:sz w:val="17"/>
+              </w:rPr>
+              <w:t xml:space="preserve">+0.098 [+0.091, +0.105]*</w:t>
+            </w:r>
+          </w:p>
+        </w:tc>
+        <w:tc>
+          <w:tcPr/>
+          <w:p>
+            <w:pPr>
+              <w:pStyle w:val="Compact"/>
+              <w:spacing w:before="20" w:after="20" w:line="240" w:lineRule="auto"/>
+              <w:ind w:firstLine="0"/>
+              <w:jc w:val="left"/>
+            </w:pPr>
+            <w:r>
+              <w:rPr>
+                <w:rFonts w:ascii="Times New Roman" w:hAnsi="Times New Roman"/>
+                <w:sz w:val="17"/>
+              </w:rPr>
+              <w:t xml:space="preserve">+0.097 [+0.088, +0.106]*</w:t>
+            </w:r>
+          </w:p>
+        </w:tc>
+        <w:tc>
+          <w:tcPr/>
+          <w:p>
+            <w:pPr>
+              <w:pStyle w:val="Compact"/>
+              <w:spacing w:before="20" w:after="20" w:line="240" w:lineRule="auto"/>
+              <w:ind w:firstLine="0"/>
+              <w:jc w:val="left"/>
+            </w:pPr>
+            <w:r>
+              <w:rPr>
+                <w:rFonts w:ascii="Times New Roman" w:hAnsi="Times New Roman"/>
+                <w:sz w:val="17"/>
+              </w:rPr>
+              <w:t xml:space="preserve">+0.001 [-0.012, +0.015]</w:t>
+            </w:r>
+          </w:p>
+        </w:tc>
+        <w:tc>
+          <w:tcPr/>
+          <w:p>
+            <w:pPr>
+              <w:pStyle w:val="Compact"/>
+              <w:spacing w:before="20" w:after="20" w:line="240" w:lineRule="auto"/>
+              <w:ind w:firstLine="0"/>
+              <w:jc w:val="left"/>
+            </w:pPr>
+            <w:r>
+              <w:rPr>
+                <w:rFonts w:ascii="Times New Roman" w:hAnsi="Times New Roman"/>
+                <w:sz w:val="17"/>
+              </w:rPr>
+              <w:t xml:space="preserve">1.82*</w:t>
+            </w:r>
+          </w:p>
+        </w:tc>
+        <w:tc>
+          <w:tcPr/>
+          <w:p>
+            <w:pPr>
+              <w:pStyle w:val="Compact"/>
+              <w:spacing w:before="20" w:after="20" w:line="240" w:lineRule="auto"/>
+              <w:ind w:firstLine="0"/>
+              <w:jc w:val="left"/>
+            </w:pPr>
+            <w:r>
+              <w:rPr>
+                <w:rFonts w:ascii="Times New Roman" w:hAnsi="Times New Roman"/>
+                <w:sz w:val="17"/>
+              </w:rPr>
+              <w:t xml:space="preserve">1.81*</w:t>
             </w:r>
           </w:p>
         </w:tc>
@@ -13813,79 +13813,79 @@
                 <w:rFonts w:ascii="Times New Roman" w:hAnsi="Times New Roman"/>
                 <w:sz w:val="17"/>
               </w:rPr>
-              <w:t xml:space="preserve">+0.080 [+0.072, +0.088]*</w:t>
-            </w:r>
-          </w:p>
-        </w:tc>
-        <w:tc>
-          <w:tcPr/>
-          <w:p>
-            <w:pPr>
-              <w:pStyle w:val="Compact"/>
-              <w:spacing w:before="20" w:after="20" w:line="240" w:lineRule="auto"/>
-              <w:ind w:firstLine="0"/>
-              <w:jc w:val="left"/>
-            </w:pPr>
-            <w:r>
-              <w:rPr>
-                <w:rFonts w:ascii="Times New Roman" w:hAnsi="Times New Roman"/>
-                <w:sz w:val="17"/>
-              </w:rPr>
-              <w:t xml:space="preserve">+0.077 [+0.069, +0.084]*</w:t>
-            </w:r>
-          </w:p>
-        </w:tc>
-        <w:tc>
-          <w:tcPr/>
-          <w:p>
-            <w:pPr>
-              <w:pStyle w:val="Compact"/>
-              <w:spacing w:before="20" w:after="20" w:line="240" w:lineRule="auto"/>
-              <w:ind w:firstLine="0"/>
-              <w:jc w:val="left"/>
-            </w:pPr>
-            <w:r>
-              <w:rPr>
-                <w:rFonts w:ascii="Times New Roman" w:hAnsi="Times New Roman"/>
-                <w:sz w:val="17"/>
-              </w:rPr>
-              <w:t xml:space="preserve">+0.003 [-0.010, +0.017]</w:t>
-            </w:r>
-          </w:p>
-        </w:tc>
-        <w:tc>
-          <w:tcPr/>
-          <w:p>
-            <w:pPr>
-              <w:pStyle w:val="Compact"/>
-              <w:spacing w:before="20" w:after="20" w:line="240" w:lineRule="auto"/>
-              <w:ind w:firstLine="0"/>
-              <w:jc w:val="left"/>
-            </w:pPr>
-            <w:r>
-              <w:rPr>
-                <w:rFonts w:ascii="Times New Roman" w:hAnsi="Times New Roman"/>
-                <w:sz w:val="17"/>
-              </w:rPr>
-              <w:t xml:space="preserve">10.43*</w:t>
-            </w:r>
-          </w:p>
-        </w:tc>
-        <w:tc>
-          <w:tcPr/>
-          <w:p>
-            <w:pPr>
-              <w:pStyle w:val="Compact"/>
-              <w:spacing w:before="20" w:after="20" w:line="240" w:lineRule="auto"/>
-              <w:ind w:firstLine="0"/>
-              <w:jc w:val="left"/>
-            </w:pPr>
-            <w:r>
-              <w:rPr>
-                <w:rFonts w:ascii="Times New Roman" w:hAnsi="Times New Roman"/>
-                <w:sz w:val="17"/>
-              </w:rPr>
-              <w:t xml:space="preserve">10.03*</w:t>
+              <w:t xml:space="preserve">+0.078 [+0.074, +0.082]*</w:t>
+            </w:r>
+          </w:p>
+        </w:tc>
+        <w:tc>
+          <w:tcPr/>
+          <w:p>
+            <w:pPr>
+              <w:pStyle w:val="Compact"/>
+              <w:spacing w:before="20" w:after="20" w:line="240" w:lineRule="auto"/>
+              <w:ind w:firstLine="0"/>
+              <w:jc w:val="left"/>
+            </w:pPr>
+            <w:r>
+              <w:rPr>
+                <w:rFonts w:ascii="Times New Roman" w:hAnsi="Times New Roman"/>
+                <w:sz w:val="17"/>
+              </w:rPr>
+              <w:t xml:space="preserve">+0.077 [+0.072, +0.081]*</w:t>
+            </w:r>
+          </w:p>
+        </w:tc>
+        <w:tc>
+          <w:tcPr/>
+          <w:p>
+            <w:pPr>
+              <w:pStyle w:val="Compact"/>
+              <w:spacing w:before="20" w:after="20" w:line="240" w:lineRule="auto"/>
+              <w:ind w:firstLine="0"/>
+              <w:jc w:val="left"/>
+            </w:pPr>
+            <w:r>
+              <w:rPr>
+                <w:rFonts w:ascii="Times New Roman" w:hAnsi="Times New Roman"/>
+                <w:sz w:val="17"/>
+              </w:rPr>
+              <w:t xml:space="preserve">+0.001 [-0.007, +0.009]</w:t>
+            </w:r>
+          </w:p>
+        </w:tc>
+        <w:tc>
+          <w:tcPr/>
+          <w:p>
+            <w:pPr>
+              <w:pStyle w:val="Compact"/>
+              <w:spacing w:before="20" w:after="20" w:line="240" w:lineRule="auto"/>
+              <w:ind w:firstLine="0"/>
+              <w:jc w:val="left"/>
+            </w:pPr>
+            <w:r>
+              <w:rPr>
+                <w:rFonts w:ascii="Times New Roman" w:hAnsi="Times New Roman"/>
+                <w:sz w:val="17"/>
+              </w:rPr>
+              <w:t xml:space="preserve">10.12*</w:t>
+            </w:r>
+          </w:p>
+        </w:tc>
+        <w:tc>
+          <w:tcPr/>
+          <w:p>
+            <w:pPr>
+              <w:pStyle w:val="Compact"/>
+              <w:spacing w:before="20" w:after="20" w:line="240" w:lineRule="auto"/>
+              <w:ind w:firstLine="0"/>
+              <w:jc w:val="left"/>
+            </w:pPr>
+            <w:r>
+              <w:rPr>
+                <w:rFonts w:ascii="Times New Roman" w:hAnsi="Times New Roman"/>
+                <w:sz w:val="17"/>
+              </w:rPr>
+              <w:t xml:space="preserve">10.01*</w:t>
             </w:r>
           </w:p>
         </w:tc>
@@ -13902,7 +13902,7 @@
           <w:iCs/>
           <w:i/>
         </w:rPr>
-        <w:t xml:space="preserve">Table 4. Probability-elicitation design (mean elicited probability over 300 simulated customers per seed, three independent calls per customer; 900 customers for GPT-4o-mini, Llama-3.3-70B, and Haiku 5.5, which were run on three seeds). Lift = probability with the email minus probability without it; gap = lift of the men’s email minus lift of the women’s email; intervals are 95% paired bootstrap intervals over customers (real values: normal approximation). RR = risk ratio; for the models run on three seeds it is the mean of the three per-seed ratios, and the asterisk is set only if the interval excludes the real ratio in all three seeds. * the simulated and the real intervals do not overlap.</w:t>
+        <w:t xml:space="preserve">Table 4. Probability-elicitation design (mean elicited probability over 300 simulated customers per seed, three independent calls per customer, pooled over three seeds, 900 customers per model). Lift = probability with the email minus probability without it; gap = lift of the men’s email minus lift of the women’s email; intervals are 95% paired bootstrap intervals over customers (real values: normal approximation). RR = risk ratio, the mean of the three per-seed ratios; its asterisk is set only if the interval excludes the real ratio in all three seeds. * the simulated and the real intervals do not overlap.</w:t>
       </w:r>
     </w:p>
     <w:p>
@@ -13965,7 +13965,7 @@
         <w:pStyle w:val="BodyText"/>
       </w:pPr>
       <w:r>
-        <w:t xml:space="preserve">Four patterns emerge. First, the direction is mostly reproduced: the risk ratio exceeds one in all 32 probability-elicitation cells, but its interval includes or touches one in two (GPT-4o-mini with the anchor for visits, 1.01 [1.00, 1.03], where the model answered about 10% regardless of the email, and Sonnet 5 with the anchor for purchases, 1.09 [0.96, 1.25]), and Llama with the anchor gave a risk ratio below one in the yes/no format for visits (0.60 to 0.69 in all three seeds). For the three models run on three seeds, the risk ratio exceeded one in all 24 cells of the two further seeds (smallest lower bound 1.00). Second, the size of the visit effect depends on the model and the prompt. In 4 of 16 configurations the lift for the men’s email is statistically consistent with the real +0.077 (Llama-3.3-70B, Haiku 5.5, and Mistral Large 4 without the anchor, and GPT-5.6-terra with it); five are less than half as large (for example Sonnet 5 with the anchor, +0.025), and four are more than 1.5 times as large (for example GPT-4o-mini without the anchor, +0.190). Which prompt works differs by model: the anchor brings GPT-5.6-terra to the real value but moves DeepSeek-V4-Pro from 0.5 to 2.6 times the real lift.</w:t>
+        <w:t xml:space="preserve">Four patterns emerge. First, the direction is mostly reproduced: the risk ratio exceeds one in all 32 probability-elicitation cells, (smallest 1.03), but in individual seeds its interval includes or touches one in a few cells (GPT-4o-mini with the anchor for visits, 1.01 [1.00, 1.03] in the first seed, where the model answered about 10% regardless of the email, and Sonnet 5 with the anchor for purchases, 1.09 [0.96, 1.25], 1.02 [0.91, 1.15], and 1.05 [0.91, 1.20] in the three seeds). Llama with the anchor gave a risk ratio below one in the yes/no format for visits (0.60 to 0.69 in all three seeds). Second, the size of the visit effect depends on the model and the prompt. In 4 of 16 configurations the lift for the men’s email is statistically consistent with the real +0.077 (Llama-3.3-70B, Haiku 5.5, and Mistral Large 4 without the anchor, and GPT-5.6-terra with it); eight are significantly smaller (three of them less than half as large, for example Sonnet 5 with the anchor, +0.027), and four are more than 1.5 times as large (for example GPT-4o-mini without the anchor, +0.190). Which prompt works differs by model: the anchor brings GPT-5.6-terra to the real value but moves DeepSeek-V4-Pro from 0.5 to 2.6 times the real lift.</w:t>
       </w:r>
     </w:p>
     <w:p>
@@ -13973,7 +13973,7 @@
         <w:pStyle w:val="BodyText"/>
       </w:pPr>
       <w:r>
-        <w:t xml:space="preserve">Third, the absolute lift in purchase probability exceeds the real +0.0068 in 15 of the 16 configurations, by a median factor of about 10 and by up to 25 (for example +0.169 for GPT-4o-mini without the anchor). The one exception is Sonnet 5 with the anchor, whose purchase lift (+0.004, interval -0.002 to +0.010) is consistent with the real one; but this model rates the visit lift at only 0.3 times the real value and its no-email purchase probability (0.046) is eight times the real one, so it attributes almost no effect to the email. Providing the base rate sets the no-email probability close to the stated number (about 0.10 for visits in six models, and 0.004 to 0.010 for purchases in five) without lowering the email-arm probability accordingly, so the risk ratio explodes in some cases (10 to 44 for Llama, Haiku, and Mistral) while the absolute lift stays large. The relation</w:t>
+        <w:t xml:space="preserve">Third, the absolute lift in purchase probability exceeds the real +0.0068 in 15 of the 16 configurations, by a median factor of about 9 and by up to 25 (for example +0.169 for GPT-4o-mini without the anchor). The one exception is Sonnet 5 with the anchor, whose purchase lift (+0.002, interval -0.001 to +0.006) is only 0.4 times the real one; this model also rates the visit lift at 0.4 times the real value and its no-email purchase probability (0.045) is eight times the real one, so it attributes almost no effect to the email. Providing the base rate sets the no-email probability close to the stated number (about 0.10 for visits in six models, and 0.004 to 0.010 for purchases in five) without lowering the email-arm probability accordingly, so the risk ratio explodes in some cases (10 to 44 for Llama, Haiku, and Mistral) while the absolute lift stays large. The relation</w:t>
       </w:r>
       <w:r>
         <w:t xml:space="preserve"> </w:t>
@@ -14034,7 +14034,7 @@
         <w:pStyle w:val="BodyText"/>
       </w:pPr>
       <w:r>
-        <w:t xml:space="preserve">Fourth, the models do not tell the two emails apart. In reality the men’s email has the larger lift (+0.077 against +0.045 for visits, a gap of +0.031 with interval +0.024 to +0.038). Among the 32 probability-elicitation cells, none has a gap interval that excludes zero in the right direction. The point estimate of the gap is positive in only 15 cells, the largest simulated visit gap is +0.013, and in three cells (Haiku 5.5 without the anchor for visits, and GPT-4o-mini in both prompt variants for purchases) the women’s email is rated significantly higher.</w:t>
+        <w:t xml:space="preserve">Fourth, the models do not tell the two emails apart. In reality the men’s email has the larger lift (+0.077 against +0.045 for visits, a gap of +0.031 with interval +0.024 to +0.038). Among the 32 probability-elicitation cells, the point estimate of the gap is positive in only 9, and the largest simulated visit gap is +0.015. Seven gap intervals exclude zero. In six of them the women’s email is rated significantly higher (Haiku 5.5 without the anchor and GPT-5.6-terra with it for visits, and GPT-4o-mini and Sonnet 5 in both prompt variants for purchases), and in one (DeepSeek-V4-Pro with the anchor for visits) the men’s email is rated higher, by +0.015, which is half the real gap.</w:t>
       </w:r>
     </w:p>
     <w:p>
@@ -14042,7 +14042,7 @@
         <w:pStyle w:val="BodyText"/>
       </w:pPr>
       <w:r>
-        <w:t xml:space="preserve">Direct yes/no answers are not usable for rare events. In 15 of 32 yes/no cells of the first seed (and in 13 of 24 cells of the two further seeds) the model answered</w:t>
+        <w:t xml:space="preserve">Direct yes/no answers are not usable for rare events. In 15 of 32 yes/no cells of the first seed (and in 27 of 64 cells of the two further seeds) the model answered</w:t>
       </w:r>
       <w:r>
         <w:t xml:space="preserve"> </w:t>
@@ -14096,7 +14096,7 @@
         <w:t xml:space="preserve"> </w:t>
       </w:r>
       <w:r>
-        <w:t xml:space="preserve">for about half with one). The yes/no visit lifts range from -0.31 to +0.55, and the purchase lifts from +0.007 to +0.55, up to 80 times the real lift.</w:t>
+        <w:t xml:space="preserve">for about half with one). The yes/no visit lifts range from -0.31 to +0.55, and the purchase lifts from +0.008 to +0.55, up to 80 times the real lift.</w:t>
       </w:r>
     </w:p>
     <w:bookmarkEnd w:id="52"/>
@@ -14515,7 +14515,7 @@
                 <w:rFonts w:ascii="Times New Roman" w:hAnsi="Times New Roman"/>
                 <w:sz w:val="17"/>
               </w:rPr>
-              <w:t xml:space="preserve">Supported for purchases: the lift exceeds the real value in 15 of 16 configurations (median about tenfold). Not for visits: 4 of 16 are consistent with the real value, 5 are too small, and 4 are too large.</w:t>
+              <w:t xml:space="preserve">Supported for purchases: the lift exceeds the real value in 15 of 16 configurations (median about ninefold). Not for visits: 4 of 16 are consistent with the real value, 8 are too small, and 4 are too large.</w:t>
             </w:r>
           </w:p>
         </w:tc>
@@ -14553,7 +14553,7 @@
                 <w:rFonts w:ascii="Times New Roman" w:hAnsi="Times New Roman"/>
                 <w:sz w:val="17"/>
               </w:rPr>
-              <w:t xml:space="preserve">Supported. The simulated gap between the two emails excludes zero in only 3 of 32 cells, and in all three the sign is the opposite of the real one.</w:t>
+              <w:t xml:space="preserve">Supported. The simulated gap between the two emails excludes zero in 7 of 32 cells; in six the sign is the opposite of the real one, and in one it is right but half the size.</w:t>
             </w:r>
           </w:p>
         </w:tc>
@@ -15170,7 +15170,7 @@
         <w:pStyle w:val="FirstParagraph"/>
       </w:pPr>
       <w:r>
-        <w:t xml:space="preserve">The consequence for a decision can be shown in a stylized example. A firm launches a promotion if the expected gain per targeted customer exceeds its cost, that is, if the lift in purchase probability exceeds the ratio of cost to margin. Suppose a promotion costs 1 monetary unit per targeted customer and each purchase earns a margin of 50, so the ratio is 0.02. The real lift in purchase probability from the men’s email was 0.0068, below 0.02, so the randomized test says not to launch. The simulated lift exceeded 0.02 in 13 of the 16 configurations (the median was 0.065, and the real value was exceeded in 15), so a firm that relied on those simulators would have launched. The stylized numbers are ours and are not taken from the retailer, and the email test does not involve a discount, but the example shows how an overstated absolute lift turns directly into a wrong go decision.</w:t>
+        <w:t xml:space="preserve">The consequence for a decision can be shown in a stylized example. A firm launches a promotion if the expected gain per targeted customer exceeds its cost, that is, if the lift in purchase probability exceeds the ratio of cost to margin. Suppose a promotion costs 1 monetary unit per targeted customer and each purchase earns a margin of 50, so the ratio is 0.02. The real lift in purchase probability from the men’s email was 0.0068, below 0.02, so the randomized test says not to launch. The simulated lift exceeded 0.02 in 13 of the 16 configurations (the median was 0.063, and the real value was exceeded in 15), so a firm that relied on those simulators would have launched. The stylized numbers are ours and are not taken from the retailer, and the email test does not involve a discount, but the example shows how an overstated absolute lift turns directly into a wrong go decision.</w:t>
       </w:r>
     </w:p>
     <w:bookmarkEnd w:id="59"/>
@@ -15206,7 +15206,7 @@
         <w:t xml:space="preserve"> </w:t>
       </w:r>
       <w:r>
-        <w:t xml:space="preserve">The simulated purchase lift for the men’s email was overstated in 15 of 16 configurations, with a median of about ten times the randomized value. In the stylized example of Section 6.3, with a cost of 1 and a margin of 50 per purchase, a campaign to 100,000 customers has a real expected result of</w:t>
+        <w:t xml:space="preserve">The simulated purchase lift for the men’s email was overstated in 15 of 16 configurations, with a median of about nine times the randomized value. In the stylized example of Section 6.3, with a cost of 1 and a margin of 50 per purchase, a campaign to 100,000 customers has a real expected result of</w:t>
       </w:r>
       <w:r>
         <w:t xml:space="preserve"> </w:t>
@@ -15253,7 +15253,7 @@
         <w:t xml:space="preserve"> </w:t>
       </w:r>
       <w:r>
-        <w:t xml:space="preserve">per customer, a loss of about 66,000. The median simulated lift of 0.065 predicts</w:t>
+        <w:t xml:space="preserve">per customer, a loss of about 66,000. The median simulated lift of 0.063 predicts about</w:t>
       </w:r>
       <w:r>
         <w:t xml:space="preserve"> </w:t>
@@ -15266,14 +15266,14 @@
           <m:t>+</m:t>
         </m:r>
         <m:r>
-          <m:t>2.25</m:t>
+          <m:t>2.1</m:t>
         </m:r>
       </m:oMath>
       <w:r>
         <w:t xml:space="preserve"> </w:t>
       </w:r>
       <w:r>
-        <w:t xml:space="preserve">per customer, a profit of about 225,000. The gap between forecast and outcome is therefore about 290,000 for a single campaign, and it has a sign that favors launching. The error is systematic, not noisy, so it does not average out over campaigns.</w:t>
+        <w:t xml:space="preserve">per customer, a profit of about 213,000. The gap between forecast and outcome is therefore about 280,000 for a single campaign, and it has a sign that favors launching. The error is systematic, not noisy, so it does not average out over campaigns.</w:t>
       </w:r>
     </w:p>
     <w:p>
@@ -15497,7 +15497,7 @@
         <w:pStyle w:val="FirstParagraph"/>
       </w:pPr>
       <w:r>
-        <w:t xml:space="preserve">The evidence is preliminary. Every design has one prompt wording, so our intervals capture the sampling of customers but not variation across prompts, and the email experiment for the five newer models rests on one seed. The three transaction settings were run on three seeds for all eight models, and the per-seed variance-to-mean ratios were stable for the direct and daily designs (median range 0.04 and 0.03 across seeds, at most 0.30), except in a few DeepSeek-V4-Pro cells where direct answers are overdispersed (ranges of up to 9.4). They varied more for the describe design (median range 0.9, at most 2.1) and the hybrid design (median 1.2, at most 4.2), so the counts of cells in which these designs match the reference should be read as approximate. We tested eight models in all four settings, five of them larger or more recent than the first three. Whether still larger or reasoning-enabled models collapse less, and whether the overstated purchase lifts persist there, remains open. The low-mean reference is a calibrated parametric distribution rather than the raw data, and the Complete Journey households are loyalty-card shoppers with relatively high purchase frequency. Richer personas built from real household demographics did not change the picture, but the demographics in these data explain almost none of the heterogeneity (</w:t>
+        <w:t xml:space="preserve">The evidence is preliminary. Every design has one prompt wording, so our intervals capture the sampling of customers but not variation across prompts, The transaction settings and the email experiment were run on three seeds for all eight models, and the per-seed variance-to-mean ratios were stable for the direct and daily designs (median range 0.04 and 0.03 across seeds, at most 0.30), except in a few DeepSeek-V4-Pro cells where direct answers are overdispersed (ranges of up to 9.4). They varied more for the describe design (median range 0.9, at most 2.1) and the hybrid design (median 1.2, at most 4.2), so the counts of cells in which these designs match the reference should be read as approximate. We tested eight models in all four settings, five of them larger or more recent than the first three. Whether still larger or reasoning-enabled models collapse less, and whether the overstated purchase lifts persist there, remains open. The low-mean reference is a calibrated parametric distribution rather than the raw data, and the Complete Journey households are loyalty-card shoppers with relatively high purchase frequency. Richer personas built from real household demographics did not change the picture, but the demographics in these data explain almost none of the heterogeneity (</w:t>
       </w:r>
       <m:oMath>
         <m:sSup>

</xml_diff>

<commit_message>
Manuscript: reframe title, abstract, introduction, Section 3, discussion, and conclusion around the IT artifact, design theory, validation protocol, and accountability
Co-Authored-By: Claude Sonnet 5.5 <noreply@anthropic.com>
Claude-Session: https://claude.ai/code/session_01VRbK37d38KZhVAbWS4xw4x
</commit_message>
<xml_diff>
--- a/llm-count-study/ISR_manuscript_draft.docx
+++ b/llm-count-study/ISR_manuscript_draft.docx
@@ -7,7 +7,7 @@
         <w:pStyle w:val="Title"/>
       </w:pPr>
       <w:r>
-        <w:t xml:space="preserve">Counting Customers with Language Models: Heterogeneity Compression in Synthetic Purchase Data</w:t>
+        <w:t xml:space="preserve">Synthetic Customers as Decision-Support Artifacts: Design Constraints, Calibration, and Accountability in Generative-AI Marketing Analytics</w:t>
       </w:r>
     </w:p>
     <w:p>
@@ -51,7 +51,25 @@
         <w:pStyle w:val="BodyText"/>
       </w:pPr>
       <w:r>
-        <w:t xml:space="preserve">Large language models (LLMs) are increasingly used to create synthetic customers for pre-testing marketing decisions, but evaluations have concentrated on ratings, choices, and stated willingness to pay. We study an output that customer analytics depends on more directly: the number of purchases a customer makes in a period. Building on the Poisson–gamma account of purchase counts, we show analytically that overdispersion measures unobserved customer heterogeneity, derive how much of it a persona-conditioned simulator can carry, and show how a hybrid design avoids double counting. We evaluate four elicitation designs across eight LLMs in public transaction settings (mean counts of about 0.5, 4.8, and 7.8) and in a randomized email experiment. Direct and day-by-day designs collapse toward a single value in nearly every model and setting, and larger, more recent models do not change this. Describing a distribution recovers part of the dispersion but under-produces zero counts where zeros are common. Personas built from real household demographics change nothing, because those demographics explain about 1% of the heterogeneity in counts. The hybrid matches dispersion only when the model’s mean is accurate; calibrating the mean to a historical average repairs the mean, but a baseline that uses no model information fits as well or better, so in this task the model supplies a level and little else. Promotion effects have the right sign in most settings, yet their size varies by an order of magnitude with model and prompt, and the absolute lift in purchase probability is overstated in 15 of 16 configurations (median about ninefold). Treating the simulator as a decision-support artifact at the interface of information systems and marketing analytics, we show why the Poisson–gamma result becomes a managerial problem when heterogeneity is generated instead of estimated, read the propositions as design constraints and a calibration mechanism, derive design principles and an evaluation protocol, and show that the overstated lifts would lead a firm to approve promotions that a randomized test rejects. We close with organizational implications for validating and governing synthetic data in analytics systems.</w:t>
+        <w:t xml:space="preserve">Organizations are placing generative-AI</w:t>
+      </w:r>
+      <w:r>
+        <w:t xml:space="preserve"> </w:t>
+      </w:r>
+      <w:r>
+        <w:t xml:space="preserve">“</w:t>
+      </w:r>
+      <w:r>
+        <w:t xml:space="preserve">digital twins</w:t>
+      </w:r>
+      <w:r>
+        <w:t xml:space="preserve">”</w:t>
+      </w:r>
+      <w:r>
+        <w:t xml:space="preserve"> </w:t>
+      </w:r>
+      <w:r>
+        <w:t xml:space="preserve">of customers inside their marketing analytics systems, yet little is known about how such systems should be designed, validated, and governed. We treat the synthetic-customer simulator as an IT artifact for decision support and develop design theory for it. Two propositions state system design constraints. A persona-conditioned model that returns deterministic answers can carry only the customer heterogeneity that its persona describes (Proposition 1), and heterogeneity supplied from outside the model must be calibrated against it to avoid double counting (Proposition 2). These constraints explain why a familiar statistical result becomes a managerial problem: when behavior is generated instead of estimated, the spread of simulated behavior is no longer disciplined by the firm’s data, it cannot be detected from inside the system, and it can be checked only against the real data that the system was meant to economize. We evaluate four elicitation designs in eight language models against public transaction data (mean counts of about 0.5, 4.8, and 7.8) and a randomized email experiment, using purchase counts and promotion lifts as supporting evidence. Direct and day-by-day designs collapse toward near-constant answers and lose the concentration of purchases among heavy buyers; a design that takes only the level from the model and calibrates the spread externally restores concentration; but calibrating the level adds little beyond what the historical mean alone provides, so the model supplies little that the firm’s data do not. Purchase lifts have the right sign but are overstated in 15 of 16 configurations (median about ninefold), enough to reverse a go/no-go decision. We derive five design principles, an acceptance-test protocol, and accountability arrangements for validating and governing synthetic data in analytics systems.</w:t>
       </w:r>
     </w:p>
     <w:p>
@@ -69,7 +87,7 @@
         <w:t xml:space="preserve"> </w:t>
       </w:r>
       <w:r>
-        <w:t xml:space="preserve">synthetic customers, large language models, IT artifact, decision support systems, design science, purchase counts, overdispersion, customer heterogeneity, digital twins</w:t>
+        <w:t xml:space="preserve">IT artifact, decision support systems, design science, generative AI, digital twins, synthetic customers, validation, calibration, organizational accountability, marketing analytics</w:t>
       </w:r>
     </w:p>
     <w:bookmarkStart w:id="20" w:name="introduction"/>
@@ -86,7 +104,7 @@
         <w:pStyle w:val="FirstParagraph"/>
       </w:pPr>
       <w:r>
-        <w:t xml:space="preserve">Firms routinely test promotions, prices, and messages before committing money to them. Large language models (LLMs) promise a cheaper way to do so: prompt a model with a customer description, ask what that customer would do, and repeat for thousands of customers. Early studies found that such synthetic respondents produce plausible willingness-to-pay estimates and conjoint results (Brand et al. 2023), reproduce the qualitative pattern of classic behavioral experiments (Horton 2023), and, with suitable elicitation, mimic human purchase-intent ratings (Maier et al. 2025). Vendors now market</w:t>
+        <w:t xml:space="preserve">Organizations are beginning to place generative-AI</w:t>
       </w:r>
       <w:r>
         <w:t xml:space="preserve"> </w:t>
@@ -104,7 +122,7 @@
         <w:t xml:space="preserve"> </w:t>
       </w:r>
       <w:r>
-        <w:t xml:space="preserve">of consumer panels on this basis.</w:t>
+        <w:t xml:space="preserve">of customers inside their marketing analytics systems. The idea is simple: prompt a language model with a customer description, ask what that customer would do, and repeat for thousands of customers, so that promotions, prices, and messages can be tested before money is committed. Early studies found that such synthetic respondents produce plausible willingness-to-pay estimates and conjoint results (Brand et al. 2023), reproduce classic behavioral experiments (Horton 2023), and mimic purchase-intent ratings (Maier et al. 2025), and vendors now market twins of consumer panels on this basis. These studies evaluate the model’s answers. What an organization adopts, however, is a system: personas drawn from its customer data, an elicitation procedure, a step that turns answers into numbers, and a decision process that uses them. Whether that system can be trusted for a decision depends on how it is designed, how it is validated, and who is accountable for it. These are questions for information systems research.</w:t>
       </w:r>
     </w:p>
     <w:p>
@@ -112,7 +130,7 @@
         <w:pStyle w:val="BodyText"/>
       </w:pPr>
       <w:r>
-        <w:t xml:space="preserve">What counts as validation in these studies is almost always a rating, a choice, or a price. Customer analytics, however, runs on counts. The number of purchases or visits per customer and period feeds customer lifetime value, repeat-purchase forecasts, and budget allocation, and marketing science has long modeled these counts as a Poisson process whose rate differs across customers (Ehrenberg 1959, Schmittlein et al. 1987, Fader et al. 2005). Because of this structure, the spread of a count distribution carries information about something firms care about, namely how much customers differ. A simulator that gets the average right but flattens the spread will mislead any decision that depends on heavy buyers, on the share of customers who do not buy at all, or on the uncertainty around a forecast.</w:t>
+        <w:t xml:space="preserve">We treat the synthetic-customer simulator as an IT artifact, that is, a system that organizations design, deploy, and use to support decisions (Orlikowski and Iacono 2001, Hevner et al. 2004). Design science asks that such an artifact be evaluated against the decisions it serves and that the evaluation yield prescriptive knowledge about how to build it (Gregor and Hevner 2013). Its value does not lie in the language model alone but in the fit between what the system delivers and what the task demands (Goodhue and Thompson 1995). For promotion planning the task demands a plausible share of customers who do not buy, a plausible weight of heavy buyers, and a plausible absolute size of an effect. The elicitation design, meaning how the model is asked, how its answers become numbers, and where the variation among customers comes from, is therefore the artifact’s central design variable. We ask which designs preserve what the decision needs, why, and what organizations must do to know.</w:t>
       </w:r>
     </w:p>
     <w:p>
@@ -120,7 +138,7 @@
         <w:pStyle w:val="BodyText"/>
       </w:pPr>
       <w:r>
-        <w:t xml:space="preserve">There is good reason to worry about flattening. Studies of silicon samples repeatedly report variance collapse: simulated answers cluster on the modal response and are narrower than human ones (Li et al. 2025, Tigre and Souto 2026), and instruction-tuned models appear unable to sample from distributions they can otherwise describe (Jang et al. 2026). For count data this problem has a precise statistical form. If customers differ in their purchase rates, counts are overdispersed relative to a Poisson process; a simulator that compresses heterogeneity therefore shows up first as underdispersion and as a distorted share of zeros. Yet we found no study that evaluates LLM-generated purchase counts against Poisson or negative binomial benchmarks.</w:t>
+        <w:t xml:space="preserve">The question sits at the interface of information systems and marketing. Marketing analytics has become a systems problem: data are collected, transformed, and fed into models and dashboards that shape budgets and campaigns (Wedel and Kannan 2016), and the design, validation, and governance of those systems fall to information systems functions as much as to marketing. Generative AI adds a new component to this pipeline, the synthetic customer. A twin is only as useful as the properties it preserves, and fluent, plausible output invites reliance beyond what a system warrants (Lee and See 2004). The limits of AI-based decision support are therefore not a technical footnote but a question of how organizations should validate and use such outputs.</w:t>
       </w:r>
     </w:p>
     <w:p>
@@ -128,7 +146,7 @@
         <w:pStyle w:val="BodyText"/>
       </w:pPr>
       <w:r>
-        <w:t xml:space="preserve">The question is also one for information systems research. A synthetic-customer simulator is an IT artifact in the sense of a system that organizations design, deploy, and use to support decisions (Orlikowski and Iacono 2001, Hevner et al. 2004). Its value does not lie in the language model itself but in the decisions it supports, so the relevant test is task–technology fit (Goodhue and Thompson 1995): does the artifact reproduce the properties of customer behavior on which the decision depends? For promotion planning, those properties are the share of customers who do not buy, the weight of heavy buyers, and the absolute size of an effect. We therefore treat the elicitation design, meaning how the model is asked, how its answers become counts, and where heterogeneity comes from, as the artifact’s design variable, and ask which designs fit which decisions.</w:t>
+        <w:t xml:space="preserve">To make the question tractable we examine one property on which analytics systems depend, the heterogeneity of customers, as it appears in purchase counts. Marketing science has long modeled counts as a Poisson process whose rate differs across customers, so that the overdispersion of counts measures how much customers differ (Ehrenberg 1959, Schmittlein et al. 1987, Fader et al. 2005). Heterogeneity is a demanding test for a generative system for three reasons. It is invisible in the averages that users inspect. It drives the decisions that matter, those that depend on heavy buyers, on non-buyers, and on uncertainty. And it is the property that studies of silicon samples find compressed, with answers clustering on the modal response (Li et al. 2025, Tigre and Souto 2026) and instruction-tuned models unable to sample from distributions they can describe (Jang et al. 2026). Purchase counts, concentration, and promotion lifts are thus the supporting evidence in this paper, not its subject. They let us observe, against real data, whether the artifact preserves the property that the decision needs.</w:t>
       </w:r>
     </w:p>
     <w:p>
@@ -136,25 +154,7 @@
         <w:pStyle w:val="BodyText"/>
       </w:pPr>
       <w:r>
-        <w:t xml:space="preserve">The question sits at the interface of information systems and marketing. Marketing analytics has become a systems problem: data are collected, transformed, and fed into models and dashboards that shape budgets and campaigns (Wedel and Kannan 2016), and the design, validation, and governance of those systems fall to information systems functions as much as to marketing. Generative AI adds a new component to this pipeline, the synthetic customer, which is marketed as a</w:t>
-      </w:r>
-      <w:r>
-        <w:t xml:space="preserve"> </w:t>
-      </w:r>
-      <w:r>
-        <w:t xml:space="preserve">“</w:t>
-      </w:r>
-      <w:r>
-        <w:t xml:space="preserve">digital twin</w:t>
-      </w:r>
-      <w:r>
-        <w:t xml:space="preserve">”</w:t>
-      </w:r>
-      <w:r>
-        <w:t xml:space="preserve"> </w:t>
-      </w:r>
-      <w:r>
-        <w:t xml:space="preserve">of a customer base. A twin is only as useful as the properties it preserves. If it preserves averages but not the spread of behavior, the systems built on it inherit a bias that looks like data but is not. Fluent, plausible output also invites reliance beyond what the system warrants (Lee and See 2004), so the limits of AI-based decision support are not a technical footnote but a question of how organizations should validate and use such outputs. We contribute to that question by showing, for a quantity that analytics systems depend on, which design choices preserve the property that matters and which do not.</w:t>
+        <w:t xml:space="preserve">The statistics are familiar; the setting is not. In classical customer-base models heterogeneity is estimated from the firm’s own data, so its magnitude is disciplined by that data. In a synthetic-customer system it is generated by a pretrained model, and nothing in the generation process ties it to the firm’s customers. This changes who can know whether the artifact is right, and what the firm must do about it.</w:t>
       </w:r>
     </w:p>
     <w:p>
@@ -162,7 +162,7 @@
         <w:pStyle w:val="BodyText"/>
       </w:pPr>
       <w:r>
-        <w:t xml:space="preserve">We ask four questions. Does the per-period purchase-count distribution of synthetic customers match the real one in mean, dispersion, zero share, and tail (RQ1)? Does variance collapse appear in count data as underdispersion (RQ2)? Do the elicitation and sampling design change fidelity (RQ3)? And does the promotion effect estimated with synthetic customers agree with a randomized experiment in direction and size (RQ4)? To answer them we compare four elicitation designs, run with eight LLMs and two prompt variants, against public transaction data sets whose mean counts differ by a factor of ten or more, and we test the same models against a randomized email experiment.</w:t>
+        <w:t xml:space="preserve">We ask four questions. What design constraints govern how much customer heterogeneity a persona-conditioned generative system can carry, and what calibration mechanism restores the rest (RQ1)? Do the elicitation designs open to an organization differ in whether they preserve decision-relevant properties of customer behavior, across models and settings (RQ2)? How can a firm validate such a system, and does calibrating it with its own data suffice (RQ3)? And what do the errors mean for a decision, as judged against a randomized promotion experiment (RQ4)? To answer them we compare four elicitation designs, run with eight language models and two prompt variants, against public transaction data sets whose mean counts differ by a factor of ten or more, and we test the same models against a randomized email experiment.</w:t>
       </w:r>
     </w:p>
     <w:p>
@@ -170,7 +170,7 @@
         <w:pStyle w:val="BodyText"/>
       </w:pPr>
       <w:r>
-        <w:t xml:space="preserve">The study makes five contributions. First, we give a short analytical account of how much heterogeneity a persona-conditioned simulator can carry, and of how an externally injected heterogeneity term must be calibrated to avoid double counting (Propositions 1 and 2). Second, we provide evidence across designs, models, and settings that direct and day-by-day designs collapse, that describing a distribution only partly repairs the problem, and that a hybrid design reproduces dispersion only when the model supplies an accurate mean. Third, in the experimental setting we show that relative and absolute effects can tell different stories when the simulated base rate is wrong, and that the absolute lift in purchase probability is overstated in 15 of the 16 configurations we tested. Fourth, we explain why a familiar statistical result becomes a new managerial problem when behavior is generated rather than estimated (a bound set by the firm’s data assets, a validation paradox, silent failure, and shifting components), and we add a result on customer concentration (Proposition 3). Fifth, we translate these findings into design principles for synthetic-customer systems and a diagnostic evaluation protocol, and we show in a stylized example how the overstated lifts would change a go/no-go decision.</w:t>
+        <w:t xml:space="preserve">The study makes five contributions. First, we give design theory for the artifact: two propositions that state a design constraint (a deterministic persona-conditioned component transmits only the heterogeneity its persona describes) and a calibration mechanism (the variance carried by external noise must be allocated against the model’s own variation), and a third that links the constraint to customer concentration (Propositions 1 to 3). Second, we explain why this is a managerial problem and not merely a statistical one: when behavior is generated rather than estimated, the quality of the artifact is bounded by the firm’s data assets, cannot be seen from inside the system, and depends on components that the firm does not control. Third, we provide evidence across designs, models, and settings that direct and day-by-day designs collapse, that a design which takes only the level from the model and calibrates the spread externally restores concentration, and that calibrating the level adds little beyond the historical mean. Fourth, we derive five design principles and an acceptance-test protocol for synthetic-customer systems. Fifth, we identify the organizational arrangements, covering ownership of reference data, revalidation, separation of synthetic from real data, and accountability, that follow, and we show with the randomized email experiment that the overstated promotion lifts would reverse a go/no-go decision.</w:t>
       </w:r>
     </w:p>
     <w:p>
@@ -178,7 +178,7 @@
         <w:pStyle w:val="BodyText"/>
       </w:pPr>
       <w:r>
-        <w:t xml:space="preserve">The remainder of the paper is organized as follows. Section 2 reviews the literature and states the gap. Section 3 develops the framework and hypotheses. Section 4 describes the data, designs, and measures. Section 5 reports results, Section 6 discusses implications and limitations, and Section 7 concludes.</w:t>
+        <w:t xml:space="preserve">The remainder of the paper is organized as follows. Section 2 reviews the literature and states the gap. Section 3 develops the design theory and hypotheses. Section 4 describes the data, designs, and measures. Section 5 reports results, Section 6 discusses implications and limitations, and Section 7 concludes.</w:t>
       </w:r>
     </w:p>
     <w:bookmarkEnd w:id="20"/>
@@ -300,13 +300,21 @@
     </w:p>
     <w:bookmarkEnd w:id="25"/>
     <w:bookmarkEnd w:id="26"/>
-    <w:bookmarkStart w:id="35" w:name="theoretical-framework-and-hypotheses"/>
+    <w:bookmarkStart w:id="35" w:name="design-theory-and-hypotheses"/>
     <w:p>
       <w:pPr>
         <w:pStyle w:val="Heading1"/>
       </w:pPr>
       <w:r>
-        <w:t xml:space="preserve">3. Theoretical Framework and Hypotheses</w:t>
+        <w:t xml:space="preserve">3. Design Theory and Hypotheses</w:t>
+      </w:r>
+    </w:p>
+    <w:p>
+      <w:pPr>
+        <w:pStyle w:val="FirstParagraph"/>
+      </w:pPr>
+      <w:r>
+        <w:t xml:space="preserve">This section develops design theory for the artifact. We use the Poisson–gamma model as the formal language in which to state what a persona-conditioned generative system can and cannot carry, and we use the propositions that follow as design constraints and as a calibration mechanism for such a system, not as claims about count data. Section 3.7 sets out why we regard them as an information systems contribution.</w:t>
       </w:r>
     </w:p>
     <w:bookmarkStart w:id="27" w:name="X44757cbbfc69edf67c20f029e2f98c3663af43b"/>
@@ -3369,13 +3377,13 @@
       </w:r>
     </w:p>
     <w:bookmarkEnd w:id="32"/>
-    <w:bookmarkStart w:id="33" w:name="from-propositions-to-system-mechanisms"/>
+    <w:bookmarkStart w:id="33" w:name="X2c5c2fa1aebbd471e65a25456b361a39b9fe3a6"/>
     <w:p>
       <w:pPr>
         <w:pStyle w:val="Heading2"/>
       </w:pPr>
       <w:r>
-        <w:t xml:space="preserve">3.7 From propositions to system mechanisms</w:t>
+        <w:t xml:space="preserve">3.7 Propositions as design constraints and a calibration mechanism</w:t>
       </w:r>
     </w:p>
     <w:p>
@@ -3471,7 +3479,152 @@
         </m:d>
       </m:oMath>
       <w:r>
-        <w:t xml:space="preserve">. The mechanism has three properties that matter for a system. It is explicit, because the allocation is computed rather than tuned by hand. It is auditable, because the target dispersion comes from a named historical data set. And it is modular, because the model can be replaced without changing the calibration step, although the step must then be recomputed. Proposition 1 and Proposition 2 therefore correspond to a separation of responsibilities between the language model, which supplies the level of a customer’s expected behavior, and the statistical layer, which supplies and calibrates the spread.</w:t>
+        <w:t xml:space="preserve">. The mechanism has three properties that matter for a system. It is explicit, because the allocation is computed rather than tuned by hand. It is auditable, because the target dispersion comes from a named historical data set. And it is modular, because the model can be replaced without changing the calibration step, although the step must then be recomputed. Together the propositions imply a separation of responsibilities between the language model, which supplies the level of a customer’s expected behavior, and a statistical layer, which supplies and calibrates the spread.</w:t>
+      </w:r>
+    </w:p>
+    <w:p>
+      <w:pPr>
+        <w:pStyle w:val="BodyText"/>
+      </w:pPr>
+      <w:r>
+        <w:rPr>
+          <w:iCs/>
+          <w:i/>
+        </w:rPr>
+        <w:t xml:space="preserve">Why this is more than a statistical result.</w:t>
+      </w:r>
+      <w:r>
+        <w:t xml:space="preserve"> </w:t>
+      </w:r>
+      <w:r>
+        <w:t xml:space="preserve">The algebra is elementary, and we do not claim otherwise. The contribution lies in what the algebra establishes about the design space that an organization faces. First, Proposition 1 is an impossibility result for the design levers that organizations control. These levers are the prompt, the persona, the choice of model, and the decoding settings. Each of them acts on the deterministic map from persona to answer, and none of them can lift the bound</w:t>
+      </w:r>
+      <w:r>
+        <w:t xml:space="preserve"> </w:t>
+      </w:r>
+      <m:oMath>
+        <m:sSup>
+          <m:e>
+            <m:r>
+              <m:t>α</m:t>
+            </m:r>
+          </m:e>
+          <m:sup>
+            <m:r>
+              <m:rPr>
+                <m:sty m:val="p"/>
+              </m:rPr>
+              <m:t>*</m:t>
+            </m:r>
+          </m:sup>
+        </m:sSup>
+        <m:r>
+          <m:rPr>
+            <m:sty m:val="p"/>
+          </m:rPr>
+          <m:t>=</m:t>
+        </m:r>
+        <m:sSup>
+          <m:e>
+            <m:r>
+              <m:t>c</m:t>
+            </m:r>
+          </m:e>
+          <m:sup>
+            <m:r>
+              <m:t>2</m:t>
+            </m:r>
+          </m:sup>
+        </m:sSup>
+        <m:r>
+          <m:rPr>
+            <m:sty m:val="p"/>
+          </m:rPr>
+          <m:t>−</m:t>
+        </m:r>
+        <m:r>
+          <m:t>1</m:t>
+        </m:r>
+        <m:r>
+          <m:rPr>
+            <m:sty m:val="p"/>
+          </m:rPr>
+          <m:t>/</m:t>
+        </m:r>
+        <m:r>
+          <m:t>μ</m:t>
+        </m:r>
+      </m:oMath>
+      <w:r>
+        <w:t xml:space="preserve"> </w:t>
+      </w:r>
+      <w:r>
+        <w:t xml:space="preserve">beyond what the persona information allows. A team that tunes prompts to</w:t>
+      </w:r>
+      <w:r>
+        <w:t xml:space="preserve"> </w:t>
+      </w:r>
+      <w:r>
+        <w:t xml:space="preserve">“</w:t>
+      </w:r>
+      <w:r>
+        <w:t xml:space="preserve">add diversity</w:t>
+      </w:r>
+      <w:r>
+        <w:t xml:space="preserve">”</w:t>
+      </w:r>
+      <w:r>
+        <w:t xml:space="preserve"> </w:t>
+      </w:r>
+      <w:r>
+        <w:t xml:space="preserve">is working on the wrong lever, and this can be known before any experiment. Second, Proposition 2 turns the remedy into a rule that can be computed, audited, and handed to a governance process, which is the form in which design knowledge becomes usable in organizations (Gregor and Hevner 2013). Third, both propositions are independent of which model is used. They state what must be true of any component placed in this role, so they continue to hold when models and providers change, and that is the condition under which an organization can build a system around a component that it does not control. Fourth, they generate predictions that we test in Section 5: that direct answers collapse, that constant answers produce</w:t>
+      </w:r>
+      <w:r>
+        <w:t xml:space="preserve"> </w:t>
+      </w:r>
+      <m:oMath>
+        <m:sSup>
+          <m:e>
+            <m:r>
+              <m:t>α</m:t>
+            </m:r>
+          </m:e>
+          <m:sup>
+            <m:r>
+              <m:rPr>
+                <m:sty m:val="p"/>
+              </m:rPr>
+              <m:t>*</m:t>
+            </m:r>
+          </m:sup>
+        </m:sSup>
+        <m:r>
+          <m:rPr>
+            <m:sty m:val="p"/>
+          </m:rPr>
+          <m:t>=</m:t>
+        </m:r>
+        <m:r>
+          <m:rPr>
+            <m:sty m:val="p"/>
+          </m:rPr>
+          <m:t>−</m:t>
+        </m:r>
+        <m:r>
+          <m:t>1</m:t>
+        </m:r>
+        <m:r>
+          <m:rPr>
+            <m:sty m:val="p"/>
+          </m:rPr>
+          <m:t>/</m:t>
+        </m:r>
+        <m:r>
+          <m:t>μ</m:t>
+        </m:r>
+      </m:oMath>
+      <w:r>
+        <w:t xml:space="preserve">, that external noise restores concentration, and that richer personas cannot supply heterogeneity that the persona data do not contain. They are therefore falsifiable design theory in the sense of design science, not post hoc description.</w:t>
       </w:r>
     </w:p>
     <w:bookmarkEnd w:id="33"/>
@@ -14774,13 +14927,21 @@
         <w:t xml:space="preserve">6. Discussion</w:t>
       </w:r>
     </w:p>
-    <w:bookmarkStart w:id="57" w:name="theoretical-contributions"/>
+    <w:p>
+      <w:pPr>
+        <w:pStyle w:val="FirstParagraph"/>
+      </w:pPr>
+      <w:r>
+        <w:t xml:space="preserve">We lead with the contributions to information systems research (Section 6.1) and the design principles that follow from them (Section 6.2), then turn to the validation protocol and the decision consequences (Section 6.3), the cost of uncritical trust (Section 6.4), and the organizational arrangements that follow (Section 6.5). The marketing results of Section 5 serve as evidence for these contributions. Limitations are in Section 6.6.</w:t>
+      </w:r>
+    </w:p>
+    <w:bookmarkStart w:id="57" w:name="X8b5d7cb2dd9a2ce0d7f424e3d7c91bdc66a3387"/>
     <w:p>
       <w:pPr>
         <w:pStyle w:val="Heading2"/>
       </w:pPr>
       <w:r>
-        <w:t xml:space="preserve">6.1 Theoretical contributions</w:t>
+        <w:t xml:space="preserve">6.1 Contributions to information systems research</w:t>
       </w:r>
     </w:p>
     <w:p>
@@ -14788,21 +14949,46 @@
         <w:pStyle w:val="FirstParagraph"/>
       </w:pPr>
       <w:r>
-        <w:t xml:space="preserve">Our results support a simple reading of synthetic purchase data: persona-conditioned LLM simulators compress customer heterogeneity, and the compression has a specific, measurable form. Proposition 1 shows why direct answers cannot be overdispersed in general (they lose Poisson noise and the share of heterogeneity that the persona does not describe), and the data are consistent with it: variance-to-mean ratios of direct answers are at most 1.00 in 42 of 48 cells, whatever the mean or the model, and the demographic-persona experiment reproduces the predicted</w:t>
+        <w:rPr>
+          <w:iCs/>
+          <w:i/>
+        </w:rPr>
+        <w:t xml:space="preserve">Design theory for a class of artifacts that organizations are adopting without one.</w:t>
+      </w:r>
+      <w:r>
+        <w:t xml:space="preserve"> </w:t>
+      </w:r>
+      <w:r>
+        <w:t xml:space="preserve">Propositions 1 and 2 define a design constraint and a calibration mechanism for persona-conditioned generative systems, and the evidence is consistent with both. Variance-to-mean ratios of direct answers are at most 1.00 in 42 of 48 cells, whatever the mean or the model. When a model returns the same number for every household, the dispersion parameter takes the value</w:t>
       </w:r>
       <w:r>
         <w:t xml:space="preserve"> </w:t>
       </w:r>
       <m:oMath>
         <m:r>
-          <m:t>α</m:t>
+          <m:rPr>
+            <m:sty m:val="p"/>
+          </m:rPr>
+          <m:t>−</m:t>
+        </m:r>
+        <m:r>
+          <m:t>1</m:t>
+        </m:r>
+        <m:r>
+          <m:rPr>
+            <m:sty m:val="p"/>
+          </m:rPr>
+          <m:t>/</m:t>
+        </m:r>
+        <m:r>
+          <m:t>μ</m:t>
         </m:r>
       </m:oMath>
       <w:r>
         <w:t xml:space="preserve"> </w:t>
       </w:r>
       <w:r>
-        <w:t xml:space="preserve">of about -0.12. Proposition 2 clarifies what an external heterogeneity term can and cannot do: it restores dispersion, but only the within-persona part, and its accuracy then rests on the model’s mean. A further result concerns model scale. Larger and more recent models (Sonnet 5, GPT-5.6-terra, DeepSeek-V4-Pro, Gemini 3.1 Flash-Lite, Mistral Large 4) do not escape the collapse of direct answers, and none of them supplies a reliably accurate mean for the hybrid design: the mean matched in 13 of 48 cells, and the cells in which all four statistics matched were scattered across models and prompts. This reframes the usual advice to</w:t>
+        <w:t xml:space="preserve">that Proposition 1 predicts (about -0.12 in the demographic experiment). Persona enrichment cannot repair this, because the demographics explain about 1% of the heterogeneity. And the design that follows Proposition 2, in which the model supplies a level and an external layer supplies the spread, restores the concentration of purchases among heavy buyers in 39 of 48 cells where direct and daily designs lose it entirely (Section 5.7). Larger and more recent models (Sonnet 5, GPT-5.6-terra, DeepSeek-V4-Pro, Gemini 3.1 Flash-Lite, Mistral Large 4) do not escape the constraint. This reframes the usual advice to</w:t>
       </w:r>
       <w:r>
         <w:t xml:space="preserve"> </w:t>
@@ -14820,7 +15006,7 @@
         <w:t xml:space="preserve"> </w:t>
       </w:r>
       <w:r>
-        <w:t xml:space="preserve">to synthetic respondents. The amount of noise is not a free parameter; it is determined by how much heterogeneity the persona already carries.</w:t>
+        <w:t xml:space="preserve">to synthetic respondents: the amount of noise is not a free parameter, and it is determined by how much heterogeneity the persona already carries.</w:t>
       </w:r>
     </w:p>
     <w:p>
@@ -14828,7 +15014,95 @@
         <w:pStyle w:val="BodyText"/>
       </w:pPr>
       <w:r>
-        <w:t xml:space="preserve">Two further results extend what is known about LLM-based simulation. First, describing a distribution (Jang et al. 2026, Zhang et al. 2025a) helps more at a high mean than at a low mean, and in the settings where zeros are common it under-produces them. The zero share is the part of a count distribution that decides how many customers a campaign is not reaching, and this is where description fails. Second, evaluating a promotion simulator on relative effects alone is hazardous. The relation</w:t>
+        <w:rPr>
+          <w:iCs/>
+          <w:i/>
+        </w:rPr>
+        <w:t xml:space="preserve">Why the problem is managerial.</w:t>
+      </w:r>
+      <w:r>
+        <w:t xml:space="preserve"> </w:t>
+      </w:r>
+      <w:r>
+        <w:t xml:space="preserve">The constraint has organizational consequences that a purely statistical reading would miss (Section 3.8). The system’s quality is bounded by the firm’s data assets and not by the capability of the model, and in our data the model contributed little heterogeneity of its own (squared coefficients of variation of its rates of 0.00 to 0.75 against dispersion parameters of 0.71 to 3.05) and nothing that identified which customers buy more (rank correlations with real counts between -0.11 and +0.08). Calibrating the model’s level to the historical mean repaired the mean in 44 of 48 cells, but a baseline that gave every customer the historical mean did as well or better on the joint fit (Section 5.8). The value of the generative component therefore has to be demonstrated against the firm’s own data, and the means to demonstrate it, real data on the same properties, are what the system was meant to economize. This is the validation paradox. The failure is also silent, since fluent output and the right sign of a promotion effect give the user no signal, and it is exposed to change in components that the firm does not control.</w:t>
+      </w:r>
+    </w:p>
+    <w:p>
+      <w:pPr>
+        <w:pStyle w:val="BodyText"/>
+      </w:pPr>
+      <w:r>
+        <w:rPr>
+          <w:iCs/>
+          <w:i/>
+        </w:rPr>
+        <w:t xml:space="preserve">The limits of AI-based decision support and of the</w:t>
+      </w:r>
+      <w:r>
+        <w:rPr>
+          <w:iCs/>
+          <w:i/>
+        </w:rPr>
+        <w:t xml:space="preserve"> </w:t>
+      </w:r>
+      <w:r>
+        <w:rPr>
+          <w:iCs/>
+          <w:i/>
+        </w:rPr>
+        <w:t xml:space="preserve">“</w:t>
+      </w:r>
+      <w:r>
+        <w:rPr>
+          <w:iCs/>
+          <w:i/>
+        </w:rPr>
+        <w:t xml:space="preserve">digital twin</w:t>
+      </w:r>
+      <w:r>
+        <w:rPr>
+          <w:iCs/>
+          <w:i/>
+        </w:rPr>
+        <w:t xml:space="preserve">”</w:t>
+      </w:r>
+      <w:r>
+        <w:rPr>
+          <w:iCs/>
+          <w:i/>
+        </w:rPr>
+        <w:t xml:space="preserve"> </w:t>
+      </w:r>
+      <w:r>
+        <w:rPr>
+          <w:iCs/>
+          <w:i/>
+        </w:rPr>
+        <w:t xml:space="preserve">idea.</w:t>
+      </w:r>
+      <w:r>
+        <w:t xml:space="preserve"> </w:t>
+      </w:r>
+      <w:r>
+        <w:t xml:space="preserve">A twin is usually understood as a replica that can stand in for the original in a decision. Our evidence supports a narrower reading. At the level of the individual customer, the demographic personas carried almost no information about real counts, so a customer-level replica is not supported by these data. At the level of the population, the distribution of counts and the size of effects are reproduced only by designs in which the dispersion is supplied from outside the model and the level is checked against data. The claim that a simulated population is a twin of a real one is therefore a claim about specific properties, and it has to be tested property by property: the share of zeros, the spread, the concentration among heavy buyers, and the absolute size of an effect. Evaluation should be stated in terms of the decision-relevant properties of the artifact’s output, because fluency and aggregate plausibility, which are what users see, do not indicate them.</w:t>
+      </w:r>
+    </w:p>
+    <w:p>
+      <w:pPr>
+        <w:pStyle w:val="BodyText"/>
+      </w:pPr>
+      <w:r>
+        <w:rPr>
+          <w:iCs/>
+          <w:i/>
+        </w:rPr>
+        <w:t xml:space="preserve">Supporting evidence for marketing analytics.</w:t>
+      </w:r>
+      <w:r>
+        <w:t xml:space="preserve"> </w:t>
+      </w:r>
+      <w:r>
+        <w:t xml:space="preserve">Two further results extend what is known about LLM-based simulation. Describing a distribution (Jang et al. 2026, Zhang et al. 2025a) helps more at a high mean than at a low mean, and in the settings where zeros are common it under-produces them, which matters because the zero share decides how many customers a campaign does not reach. And evaluating a promotion simulator on relative effects alone is hazardous: the relation</w:t>
       </w:r>
       <w:r>
         <w:t xml:space="preserve"> </w:t>
@@ -14884,32 +15158,6 @@
         <w:t xml:space="preserve">shows that errors in the simulated base rate and errors in the simulated lift are confounded in the risk ratio, and our data contain cases in which the two readings of the same output disagree.</w:t>
       </w:r>
     </w:p>
-    <w:p>
-      <w:pPr>
-        <w:pStyle w:val="BodyText"/>
-      </w:pPr>
-      <w:r>
-        <w:t xml:space="preserve">A further implication concerns the limits of AI-based decision support and of the</w:t>
-      </w:r>
-      <w:r>
-        <w:t xml:space="preserve"> </w:t>
-      </w:r>
-      <w:r>
-        <w:t xml:space="preserve">“</w:t>
-      </w:r>
-      <w:r>
-        <w:t xml:space="preserve">digital twin</w:t>
-      </w:r>
-      <w:r>
-        <w:t xml:space="preserve">”</w:t>
-      </w:r>
-      <w:r>
-        <w:t xml:space="preserve"> </w:t>
-      </w:r>
-      <w:r>
-        <w:t xml:space="preserve">idea. A twin is usually understood as a replica that can stand in for the original in a decision. Our evidence supports a narrower reading. At the level of the individual customer, the demographic personas carried almost no information about real counts (rank correlations between -0.17 and +0.16), so a customer-level replica is not supported by these data. At the level of the population, the distribution of counts and the size of effects are reproduced only by designs in which the dispersion is supplied from outside the model and the level is checked against data. The claim that a simulated population is a twin of a real one is therefore a claim about specific properties, and it has to be tested property by property: the share of zeros, the spread, the tail, and the absolute size of an effect. We view this as the main point for information systems research on generative AI in decision support. Evaluation should be stated in terms of the decision-relevant properties of the artifact’s output, because fluency and aggregate plausibility, which are what users see, do not indicate them.</w:t>
-      </w:r>
-    </w:p>
     <w:bookmarkEnd w:id="57"/>
     <w:bookmarkStart w:id="58" w:name="X65830c8ffcd303230289e3fa99b65d240227f6e"/>
     <w:p>
@@ -15027,13 +15275,13 @@
       </w:r>
     </w:p>
     <w:bookmarkEnd w:id="58"/>
-    <w:bookmarkStart w:id="59" w:name="implications-for-practice"/>
+    <w:bookmarkStart w:id="59" w:name="X8611a2c0935e4d980399ee647409232e58aa6f3"/>
     <w:p>
       <w:pPr>
         <w:pStyle w:val="Heading2"/>
       </w:pPr>
       <w:r>
-        <w:t xml:space="preserve">6.3 Implications for practice</w:t>
+        <w:t xml:space="preserve">6.3 Validation protocol and decision consequences</w:t>
       </w:r>
     </w:p>
     <w:p>
@@ -15041,7 +15289,7 @@
         <w:pStyle w:val="FirstParagraph"/>
       </w:pPr>
       <w:r>
-        <w:t xml:space="preserve">For managers who consider synthetic customers for decision support, the evidence suggests a short diagnostic protocol.</w:t>
+        <w:t xml:space="preserve">The artifact view implies an acceptance test that a synthetic-customer system should pass before it enters a planning process. We state it in terms of the decision-relevant properties established above.</w:t>
       </w:r>
     </w:p>
     <w:p>
@@ -15074,7 +15322,7 @@
         </m:r>
       </m:oMath>
       <w:r>
-        <w:t xml:space="preserve">, and the zero share against a historical customer file, and check them with an interval, as we do here. A ratio near or below one signals collapse.</w:t>
+        <w:t xml:space="preserve">, the zero share, and the share of purchases made by the top decile of customers against a historical customer file, and check them with an interval, as we do here. A ratio near or below one signals collapse.</w:t>
       </w:r>
     </w:p>
     <w:p>
@@ -15357,13 +15605,13 @@
       </w:r>
     </w:p>
     <w:bookmarkEnd w:id="60"/>
-    <w:bookmarkStart w:id="61" w:name="X94616b3a30dccc1fe21684587130f01609b39ab"/>
+    <w:bookmarkStart w:id="61" w:name="X09d14e7ca6d203994f1ab3b488c22ba41949633"/>
     <w:p>
       <w:pPr>
         <w:pStyle w:val="Heading2"/>
       </w:pPr>
       <w:r>
-        <w:t xml:space="preserve">6.5 Organizational implications: validating and using synthetic data in marketing analytics systems</w:t>
+        <w:t xml:space="preserve">6.5 Organizational accountability: validating and governing synthetic data in analytics systems</w:t>
       </w:r>
     </w:p>
     <w:p>
@@ -15551,7 +15799,7 @@
         <w:pStyle w:val="FirstParagraph"/>
       </w:pPr>
       <w:r>
-        <w:t xml:space="preserve">Synthetic customers built from language models do not yet reproduce the shape of real purchase-count distributions or the size of real promotion effects. Direct and day-by-day designs collapse toward a single value whether the mean is 0.5, 4.8, or 7.8, and larger, more recent models do not change this; describing a distribution repairs part of the damage but loses zeros; and a hybrid that takes only the mean from the model matches the dispersion when that mean is accurate, although a baseline that uses the historical mean alone does about as well. In a randomized email test the models usually get the sign of the effect right, but the absolute lift in purchase probability is overstated in 15 of 16 configurations and similar treatments are not told apart. Practitioners who use synthetic customers should check dispersion and zero share against their own data, rely on the model for means only, and validate absolute effects before they act on them. For the design of such systems, the evidence points to separating the level, which the model can supply, from the spread, which must come from an external calibrated source, and to evaluating the artifact against the decision it is meant to support.</w:t>
+        <w:t xml:space="preserve">A synthetic-customer system is an artifact whose quality cannot be read from its output. We showed that a persona-conditioned generative component can transmit only the customer heterogeneity that its persona describes, that the remainder has to be supplied and calibrated by a layer connected to the firm’s own data, and that this turns a familiar statistical fact into a managerial problem: the spread of simulated behavior is no longer disciplined by the firm’s data, it cannot be seen from inside the system, and it can be checked only against the real data that the system was meant to economize. The evidence from eight language models, three transaction settings, and a randomized email experiment is consistent with this account. Direct and day-by-day designs collapse toward a single value and lose the concentration of purchases among heavy buyers; a design that takes the level from the model and the spread from an external calibrated source restores concentration; calibrating the level repairs the mean, but a baseline that uses the historical mean alone does about as well, so the model supplied little that the firm’s data did not; and purchase lifts are overstated in 15 of 16 configurations, enough to turn a no-go decision into a go. For organizations the implication is a short list of duties: validate against the firm’s own data before use, with an acceptance test on shape, concentration, and absolute effects; revalidate when the model, provider, or prompt changes; keep synthetic data apart from real data; keep running randomized tests as the evidence base that calibration needs; and assign accountability for the artifact before it is used, not after the first costly outcome. Future research should study these arrangements in organizations and test whether personas that carry informative purchase histories give the generative component more to contribute.</w:t>
       </w:r>
     </w:p>
     <w:bookmarkEnd w:id="64"/>

</xml_diff>

<commit_message>
Manuscript: describe the contribution as design knowledge rather than design theory
Co-Authored-By: Claude Sonnet 5.5 <noreply@anthropic.com>
Claude-Session: https://claude.ai/code/session_01VRbK37d38KZhVAbWS4xw4x
</commit_message>
<xml_diff>
--- a/llm-count-study/ISR_manuscript_draft.docx
+++ b/llm-count-study/ISR_manuscript_draft.docx
@@ -69,7 +69,7 @@
         <w:t xml:space="preserve"> </w:t>
       </w:r>
       <w:r>
-        <w:t xml:space="preserve">of customers inside their marketing analytics systems, yet little is known about how such systems should be designed, validated, and governed. We treat the synthetic-customer simulator as an IT artifact for decision support and develop design theory for it. Two propositions state system design constraints. A persona-conditioned model that returns deterministic answers can carry only the customer heterogeneity that its persona describes (Proposition 1), and heterogeneity supplied from outside the model must be calibrated against it to avoid double counting (Proposition 2). These constraints explain why a familiar statistical result becomes a managerial problem: when behavior is generated instead of estimated, the spread of simulated behavior is no longer disciplined by the firm’s data, it cannot be detected from inside the system, and it can be checked only against the real data that the system was meant to economize. We evaluate four elicitation designs in eight language models against public transaction data (mean counts of about 0.5, 4.8, and 7.8) and a randomized email experiment, using purchase counts and promotion lifts as supporting evidence. Direct and day-by-day designs collapse toward near-constant answers and lose the concentration of purchases among heavy buyers; a design that takes only the level from the model and calibrates the spread externally restores concentration; but calibrating the level adds little beyond what the historical mean alone provides, so the model supplies little that the firm’s data do not. Purchase lifts have the right sign but are overstated in 15 of 16 configurations (median about ninefold), enough to reverse a go/no-go decision. We derive five design principles, an acceptance-test protocol, and accountability arrangements for validating and governing synthetic data in analytics systems.</w:t>
+        <w:t xml:space="preserve">of customers inside their marketing analytics systems, yet little is known about how such systems should be designed, validated, and governed. We treat the synthetic-customer simulator as an IT artifact for decision support and develop design knowledge for it. Two propositions state system design constraints. A persona-conditioned model that returns deterministic answers can carry only the customer heterogeneity that its persona describes (Proposition 1), and heterogeneity supplied from outside the model must be calibrated against it to avoid double counting (Proposition 2). These constraints explain why a familiar statistical result becomes a managerial problem: when behavior is generated instead of estimated, the spread of simulated behavior is no longer disciplined by the firm’s data, it cannot be detected from inside the system, and it can be checked only against the real data that the system was meant to economize. We evaluate four elicitation designs in eight language models against public transaction data (mean counts of about 0.5, 4.8, and 7.8) and a randomized email experiment, using purchase counts and promotion lifts as supporting evidence. Direct and day-by-day designs collapse toward near-constant answers and lose the concentration of purchases among heavy buyers; a design that takes only the level from the model and calibrates the spread externally restores concentration; but calibrating the level adds little beyond what the historical mean alone provides, so the model supplies little that the firm’s data do not. Purchase lifts have the right sign but are overstated in 15 of 16 configurations (median about ninefold), enough to reverse a go/no-go decision. We derive five design principles, an acceptance-test protocol, and accountability arrangements for validating and governing synthetic data in analytics systems.</w:t>
       </w:r>
     </w:p>
     <w:p>
@@ -170,7 +170,7 @@
         <w:pStyle w:val="BodyText"/>
       </w:pPr>
       <w:r>
-        <w:t xml:space="preserve">The study makes five contributions. First, we give design theory for the artifact: two propositions that state a design constraint (a deterministic persona-conditioned component transmits only the heterogeneity its persona describes) and a calibration mechanism (the variance carried by external noise must be allocated against the model’s own variation), and a third that links the constraint to customer concentration (Propositions 1 to 3). Second, we explain why this is a managerial problem and not merely a statistical one: when behavior is generated rather than estimated, the quality of the artifact is bounded by the firm’s data assets, cannot be seen from inside the system, and depends on components that the firm does not control. Third, we provide evidence across designs, models, and settings that direct and day-by-day designs collapse, that a design which takes only the level from the model and calibrates the spread externally restores concentration, and that calibrating the level adds little beyond the historical mean. Fourth, we derive five design principles and an acceptance-test protocol for synthetic-customer systems. Fifth, we identify the organizational arrangements, covering ownership of reference data, revalidation, separation of synthetic from real data, and accountability, that follow, and we show with the randomized email experiment that the overstated promotion lifts would reverse a go/no-go decision.</w:t>
+        <w:t xml:space="preserve">The study makes five contributions. First, we give design knowledge for the artifact: two propositions that state a design constraint (a deterministic persona-conditioned component transmits only the heterogeneity its persona describes) and a calibration mechanism (the variance carried by external noise must be allocated against the model’s own variation), and a third that links the constraint to customer concentration (Propositions 1 to 3). Second, we explain why this is a managerial problem and not merely a statistical one: when behavior is generated rather than estimated, the quality of the artifact is bounded by the firm’s data assets, cannot be seen from inside the system, and depends on components that the firm does not control. Third, we provide evidence across designs, models, and settings that direct and day-by-day designs collapse, that a design which takes only the level from the model and calibrates the spread externally restores concentration, and that calibrating the level adds little beyond the historical mean. Fourth, we derive five design principles and an acceptance-test protocol for synthetic-customer systems. Fifth, we identify the organizational arrangements, covering ownership of reference data, revalidation, separation of synthetic from real data, and accountability, that follow, and we show with the randomized email experiment that the overstated promotion lifts would reverse a go/no-go decision.</w:t>
       </w:r>
     </w:p>
     <w:p>
@@ -178,7 +178,7 @@
         <w:pStyle w:val="BodyText"/>
       </w:pPr>
       <w:r>
-        <w:t xml:space="preserve">The remainder of the paper is organized as follows. Section 2 reviews the literature and states the gap. Section 3 develops the design theory and hypotheses. Section 4 describes the data, designs, and measures. Section 5 reports results, Section 6 discusses implications and limitations, and Section 7 concludes.</w:t>
+        <w:t xml:space="preserve">The remainder of the paper is organized as follows. Section 2 reviews the literature and states the gap. Section 3 develops the design knowledge and hypotheses. Section 4 describes the data, designs, and measures. Section 5 reports results, Section 6 discusses implications and limitations, and Section 7 concludes.</w:t>
       </w:r>
     </w:p>
     <w:bookmarkEnd w:id="20"/>
@@ -300,13 +300,13 @@
     </w:p>
     <w:bookmarkEnd w:id="25"/>
     <w:bookmarkEnd w:id="26"/>
-    <w:bookmarkStart w:id="35" w:name="design-theory-and-hypotheses"/>
+    <w:bookmarkStart w:id="35" w:name="design-knowledge-and-hypotheses"/>
     <w:p>
       <w:pPr>
         <w:pStyle w:val="Heading1"/>
       </w:pPr>
       <w:r>
-        <w:t xml:space="preserve">3. Design Theory and Hypotheses</w:t>
+        <w:t xml:space="preserve">3. Design Knowledge and Hypotheses</w:t>
       </w:r>
     </w:p>
     <w:p>
@@ -314,7 +314,7 @@
         <w:pStyle w:val="FirstParagraph"/>
       </w:pPr>
       <w:r>
-        <w:t xml:space="preserve">This section develops design theory for the artifact. We use the Poisson–gamma model as the formal language in which to state what a persona-conditioned generative system can and cannot carry, and we use the propositions that follow as design constraints and as a calibration mechanism for such a system, not as claims about count data. Section 3.7 sets out why we regard them as an information systems contribution.</w:t>
+        <w:t xml:space="preserve">This section develops design knowledge for the artifact. We use the Poisson–gamma model as the formal language in which to state what a persona-conditioned generative system can and cannot carry, and we use the propositions that follow as design constraints and as a calibration mechanism for such a system, not as claims about count data. Section 3.7 sets out why we regard them as an information systems contribution.</w:t>
       </w:r>
     </w:p>
     <w:bookmarkStart w:id="27" w:name="X44757cbbfc69edf67c20f029e2f98c3663af43b"/>
@@ -3624,7 +3624,7 @@
         </m:r>
       </m:oMath>
       <w:r>
-        <w:t xml:space="preserve">, that external noise restores concentration, and that richer personas cannot supply heterogeneity that the persona data do not contain. They are therefore falsifiable design theory in the sense of design science, not post hoc description.</w:t>
+        <w:t xml:space="preserve">, that external noise restores concentration, and that richer personas cannot supply heterogeneity that the persona data do not contain. They are therefore testable design knowledge in the sense of design science (Gregor and Hevner 2013), in the form of constraints and a mechanism that apply to a class of artifacts, not post hoc description.</w:t>
       </w:r>
     </w:p>
     <w:bookmarkEnd w:id="33"/>
@@ -14953,7 +14953,7 @@
           <w:iCs/>
           <w:i/>
         </w:rPr>
-        <w:t xml:space="preserve">Design theory for a class of artifacts that organizations are adopting without one.</w:t>
+        <w:t xml:space="preserve">Design knowledge for a class of artifacts that organizations are adopting without one.</w:t>
       </w:r>
       <w:r>
         <w:t xml:space="preserve"> </w:t>

</xml_diff>

<commit_message>
Manuscript: rigorous statement and proof of Proposition 3 (concentration)
Co-Authored-By: Claude Sonnet 5.5 <noreply@anthropic.com>
Claude-Session: https://claude.ai/code/session_01VRbK37d38KZhVAbWS4xw4x
</commit_message>
<xml_diff>
--- a/llm-count-study/ISR_manuscript_draft.docx
+++ b/llm-count-study/ISR_manuscript_draft.docx
@@ -3813,7 +3813,30 @@
         <w:t xml:space="preserve"> </w:t>
       </w:r>
       <w:r>
-        <w:t xml:space="preserve">Let customer rates be gamma distributed with mean</w:t>
+        <w:t xml:space="preserve">Let</w:t>
+      </w:r>
+      <w:r>
+        <w:t xml:space="preserve"> </w:t>
+      </w:r>
+      <m:oMath>
+        <m:r>
+          <m:t>Λ</m:t>
+        </m:r>
+        <m:r>
+          <m:rPr>
+            <m:sty m:val="p"/>
+          </m:rPr>
+          <m:t>≥</m:t>
+        </m:r>
+        <m:r>
+          <m:t>0</m:t>
+        </m:r>
+      </m:oMath>
+      <w:r>
+        <w:t xml:space="preserve"> </w:t>
+      </w:r>
+      <w:r>
+        <w:t xml:space="preserve">be a customer rate with mean</w:t>
       </w:r>
       <w:r>
         <w:t xml:space="preserve"> </w:t>
@@ -3836,9 +3859,50 @@
         <m:r>
           <m:t>α</m:t>
         </m:r>
+        <m:r>
+          <m:rPr>
+            <m:sty m:val="p"/>
+          </m:rPr>
+          <m:t>&gt;</m:t>
+        </m:r>
+        <m:r>
+          <m:t>0</m:t>
+        </m:r>
       </m:oMath>
       <w:r>
-        <w:t xml:space="preserve">, and let</w:t>
+        <w:t xml:space="preserve">. For</w:t>
+      </w:r>
+      <w:r>
+        <w:t xml:space="preserve"> </w:t>
+      </w:r>
+      <m:oMath>
+        <m:r>
+          <m:t>0</m:t>
+        </m:r>
+        <m:r>
+          <m:rPr>
+            <m:sty m:val="p"/>
+          </m:rPr>
+          <m:t>&lt;</m:t>
+        </m:r>
+        <m:r>
+          <m:t>q</m:t>
+        </m:r>
+        <m:r>
+          <m:rPr>
+            <m:sty m:val="p"/>
+          </m:rPr>
+          <m:t>&lt;</m:t>
+        </m:r>
+        <m:r>
+          <m:t>1</m:t>
+        </m:r>
+      </m:oMath>
+      <w:r>
+        <w:t xml:space="preserve"> </w:t>
+      </w:r>
+      <w:r>
+        <w:t xml:space="preserve">let</w:t>
       </w:r>
       <w:r>
         <w:t xml:space="preserve"> </w:t>
@@ -3856,25 +3920,143 @@
             </m:r>
           </m:sub>
         </m:sSub>
+      </m:oMath>
+      <w:r>
+        <w:t xml:space="preserve"> </w:t>
+      </w:r>
+      <w:r>
+        <w:t xml:space="preserve">be the share of all expected purchases that comes from the fraction</w:t>
+      </w:r>
+      <w:r>
+        <w:t xml:space="preserve"> </w:t>
+      </w:r>
+      <m:oMath>
+        <m:r>
+          <m:t>q</m:t>
+        </m:r>
+      </m:oMath>
+      <w:r>
+        <w:t xml:space="preserve"> </w:t>
+      </w:r>
+      <w:r>
+        <w:t xml:space="preserve">of customers with the highest rates,</w:t>
+      </w:r>
+      <w:r>
+        <w:t xml:space="preserve"> </w:t>
+      </w:r>
+      <m:oMath>
+        <m:sSub>
+          <m:e>
+            <m:r>
+              <m:t>S</m:t>
+            </m:r>
+          </m:e>
+          <m:sub>
+            <m:r>
+              <m:t>q</m:t>
+            </m:r>
+          </m:sub>
+        </m:sSub>
+        <m:r>
+          <m:rPr>
+            <m:sty m:val="p"/>
+          </m:rPr>
+          <m:t>=</m:t>
+        </m:r>
+        <m:sSub>
+          <m:e>
+            <m:r>
+              <m:rPr>
+                <m:sty m:val="p"/>
+              </m:rPr>
+              <m:t>max</m:t>
+            </m:r>
+          </m:e>
+          <m:sub>
+            <m:r>
+              <m:t>P</m:t>
+            </m:r>
+            <m:d>
+              <m:dPr>
+                <m:begChr m:val="("/>
+                <m:endChr m:val=")"/>
+                <m:sepChr m:val=""/>
+                <m:grow/>
+              </m:dPr>
+              <m:e>
+                <m:r>
+                  <m:t>A</m:t>
+                </m:r>
+              </m:e>
+            </m:d>
+            <m:r>
+              <m:rPr>
+                <m:sty m:val="p"/>
+              </m:rPr>
+              <m:t>=</m:t>
+            </m:r>
+            <m:r>
+              <m:t>q</m:t>
+            </m:r>
+          </m:sub>
+        </m:sSub>
+        <m:r>
+          <m:t>E</m:t>
+        </m:r>
         <m:d>
           <m:dPr>
-            <m:begChr m:val="("/>
-            <m:endChr m:val=")"/>
+            <m:begChr m:val="["/>
+            <m:endChr m:val="]"/>
             <m:sepChr m:val=""/>
             <m:grow/>
           </m:dPr>
           <m:e>
             <m:r>
-              <m:t>α</m:t>
+              <m:t>Λ</m:t>
             </m:r>
+            <m:sSub>
+              <m:e>
+                <m:r>
+                  <m:rPr>
+                    <m:sty m:val="b"/>
+                  </m:rPr>
+                  <m:t>1</m:t>
+                </m:r>
+              </m:e>
+              <m:sub>
+                <m:r>
+                  <m:t>A</m:t>
+                </m:r>
+              </m:sub>
+            </m:sSub>
           </m:e>
         </m:d>
+        <m:r>
+          <m:rPr>
+            <m:sty m:val="p"/>
+          </m:rPr>
+          <m:t>/</m:t>
+        </m:r>
+        <m:r>
+          <m:t>μ</m:t>
+        </m:r>
       </m:oMath>
       <w:r>
+        <w:t xml:space="preserve">, where the maximum is over events</w:t>
+      </w:r>
+      <w:r>
         <w:t xml:space="preserve"> </w:t>
       </w:r>
-      <w:r>
-        <w:t xml:space="preserve">denote the share of all expected purchases made by the fraction</w:t>
+      <m:oMath>
+        <m:r>
+          <m:t>A</m:t>
+        </m:r>
+      </m:oMath>
+      <w:r>
+        <w:t xml:space="preserve"> </w:t>
+      </w:r>
+      <w:r>
+        <w:t xml:space="preserve">of probability</w:t>
       </w:r>
       <w:r>
         <w:t xml:space="preserve"> </w:t>
@@ -3885,10 +4067,126 @@
         </m:r>
       </m:oMath>
       <w:r>
+        <w:t xml:space="preserve">.</w:t>
+      </w:r>
+    </w:p>
+    <w:p>
+      <w:pPr>
+        <w:numPr>
+          <w:ilvl w:val="0"/>
+          <w:numId w:val="1002"/>
+        </w:numPr>
+      </w:pPr>
+      <w:r>
+        <w:t xml:space="preserve">For every rate distribution,</w:t>
+      </w:r>
+      <w:r>
         <w:t xml:space="preserve"> </w:t>
       </w:r>
-      <w:r>
-        <w:t xml:space="preserve">of customers with the highest rates. With shape</w:t>
+      <m:oMath>
+        <m:r>
+          <m:t>q</m:t>
+        </m:r>
+        <m:r>
+          <m:rPr>
+            <m:sty m:val="p"/>
+          </m:rPr>
+          <m:t>≤</m:t>
+        </m:r>
+        <m:sSub>
+          <m:e>
+            <m:r>
+              <m:t>S</m:t>
+            </m:r>
+          </m:e>
+          <m:sub>
+            <m:r>
+              <m:t>q</m:t>
+            </m:r>
+          </m:sub>
+        </m:sSub>
+        <m:r>
+          <m:rPr>
+            <m:sty m:val="p"/>
+          </m:rPr>
+          <m:t>≤</m:t>
+        </m:r>
+        <m:r>
+          <m:t>q</m:t>
+        </m:r>
+        <m:r>
+          <m:rPr>
+            <m:sty m:val="p"/>
+          </m:rPr>
+          <m:t>+</m:t>
+        </m:r>
+        <m:rad>
+          <m:radPr>
+            <m:degHide m:val="on"/>
+          </m:radPr>
+          <m:deg/>
+          <m:e>
+            <m:r>
+              <m:t>α</m:t>
+            </m:r>
+            <m:r>
+              <m:t> </m:t>
+            </m:r>
+            <m:r>
+              <m:t>q</m:t>
+            </m:r>
+            <m:d>
+              <m:dPr>
+                <m:begChr m:val="("/>
+                <m:endChr m:val=")"/>
+                <m:sepChr m:val=""/>
+                <m:grow/>
+              </m:dPr>
+              <m:e>
+                <m:r>
+                  <m:t>1</m:t>
+                </m:r>
+                <m:r>
+                  <m:rPr>
+                    <m:sty m:val="p"/>
+                  </m:rPr>
+                  <m:t>−</m:t>
+                </m:r>
+                <m:r>
+                  <m:t>q</m:t>
+                </m:r>
+              </m:e>
+            </m:d>
+          </m:e>
+        </m:rad>
+      </m:oMath>
+      <w:r>
+        <w:t xml:space="preserve">.</w:t>
+      </w:r>
+    </w:p>
+    <w:p>
+      <w:pPr>
+        <w:numPr>
+          <w:ilvl w:val="0"/>
+          <w:numId w:val="1002"/>
+        </w:numPr>
+      </w:pPr>
+      <w:r>
+        <w:t xml:space="preserve">If</w:t>
+      </w:r>
+      <w:r>
+        <w:t xml:space="preserve"> </w:t>
+      </w:r>
+      <m:oMath>
+        <m:r>
+          <m:t>Λ</m:t>
+        </m:r>
+      </m:oMath>
+      <w:r>
+        <w:t xml:space="preserve"> </w:t>
+      </w:r>
+      <w:r>
+        <w:t xml:space="preserve">is gamma distributed with shape</w:t>
       </w:r>
       <w:r>
         <w:t xml:space="preserve"> </w:t>
@@ -3917,7 +4215,7 @@
         </m:r>
       </m:oMath>
       <w:r>
-        <w:t xml:space="preserve">,</w:t>
+        <w:t xml:space="preserve">, then</w:t>
       </w:r>
       <w:r>
         <w:t xml:space="preserve"> </w:t>
@@ -3984,6 +4282,9 @@
             </m:r>
           </m:sub>
         </m:sSub>
+        <m:r>
+          <m:t>​</m:t>
+        </m:r>
         <m:d>
           <m:dPr>
             <m:begChr m:val="("/>
@@ -4064,7 +4365,7 @@
         <w:t xml:space="preserve"> </w:t>
       </w:r>
       <w:r>
-        <w:t xml:space="preserve">is the gamma distribution function with shape</w:t>
+        <w:t xml:space="preserve">is the distribution function of a gamma variable with shape</w:t>
       </w:r>
       <w:r>
         <w:t xml:space="preserve"> </w:t>
@@ -4080,156 +4381,16 @@
       <w:r>
         <w:t xml:space="preserve">and unit scale.</w:t>
       </w:r>
-      <w:r>
-        <w:t xml:space="preserve"> </w:t>
-      </w:r>
-      <m:oMath>
-        <m:sSub>
-          <m:e>
-            <m:r>
-              <m:t>S</m:t>
-            </m:r>
-          </m:e>
-          <m:sub>
-            <m:r>
-              <m:t>q</m:t>
-            </m:r>
-          </m:sub>
-        </m:sSub>
-      </m:oMath>
-      <w:r>
-        <w:t xml:space="preserve"> </w:t>
-      </w:r>
-      <w:r>
-        <w:t xml:space="preserve">increases in</w:t>
-      </w:r>
-      <w:r>
-        <w:t xml:space="preserve"> </w:t>
-      </w:r>
-      <m:oMath>
-        <m:r>
-          <m:t>α</m:t>
-        </m:r>
-      </m:oMath>
-      <w:r>
-        <w:t xml:space="preserve"> </w:t>
-      </w:r>
-      <w:r>
-        <w:t xml:space="preserve">and tends to</w:t>
-      </w:r>
-      <w:r>
-        <w:t xml:space="preserve"> </w:t>
-      </w:r>
-      <m:oMath>
-        <m:r>
-          <m:t>q</m:t>
-        </m:r>
-      </m:oMath>
-      <w:r>
-        <w:t xml:space="preserve"> </w:t>
-      </w:r>
-      <w:r>
-        <w:t xml:space="preserve">as</w:t>
-      </w:r>
-      <w:r>
-        <w:t xml:space="preserve"> </w:t>
-      </w:r>
-      <m:oMath>
-        <m:r>
-          <m:t>α</m:t>
-        </m:r>
-        <m:r>
-          <m:rPr>
-            <m:sty m:val="p"/>
-          </m:rPr>
-          <m:t>→</m:t>
-        </m:r>
-        <m:r>
-          <m:t>0</m:t>
-        </m:r>
-      </m:oMath>
-      <w:r>
-        <w:t xml:space="preserve">. A deterministic persona-conditioned simulator has</w:t>
-      </w:r>
-      <w:r>
-        <w:t xml:space="preserve"> </w:t>
-      </w:r>
-      <m:oMath>
-        <m:sSup>
-          <m:e>
-            <m:r>
-              <m:t>α</m:t>
-            </m:r>
-          </m:e>
-          <m:sup>
-            <m:r>
-              <m:rPr>
-                <m:sty m:val="p"/>
-              </m:rPr>
-              <m:t>*</m:t>
-            </m:r>
-          </m:sup>
-        </m:sSup>
-        <m:r>
-          <m:rPr>
-            <m:sty m:val="p"/>
-          </m:rPr>
-          <m:t>=</m:t>
-        </m:r>
-        <m:sSup>
-          <m:e>
-            <m:r>
-              <m:t>c</m:t>
-            </m:r>
-          </m:e>
-          <m:sup>
-            <m:r>
-              <m:t>2</m:t>
-            </m:r>
-          </m:sup>
-        </m:sSup>
-        <m:r>
-          <m:rPr>
-            <m:sty m:val="p"/>
-          </m:rPr>
-          <m:t>−</m:t>
-        </m:r>
-        <m:r>
-          <m:t>1</m:t>
-        </m:r>
-        <m:r>
-          <m:rPr>
-            <m:sty m:val="p"/>
-          </m:rPr>
-          <m:t>/</m:t>
-        </m:r>
-        <m:r>
-          <m:t>μ</m:t>
-        </m:r>
-        <m:r>
-          <m:rPr>
-            <m:sty m:val="p"/>
-          </m:rPr>
-          <m:t>&lt;</m:t>
-        </m:r>
-        <m:sSup>
-          <m:e>
-            <m:r>
-              <m:t>c</m:t>
-            </m:r>
-          </m:e>
-          <m:sup>
-            <m:r>
-              <m:t>2</m:t>
-            </m:r>
-          </m:sup>
-        </m:sSup>
-      </m:oMath>
-      <w:r>
-        <w:t xml:space="preserve"> </w:t>
-      </w:r>
-      <w:r>
-        <w:t xml:space="preserve">(Proposition 1), so the concentration it can represent is at most</w:t>
+    </w:p>
+    <w:p>
+      <w:pPr>
+        <w:numPr>
+          <w:ilvl w:val="0"/>
+          <w:numId w:val="1002"/>
+        </w:numPr>
+      </w:pPr>
+      <w:r>
+        <w:t xml:space="preserve">Among gamma distributions,</w:t>
       </w:r>
       <w:r>
         <w:t xml:space="preserve"> </w:t>
@@ -4255,6 +4416,184 @@
             <m:grow/>
           </m:dPr>
           <m:e>
+            <m:r>
+              <m:t>α</m:t>
+            </m:r>
+          </m:e>
+        </m:d>
+      </m:oMath>
+      <w:r>
+        <w:t xml:space="preserve"> </w:t>
+      </w:r>
+      <w:r>
+        <w:t xml:space="preserve">is strictly increasing in</w:t>
+      </w:r>
+      <w:r>
+        <w:t xml:space="preserve"> </w:t>
+      </w:r>
+      <m:oMath>
+        <m:r>
+          <m:t>α</m:t>
+        </m:r>
+      </m:oMath>
+      <w:r>
+        <w:t xml:space="preserve">, and</w:t>
+      </w:r>
+      <w:r>
+        <w:t xml:space="preserve"> </w:t>
+      </w:r>
+      <m:oMath>
+        <m:sSub>
+          <m:e>
+            <m:r>
+              <m:t>S</m:t>
+            </m:r>
+          </m:e>
+          <m:sub>
+            <m:r>
+              <m:t>q</m:t>
+            </m:r>
+          </m:sub>
+        </m:sSub>
+        <m:d>
+          <m:dPr>
+            <m:begChr m:val="("/>
+            <m:endChr m:val=")"/>
+            <m:sepChr m:val=""/>
+            <m:grow/>
+          </m:dPr>
+          <m:e>
+            <m:r>
+              <m:t>α</m:t>
+            </m:r>
+          </m:e>
+        </m:d>
+        <m:r>
+          <m:rPr>
+            <m:sty m:val="p"/>
+          </m:rPr>
+          <m:t>→</m:t>
+        </m:r>
+        <m:r>
+          <m:t>q</m:t>
+        </m:r>
+      </m:oMath>
+      <w:r>
+        <w:t xml:space="preserve"> </w:t>
+      </w:r>
+      <w:r>
+        <w:t xml:space="preserve">as</w:t>
+      </w:r>
+      <w:r>
+        <w:t xml:space="preserve"> </w:t>
+      </w:r>
+      <m:oMath>
+        <m:r>
+          <m:t>α</m:t>
+        </m:r>
+        <m:r>
+          <m:rPr>
+            <m:sty m:val="p"/>
+          </m:rPr>
+          <m:t>→</m:t>
+        </m:r>
+        <m:r>
+          <m:t>0</m:t>
+        </m:r>
+      </m:oMath>
+      <w:r>
+        <w:t xml:space="preserve">.</w:t>
+      </w:r>
+    </w:p>
+    <w:p>
+      <w:pPr>
+        <w:numPr>
+          <w:ilvl w:val="0"/>
+          <w:numId w:val="1002"/>
+        </w:numPr>
+      </w:pPr>
+      <w:r>
+        <w:t xml:space="preserve">The simulated count</w:t>
+      </w:r>
+      <w:r>
+        <w:t xml:space="preserve"> </w:t>
+      </w:r>
+      <m:oMath>
+        <m:sSup>
+          <m:e>
+            <m:r>
+              <m:t>N</m:t>
+            </m:r>
+          </m:e>
+          <m:sup>
+            <m:r>
+              <m:rPr>
+                <m:sty m:val="p"/>
+              </m:rPr>
+              <m:t>*</m:t>
+            </m:r>
+          </m:sup>
+        </m:sSup>
+      </m:oMath>
+      <w:r>
+        <w:t xml:space="preserve"> </w:t>
+      </w:r>
+      <w:r>
+        <w:t xml:space="preserve">of a deterministic persona-conditioned simulator (Proposition 1) has squared coefficient of variation</w:t>
+      </w:r>
+      <w:r>
+        <w:t xml:space="preserve"> </w:t>
+      </w:r>
+      <m:oMath>
+        <m:sSup>
+          <m:e>
+            <m:r>
+              <m:t>c</m:t>
+            </m:r>
+          </m:e>
+          <m:sup>
+            <m:r>
+              <m:t>2</m:t>
+            </m:r>
+          </m:sup>
+        </m:sSup>
+      </m:oMath>
+      <w:r>
+        <w:t xml:space="preserve">. The share of simulated purchases made by the fraction</w:t>
+      </w:r>
+      <w:r>
+        <w:t xml:space="preserve"> </w:t>
+      </w:r>
+      <m:oMath>
+        <m:r>
+          <m:t>q</m:t>
+        </m:r>
+      </m:oMath>
+      <w:r>
+        <w:t xml:space="preserve"> </w:t>
+      </w:r>
+      <w:r>
+        <w:t xml:space="preserve">of customers with the highest counts is therefore at most</w:t>
+      </w:r>
+      <w:r>
+        <w:t xml:space="preserve"> </w:t>
+      </w:r>
+      <m:oMath>
+        <m:r>
+          <m:t>q</m:t>
+        </m:r>
+        <m:r>
+          <m:rPr>
+            <m:sty m:val="p"/>
+          </m:rPr>
+          <m:t>+</m:t>
+        </m:r>
+        <m:rad>
+          <m:radPr>
+            <m:degHide m:val="on"/>
+          </m:radPr>
+          <m:deg/>
+          <m:e>
             <m:sSup>
               <m:e>
                 <m:r>
@@ -4267,8 +4606,33 @@
                 </m:r>
               </m:sup>
             </m:sSup>
+            <m:r>
+              <m:t>q</m:t>
+            </m:r>
+            <m:d>
+              <m:dPr>
+                <m:begChr m:val="("/>
+                <m:endChr m:val=")"/>
+                <m:sepChr m:val=""/>
+                <m:grow/>
+              </m:dPr>
+              <m:e>
+                <m:r>
+                  <m:t>1</m:t>
+                </m:r>
+                <m:r>
+                  <m:rPr>
+                    <m:sty m:val="p"/>
+                  </m:rPr>
+                  <m:t>−</m:t>
+                </m:r>
+                <m:r>
+                  <m:t>q</m:t>
+                </m:r>
+              </m:e>
+            </m:d>
           </m:e>
-        </m:d>
+        </m:rad>
       </m:oMath>
       <w:r>
         <w:t xml:space="preserve">.</w:t>
@@ -4276,7 +4640,7 @@
     </w:p>
     <w:p>
       <w:pPr>
-        <w:pStyle w:val="BodyText"/>
+        <w:pStyle w:val="FirstParagraph"/>
       </w:pPr>
       <w:r>
         <w:rPr>
@@ -4289,54 +4653,502 @@
         <w:t xml:space="preserve"> </w:t>
       </w:r>
       <w:r>
-        <w:t xml:space="preserve">The expected purchases contributed by customers with rate above</w:t>
+        <w:t xml:space="preserve">(a) Let</w:t>
       </w:r>
       <w:r>
         <w:t xml:space="preserve"> </w:t>
       </w:r>
       <m:oMath>
         <m:r>
-          <m:t>x</m:t>
+          <m:t>A</m:t>
         </m:r>
       </m:oMath>
       <w:r>
         <w:t xml:space="preserve"> </w:t>
       </w:r>
       <w:r>
-        <w:t xml:space="preserve">are proportional to</w:t>
+        <w:t xml:space="preserve">be any event with</w:t>
       </w:r>
       <w:r>
         <w:t xml:space="preserve"> </w:t>
       </w:r>
       <m:oMath>
-        <m:nary>
-          <m:naryPr>
-            <m:chr m:val="∫"/>
-            <m:limLoc m:val="subSup"/>
-            <m:subHide m:val="off"/>
-            <m:supHide m:val="off"/>
-          </m:naryPr>
-          <m:sub>
+        <m:r>
+          <m:t>P</m:t>
+        </m:r>
+        <m:d>
+          <m:dPr>
+            <m:begChr m:val="("/>
+            <m:endChr m:val=")"/>
+            <m:sepChr m:val=""/>
+            <m:grow/>
+          </m:dPr>
+          <m:e>
             <m:r>
-              <m:t>x</m:t>
+              <m:t>A</m:t>
             </m:r>
-          </m:sub>
-          <m:sup>
+          </m:e>
+        </m:d>
+        <m:r>
+          <m:rPr>
+            <m:sty m:val="p"/>
+          </m:rPr>
+          <m:t>=</m:t>
+        </m:r>
+        <m:r>
+          <m:t>q</m:t>
+        </m:r>
+      </m:oMath>
+      <w:r>
+        <w:t xml:space="preserve">. Then</w:t>
+      </w:r>
+      <w:r>
+        <w:t xml:space="preserve"> </w:t>
+      </w:r>
+      <m:oMath>
+        <m:r>
+          <m:t>E</m:t>
+        </m:r>
+        <m:d>
+          <m:dPr>
+            <m:begChr m:val="["/>
+            <m:endChr m:val="]"/>
+            <m:sepChr m:val=""/>
+            <m:grow/>
+          </m:dPr>
+          <m:e>
+            <m:r>
+              <m:t>Λ</m:t>
+            </m:r>
+            <m:sSub>
+              <m:e>
+                <m:r>
+                  <m:rPr>
+                    <m:sty m:val="b"/>
+                  </m:rPr>
+                  <m:t>1</m:t>
+                </m:r>
+              </m:e>
+              <m:sub>
+                <m:r>
+                  <m:t>A</m:t>
+                </m:r>
+              </m:sub>
+            </m:sSub>
+          </m:e>
+        </m:d>
+        <m:r>
+          <m:rPr>
+            <m:sty m:val="p"/>
+          </m:rPr>
+          <m:t>=</m:t>
+        </m:r>
+        <m:r>
+          <m:t>μ</m:t>
+        </m:r>
+        <m:r>
+          <m:t>q</m:t>
+        </m:r>
+        <m:r>
+          <m:rPr>
+            <m:sty m:val="p"/>
+          </m:rPr>
+          <m:t>+</m:t>
+        </m:r>
+        <m:r>
+          <m:rPr>
+            <m:nor/>
+            <m:sty m:val="p"/>
+          </m:rPr>
+          <m:t>Cov</m:t>
+        </m:r>
+        <m:d>
+          <m:dPr>
+            <m:begChr m:val="("/>
+            <m:endChr m:val=")"/>
+            <m:sepChr m:val=""/>
+            <m:grow/>
+          </m:dPr>
+          <m:e>
+            <m:r>
+              <m:t>Λ</m:t>
+            </m:r>
             <m:r>
               <m:rPr>
                 <m:sty m:val="p"/>
               </m:rPr>
-              <m:t>∞</m:t>
+              <m:t>,</m:t>
             </m:r>
-          </m:sup>
+            <m:sSub>
+              <m:e>
+                <m:r>
+                  <m:rPr>
+                    <m:sty m:val="b"/>
+                  </m:rPr>
+                  <m:t>1</m:t>
+                </m:r>
+              </m:e>
+              <m:sub>
+                <m:r>
+                  <m:t>A</m:t>
+                </m:r>
+              </m:sub>
+            </m:sSub>
+          </m:e>
+        </m:d>
+      </m:oMath>
+      <w:r>
+        <w:t xml:space="preserve">, and the Cauchy–Schwarz inequality gives</w:t>
+      </w:r>
+      <w:r>
+        <w:t xml:space="preserve"> </w:t>
+      </w:r>
+      <m:oMath>
+        <m:r>
+          <m:rPr>
+            <m:nor/>
+            <m:sty m:val="p"/>
+          </m:rPr>
+          <m:t>Cov</m:t>
+        </m:r>
+        <m:d>
+          <m:dPr>
+            <m:begChr m:val="("/>
+            <m:endChr m:val=")"/>
+            <m:sepChr m:val=""/>
+            <m:grow/>
+          </m:dPr>
           <m:e>
             <m:r>
-              <m:t>λ</m:t>
+              <m:t>Λ</m:t>
+            </m:r>
+            <m:r>
+              <m:rPr>
+                <m:sty m:val="p"/>
+              </m:rPr>
+              <m:t>,</m:t>
+            </m:r>
+            <m:sSub>
+              <m:e>
+                <m:r>
+                  <m:rPr>
+                    <m:sty m:val="b"/>
+                  </m:rPr>
+                  <m:t>1</m:t>
+                </m:r>
+              </m:e>
+              <m:sub>
+                <m:r>
+                  <m:t>A</m:t>
+                </m:r>
+              </m:sub>
+            </m:sSub>
+          </m:e>
+        </m:d>
+        <m:r>
+          <m:rPr>
+            <m:sty m:val="p"/>
+          </m:rPr>
+          <m:t>≤</m:t>
+        </m:r>
+        <m:rad>
+          <m:radPr>
+            <m:degHide m:val="on"/>
+          </m:radPr>
+          <m:deg/>
+          <m:e>
+            <m:r>
+              <m:rPr>
+                <m:nor/>
+                <m:sty m:val="p"/>
+              </m:rPr>
+              <m:t>Var</m:t>
+            </m:r>
+            <m:d>
+              <m:dPr>
+                <m:begChr m:val="("/>
+                <m:endChr m:val=")"/>
+                <m:sepChr m:val=""/>
+                <m:grow/>
+              </m:dPr>
+              <m:e>
+                <m:r>
+                  <m:t>Λ</m:t>
+                </m:r>
+              </m:e>
+            </m:d>
+          </m:e>
+        </m:rad>
+        <m:rad>
+          <m:radPr>
+            <m:degHide m:val="on"/>
+          </m:radPr>
+          <m:deg/>
+          <m:e>
+            <m:r>
+              <m:t>q</m:t>
+            </m:r>
+            <m:d>
+              <m:dPr>
+                <m:begChr m:val="("/>
+                <m:endChr m:val=")"/>
+                <m:sepChr m:val=""/>
+                <m:grow/>
+              </m:dPr>
+              <m:e>
+                <m:r>
+                  <m:t>1</m:t>
+                </m:r>
+                <m:r>
+                  <m:rPr>
+                    <m:sty m:val="p"/>
+                  </m:rPr>
+                  <m:t>−</m:t>
+                </m:r>
+                <m:r>
+                  <m:t>q</m:t>
+                </m:r>
+              </m:e>
+            </m:d>
+          </m:e>
+        </m:rad>
+        <m:r>
+          <m:rPr>
+            <m:sty m:val="p"/>
+          </m:rPr>
+          <m:t>=</m:t>
+        </m:r>
+        <m:r>
+          <m:t>μ</m:t>
+        </m:r>
+        <m:rad>
+          <m:radPr>
+            <m:degHide m:val="on"/>
+          </m:radPr>
+          <m:deg/>
+          <m:e>
+            <m:r>
+              <m:t>α</m:t>
+            </m:r>
+            <m:r>
+              <m:t>q</m:t>
+            </m:r>
+            <m:d>
+              <m:dPr>
+                <m:begChr m:val="("/>
+                <m:endChr m:val=")"/>
+                <m:sepChr m:val=""/>
+                <m:grow/>
+              </m:dPr>
+              <m:e>
+                <m:r>
+                  <m:t>1</m:t>
+                </m:r>
+                <m:r>
+                  <m:rPr>
+                    <m:sty m:val="p"/>
+                  </m:rPr>
+                  <m:t>−</m:t>
+                </m:r>
+                <m:r>
+                  <m:t>q</m:t>
+                </m:r>
+              </m:e>
+            </m:d>
+          </m:e>
+        </m:rad>
+      </m:oMath>
+      <w:r>
+        <w:t xml:space="preserve">. This bounds</w:t>
+      </w:r>
+      <w:r>
+        <w:t xml:space="preserve"> </w:t>
+      </w:r>
+      <m:oMath>
+        <m:sSub>
+          <m:e>
+            <m:r>
+              <m:t>S</m:t>
             </m:r>
           </m:e>
-        </m:nary>
+          <m:sub>
+            <m:r>
+              <m:t>q</m:t>
+            </m:r>
+          </m:sub>
+        </m:sSub>
+      </m:oMath>
+      <w:r>
+        <w:t xml:space="preserve"> </w:t>
+      </w:r>
+      <w:r>
+        <w:t xml:space="preserve">from above. For the lower bound take an event that is independent of</w:t>
+      </w:r>
+      <w:r>
+        <w:t xml:space="preserve"> </w:t>
+      </w:r>
+      <m:oMath>
         <m:r>
-          <m:t> </m:t>
+          <m:t>Λ</m:t>
+        </m:r>
+      </m:oMath>
+      <w:r>
+        <w:t xml:space="preserve"> </w:t>
+      </w:r>
+      <w:r>
+        <w:t xml:space="preserve">and has probability</w:t>
+      </w:r>
+      <w:r>
+        <w:t xml:space="preserve"> </w:t>
+      </w:r>
+      <m:oMath>
+        <m:r>
+          <m:t>q</m:t>
+        </m:r>
+      </m:oMath>
+      <w:r>
+        <w:t xml:space="preserve"> </w:t>
+      </w:r>
+      <w:r>
+        <w:t xml:space="preserve">(on a sufficiently rich probability space, or by assigning ties fractionally); it yields</w:t>
+      </w:r>
+      <w:r>
+        <w:t xml:space="preserve"> </w:t>
+      </w:r>
+      <m:oMath>
+        <m:r>
+          <m:t>E</m:t>
+        </m:r>
+        <m:d>
+          <m:dPr>
+            <m:begChr m:val="["/>
+            <m:endChr m:val="]"/>
+            <m:sepChr m:val=""/>
+            <m:grow/>
+          </m:dPr>
+          <m:e>
+            <m:r>
+              <m:t>Λ</m:t>
+            </m:r>
+            <m:sSub>
+              <m:e>
+                <m:r>
+                  <m:rPr>
+                    <m:sty m:val="b"/>
+                  </m:rPr>
+                  <m:t>1</m:t>
+                </m:r>
+              </m:e>
+              <m:sub>
+                <m:r>
+                  <m:t>A</m:t>
+                </m:r>
+              </m:sub>
+            </m:sSub>
+          </m:e>
+        </m:d>
+        <m:r>
+          <m:rPr>
+            <m:sty m:val="p"/>
+          </m:rPr>
+          <m:t>=</m:t>
+        </m:r>
+        <m:r>
+          <m:t>μ</m:t>
+        </m:r>
+        <m:r>
+          <m:t>q</m:t>
+        </m:r>
+      </m:oMath>
+      <w:r>
+        <w:t xml:space="preserve">.</w:t>
+      </w:r>
+    </w:p>
+    <w:p>
+      <w:pPr>
+        <w:numPr>
+          <w:ilvl w:val="0"/>
+          <w:numId w:val="1003"/>
+        </w:numPr>
+      </w:pPr>
+      <w:r>
+        <w:t xml:space="preserve">Let</w:t>
+      </w:r>
+      <w:r>
+        <w:t xml:space="preserve"> </w:t>
+      </w:r>
+      <m:oMath>
+        <m:r>
+          <m:t>Λ</m:t>
+        </m:r>
+      </m:oMath>
+      <w:r>
+        <w:t xml:space="preserve"> </w:t>
+      </w:r>
+      <w:r>
+        <w:t xml:space="preserve">have density</w:t>
+      </w:r>
+      <w:r>
+        <w:t xml:space="preserve"> </w:t>
+      </w:r>
+      <m:oMath>
+        <m:sSub>
+          <m:e>
+            <m:r>
+              <m:t>f</m:t>
+            </m:r>
+          </m:e>
+          <m:sub>
+            <m:r>
+              <m:t>k</m:t>
+            </m:r>
+            <m:r>
+              <m:rPr>
+                <m:sty m:val="p"/>
+              </m:rPr>
+              <m:t>,</m:t>
+            </m:r>
+            <m:r>
+              <m:t>θ</m:t>
+            </m:r>
+          </m:sub>
+        </m:sSub>
+      </m:oMath>
+      <w:r>
+        <w:t xml:space="preserve"> </w:t>
+      </w:r>
+      <w:r>
+        <w:t xml:space="preserve">with</w:t>
+      </w:r>
+      <w:r>
+        <w:t xml:space="preserve"> </w:t>
+      </w:r>
+      <m:oMath>
+        <m:r>
+          <m:t>μ</m:t>
+        </m:r>
+        <m:r>
+          <m:rPr>
+            <m:sty m:val="p"/>
+          </m:rPr>
+          <m:t>=</m:t>
+        </m:r>
+        <m:r>
+          <m:t>k</m:t>
+        </m:r>
+        <m:r>
+          <m:t>θ</m:t>
+        </m:r>
+      </m:oMath>
+      <w:r>
+        <w:t xml:space="preserve">. Since</w:t>
+      </w:r>
+      <w:r>
+        <w:t xml:space="preserve"> </w:t>
+      </w:r>
+      <m:oMath>
+        <m:r>
+          <m:t>λ</m:t>
         </m:r>
         <m:sSub>
           <m:e>
@@ -4347,6 +5159,15 @@
           <m:sub>
             <m:r>
               <m:t>k</m:t>
+            </m:r>
+            <m:r>
+              <m:rPr>
+                <m:sty m:val="p"/>
+              </m:rPr>
+              <m:t>,</m:t>
+            </m:r>
+            <m:r>
+              <m:t>θ</m:t>
             </m:r>
           </m:sub>
         </m:sSub>
@@ -4364,24 +5185,19 @@
           </m:e>
         </m:d>
         <m:r>
-          <m:t> </m:t>
+          <m:rPr>
+            <m:sty m:val="p"/>
+          </m:rPr>
+          <m:t>=</m:t>
         </m:r>
         <m:r>
-          <m:t>d</m:t>
+          <m:t>k</m:t>
         </m:r>
         <m:r>
-          <m:t>λ</m:t>
+          <m:t>θ</m:t>
         </m:r>
-      </m:oMath>
-      <w:r>
-        <w:t xml:space="preserve">, and</w:t>
-      </w:r>
-      <w:r>
-        <w:t xml:space="preserve"> </w:t>
-      </w:r>
-      <m:oMath>
         <m:r>
-          <m:t>λ</m:t>
+          <m:t> </m:t>
         </m:r>
         <m:sSub>
           <m:e>
@@ -4392,6 +5208,24 @@
           <m:sub>
             <m:r>
               <m:t>k</m:t>
+            </m:r>
+            <m:r>
+              <m:rPr>
+                <m:sty m:val="p"/>
+              </m:rPr>
+              <m:t>+</m:t>
+            </m:r>
+            <m:r>
+              <m:t>1</m:t>
+            </m:r>
+            <m:r>
+              <m:rPr>
+                <m:sty m:val="p"/>
+              </m:rPr>
+              <m:t>,</m:t>
+            </m:r>
+            <m:r>
+              <m:t>θ</m:t>
             </m:r>
           </m:sub>
         </m:sSub>
@@ -4410,10 +5244,169 @@
         </m:d>
       </m:oMath>
       <w:r>
+        <w:t xml:space="preserve">, we have</w:t>
+      </w:r>
+      <w:r>
         <w:t xml:space="preserve"> </w:t>
       </w:r>
-      <w:r>
-        <w:t xml:space="preserve">is proportional to the gamma density with shape</w:t>
+      <m:oMath>
+        <m:r>
+          <m:t>E</m:t>
+        </m:r>
+        <m:d>
+          <m:dPr>
+            <m:begChr m:val="["/>
+            <m:endChr m:val="]"/>
+            <m:sepChr m:val=""/>
+            <m:grow/>
+          </m:dPr>
+          <m:e>
+            <m:r>
+              <m:t>Λ</m:t>
+            </m:r>
+            <m:r>
+              <m:rPr>
+                <m:sty m:val="b"/>
+              </m:rPr>
+              <m:t>1</m:t>
+            </m:r>
+            <m:r>
+              <m:rPr>
+                <m:sty m:val="p"/>
+              </m:rPr>
+              <m:t>{</m:t>
+            </m:r>
+            <m:r>
+              <m:t>Λ</m:t>
+            </m:r>
+            <m:r>
+              <m:rPr>
+                <m:sty m:val="p"/>
+              </m:rPr>
+              <m:t>&gt;</m:t>
+            </m:r>
+            <m:r>
+              <m:t>x</m:t>
+            </m:r>
+            <m:r>
+              <m:rPr>
+                <m:sty m:val="p"/>
+              </m:rPr>
+              <m:t>}</m:t>
+            </m:r>
+          </m:e>
+        </m:d>
+        <m:r>
+          <m:rPr>
+            <m:sty m:val="p"/>
+          </m:rPr>
+          <m:t>=</m:t>
+        </m:r>
+        <m:r>
+          <m:t>μ</m:t>
+        </m:r>
+        <m:r>
+          <m:t> </m:t>
+        </m:r>
+        <m:r>
+          <m:t>P</m:t>
+        </m:r>
+        <m:d>
+          <m:dPr>
+            <m:begChr m:val="("/>
+            <m:endChr m:val=")"/>
+            <m:sepChr m:val=""/>
+            <m:grow/>
+          </m:dPr>
+          <m:e>
+            <m:sSub>
+              <m:e>
+                <m:r>
+                  <m:t>G</m:t>
+                </m:r>
+              </m:e>
+              <m:sub>
+                <m:r>
+                  <m:t>k</m:t>
+                </m:r>
+                <m:r>
+                  <m:rPr>
+                    <m:sty m:val="p"/>
+                  </m:rPr>
+                  <m:t>+</m:t>
+                </m:r>
+                <m:r>
+                  <m:t>1</m:t>
+                </m:r>
+                <m:r>
+                  <m:rPr>
+                    <m:sty m:val="p"/>
+                  </m:rPr>
+                  <m:t>,</m:t>
+                </m:r>
+                <m:r>
+                  <m:t>θ</m:t>
+                </m:r>
+              </m:sub>
+            </m:sSub>
+            <m:r>
+              <m:rPr>
+                <m:sty m:val="p"/>
+              </m:rPr>
+              <m:t>&gt;</m:t>
+            </m:r>
+            <m:r>
+              <m:t>x</m:t>
+            </m:r>
+          </m:e>
+        </m:d>
+      </m:oMath>
+      <w:r>
+        <w:t xml:space="preserve"> </w:t>
+      </w:r>
+      <w:r>
+        <w:t xml:space="preserve">for a gamma variable</w:t>
+      </w:r>
+      <w:r>
+        <w:t xml:space="preserve"> </w:t>
+      </w:r>
+      <m:oMath>
+        <m:sSub>
+          <m:e>
+            <m:r>
+              <m:t>G</m:t>
+            </m:r>
+          </m:e>
+          <m:sub>
+            <m:r>
+              <m:t>k</m:t>
+            </m:r>
+            <m:r>
+              <m:rPr>
+                <m:sty m:val="p"/>
+              </m:rPr>
+              <m:t>+</m:t>
+            </m:r>
+            <m:r>
+              <m:t>1</m:t>
+            </m:r>
+            <m:r>
+              <m:rPr>
+                <m:sty m:val="p"/>
+              </m:rPr>
+              <m:t>,</m:t>
+            </m:r>
+            <m:r>
+              <m:t>θ</m:t>
+            </m:r>
+          </m:sub>
+        </m:sSub>
+      </m:oMath>
+      <w:r>
+        <w:t xml:space="preserve"> </w:t>
+      </w:r>
+      <w:r>
+        <w:t xml:space="preserve">with shape</w:t>
       </w:r>
       <w:r>
         <w:t xml:space="preserve"> </w:t>
@@ -4433,7 +5426,395 @@
         </m:r>
       </m:oMath>
       <w:r>
-        <w:t xml:space="preserve">, which gives the stated form. Monotonicity in</w:t>
+        <w:t xml:space="preserve"> </w:t>
+      </w:r>
+      <w:r>
+        <w:t xml:space="preserve">and scale</w:t>
+      </w:r>
+      <w:r>
+        <w:t xml:space="preserve"> </w:t>
+      </w:r>
+      <m:oMath>
+        <m:r>
+          <m:t>θ</m:t>
+        </m:r>
+      </m:oMath>
+      <w:r>
+        <w:t xml:space="preserve">. The maximum in the definition of</w:t>
+      </w:r>
+      <w:r>
+        <w:t xml:space="preserve"> </w:t>
+      </w:r>
+      <m:oMath>
+        <m:sSub>
+          <m:e>
+            <m:r>
+              <m:t>S</m:t>
+            </m:r>
+          </m:e>
+          <m:sub>
+            <m:r>
+              <m:t>q</m:t>
+            </m:r>
+          </m:sub>
+        </m:sSub>
+      </m:oMath>
+      <w:r>
+        <w:t xml:space="preserve"> </w:t>
+      </w:r>
+      <w:r>
+        <w:t xml:space="preserve">is attained by the event</w:t>
+      </w:r>
+      <w:r>
+        <w:t xml:space="preserve"> </w:t>
+      </w:r>
+      <m:oMath>
+        <m:r>
+          <m:rPr>
+            <m:sty m:val="p"/>
+          </m:rPr>
+          <m:t>{</m:t>
+        </m:r>
+        <m:r>
+          <m:t>Λ</m:t>
+        </m:r>
+        <m:r>
+          <m:rPr>
+            <m:sty m:val="p"/>
+          </m:rPr>
+          <m:t>&gt;</m:t>
+        </m:r>
+        <m:sSub>
+          <m:e>
+            <m:r>
+              <m:t>x</m:t>
+            </m:r>
+          </m:e>
+          <m:sub>
+            <m:r>
+              <m:t>q</m:t>
+            </m:r>
+          </m:sub>
+        </m:sSub>
+        <m:r>
+          <m:rPr>
+            <m:sty m:val="p"/>
+          </m:rPr>
+          <m:t>}</m:t>
+        </m:r>
+      </m:oMath>
+      <w:r>
+        <w:t xml:space="preserve"> </w:t>
+      </w:r>
+      <w:r>
+        <w:t xml:space="preserve">with</w:t>
+      </w:r>
+      <w:r>
+        <w:t xml:space="preserve"> </w:t>
+      </w:r>
+      <m:oMath>
+        <m:r>
+          <m:t>P</m:t>
+        </m:r>
+        <m:d>
+          <m:dPr>
+            <m:begChr m:val="("/>
+            <m:endChr m:val=")"/>
+            <m:sepChr m:val=""/>
+            <m:grow/>
+          </m:dPr>
+          <m:e>
+            <m:r>
+              <m:t>Λ</m:t>
+            </m:r>
+            <m:r>
+              <m:rPr>
+                <m:sty m:val="p"/>
+              </m:rPr>
+              <m:t>&gt;</m:t>
+            </m:r>
+            <m:sSub>
+              <m:e>
+                <m:r>
+                  <m:t>x</m:t>
+                </m:r>
+              </m:e>
+              <m:sub>
+                <m:r>
+                  <m:t>q</m:t>
+                </m:r>
+              </m:sub>
+            </m:sSub>
+          </m:e>
+        </m:d>
+        <m:r>
+          <m:rPr>
+            <m:sty m:val="p"/>
+          </m:rPr>
+          <m:t>=</m:t>
+        </m:r>
+        <m:r>
+          <m:t>q</m:t>
+        </m:r>
+      </m:oMath>
+      <w:r>
+        <w:t xml:space="preserve">, because</w:t>
+      </w:r>
+      <w:r>
+        <w:t xml:space="preserve"> </w:t>
+      </w:r>
+      <m:oMath>
+        <m:r>
+          <m:t>E</m:t>
+        </m:r>
+        <m:d>
+          <m:dPr>
+            <m:begChr m:val="["/>
+            <m:endChr m:val="]"/>
+            <m:sepChr m:val=""/>
+            <m:grow/>
+          </m:dPr>
+          <m:e>
+            <m:r>
+              <m:t>Λ</m:t>
+            </m:r>
+            <m:sSub>
+              <m:e>
+                <m:r>
+                  <m:rPr>
+                    <m:sty m:val="b"/>
+                  </m:rPr>
+                  <m:t>1</m:t>
+                </m:r>
+              </m:e>
+              <m:sub>
+                <m:r>
+                  <m:t>A</m:t>
+                </m:r>
+              </m:sub>
+            </m:sSub>
+          </m:e>
+        </m:d>
+      </m:oMath>
+      <w:r>
+        <w:t xml:space="preserve"> </w:t>
+      </w:r>
+      <w:r>
+        <w:t xml:space="preserve">is largest when</w:t>
+      </w:r>
+      <w:r>
+        <w:t xml:space="preserve"> </w:t>
+      </w:r>
+      <m:oMath>
+        <m:r>
+          <m:t>A</m:t>
+        </m:r>
+      </m:oMath>
+      <w:r>
+        <w:t xml:space="preserve"> </w:t>
+      </w:r>
+      <w:r>
+        <w:t xml:space="preserve">collects the largest values of</w:t>
+      </w:r>
+      <w:r>
+        <w:t xml:space="preserve"> </w:t>
+      </w:r>
+      <m:oMath>
+        <m:r>
+          <m:t>Λ</m:t>
+        </m:r>
+      </m:oMath>
+      <w:r>
+        <w:t xml:space="preserve">. Hence</w:t>
+      </w:r>
+      <w:r>
+        <w:t xml:space="preserve"> </w:t>
+      </w:r>
+      <m:oMath>
+        <m:sSub>
+          <m:e>
+            <m:r>
+              <m:t>S</m:t>
+            </m:r>
+          </m:e>
+          <m:sub>
+            <m:r>
+              <m:t>q</m:t>
+            </m:r>
+          </m:sub>
+        </m:sSub>
+        <m:r>
+          <m:rPr>
+            <m:sty m:val="p"/>
+          </m:rPr>
+          <m:t>=</m:t>
+        </m:r>
+        <m:r>
+          <m:t>P</m:t>
+        </m:r>
+        <m:d>
+          <m:dPr>
+            <m:begChr m:val="("/>
+            <m:endChr m:val=")"/>
+            <m:sepChr m:val=""/>
+            <m:grow/>
+          </m:dPr>
+          <m:e>
+            <m:sSub>
+              <m:e>
+                <m:r>
+                  <m:t>G</m:t>
+                </m:r>
+              </m:e>
+              <m:sub>
+                <m:r>
+                  <m:t>k</m:t>
+                </m:r>
+                <m:r>
+                  <m:rPr>
+                    <m:sty m:val="p"/>
+                  </m:rPr>
+                  <m:t>+</m:t>
+                </m:r>
+                <m:r>
+                  <m:t>1</m:t>
+                </m:r>
+                <m:r>
+                  <m:rPr>
+                    <m:sty m:val="p"/>
+                  </m:rPr>
+                  <m:t>,</m:t>
+                </m:r>
+                <m:r>
+                  <m:t>θ</m:t>
+                </m:r>
+              </m:sub>
+            </m:sSub>
+            <m:r>
+              <m:rPr>
+                <m:sty m:val="p"/>
+              </m:rPr>
+              <m:t>&gt;</m:t>
+            </m:r>
+            <m:sSub>
+              <m:e>
+                <m:r>
+                  <m:t>x</m:t>
+                </m:r>
+              </m:e>
+              <m:sub>
+                <m:r>
+                  <m:t>q</m:t>
+                </m:r>
+              </m:sub>
+            </m:sSub>
+          </m:e>
+        </m:d>
+      </m:oMath>
+      <w:r>
+        <w:t xml:space="preserve"> </w:t>
+      </w:r>
+      <w:r>
+        <w:t xml:space="preserve">with</w:t>
+      </w:r>
+      <w:r>
+        <w:t xml:space="preserve"> </w:t>
+      </w:r>
+      <m:oMath>
+        <m:sSub>
+          <m:e>
+            <m:r>
+              <m:t>x</m:t>
+            </m:r>
+          </m:e>
+          <m:sub>
+            <m:r>
+              <m:t>q</m:t>
+            </m:r>
+          </m:sub>
+        </m:sSub>
+        <m:r>
+          <m:rPr>
+            <m:sty m:val="p"/>
+          </m:rPr>
+          <m:t>=</m:t>
+        </m:r>
+        <m:r>
+          <m:t>θ</m:t>
+        </m:r>
+        <m:sSubSup>
+          <m:e>
+            <m:r>
+              <m:t>F</m:t>
+            </m:r>
+          </m:e>
+          <m:sub>
+            <m:r>
+              <m:t>k</m:t>
+            </m:r>
+          </m:sub>
+          <m:sup>
+            <m:r>
+              <m:rPr>
+                <m:sty m:val="p"/>
+              </m:rPr>
+              <m:t>−</m:t>
+            </m:r>
+            <m:r>
+              <m:t>1</m:t>
+            </m:r>
+          </m:sup>
+        </m:sSubSup>
+        <m:d>
+          <m:dPr>
+            <m:begChr m:val="("/>
+            <m:endChr m:val=")"/>
+            <m:sepChr m:val=""/>
+            <m:grow/>
+          </m:dPr>
+          <m:e>
+            <m:r>
+              <m:t>1</m:t>
+            </m:r>
+            <m:r>
+              <m:rPr>
+                <m:sty m:val="p"/>
+              </m:rPr>
+              <m:t>−</m:t>
+            </m:r>
+            <m:r>
+              <m:t>q</m:t>
+            </m:r>
+          </m:e>
+        </m:d>
+      </m:oMath>
+      <w:r>
+        <w:t xml:space="preserve">, which is the stated expression.</w:t>
+      </w:r>
+    </w:p>
+    <w:p>
+      <w:pPr>
+        <w:numPr>
+          <w:ilvl w:val="0"/>
+          <w:numId w:val="1003"/>
+        </w:numPr>
+      </w:pPr>
+      <w:r>
+        <w:t xml:space="preserve">The limit follows from (a), because the upper bound tends to</w:t>
+      </w:r>
+      <w:r>
+        <w:t xml:space="preserve"> </w:t>
+      </w:r>
+      <m:oMath>
+        <m:r>
+          <m:t>q</m:t>
+        </m:r>
+      </m:oMath>
+      <w:r>
+        <w:t xml:space="preserve"> </w:t>
+      </w:r>
+      <w:r>
+        <w:t xml:space="preserve">as</w:t>
       </w:r>
       <w:r>
         <w:t xml:space="preserve"> </w:t>
@@ -4441,20 +5822,6 @@
       <m:oMath>
         <m:r>
           <m:t>α</m:t>
-        </m:r>
-      </m:oMath>
-      <w:r>
-        <w:t xml:space="preserve"> </w:t>
-      </w:r>
-      <w:r>
-        <w:t xml:space="preserve">follows because a gamma distribution with a smaller shape is larger in the convex (Lorenz) order, and the limit follows from the degeneracy of the rate distribution as</w:t>
-      </w:r>
-      <w:r>
-        <w:t xml:space="preserve"> </w:t>
-      </w:r>
-      <m:oMath>
-        <m:r>
-          <m:t>k</m:t>
         </m:r>
         <m:r>
           <m:rPr>
@@ -4463,14 +5830,1173 @@
           <m:t>→</m:t>
         </m:r>
         <m:r>
+          <m:t>0</m:t>
+        </m:r>
+      </m:oMath>
+      <w:r>
+        <w:t xml:space="preserve">. For monotonicity let</w:t>
+      </w:r>
+      <w:r>
+        <w:t xml:space="preserve"> </w:t>
+      </w:r>
+      <m:oMath>
+        <m:sSub>
+          <m:e>
+            <m:r>
+              <m:t>k</m:t>
+            </m:r>
+          </m:e>
+          <m:sub>
+            <m:r>
+              <m:t>1</m:t>
+            </m:r>
+          </m:sub>
+        </m:sSub>
+        <m:r>
           <m:rPr>
             <m:sty m:val="p"/>
           </m:rPr>
-          <m:t>∞</m:t>
+          <m:t>&lt;</m:t>
+        </m:r>
+        <m:sSub>
+          <m:e>
+            <m:r>
+              <m:t>k</m:t>
+            </m:r>
+          </m:e>
+          <m:sub>
+            <m:r>
+              <m:t>2</m:t>
+            </m:r>
+          </m:sub>
+        </m:sSub>
+      </m:oMath>
+      <w:r>
+        <w:t xml:space="preserve">, so that</w:t>
+      </w:r>
+      <w:r>
+        <w:t xml:space="preserve"> </w:t>
+      </w:r>
+      <m:oMath>
+        <m:sSub>
+          <m:e>
+            <m:r>
+              <m:t>α</m:t>
+            </m:r>
+          </m:e>
+          <m:sub>
+            <m:r>
+              <m:t>1</m:t>
+            </m:r>
+          </m:sub>
+        </m:sSub>
+        <m:r>
+          <m:rPr>
+            <m:sty m:val="p"/>
+          </m:rPr>
+          <m:t>&gt;</m:t>
+        </m:r>
+        <m:sSub>
+          <m:e>
+            <m:r>
+              <m:t>α</m:t>
+            </m:r>
+          </m:e>
+          <m:sub>
+            <m:r>
+              <m:t>2</m:t>
+            </m:r>
+          </m:sub>
+        </m:sSub>
+      </m:oMath>
+      <w:r>
+        <w:t xml:space="preserve">, and let</w:t>
+      </w:r>
+      <w:r>
+        <w:t xml:space="preserve"> </w:t>
+      </w:r>
+      <m:oMath>
+        <m:sSub>
+          <m:e>
+            <m:r>
+              <m:t>Y</m:t>
+            </m:r>
+          </m:e>
+          <m:sub>
+            <m:r>
+              <m:t>j</m:t>
+            </m:r>
+          </m:sub>
+        </m:sSub>
+      </m:oMath>
+      <w:r>
+        <w:t xml:space="preserve"> </w:t>
+      </w:r>
+      <w:r>
+        <w:t xml:space="preserve">be gamma variables with shape</w:t>
+      </w:r>
+      <w:r>
+        <w:t xml:space="preserve"> </w:t>
+      </w:r>
+      <m:oMath>
+        <m:sSub>
+          <m:e>
+            <m:r>
+              <m:t>k</m:t>
+            </m:r>
+          </m:e>
+          <m:sub>
+            <m:r>
+              <m:t>j</m:t>
+            </m:r>
+          </m:sub>
+        </m:sSub>
+      </m:oMath>
+      <w:r>
+        <w:t xml:space="preserve"> </w:t>
+      </w:r>
+      <w:r>
+        <w:t xml:space="preserve">and mean one. By the beta–gamma algebra, if</w:t>
+      </w:r>
+      <w:r>
+        <w:t xml:space="preserve"> </w:t>
+      </w:r>
+      <m:oMath>
+        <m:r>
+          <m:t>G</m:t>
+        </m:r>
+        <m:r>
+          <m:rPr>
+            <m:sty m:val="p"/>
+          </m:rPr>
+          <m:t>∼</m:t>
+        </m:r>
+        <m:r>
+          <m:rPr>
+            <m:nor/>
+            <m:sty m:val="p"/>
+          </m:rPr>
+          <m:t>Gamma</m:t>
+        </m:r>
+        <m:d>
+          <m:dPr>
+            <m:begChr m:val="("/>
+            <m:endChr m:val=")"/>
+            <m:sepChr m:val=""/>
+            <m:grow/>
+          </m:dPr>
+          <m:e>
+            <m:sSub>
+              <m:e>
+                <m:r>
+                  <m:t>k</m:t>
+                </m:r>
+              </m:e>
+              <m:sub>
+                <m:r>
+                  <m:t>2</m:t>
+                </m:r>
+              </m:sub>
+            </m:sSub>
+            <m:r>
+              <m:rPr>
+                <m:sty m:val="p"/>
+              </m:rPr>
+              <m:t>,</m:t>
+            </m:r>
+            <m:r>
+              <m:t>1</m:t>
+            </m:r>
+          </m:e>
+        </m:d>
+      </m:oMath>
+      <w:r>
+        <w:t xml:space="preserve"> </w:t>
+      </w:r>
+      <w:r>
+        <w:t xml:space="preserve">and</w:t>
+      </w:r>
+      <w:r>
+        <w:t xml:space="preserve"> </w:t>
+      </w:r>
+      <m:oMath>
+        <m:r>
+          <m:t>B</m:t>
+        </m:r>
+        <m:r>
+          <m:rPr>
+            <m:sty m:val="p"/>
+          </m:rPr>
+          <m:t>∼</m:t>
+        </m:r>
+        <m:r>
+          <m:rPr>
+            <m:nor/>
+            <m:sty m:val="p"/>
+          </m:rPr>
+          <m:t>Beta</m:t>
+        </m:r>
+        <m:d>
+          <m:dPr>
+            <m:begChr m:val="("/>
+            <m:endChr m:val=")"/>
+            <m:sepChr m:val=""/>
+            <m:grow/>
+          </m:dPr>
+          <m:e>
+            <m:sSub>
+              <m:e>
+                <m:r>
+                  <m:t>k</m:t>
+                </m:r>
+              </m:e>
+              <m:sub>
+                <m:r>
+                  <m:t>1</m:t>
+                </m:r>
+              </m:sub>
+            </m:sSub>
+            <m:r>
+              <m:rPr>
+                <m:sty m:val="p"/>
+              </m:rPr>
+              <m:t>,</m:t>
+            </m:r>
+            <m:sSub>
+              <m:e>
+                <m:r>
+                  <m:t>k</m:t>
+                </m:r>
+              </m:e>
+              <m:sub>
+                <m:r>
+                  <m:t>2</m:t>
+                </m:r>
+              </m:sub>
+            </m:sSub>
+            <m:r>
+              <m:rPr>
+                <m:sty m:val="p"/>
+              </m:rPr>
+              <m:t>−</m:t>
+            </m:r>
+            <m:sSub>
+              <m:e>
+                <m:r>
+                  <m:t>k</m:t>
+                </m:r>
+              </m:e>
+              <m:sub>
+                <m:r>
+                  <m:t>1</m:t>
+                </m:r>
+              </m:sub>
+            </m:sSub>
+          </m:e>
+        </m:d>
+      </m:oMath>
+      <w:r>
+        <w:t xml:space="preserve"> </w:t>
+      </w:r>
+      <w:r>
+        <w:t xml:space="preserve">are independent, then</w:t>
+      </w:r>
+      <w:r>
+        <w:t xml:space="preserve"> </w:t>
+      </w:r>
+      <m:oMath>
+        <m:r>
+          <m:t>B</m:t>
+        </m:r>
+        <m:r>
+          <m:t>G</m:t>
+        </m:r>
+        <m:r>
+          <m:rPr>
+            <m:sty m:val="p"/>
+          </m:rPr>
+          <m:t>∼</m:t>
+        </m:r>
+        <m:r>
+          <m:rPr>
+            <m:nor/>
+            <m:sty m:val="p"/>
+          </m:rPr>
+          <m:t>Gamma</m:t>
+        </m:r>
+        <m:d>
+          <m:dPr>
+            <m:begChr m:val="("/>
+            <m:endChr m:val=")"/>
+            <m:sepChr m:val=""/>
+            <m:grow/>
+          </m:dPr>
+          <m:e>
+            <m:sSub>
+              <m:e>
+                <m:r>
+                  <m:t>k</m:t>
+                </m:r>
+              </m:e>
+              <m:sub>
+                <m:r>
+                  <m:t>1</m:t>
+                </m:r>
+              </m:sub>
+            </m:sSub>
+            <m:r>
+              <m:rPr>
+                <m:sty m:val="p"/>
+              </m:rPr>
+              <m:t>,</m:t>
+            </m:r>
+            <m:r>
+              <m:t>1</m:t>
+            </m:r>
+          </m:e>
+        </m:d>
+      </m:oMath>
+      <w:r>
+        <w:t xml:space="preserve">. Hence</w:t>
+      </w:r>
+      <w:r>
+        <w:t xml:space="preserve"> </w:t>
+      </w:r>
+      <m:oMath>
+        <m:sSub>
+          <m:e>
+            <m:r>
+              <m:t>Y</m:t>
+            </m:r>
+          </m:e>
+          <m:sub>
+            <m:r>
+              <m:t>1</m:t>
+            </m:r>
+          </m:sub>
+        </m:sSub>
+      </m:oMath>
+      <w:r>
+        <w:t xml:space="preserve"> </w:t>
+      </w:r>
+      <w:r>
+        <w:t xml:space="preserve">has the distribution of</w:t>
+      </w:r>
+      <w:r>
+        <w:t xml:space="preserve"> </w:t>
+      </w:r>
+      <m:oMath>
+        <m:r>
+          <m:t>M</m:t>
+        </m:r>
+        <m:sSub>
+          <m:e>
+            <m:r>
+              <m:t>Y</m:t>
+            </m:r>
+          </m:e>
+          <m:sub>
+            <m:r>
+              <m:t>2</m:t>
+            </m:r>
+          </m:sub>
+        </m:sSub>
+      </m:oMath>
+      <w:r>
+        <w:t xml:space="preserve"> </w:t>
+      </w:r>
+      <w:r>
+        <w:t xml:space="preserve">with</w:t>
+      </w:r>
+      <w:r>
+        <w:t xml:space="preserve"> </w:t>
+      </w:r>
+      <m:oMath>
+        <m:sSub>
+          <m:e>
+            <m:r>
+              <m:t>Y</m:t>
+            </m:r>
+          </m:e>
+          <m:sub>
+            <m:r>
+              <m:t>2</m:t>
+            </m:r>
+          </m:sub>
+        </m:sSub>
+        <m:r>
+          <m:rPr>
+            <m:sty m:val="p"/>
+          </m:rPr>
+          <m:t>=</m:t>
+        </m:r>
+        <m:r>
+          <m:t>G</m:t>
+        </m:r>
+        <m:r>
+          <m:rPr>
+            <m:sty m:val="p"/>
+          </m:rPr>
+          <m:t>/</m:t>
+        </m:r>
+        <m:sSub>
+          <m:e>
+            <m:r>
+              <m:t>k</m:t>
+            </m:r>
+          </m:e>
+          <m:sub>
+            <m:r>
+              <m:t>2</m:t>
+            </m:r>
+          </m:sub>
+        </m:sSub>
+      </m:oMath>
+      <w:r>
+        <w:t xml:space="preserve"> </w:t>
+      </w:r>
+      <w:r>
+        <w:t xml:space="preserve">and</w:t>
+      </w:r>
+      <w:r>
+        <w:t xml:space="preserve"> </w:t>
+      </w:r>
+      <m:oMath>
+        <m:r>
+          <m:t>M</m:t>
+        </m:r>
+        <m:r>
+          <m:rPr>
+            <m:sty m:val="p"/>
+          </m:rPr>
+          <m:t>=</m:t>
+        </m:r>
+        <m:r>
+          <m:t>B</m:t>
+        </m:r>
+        <m:sSub>
+          <m:e>
+            <m:r>
+              <m:t>k</m:t>
+            </m:r>
+          </m:e>
+          <m:sub>
+            <m:r>
+              <m:t>2</m:t>
+            </m:r>
+          </m:sub>
+        </m:sSub>
+        <m:r>
+          <m:rPr>
+            <m:sty m:val="p"/>
+          </m:rPr>
+          <m:t>/</m:t>
+        </m:r>
+        <m:sSub>
+          <m:e>
+            <m:r>
+              <m:t>k</m:t>
+            </m:r>
+          </m:e>
+          <m:sub>
+            <m:r>
+              <m:t>1</m:t>
+            </m:r>
+          </m:sub>
+        </m:sSub>
+      </m:oMath>
+      <w:r>
+        <w:t xml:space="preserve">, where</w:t>
+      </w:r>
+      <w:r>
+        <w:t xml:space="preserve"> </w:t>
+      </w:r>
+      <m:oMath>
+        <m:r>
+          <m:t>M</m:t>
         </m:r>
       </m:oMath>
       <w:r>
-        <w:t xml:space="preserve">. The last statement applies Proposition 1.</w:t>
+        <w:t xml:space="preserve"> </w:t>
+      </w:r>
+      <w:r>
+        <w:t xml:space="preserve">is independent of</w:t>
+      </w:r>
+      <w:r>
+        <w:t xml:space="preserve"> </w:t>
+      </w:r>
+      <m:oMath>
+        <m:sSub>
+          <m:e>
+            <m:r>
+              <m:t>Y</m:t>
+            </m:r>
+          </m:e>
+          <m:sub>
+            <m:r>
+              <m:t>2</m:t>
+            </m:r>
+          </m:sub>
+        </m:sSub>
+      </m:oMath>
+      <w:r>
+        <w:t xml:space="preserve">, non-degenerate, and has</w:t>
+      </w:r>
+      <w:r>
+        <w:t xml:space="preserve"> </w:t>
+      </w:r>
+      <m:oMath>
+        <m:r>
+          <m:t>E</m:t>
+        </m:r>
+        <m:d>
+          <m:dPr>
+            <m:begChr m:val="["/>
+            <m:endChr m:val="]"/>
+            <m:sepChr m:val=""/>
+            <m:grow/>
+          </m:dPr>
+          <m:e>
+            <m:r>
+              <m:t>M</m:t>
+            </m:r>
+          </m:e>
+        </m:d>
+        <m:r>
+          <m:rPr>
+            <m:sty m:val="p"/>
+          </m:rPr>
+          <m:t>=</m:t>
+        </m:r>
+        <m:r>
+          <m:t>1</m:t>
+        </m:r>
+      </m:oMath>
+      <w:r>
+        <w:t xml:space="preserve">. Let</w:t>
+      </w:r>
+      <w:r>
+        <w:t xml:space="preserve"> </w:t>
+      </w:r>
+      <m:oMath>
+        <m:sSup>
+          <m:e>
+            <m:r>
+              <m:t>A</m:t>
+            </m:r>
+          </m:e>
+          <m:sup>
+            <m:r>
+              <m:rPr>
+                <m:sty m:val="p"/>
+              </m:rPr>
+              <m:t>*</m:t>
+            </m:r>
+          </m:sup>
+        </m:sSup>
+        <m:r>
+          <m:rPr>
+            <m:sty m:val="p"/>
+          </m:rPr>
+          <m:t>=</m:t>
+        </m:r>
+        <m:r>
+          <m:rPr>
+            <m:sty m:val="p"/>
+          </m:rPr>
+          <m:t>{</m:t>
+        </m:r>
+        <m:sSub>
+          <m:e>
+            <m:r>
+              <m:t>Y</m:t>
+            </m:r>
+          </m:e>
+          <m:sub>
+            <m:r>
+              <m:t>2</m:t>
+            </m:r>
+          </m:sub>
+        </m:sSub>
+        <m:r>
+          <m:rPr>
+            <m:sty m:val="p"/>
+          </m:rPr>
+          <m:t>&gt;</m:t>
+        </m:r>
+        <m:sSup>
+          <m:e>
+            <m:r>
+              <m:t>x</m:t>
+            </m:r>
+          </m:e>
+          <m:sup>
+            <m:r>
+              <m:rPr>
+                <m:sty m:val="p"/>
+              </m:rPr>
+              <m:t>*</m:t>
+            </m:r>
+          </m:sup>
+        </m:sSup>
+        <m:r>
+          <m:rPr>
+            <m:sty m:val="p"/>
+          </m:rPr>
+          <m:t>}</m:t>
+        </m:r>
+      </m:oMath>
+      <w:r>
+        <w:t xml:space="preserve"> </w:t>
+      </w:r>
+      <w:r>
+        <w:t xml:space="preserve">be the event with probability</w:t>
+      </w:r>
+      <w:r>
+        <w:t xml:space="preserve"> </w:t>
+      </w:r>
+      <m:oMath>
+        <m:r>
+          <m:t>q</m:t>
+        </m:r>
+      </m:oMath>
+      <w:r>
+        <w:t xml:space="preserve"> </w:t>
+      </w:r>
+      <w:r>
+        <w:t xml:space="preserve">that attains</w:t>
+      </w:r>
+      <w:r>
+        <w:t xml:space="preserve"> </w:t>
+      </w:r>
+      <m:oMath>
+        <m:sSub>
+          <m:e>
+            <m:r>
+              <m:t>S</m:t>
+            </m:r>
+          </m:e>
+          <m:sub>
+            <m:r>
+              <m:t>q</m:t>
+            </m:r>
+          </m:sub>
+        </m:sSub>
+      </m:oMath>
+      <w:r>
+        <w:t xml:space="preserve"> </w:t>
+      </w:r>
+      <w:r>
+        <w:t xml:space="preserve">for</w:t>
+      </w:r>
+      <w:r>
+        <w:t xml:space="preserve"> </w:t>
+      </w:r>
+      <m:oMath>
+        <m:sSub>
+          <m:e>
+            <m:r>
+              <m:t>Y</m:t>
+            </m:r>
+          </m:e>
+          <m:sub>
+            <m:r>
+              <m:t>2</m:t>
+            </m:r>
+          </m:sub>
+        </m:sSub>
+      </m:oMath>
+      <w:r>
+        <w:t xml:space="preserve">. Then</w:t>
+      </w:r>
+      <w:r>
+        <w:t xml:space="preserve"> </w:t>
+      </w:r>
+      <m:oMath>
+        <m:sSub>
+          <m:e>
+            <m:r>
+              <m:t>S</m:t>
+            </m:r>
+          </m:e>
+          <m:sub>
+            <m:r>
+              <m:t>q</m:t>
+            </m:r>
+          </m:sub>
+        </m:sSub>
+        <m:d>
+          <m:dPr>
+            <m:begChr m:val="("/>
+            <m:endChr m:val=")"/>
+            <m:sepChr m:val=""/>
+            <m:grow/>
+          </m:dPr>
+          <m:e>
+            <m:sSub>
+              <m:e>
+                <m:r>
+                  <m:t>α</m:t>
+                </m:r>
+              </m:e>
+              <m:sub>
+                <m:r>
+                  <m:t>1</m:t>
+                </m:r>
+              </m:sub>
+            </m:sSub>
+          </m:e>
+        </m:d>
+        <m:r>
+          <m:rPr>
+            <m:sty m:val="p"/>
+          </m:rPr>
+          <m:t>≥</m:t>
+        </m:r>
+        <m:r>
+          <m:t>E</m:t>
+        </m:r>
+        <m:d>
+          <m:dPr>
+            <m:begChr m:val="["/>
+            <m:endChr m:val="]"/>
+            <m:sepChr m:val=""/>
+            <m:grow/>
+          </m:dPr>
+          <m:e>
+            <m:r>
+              <m:t>M</m:t>
+            </m:r>
+            <m:sSub>
+              <m:e>
+                <m:r>
+                  <m:t>Y</m:t>
+                </m:r>
+              </m:e>
+              <m:sub>
+                <m:r>
+                  <m:t>2</m:t>
+                </m:r>
+              </m:sub>
+            </m:sSub>
+            <m:sSub>
+              <m:e>
+                <m:r>
+                  <m:rPr>
+                    <m:sty m:val="b"/>
+                  </m:rPr>
+                  <m:t>1</m:t>
+                </m:r>
+              </m:e>
+              <m:sub>
+                <m:sSup>
+                  <m:e>
+                    <m:r>
+                      <m:t>A</m:t>
+                    </m:r>
+                  </m:e>
+                  <m:sup>
+                    <m:r>
+                      <m:rPr>
+                        <m:sty m:val="p"/>
+                      </m:rPr>
+                      <m:t>*</m:t>
+                    </m:r>
+                  </m:sup>
+                </m:sSup>
+              </m:sub>
+            </m:sSub>
+          </m:e>
+        </m:d>
+        <m:r>
+          <m:rPr>
+            <m:sty m:val="p"/>
+          </m:rPr>
+          <m:t>=</m:t>
+        </m:r>
+        <m:r>
+          <m:t>E</m:t>
+        </m:r>
+        <m:d>
+          <m:dPr>
+            <m:begChr m:val="["/>
+            <m:endChr m:val="]"/>
+            <m:sepChr m:val=""/>
+            <m:grow/>
+          </m:dPr>
+          <m:e>
+            <m:r>
+              <m:t>M</m:t>
+            </m:r>
+          </m:e>
+        </m:d>
+        <m:r>
+          <m:t> </m:t>
+        </m:r>
+        <m:r>
+          <m:t>E</m:t>
+        </m:r>
+        <m:d>
+          <m:dPr>
+            <m:begChr m:val="["/>
+            <m:endChr m:val="]"/>
+            <m:sepChr m:val=""/>
+            <m:grow/>
+          </m:dPr>
+          <m:e>
+            <m:sSub>
+              <m:e>
+                <m:r>
+                  <m:t>Y</m:t>
+                </m:r>
+              </m:e>
+              <m:sub>
+                <m:r>
+                  <m:t>2</m:t>
+                </m:r>
+              </m:sub>
+            </m:sSub>
+            <m:sSub>
+              <m:e>
+                <m:r>
+                  <m:rPr>
+                    <m:sty m:val="b"/>
+                  </m:rPr>
+                  <m:t>1</m:t>
+                </m:r>
+              </m:e>
+              <m:sub>
+                <m:sSup>
+                  <m:e>
+                    <m:r>
+                      <m:t>A</m:t>
+                    </m:r>
+                  </m:e>
+                  <m:sup>
+                    <m:r>
+                      <m:rPr>
+                        <m:sty m:val="p"/>
+                      </m:rPr>
+                      <m:t>*</m:t>
+                    </m:r>
+                  </m:sup>
+                </m:sSup>
+              </m:sub>
+            </m:sSub>
+          </m:e>
+        </m:d>
+        <m:r>
+          <m:rPr>
+            <m:sty m:val="p"/>
+          </m:rPr>
+          <m:t>=</m:t>
+        </m:r>
+        <m:sSub>
+          <m:e>
+            <m:r>
+              <m:t>S</m:t>
+            </m:r>
+          </m:e>
+          <m:sub>
+            <m:r>
+              <m:t>q</m:t>
+            </m:r>
+          </m:sub>
+        </m:sSub>
+        <m:d>
+          <m:dPr>
+            <m:begChr m:val="("/>
+            <m:endChr m:val=")"/>
+            <m:sepChr m:val=""/>
+            <m:grow/>
+          </m:dPr>
+          <m:e>
+            <m:sSub>
+              <m:e>
+                <m:r>
+                  <m:t>α</m:t>
+                </m:r>
+              </m:e>
+              <m:sub>
+                <m:r>
+                  <m:t>2</m:t>
+                </m:r>
+              </m:sub>
+            </m:sSub>
+          </m:e>
+        </m:d>
+      </m:oMath>
+      <w:r>
+        <w:t xml:space="preserve">. The inequality is strict, because the maximizing event for</w:t>
+      </w:r>
+      <w:r>
+        <w:t xml:space="preserve"> </w:t>
+      </w:r>
+      <m:oMath>
+        <m:r>
+          <m:t>M</m:t>
+        </m:r>
+        <m:sSub>
+          <m:e>
+            <m:r>
+              <m:t>Y</m:t>
+            </m:r>
+          </m:e>
+          <m:sub>
+            <m:r>
+              <m:t>2</m:t>
+            </m:r>
+          </m:sub>
+        </m:sSub>
+      </m:oMath>
+      <w:r>
+        <w:t xml:space="preserve"> </w:t>
+      </w:r>
+      <w:r>
+        <w:t xml:space="preserve">is</w:t>
+      </w:r>
+      <w:r>
+        <w:t xml:space="preserve"> </w:t>
+      </w:r>
+      <m:oMath>
+        <m:r>
+          <m:rPr>
+            <m:sty m:val="p"/>
+          </m:rPr>
+          <m:t>{</m:t>
+        </m:r>
+        <m:r>
+          <m:t>M</m:t>
+        </m:r>
+        <m:sSub>
+          <m:e>
+            <m:r>
+              <m:t>Y</m:t>
+            </m:r>
+          </m:e>
+          <m:sub>
+            <m:r>
+              <m:t>2</m:t>
+            </m:r>
+          </m:sub>
+        </m:sSub>
+        <m:r>
+          <m:rPr>
+            <m:sty m:val="p"/>
+          </m:rPr>
+          <m:t>&gt;</m:t>
+        </m:r>
+        <m:sSup>
+          <m:e>
+            <m:r>
+              <m:t>y</m:t>
+            </m:r>
+          </m:e>
+          <m:sup>
+            <m:r>
+              <m:rPr>
+                <m:sty m:val="p"/>
+              </m:rPr>
+              <m:t>*</m:t>
+            </m:r>
+          </m:sup>
+        </m:sSup>
+        <m:r>
+          <m:rPr>
+            <m:sty m:val="p"/>
+          </m:rPr>
+          <m:t>}</m:t>
+        </m:r>
+      </m:oMath>
+      <w:r>
+        <w:t xml:space="preserve">, which differs from</w:t>
+      </w:r>
+      <w:r>
+        <w:t xml:space="preserve"> </w:t>
+      </w:r>
+      <m:oMath>
+        <m:sSup>
+          <m:e>
+            <m:r>
+              <m:t>A</m:t>
+            </m:r>
+          </m:e>
+          <m:sup>
+            <m:r>
+              <m:rPr>
+                <m:sty m:val="p"/>
+              </m:rPr>
+              <m:t>*</m:t>
+            </m:r>
+          </m:sup>
+        </m:sSup>
+      </m:oMath>
+      <w:r>
+        <w:t xml:space="preserve"> </w:t>
+      </w:r>
+      <w:r>
+        <w:t xml:space="preserve">with positive probability when</w:t>
+      </w:r>
+      <w:r>
+        <w:t xml:space="preserve"> </w:t>
+      </w:r>
+      <m:oMath>
+        <m:r>
+          <m:t>M</m:t>
+        </m:r>
+      </m:oMath>
+      <w:r>
+        <w:t xml:space="preserve"> </w:t>
+      </w:r>
+      <w:r>
+        <w:t xml:space="preserve">is non-degenerate, and the maximizing event is unique up to null sets.</w:t>
+      </w:r>
+    </w:p>
+    <w:p>
+      <w:pPr>
+        <w:numPr>
+          <w:ilvl w:val="0"/>
+          <w:numId w:val="1003"/>
+        </w:numPr>
+      </w:pPr>
+      <w:r>
+        <w:t xml:space="preserve">The argument of (a) uses only the mean and the variance of the nonnegative variable and holds for any event of probability</w:t>
+      </w:r>
+      <w:r>
+        <w:t xml:space="preserve"> </w:t>
+      </w:r>
+      <m:oMath>
+        <m:r>
+          <m:t>q</m:t>
+        </m:r>
+      </m:oMath>
+      <w:r>
+        <w:t xml:space="preserve">, including events defined by ranking customers on their counts (ties are broken arbitrarily). For a deterministic simulator</w:t>
+      </w:r>
+      <w:r>
+        <w:t xml:space="preserve"> </w:t>
+      </w:r>
+      <m:oMath>
+        <m:r>
+          <m:rPr>
+            <m:nor/>
+            <m:sty m:val="p"/>
+          </m:rPr>
+          <m:t>Var</m:t>
+        </m:r>
+        <m:d>
+          <m:dPr>
+            <m:begChr m:val="("/>
+            <m:endChr m:val=")"/>
+            <m:sepChr m:val=""/>
+            <m:grow/>
+          </m:dPr>
+          <m:e>
+            <m:sSup>
+              <m:e>
+                <m:r>
+                  <m:t>N</m:t>
+                </m:r>
+              </m:e>
+              <m:sup>
+                <m:r>
+                  <m:rPr>
+                    <m:sty m:val="p"/>
+                  </m:rPr>
+                  <m:t>*</m:t>
+                </m:r>
+              </m:sup>
+            </m:sSup>
+          </m:e>
+        </m:d>
+        <m:r>
+          <m:rPr>
+            <m:sty m:val="p"/>
+          </m:rPr>
+          <m:t>=</m:t>
+        </m:r>
+        <m:r>
+          <m:rPr>
+            <m:nor/>
+            <m:sty m:val="p"/>
+          </m:rPr>
+          <m:t>Var</m:t>
+        </m:r>
+        <m:d>
+          <m:dPr>
+            <m:begChr m:val="("/>
+            <m:endChr m:val=")"/>
+            <m:sepChr m:val=""/>
+            <m:grow/>
+          </m:dPr>
+          <m:e>
+            <m:r>
+              <m:t>m</m:t>
+            </m:r>
+            <m:d>
+              <m:dPr>
+                <m:begChr m:val="("/>
+                <m:endChr m:val=")"/>
+                <m:sepChr m:val=""/>
+                <m:grow/>
+              </m:dPr>
+              <m:e>
+                <m:r>
+                  <m:t>X</m:t>
+                </m:r>
+              </m:e>
+            </m:d>
+          </m:e>
+        </m:d>
+      </m:oMath>
+      <w:r>
+        <w:t xml:space="preserve">, so the squared coefficient of variation of</w:t>
+      </w:r>
+      <w:r>
+        <w:t xml:space="preserve"> </w:t>
+      </w:r>
+      <m:oMath>
+        <m:sSup>
+          <m:e>
+            <m:r>
+              <m:t>N</m:t>
+            </m:r>
+          </m:e>
+          <m:sup>
+            <m:r>
+              <m:rPr>
+                <m:sty m:val="p"/>
+              </m:rPr>
+              <m:t>*</m:t>
+            </m:r>
+          </m:sup>
+        </m:sSup>
+      </m:oMath>
+      <w:r>
+        <w:t xml:space="preserve"> </w:t>
+      </w:r>
+      <w:r>
+        <w:t xml:space="preserve">is</w:t>
+      </w:r>
+      <w:r>
+        <w:t xml:space="preserve"> </w:t>
+      </w:r>
+      <m:oMath>
+        <m:sSup>
+          <m:e>
+            <m:r>
+              <m:t>c</m:t>
+            </m:r>
+          </m:e>
+          <m:sup>
+            <m:r>
+              <m:t>2</m:t>
+            </m:r>
+          </m:sup>
+        </m:sSup>
+      </m:oMath>
+      <w:r>
+        <w:t xml:space="preserve">.</w:t>
       </w:r>
       <w:r>
         <w:t xml:space="preserve"> </w:t>
@@ -4486,10 +7012,10 @@
     </w:p>
     <w:p>
       <w:pPr>
-        <w:pStyle w:val="BodyText"/>
+        <w:pStyle w:val="FirstParagraph"/>
       </w:pPr>
       <w:r>
-        <w:t xml:space="preserve">For the three reference settings, with</w:t>
+        <w:t xml:space="preserve">For the three reference settings with</w:t>
       </w:r>
       <w:r>
         <w:t xml:space="preserve"> </w:t>
@@ -4509,7 +7035,7 @@
         </m:r>
       </m:oMath>
       <w:r>
-        <w:t xml:space="preserve">, the top tenth of customers account for 52% of expected purchases when</w:t>
+        <w:t xml:space="preserve">, part (b) gives shares of expected purchases of 52% for the top tenth of customers when</w:t>
       </w:r>
       <w:r>
         <w:t xml:space="preserve"> </w:t>
@@ -4578,7 +7104,7 @@
         <w:t xml:space="preserve"> </w:t>
       </w:r>
       <w:r>
-        <w:t xml:space="preserve">(demographic households), against 10% for a population without heterogeneity. A simulator that carries only the persona-described heterogeneity of the demographic experiment (</w:t>
+        <w:t xml:space="preserve">(demographic households), against 10% for a population without heterogeneity. The shares of observed counts are somewhat higher in the low-mean setting (65%, 39%, and 30%) because counts are discrete and zeros are common. A simulator that carries only the persona-described heterogeneity of the demographic experiment (</w:t>
       </w:r>
       <m:oMath>
         <m:sSup>
@@ -4604,7 +7130,7 @@
         </m:r>
       </m:oMath>
       <w:r>
-        <w:t xml:space="preserve">) represents a share of 11%. Decisions that depend on concentration, such as how deeply to target a promotion, how to set loyalty tiers, or how to size a budget ceiling for heavy buyers, are therefore biased in a known direction when the spread is lost. The direction of the bias, not only its size, is predictable, which is what makes the problem manageable by design.</w:t>
+        <w:t xml:space="preserve">) can represent a share of at most 12% by part (d), and 11% if its rates were gamma distributed. Decisions that depend on concentration, such as how deeply to target a promotion, how to set loyalty tiers, or how to size a budget ceiling for heavy buyers, are therefore biased in a known direction when the spread is lost. The direction of the bias, and an upper bound on what a given simulator can represent, are known in advance, which is what makes the problem manageable by design.</w:t>
       </w:r>
     </w:p>
     <w:bookmarkEnd w:id="34"/>
@@ -15296,7 +17822,7 @@
       <w:pPr>
         <w:numPr>
           <w:ilvl w:val="0"/>
-          <w:numId w:val="1002"/>
+          <w:numId w:val="1004"/>
         </w:numPr>
         <w:pStyle w:val="Compact"/>
       </w:pPr>
@@ -15329,7 +17855,7 @@
       <w:pPr>
         <w:numPr>
           <w:ilvl w:val="0"/>
-          <w:numId w:val="1002"/>
+          <w:numId w:val="1004"/>
         </w:numPr>
         <w:pStyle w:val="Compact"/>
       </w:pPr>
@@ -15351,7 +17877,7 @@
       <w:pPr>
         <w:numPr>
           <w:ilvl w:val="0"/>
-          <w:numId w:val="1002"/>
+          <w:numId w:val="1004"/>
         </w:numPr>
         <w:pStyle w:val="Compact"/>
       </w:pPr>
@@ -15373,7 +17899,7 @@
       <w:pPr>
         <w:numPr>
           <w:ilvl w:val="0"/>
-          <w:numId w:val="1002"/>
+          <w:numId w:val="1004"/>
         </w:numPr>
         <w:pStyle w:val="Compact"/>
       </w:pPr>
@@ -15395,7 +17921,7 @@
       <w:pPr>
         <w:numPr>
           <w:ilvl w:val="0"/>
-          <w:numId w:val="1002"/>
+          <w:numId w:val="1004"/>
         </w:numPr>
         <w:pStyle w:val="Compact"/>
       </w:pPr>
@@ -42132,6 +44658,176 @@
       </w:pPr>
     </w:lvl>
   </w:abstractNum>
+  <w:abstractNum w:abstractNumId="99731">
+    <w:nsid w:val="A99731"/>
+    <w:multiLevelType w:val="multilevel"/>
+    <w:lvl w:ilvl="0">
+      <w:start w:val="1"/>
+      <w:numFmt w:val="lowerLetter"/>
+      <w:lvlText w:val="(%1)"/>
+      <w:lvlJc w:val="left"/>
+      <w:pPr>
+        <w:ind w:left="720" w:hanging="480"/>
+      </w:pPr>
+    </w:lvl>
+    <w:lvl w:ilvl="1">
+      <w:start w:val="1"/>
+      <w:numFmt w:val="lowerLetter"/>
+      <w:lvlText w:val="(%2)"/>
+      <w:lvlJc w:val="left"/>
+      <w:pPr>
+        <w:ind w:left="1440" w:hanging="480"/>
+      </w:pPr>
+    </w:lvl>
+    <w:lvl w:ilvl="2">
+      <w:start w:val="1"/>
+      <w:numFmt w:val="lowerLetter"/>
+      <w:lvlText w:val="(%3)"/>
+      <w:lvlJc w:val="left"/>
+      <w:pPr>
+        <w:ind w:left="2160" w:hanging="480"/>
+      </w:pPr>
+    </w:lvl>
+    <w:lvl w:ilvl="3">
+      <w:start w:val="1"/>
+      <w:numFmt w:val="lowerLetter"/>
+      <w:lvlText w:val="(%4)"/>
+      <w:lvlJc w:val="left"/>
+      <w:pPr>
+        <w:ind w:left="2880" w:hanging="480"/>
+      </w:pPr>
+    </w:lvl>
+    <w:lvl w:ilvl="4">
+      <w:start w:val="1"/>
+      <w:numFmt w:val="lowerLetter"/>
+      <w:lvlText w:val="(%5)"/>
+      <w:lvlJc w:val="left"/>
+      <w:pPr>
+        <w:ind w:left="3600" w:hanging="480"/>
+      </w:pPr>
+    </w:lvl>
+    <w:lvl w:ilvl="5">
+      <w:start w:val="1"/>
+      <w:numFmt w:val="lowerLetter"/>
+      <w:lvlText w:val="(%6)"/>
+      <w:lvlJc w:val="left"/>
+      <w:pPr>
+        <w:ind w:left="4320" w:hanging="480"/>
+      </w:pPr>
+    </w:lvl>
+    <w:lvl w:ilvl="6">
+      <w:start w:val="1"/>
+      <w:numFmt w:val="lowerLetter"/>
+      <w:lvlText w:val="(%7)"/>
+      <w:lvlJc w:val="left"/>
+      <w:pPr>
+        <w:ind w:left="5040" w:hanging="480"/>
+      </w:pPr>
+    </w:lvl>
+    <w:lvl w:ilvl="7">
+      <w:start w:val="1"/>
+      <w:numFmt w:val="lowerLetter"/>
+      <w:lvlText w:val="(%8)"/>
+      <w:lvlJc w:val="left"/>
+      <w:pPr>
+        <w:ind w:left="5760" w:hanging="480"/>
+      </w:pPr>
+    </w:lvl>
+    <w:lvl w:ilvl="8">
+      <w:start w:val="1"/>
+      <w:numFmt w:val="lowerLetter"/>
+      <w:lvlText w:val="(%9)"/>
+      <w:lvlJc w:val="left"/>
+      <w:pPr>
+        <w:ind w:left="6480" w:hanging="480"/>
+      </w:pPr>
+    </w:lvl>
+  </w:abstractNum>
+  <w:abstractNum w:abstractNumId="99732">
+    <w:nsid w:val="A99732"/>
+    <w:multiLevelType w:val="multilevel"/>
+    <w:lvl w:ilvl="0">
+      <w:start w:val="2"/>
+      <w:numFmt w:val="lowerLetter"/>
+      <w:lvlText w:val="(%1)"/>
+      <w:lvlJc w:val="left"/>
+      <w:pPr>
+        <w:ind w:left="720" w:hanging="480"/>
+      </w:pPr>
+    </w:lvl>
+    <w:lvl w:ilvl="1">
+      <w:start w:val="2"/>
+      <w:numFmt w:val="lowerLetter"/>
+      <w:lvlText w:val="(%2)"/>
+      <w:lvlJc w:val="left"/>
+      <w:pPr>
+        <w:ind w:left="1440" w:hanging="480"/>
+      </w:pPr>
+    </w:lvl>
+    <w:lvl w:ilvl="2">
+      <w:start w:val="2"/>
+      <w:numFmt w:val="lowerLetter"/>
+      <w:lvlText w:val="(%3)"/>
+      <w:lvlJc w:val="left"/>
+      <w:pPr>
+        <w:ind w:left="2160" w:hanging="480"/>
+      </w:pPr>
+    </w:lvl>
+    <w:lvl w:ilvl="3">
+      <w:start w:val="2"/>
+      <w:numFmt w:val="lowerLetter"/>
+      <w:lvlText w:val="(%4)"/>
+      <w:lvlJc w:val="left"/>
+      <w:pPr>
+        <w:ind w:left="2880" w:hanging="480"/>
+      </w:pPr>
+    </w:lvl>
+    <w:lvl w:ilvl="4">
+      <w:start w:val="2"/>
+      <w:numFmt w:val="lowerLetter"/>
+      <w:lvlText w:val="(%5)"/>
+      <w:lvlJc w:val="left"/>
+      <w:pPr>
+        <w:ind w:left="3600" w:hanging="480"/>
+      </w:pPr>
+    </w:lvl>
+    <w:lvl w:ilvl="5">
+      <w:start w:val="2"/>
+      <w:numFmt w:val="lowerLetter"/>
+      <w:lvlText w:val="(%6)"/>
+      <w:lvlJc w:val="left"/>
+      <w:pPr>
+        <w:ind w:left="4320" w:hanging="480"/>
+      </w:pPr>
+    </w:lvl>
+    <w:lvl w:ilvl="6">
+      <w:start w:val="2"/>
+      <w:numFmt w:val="lowerLetter"/>
+      <w:lvlText w:val="(%7)"/>
+      <w:lvlJc w:val="left"/>
+      <w:pPr>
+        <w:ind w:left="5040" w:hanging="480"/>
+      </w:pPr>
+    </w:lvl>
+    <w:lvl w:ilvl="7">
+      <w:start w:val="2"/>
+      <w:numFmt w:val="lowerLetter"/>
+      <w:lvlText w:val="(%8)"/>
+      <w:lvlJc w:val="left"/>
+      <w:pPr>
+        <w:ind w:left="5760" w:hanging="480"/>
+      </w:pPr>
+    </w:lvl>
+    <w:lvl w:ilvl="8">
+      <w:start w:val="2"/>
+      <w:numFmt w:val="lowerLetter"/>
+      <w:lvlText w:val="(%9)"/>
+      <w:lvlJc w:val="left"/>
+      <w:pPr>
+        <w:ind w:left="6480" w:hanging="480"/>
+      </w:pPr>
+    </w:lvl>
+  </w:abstractNum>
   <w:abstractNum w:abstractNumId="99411">
     <w:nsid w:val="A99411"/>
     <w:multiLevelType w:val="multilevel"/>
@@ -42224,6 +44920,66 @@
     <w:abstractNumId w:val="991"/>
   </w:num>
   <w:num w:numId="1002">
+    <w:abstractNumId w:val="99731"/>
+    <w:lvlOverride w:ilvl="0">
+      <w:startOverride w:val="1"/>
+    </w:lvlOverride>
+    <w:lvlOverride w:ilvl="1">
+      <w:startOverride w:val="1"/>
+    </w:lvlOverride>
+    <w:lvlOverride w:ilvl="2">
+      <w:startOverride w:val="1"/>
+    </w:lvlOverride>
+    <w:lvlOverride w:ilvl="3">
+      <w:startOverride w:val="1"/>
+    </w:lvlOverride>
+    <w:lvlOverride w:ilvl="4">
+      <w:startOverride w:val="1"/>
+    </w:lvlOverride>
+    <w:lvlOverride w:ilvl="5">
+      <w:startOverride w:val="1"/>
+    </w:lvlOverride>
+    <w:lvlOverride w:ilvl="6">
+      <w:startOverride w:val="1"/>
+    </w:lvlOverride>
+    <w:lvlOverride w:ilvl="7">
+      <w:startOverride w:val="1"/>
+    </w:lvlOverride>
+    <w:lvlOverride w:ilvl="8">
+      <w:startOverride w:val="1"/>
+    </w:lvlOverride>
+  </w:num>
+  <w:num w:numId="1003">
+    <w:abstractNumId w:val="99732"/>
+    <w:lvlOverride w:ilvl="0">
+      <w:startOverride w:val="2"/>
+    </w:lvlOverride>
+    <w:lvlOverride w:ilvl="1">
+      <w:startOverride w:val="2"/>
+    </w:lvlOverride>
+    <w:lvlOverride w:ilvl="2">
+      <w:startOverride w:val="2"/>
+    </w:lvlOverride>
+    <w:lvlOverride w:ilvl="3">
+      <w:startOverride w:val="2"/>
+    </w:lvlOverride>
+    <w:lvlOverride w:ilvl="4">
+      <w:startOverride w:val="2"/>
+    </w:lvlOverride>
+    <w:lvlOverride w:ilvl="5">
+      <w:startOverride w:val="2"/>
+    </w:lvlOverride>
+    <w:lvlOverride w:ilvl="6">
+      <w:startOverride w:val="2"/>
+    </w:lvlOverride>
+    <w:lvlOverride w:ilvl="7">
+      <w:startOverride w:val="2"/>
+    </w:lvlOverride>
+    <w:lvlOverride w:ilvl="8">
+      <w:startOverride w:val="2"/>
+    </w:lvlOverride>
+  </w:num>
+  <w:num w:numId="1004">
     <w:abstractNumId w:val="99411"/>
     <w:lvlOverride w:ilvl="0">
       <w:startOverride w:val="1"/>

</xml_diff>

<commit_message>
Manuscript: merge sections 3.7-3.8, tighten Sections 5.5-5.6 and the introduction; anonymize repository link; add page numbers; reduce keywords
Co-Authored-By: Claude Sonnet 5.5 <noreply@anthropic.com>
Claude-Session: https://claude.ai/code/session_01VRbK37d38KZhVAbWS4xw4x
</commit_message>
<xml_diff>
--- a/llm-count-study/ISR_manuscript_draft.docx
+++ b/llm-count-study/ISR_manuscript_draft.docx
@@ -87,7 +87,7 @@
         <w:t xml:space="preserve"> </w:t>
       </w:r>
       <w:r>
-        <w:t xml:space="preserve">IT artifact, decision support systems, design science, generative AI, digital twins, synthetic customers, validation, calibration, organizational accountability, marketing analytics</w:t>
+        <w:t xml:space="preserve">IT artifact, decision support systems, design science, generative AI, synthetic customers, organizational accountability</w:t>
       </w:r>
     </w:p>
     <w:bookmarkStart w:id="20" w:name="introduction"/>
@@ -162,7 +162,7 @@
         <w:pStyle w:val="BodyText"/>
       </w:pPr>
       <w:r>
-        <w:t xml:space="preserve">We ask four questions. What design constraints govern how much customer heterogeneity a persona-conditioned generative system can carry, and what calibration mechanism restores the rest (RQ1)? Do the elicitation designs open to an organization differ in whether they preserve decision-relevant properties of customer behavior, across models and settings (RQ2)? How can a firm validate such a system, and does calibrating it with its own data suffice (RQ3)? And what do the errors mean for a decision, as judged against a randomized promotion experiment (RQ4)? To answer them we compare four elicitation designs, run with eight language models and two prompt variants, against public transaction data sets whose mean counts differ by a factor of ten or more, and we test the same models against a randomized email experiment.</w:t>
+        <w:t xml:space="preserve">We ask four questions. What design constraints govern how much customer heterogeneity a persona-conditioned generative system can carry, and what calibration mechanism restores the rest (RQ1)? Do the elicitation designs open to an organization differ in whether they preserve decision-relevant properties of customer behavior, across models and settings (RQ2)? How can a firm validate such a system, and does calibrating it with its own data suffice (RQ3)? And what do the errors mean for a decision, as judged against a randomized promotion experiment (RQ4)? We compare four elicitation designs in eight language models and two prompt variants against public transaction data sets whose mean counts differ by a factor of ten or more, and against a randomized email experiment.</w:t>
       </w:r>
     </w:p>
     <w:p>
@@ -170,7 +170,7 @@
         <w:pStyle w:val="BodyText"/>
       </w:pPr>
       <w:r>
-        <w:t xml:space="preserve">The study makes five contributions. First, we give design knowledge for the artifact: two propositions that state a design constraint (a deterministic persona-conditioned component transmits only the heterogeneity its persona describes) and a calibration mechanism (the variance carried by external noise must be allocated against the model’s own variation), and a third that links the constraint to customer concentration (Propositions 1 to 3). Second, we explain why this is a managerial problem and not merely a statistical one: when behavior is generated rather than estimated, the quality of the artifact is bounded by the firm’s data assets, cannot be seen from inside the system, and depends on components that the firm does not control. Third, we provide evidence across designs, models, and settings that direct and day-by-day designs collapse, that a design which takes only the level from the model and calibrates the spread externally restores concentration, and that calibrating the level adds little beyond the historical mean. Fourth, we derive five design principles and an acceptance-test protocol for synthetic-customer systems. Fifth, we identify the organizational arrangements, covering ownership of reference data, revalidation, separation of synthetic from real data, and accountability, that follow, and we show with the randomized email experiment that the overstated promotion lifts would reverse a go/no-go decision.</w:t>
+        <w:t xml:space="preserve">The study makes five contributions. First, we give design knowledge for the artifact: a design constraint, a calibration mechanism, and a result that links the constraint to customer concentration (Propositions 1 to 3). Second, we explain why this is a managerial problem and not merely a statistical one: when behavior is generated rather than estimated, quality is bounded by the firm’s data assets, cannot be seen from inside the system, and depends on components that the firm does not control. Third, we show across designs, models, and settings that direct and day-by-day designs collapse, that taking only the level from the model and calibrating the spread externally restores concentration, and that calibrating the level adds little beyond the historical mean. Fourth, we derive five design principles and an acceptance-test protocol for synthetic-customer systems. Fifth, we identify the organizational arrangements that follow, and we show with a randomized email experiment that overstated promotion lifts would reverse a go/no-go decision.</w:t>
       </w:r>
     </w:p>
     <w:p>
@@ -3391,7 +3391,7 @@
         <w:pStyle w:val="FirstParagraph"/>
       </w:pPr>
       <w:r>
-        <w:t xml:space="preserve">The two propositions can be read as statements about how to build the artifact, not only about count distributions. Proposition 1 is a design constraint: a component that returns a deterministic answer for each persona can transmit only the heterogeneity that the persona describes, so the remainder must come from a different component. Proposition 2 is a calibration mechanism. It allocates a variance budget between two sources, the model’s persona-conditioned rates and an external noise generator, so that their combination matches the dispersion observed in the organization’s own data,</w:t>
+        <w:t xml:space="preserve">The propositions can be read as statements about how to build the artifact, not only about count distributions. Proposition 1 is a design constraint: a component that returns a deterministic answer for each persona can transmit only the heterogeneity that the persona describes, so the remainder must come from another component. Proposition 2 is a calibration mechanism. It allocates a variance budget between the model’s persona-conditioned rates and an external noise generator so that their combination matches the dispersion in the organization’s own data,</w:t>
       </w:r>
       <w:r>
         <w:t xml:space="preserve"> </w:t>
@@ -3479,7 +3479,7 @@
         </m:d>
       </m:oMath>
       <w:r>
-        <w:t xml:space="preserve">. The mechanism has three properties that matter for a system. It is explicit, because the allocation is computed rather than tuned by hand. It is auditable, because the target dispersion comes from a named historical data set. And it is modular, because the model can be replaced without changing the calibration step, although the step must then be recomputed. Together the propositions imply a separation of responsibilities between the language model, which supplies the level of a customer’s expected behavior, and a statistical layer, which supplies and calibrates the spread.</w:t>
+        <w:t xml:space="preserve">. The mechanism is explicit, because the allocation is computed rather than tuned; auditable, because the target comes from a named historical data set; and modular, because the model can be replaced without changing the calibration step, although the step must then be recomputed. Together the propositions separate the responsibilities of the language model, which supplies the level of a customer’s expected behavior, and a statistical layer, which supplies and calibrates the spread.</w:t>
       </w:r>
     </w:p>
     <w:p>
@@ -3497,7 +3497,7 @@
         <w:t xml:space="preserve"> </w:t>
       </w:r>
       <w:r>
-        <w:t xml:space="preserve">The algebra is elementary, and we do not claim otherwise. The contribution lies in what the algebra establishes about the design space that an organization faces. First, Proposition 1 is an impossibility result for the design levers that organizations control. These levers are the prompt, the persona, the choice of model, and the decoding settings. Each of them acts on the deterministic map from persona to answer, and none of them can lift the bound</w:t>
+        <w:t xml:space="preserve">The algebra is elementary, and we do not claim otherwise. The contribution lies in what it establishes about the design space that an organization faces. First, Proposition 1 is an impossibility result for the levers that organizations control: the prompt, the persona, the choice of model, and the decoding settings. Each acts on the deterministic map from persona to answer, and none can lift the bound</w:t>
       </w:r>
       <w:r>
         <w:t xml:space="preserve"> </w:t>
@@ -3559,7 +3559,7 @@
         <w:t xml:space="preserve"> </w:t>
       </w:r>
       <w:r>
-        <w:t xml:space="preserve">beyond what the persona information allows. A team that tunes prompts to</w:t>
+        <w:t xml:space="preserve">beyond what the persona information allows, so a team that tunes prompts to</w:t>
       </w:r>
       <w:r>
         <w:t xml:space="preserve"> </w:t>
@@ -3577,7 +3577,7 @@
         <w:t xml:space="preserve"> </w:t>
       </w:r>
       <w:r>
-        <w:t xml:space="preserve">is working on the wrong lever, and this can be known before any experiment. Second, Proposition 2 turns the remedy into a rule that can be computed, audited, and handed to a governance process, which is the form in which design knowledge becomes usable in organizations (Gregor and Hevner 2013). Third, both propositions are independent of which model is used. They state what must be true of any component placed in this role, so they continue to hold when models and providers change, and that is the condition under which an organization can build a system around a component that it does not control. Fourth, they generate predictions that we test in Section 5: that direct answers collapse, that constant answers produce</w:t>
+        <w:t xml:space="preserve">is working on the wrong lever, and this can be known before any experiment. Second, Proposition 2 turns the remedy into a rule that can be computed, audited, and handed to a governance process, which is the form in which design knowledge becomes usable in organizations (Gregor and Hevner 2013). Third, both propositions are independent of which model is used, so they continue to hold when models and providers change, which is the condition for building a system around a component that the organization does not control. Fourth, they generate predictions that we test in Section 5: that direct answers collapse, that constant answers produce</w:t>
       </w:r>
       <w:r>
         <w:t xml:space="preserve"> </w:t>
@@ -3642,7 +3642,7 @@
         <w:pStyle w:val="FirstParagraph"/>
       </w:pPr>
       <w:r>
-        <w:t xml:space="preserve">Propositions 1 and 2 follow from the Poisson–gamma model, and a reader may ask whether they say anything beyond it. The model is not new. What is new is the setting in which its implication becomes a problem for organizations, and we argue that it changes in four ways when behavior is generated by a language model instead of estimated from data.</w:t>
+        <w:t xml:space="preserve">The model behind the propositions is not new. What is new is the setting in which their implication becomes a problem for organizations. It changes in four ways when behavior is generated by a language model instead of estimated from data.</w:t>
       </w:r>
     </w:p>
     <w:p>
@@ -3660,66 +3660,7 @@
         <w:t xml:space="preserve"> </w:t>
       </w:r>
       <w:r>
-        <w:t xml:space="preserve">In the stochastic customer-base models of marketing science, heterogeneity is a latent quantity that the analyst infers from observed behavior, so its magnitude is disciplined by the organization’s own data. In a synthetic-customer system behavior is generated by a pretrained model, and nothing in the generation process ties the spread of the output to the organization’s customers. Proposition 1 shows that this tie cannot be restored through the prompt: a deterministic function of the persona carries only the heterogeneity that the persona describes, and no rewording, persona enrichment, or choice of model changes the bound</w:t>
-      </w:r>
-      <w:r>
-        <w:t xml:space="preserve"> </w:t>
-      </w:r>
-      <m:oMath>
-        <m:sSup>
-          <m:e>
-            <m:r>
-              <m:t>α</m:t>
-            </m:r>
-          </m:e>
-          <m:sup>
-            <m:r>
-              <m:rPr>
-                <m:sty m:val="p"/>
-              </m:rPr>
-              <m:t>*</m:t>
-            </m:r>
-          </m:sup>
-        </m:sSup>
-        <m:r>
-          <m:rPr>
-            <m:sty m:val="p"/>
-          </m:rPr>
-          <m:t>=</m:t>
-        </m:r>
-        <m:sSup>
-          <m:e>
-            <m:r>
-              <m:t>c</m:t>
-            </m:r>
-          </m:e>
-          <m:sup>
-            <m:r>
-              <m:t>2</m:t>
-            </m:r>
-          </m:sup>
-        </m:sSup>
-        <m:r>
-          <m:rPr>
-            <m:sty m:val="p"/>
-          </m:rPr>
-          <m:t>−</m:t>
-        </m:r>
-        <m:r>
-          <m:t>1</m:t>
-        </m:r>
-        <m:r>
-          <m:rPr>
-            <m:sty m:val="p"/>
-          </m:rPr>
-          <m:t>/</m:t>
-        </m:r>
-        <m:r>
-          <m:t>μ</m:t>
-        </m:r>
-      </m:oMath>
-      <w:r>
-        <w:t xml:space="preserve">. The spread is therefore a property of the system’s architecture rather than of its inputs, and it has to be supplied by a component that is connected to data.</w:t>
+        <w:t xml:space="preserve">In the customer-base models of marketing science, heterogeneity is a latent quantity inferred from the firm’s own data, so its magnitude is disciplined by that data. In a synthetic-customer system it is generated by a pretrained model, and nothing in the generation process ties it to the firm’s customers. Proposition 1 shows that the tie cannot be restored through the prompt. The spread is a property of the system’s architecture and not of its inputs, and it must be supplied by a component that is connected to data.</w:t>
       </w:r>
     </w:p>
     <w:p>
@@ -3737,7 +3678,7 @@
         <w:t xml:space="preserve"> </w:t>
       </w:r>
       <w:r>
-        <w:t xml:space="preserve">Proposition 1 also says where the limit lies. The share of heterogeneity a simulator can carry is the share explained by the persona, and the persona can contain only what the organization knows about its customers. In our demographic experiment that share was about 1%. This is a statement of complementarity between a generative model and the firm’s data assets, a theme familiar from research on IT business value (Melville et al. 2004), with a sharp form: more capable models cannot compensate for uninformative customer data, and the value of a synthetic-customer system is bounded by the explanatory power of first-party data. A common managerial assumption is the opposite, namely that a more capable model will substitute for the missing data.</w:t>
+        <w:t xml:space="preserve">The share of heterogeneity that a simulator can carry is the share explained by the persona, and the persona can contain only what the organization knows about its customers (about 1% in our demographic experiment). This is a statement of complementarity between a generative model and the firm’s data assets, familiar from research on IT business value (Melville et al. 2004), with a sharp form: more capable models cannot compensate for uninformative customer data. The common assumption that they can is the opposite of what the proposition implies.</w:t>
       </w:r>
     </w:p>
     <w:p>
@@ -3755,21 +3696,7 @@
         <w:t xml:space="preserve"> </w:t>
       </w:r>
       <w:r>
-        <w:t xml:space="preserve">Synthetic customers are adopted where real data are scarce or costly. Yet the quantity that Proposition 1 shows to be lost, the unexplained part</w:t>
-      </w:r>
-      <w:r>
-        <w:t xml:space="preserve"> </w:t>
-      </w:r>
-      <m:oMath>
-        <m:r>
-          <m:t>R</m:t>
-        </m:r>
-      </m:oMath>
-      <w:r>
-        <w:t xml:space="preserve"> </w:t>
-      </w:r>
-      <w:r>
-        <w:t xml:space="preserve">of the heterogeneity, is invisible inside the system and can be detected only against real data on the same distributional properties. The evidence that would reveal the error is the evidence the system was meant to economize. This is a validation paradox. It is resolved only by partial validation, in which a small amount of real data, such as a historical customer file and a few past randomized tests, is used to calibrate and audit a large amount of synthetic data. Proposition 2 provides the calibration step for such an arrangement.</w:t>
+        <w:t xml:space="preserve">Synthetic customers are adopted where real data are scarce or costly, yet the part of the heterogeneity that Proposition 1 shows to be lost is invisible inside the system and can be detected only against real data on the same properties. The evidence that would reveal the error is the evidence that the system was meant to economize. The paradox is resolved only by partial validation, in which a small amount of real data is used to calibrate and audit a large amount of synthetic data, and Proposition 2 supplies the calibration step.</w:t>
       </w:r>
     </w:p>
     <w:p>
@@ -3787,7 +3714,7 @@
         <w:t xml:space="preserve"> </w:t>
       </w:r>
       <w:r>
-        <w:t xml:space="preserve">Output that is fluent and has the right sign gives the user no signal of failure. A compressed spread does not show up in a mean or in a headline result, and a decision that is wrong because of it, such as a launch that does not pay, becomes visible only after several campaign cycles, if at all. In addition the component that generates the behavior is outside the organization’s control. Model versions and providers change, and in our runs eight models produced very different levels and spreads for the same prompt. Whereas a statistical model that the organization owns is calibrated once, a model that the organization rents has to be re-validated whenever it changes, which makes validation a continuing governance task.</w:t>
+        <w:t xml:space="preserve">Fluent output with the right sign gives the user no signal of failure, and a decision that is wrong because of a compressed spread becomes visible only after several campaign cycles, if at all. The generating component is also outside the firm’s control. In our runs eight models produced very different levels and spreads for the same prompt, and a model that the firm rents has to be re-validated whenever it changes, which makes validation a continuing governance task.</w:t>
       </w:r>
     </w:p>
     <w:p>
@@ -7773,7 +7700,7 @@
         <w:pStyle w:val="BodyText"/>
       </w:pPr>
       <w:r>
-        <w:t xml:space="preserve">The simulations behave as Proposition 1 predicts (Table 3, Online Appendix Table B3). Direct answers are collapsed again (variance-to-mean ratio 0.00 to 1.73, zero share at most 0.01) with</w:t>
+        <w:t xml:space="preserve">The simulations behave as Proposition 1 predicts (Table 3, Online Appendix Table B3). Direct answers are collapsed again (variance-to-mean ratio 0.00 to 1.73,</w:t>
       </w:r>
       <w:r>
         <w:t xml:space="preserve"> </w:t>
@@ -7787,7 +7714,7 @@
         <w:t xml:space="preserve"> </w:t>
       </w:r>
       <w:r>
-        <w:t xml:space="preserve">between -0.16 and +0.08. GPT-4o-mini answered</w:t>
+        <w:t xml:space="preserve">between -0.16 and +0.08). GPT-4o-mini answered</w:t>
       </w:r>
       <w:r>
         <w:t xml:space="preserve"> </w:t>
@@ -7805,7 +7732,7 @@
         <w:t xml:space="preserve"> </w:t>
       </w:r>
       <w:r>
-        <w:t xml:space="preserve">for every household when told the base rate (the number in the anchor text) and for practically every household without it, which gives</w:t>
+        <w:t xml:space="preserve">for every household when told the base rate and for practically every household without it, which gives</w:t>
       </w:r>
       <w:r>
         <w:t xml:space="preserve"> </w:t>
@@ -7884,7 +7811,7 @@
         </m:r>
       </m:oMath>
       <w:r>
-        <w:t xml:space="preserve">. Daily simulation again misses the mean (5.9 to 17.2 against 7.83) and has ratios of 0.06 to 0.30. Describing a distribution reaches ratios of 3.44 to 6.11, and its intervals contain the ceiling of 5.01 in 10 of 16 cells (5 of the 8 anchored cells); its zero share (0.03 to 0.15) matches the small real share of 0.03 in 8 of 16 cells. The hybrid matches the reference ratio in 10 of 16 cells, but its mean in only 3 of 16: the model’s</w:t>
+        <w:t xml:space="preserve">. Daily simulation again misses the mean (5.9 to 17.2 against 7.83). Describing a distribution reaches ratios of 3.44 to 6.11, with intervals that contain the ceiling of 5.01 in 10 of 16 cells and a zero share that matches the real 0.03 in 8 of 16. The hybrid matches the reference ratio in 10 of 16 cells but the mean in only 3, because the model’s</w:t>
       </w:r>
       <w:r>
         <w:t xml:space="preserve"> </w:t>
@@ -7898,21 +7825,7 @@
         <w:t xml:space="preserve"> </w:t>
       </w:r>
       <w:r>
-        <w:t xml:space="preserve">is usually too low (4.28 to 7.17 in the cells that miss, against 7.83). It matches the zero share in none of the 16 cells (0.07 to 0.15 against 0.03), because Poisson counts with a gamma multiplier produce more zeros than these households, and so it matches all four of mean, ratio, zero share, and</w:t>
-      </w:r>
-      <w:r>
-        <w:t xml:space="preserve"> </w:t>
-      </w:r>
-      <m:oMath>
-        <m:r>
-          <m:t>α</m:t>
-        </m:r>
-      </m:oMath>
-      <w:r>
-        <w:t xml:space="preserve"> </w:t>
-      </w:r>
-      <w:r>
-        <w:t xml:space="preserve">in none.</w:t>
+        <w:t xml:space="preserve">is usually too low (4.28 to 7.17 in the cells that miss, against 7.83). It matches the zero share in none (0.07 to 0.15), because Poisson counts with a gamma multiplier produce more zeros than these households, and so it matches all four statistics in none.</w:t>
       </w:r>
     </w:p>
     <w:tbl>
@@ -14487,7 +14400,7 @@
         <w:pStyle w:val="BodyText"/>
       </w:pPr>
       <w:r>
-        <w:t xml:space="preserve">Four patterns emerge. First, the direction is mostly reproduced: the risk ratio exceeds one in all 32 probability-elicitation cells, (smallest 1.03), but in individual seeds its interval includes or touches one in a few cells (GPT-4o-mini with the anchor for visits, 1.01 [1.00, 1.03] in the first seed, where the model answered about 10% regardless of the email, and Sonnet 5 with the anchor for purchases, 1.09 [0.96, 1.25], 1.02 [0.91, 1.15], and 1.05 [0.91, 1.20] in the three seeds). Llama with the anchor gave a risk ratio below one in the yes/no format for visits (0.60 to 0.69 in all three seeds). Second, the size of the visit effect depends on the model and the prompt. In 4 of 16 configurations the lift for the men’s email is statistically consistent with the real +0.077 (Llama-3.3-70B, Haiku 5.5, and Mistral Large 4 without the anchor, and GPT-5.6-terra with it); eight are significantly smaller (three of them less than half as large, for example Sonnet 5 with the anchor, +0.027), and four are more than 1.5 times as large (for example GPT-4o-mini without the anchor, +0.190). Which prompt works differs by model: the anchor brings GPT-5.6-terra to the real value but moves DeepSeek-V4-Pro from 0.5 to 2.6 times the real lift.</w:t>
+        <w:t xml:space="preserve">Four patterns emerge. First, the direction is mostly reproduced: the risk ratio, averaged over seeds, exceeds one in all 32 probability-elicitation cells (smallest 1.03), although in individual seeds its interval touches one in a few cells (for example, Sonnet 5 with the anchor for purchases, 1.02 [0.91, 1.15] in the second seed). Llama with the anchor gave a risk ratio below one in the yes/no format for visits (0.60 to 0.69 in all three seeds). Second, the size of the visit effect depends on the model and the prompt. In 4 of 16 configurations the lift for the men’s email is statistically consistent with the real +0.077 (Llama-3.3-70B, Haiku 5.5, and Mistral Large 4 without the anchor, and GPT-5.6-terra with it); eight are significantly smaller (three of them less than half as large, for example Sonnet 5 with the anchor, +0.027), and four are more than 1.5 times as large (for example GPT-4o-mini without the anchor, +0.190). Which prompt works differs by model: the anchor brings GPT-5.6-terra to the real value but moves DeepSeek-V4-Pro from 0.5 to 2.6 times the real lift.</w:t>
       </w:r>
     </w:p>
     <w:p>
@@ -14495,7 +14408,7 @@
         <w:pStyle w:val="BodyText"/>
       </w:pPr>
       <w:r>
-        <w:t xml:space="preserve">Third, the absolute lift in purchase probability exceeds the real +0.0068 in 15 of the 16 configurations, by a median factor of about 9 and by up to 25 (for example +0.169 for GPT-4o-mini without the anchor). The one exception is Sonnet 5 with the anchor, whose purchase lift (+0.002, interval -0.001 to +0.006) is only 0.4 times the real one; this model also rates the visit lift at 0.4 times the real value and its no-email purchase probability (0.045) is eight times the real one, so it attributes almost no effect to the email. Providing the base rate sets the no-email probability close to the stated number (about 0.10 for visits in six models, and 0.004 to 0.010 for purchases in five) without lowering the email-arm probability accordingly, so the risk ratio explodes in some cases (10 to 44 for Llama, Haiku, and Mistral) while the absolute lift stays large. The relation</w:t>
+        <w:t xml:space="preserve">Third, the absolute lift in purchase probability exceeds the real +0.0068 in 15 of the 16 configurations, by a median factor of about 9 and by up to 25 (for example +0.169 for GPT-4o-mini without the anchor). The one exception is Sonnet 5 with the anchor, whose purchase lift (+0.002) is only 0.4 times the real one, because it attributes almost no effect to the email (its visit lift is also 0.4 times the real one, and its no-email purchase probability is eight times the real one). Providing the base rate sets the no-email probability close to the stated number (about 0.10 for visits in six models, and 0.004 to 0.010 for purchases in five) without lowering the email-arm probability accordingly, so the risk ratio explodes in some cases (10 to 44 for Llama, Haiku, and Mistral) while the absolute lift stays large. The relation</w:t>
       </w:r>
       <w:r>
         <w:t xml:space="preserve"> </w:t>
@@ -16634,13 +16547,32 @@
       </w:r>
     </w:p>
     <w:bookmarkEnd w:id="65"/>
-    <w:sectPr/>
+    <w:sectPr>
+      <w:footerReference w:type="default" r:id="rId9"/>
+      <w:pgMar w:left="1440" w:right="1440" w:top="1440" w:bottom="1440"/>
+    </w:sectPr>
   </w:body>
 </w:document>
 </file>
 
 <file path=word/comments.xml><?xml version="1.0" encoding="utf-8"?>
 <w:comments xmlns:w="http://schemas.openxmlformats.org/wordprocessingml/2006/main" xmlns:m="http://schemas.openxmlformats.org/officeDocument/2006/math" xmlns:r="http://schemas.openxmlformats.org/officeDocument/2006/relationships" xmlns:o="urn:schemas-microsoft-com:office:office" xmlns:v="urn:schemas-microsoft-com:vml" xmlns:w10="urn:schemas-microsoft-com:office:word" xmlns:a="http://schemas.openxmlformats.org/drawingml/2006/main" xmlns:pic="http://schemas.openxmlformats.org/drawingml/2006/picture" xmlns:wp="http://schemas.openxmlformats.org/drawingml/2006/wordprocessingDrawing"/>
+</file>
+
+<file path=word/footer1.xml><?xml version="1.0" encoding="utf-8"?>
+<w:ftr xmlns:m="http://schemas.openxmlformats.org/officeDocument/2006/math" xmlns:mc="http://schemas.openxmlformats.org/markup-compatibility/2006" xmlns:mo="http://schemas.microsoft.com/office/mac/office/2008/main" xmlns:mv="urn:schemas-microsoft-com:mac:vml" xmlns:o="urn:schemas-microsoft-com:office:office" xmlns:r="http://schemas.openxmlformats.org/officeDocument/2006/relationships" xmlns:v="urn:schemas-microsoft-com:vml" xmlns:w10="urn:schemas-microsoft-com:office:word" xmlns:w14="http://schemas.microsoft.com/office/word/2010/wordml" xmlns:w="http://schemas.openxmlformats.org/wordprocessingml/2006/main" xmlns:wne="http://schemas.microsoft.com/office/word/2006/wordml" xmlns:wp14="http://schemas.microsoft.com/office/word/2010/wordprocessingDrawing" xmlns:wp="http://schemas.openxmlformats.org/drawingml/2006/wordprocessingDrawing" xmlns:wpc="http://schemas.microsoft.com/office/word/2010/wordprocessingCanvas" xmlns:wpg="http://schemas.microsoft.com/office/word/2010/wordprocessingGroup" xmlns:wpi="http://schemas.microsoft.com/office/word/2010/wordprocessingInk" xmlns:wps="http://schemas.microsoft.com/office/word/2010/wordprocessingShape" mc:Ignorable="w14 wp14">
+  <w:p>
+    <w:pPr>
+      <w:pStyle w:val="Footer"/>
+      <w:jc w:val="center"/>
+    </w:pPr>
+    <w:r>
+      <w:fldChar w:fldCharType="begin"/>
+      <w:instrText xml:space="preserve"> PAGE </w:instrText>
+      <w:fldChar w:fldCharType="end"/>
+    </w:r>
+  </w:p>
+</w:ftr>
 </file>
 
 <file path=word/footnotes.xml><?xml version="1.0" encoding="utf-8"?>

</xml_diff>

<commit_message>
Manuscript: Section 5.9 on whether visible cues reveal decision errors; add within-design correlations to cue_validity
Co-Authored-By: Claude Sonnet 5.5 <noreply@anthropic.com>
Claude-Session: https://claude.ai/code/session_01VRbK37d38KZhVAbWS4xw4x
</commit_message>
<xml_diff>
--- a/llm-count-study/ISR_manuscript_draft.docx
+++ b/llm-count-study/ISR_manuscript_draft.docx
@@ -5263,7 +5263,7 @@
     </w:p>
     <w:bookmarkEnd w:id="39"/>
     <w:bookmarkEnd w:id="40"/>
-    <w:bookmarkStart w:id="56" w:name="results"/>
+    <w:bookmarkStart w:id="57" w:name="results"/>
     <w:p>
       <w:pPr>
         <w:pStyle w:val="Heading1"/>
@@ -6075,13 +6075,68 @@
       </w:r>
     </w:p>
     <w:bookmarkEnd w:id="54"/>
-    <w:bookmarkStart w:id="55" w:name="summary-of-hypotheses"/>
+    <w:bookmarkStart w:id="55" w:name="X88cf7aa32bf19b55e3a062077a58560147befe8"/>
     <w:p>
       <w:pPr>
         <w:pStyle w:val="Heading2"/>
       </w:pPr>
       <w:r>
-        <w:t xml:space="preserve">5.9 Summary of hypotheses</w:t>
+        <w:t xml:space="preserve">5.9 Do the cues a user can see reveal the errors that matter?</w:t>
+      </w:r>
+    </w:p>
+    <w:p>
+      <w:pPr>
+        <w:pStyle w:val="FirstParagraph"/>
+      </w:pPr>
+      <w:r>
+        <w:t xml:space="preserve">A user who inspects a synthetic population sees its mean, the sign of a promotion effect, the width of its intervals, and whether the answers parsed. We asked whether such cues reveal the errors that matter for a decision, defined for the transaction settings as an error in</w:t>
+      </w:r>
+      <w:r>
+        <w:t xml:space="preserve"> </w:t>
+      </w:r>
+      <m:oMath>
+        <m:r>
+          <m:t>1</m:t>
+        </m:r>
+        <m:r>
+          <m:rPr>
+            <m:sty m:val="p"/>
+          </m:rPr>
+          <m:t>+</m:t>
+        </m:r>
+        <m:r>
+          <m:t>α</m:t>
+        </m:r>
+      </m:oMath>
+      <w:r>
+        <w:t xml:space="preserve"> </w:t>
+      </w:r>
+      <w:r>
+        <w:t xml:space="preserve">of more than a factor of 1.65 or an error of more than 0.15 in the top-decile share, and for the email experiment as a lift ratio outside 0.5 to 2. The thresholds were fixed before the analysis, and a cell passes a face-validity check if its mean is within 50% of the reference and fewer than 5% of answers failed to parse (in the email experiment, if both lifts have the right sign). Of the 191 transaction cells, 135 pass, and 60 of those (44%) have a large decision error, against 51 of the 56 cells that fail. The check works as a screen for gross failure, mainly because the hybrid design passes it with no large errors in 45 cells. It does not work for the designs that collapse: of the 48 direct and daily cells that pass, 47 have a large decision error, and in the email experiment all 32 configurations have the right sign while 15 of 16 purchase lifts and 5 of 16 visit lifts are outside the 0.5 to 2 range. The interval is misleading in the opposite direction: the relative width of the interval of the mean correlates negatively with the decision errors (rank correlation -0.32 with the</w:t>
+      </w:r>
+      <w:r>
+        <w:t xml:space="preserve"> </w:t>
+      </w:r>
+      <m:oMath>
+        <m:r>
+          <m:t>α</m:t>
+        </m:r>
+      </m:oMath>
+      <w:r>
+        <w:t xml:space="preserve"> </w:t>
+      </w:r>
+      <w:r>
+        <w:t xml:space="preserve">error and -0.43 with the top-decile error; model-bootstrap intervals exclude zero), because collapsed answers have very narrow intervals. With eight models the model-level permutation tests are not significant (p between 0.13 and 0.50), and cell-level correlations partly reflect differences between designs.</w:t>
+      </w:r>
+    </w:p>
+    <w:bookmarkEnd w:id="55"/>
+    <w:bookmarkStart w:id="56" w:name="summary-of-hypotheses"/>
+    <w:p>
+      <w:pPr>
+        <w:pStyle w:val="Heading2"/>
+      </w:pPr>
+      <w:r>
+        <w:t xml:space="preserve">5.10 Summary of hypotheses</w:t>
       </w:r>
     </w:p>
     <w:tbl>
@@ -6602,9 +6657,9 @@
         <w:t xml:space="preserve">Table 2. Hypotheses and evidence.</w:t>
       </w:r>
     </w:p>
-    <w:bookmarkEnd w:id="55"/>
     <w:bookmarkEnd w:id="56"/>
-    <w:bookmarkStart w:id="62" w:name="discussion"/>
+    <w:bookmarkEnd w:id="57"/>
+    <w:bookmarkStart w:id="63" w:name="discussion"/>
     <w:p>
       <w:pPr>
         <w:pStyle w:val="Heading1"/>
@@ -6621,7 +6676,7 @@
         <w:t xml:space="preserve">We lead with the contributions to information systems research (Section 6.1) and the design principles and acceptance test that follow from them (Section 6.2), then turn to the decision consequences and the cost of uncritical trust (Section 6.3) and the organizational arrangements that follow (Section 6.4). The marketing results of Section 5 serve as evidence for these contributions. Limitations are in Section 6.5.</w:t>
       </w:r>
     </w:p>
-    <w:bookmarkStart w:id="57" w:name="X8b5d7cb2dd9a2ce0d7f424e3d7c91bdc66a3387"/>
+    <w:bookmarkStart w:id="58" w:name="X8b5d7cb2dd9a2ce0d7f424e3d7c91bdc66a3387"/>
     <w:p>
       <w:pPr>
         <w:pStyle w:val="Heading2"/>
@@ -6844,8 +6899,8 @@
         <w:t xml:space="preserve">errors in the simulated base rate and in the simulated lift are confounded in the risk ratio.</w:t>
       </w:r>
     </w:p>
-    <w:bookmarkEnd w:id="57"/>
-    <w:bookmarkStart w:id="58" w:name="design-principles-and-an-acceptance-test"/>
+    <w:bookmarkEnd w:id="58"/>
+    <w:bookmarkStart w:id="59" w:name="design-principles-and-an-acceptance-test"/>
     <w:p>
       <w:pPr>
         <w:pStyle w:val="Heading2"/>
@@ -6971,8 +7026,8 @@
         <w:t xml:space="preserve">, the zero share, and the share of purchases made by the top decile of customers, with intervals; compares the hybrid design with a baseline that uses no model information; checks sensitivity to the prompt context; and compares the simulated base rate and absolute lift, not only the risk ratio, with a past randomized test. Such a test is needed because these errors cannot be seen by inspecting the output: the sign of the promotion effect was right in nearly all cells, and the answers were fluent.</w:t>
       </w:r>
     </w:p>
-    <w:bookmarkEnd w:id="58"/>
-    <w:bookmarkStart w:id="59" w:name="X055b4e56704b177d348b257ab69ce21480d0ba8"/>
+    <w:bookmarkEnd w:id="59"/>
+    <w:bookmarkStart w:id="60" w:name="X055b4e56704b177d348b257ab69ce21480d0ba8"/>
     <w:p>
       <w:pPr>
         <w:pStyle w:val="Heading2"/>
@@ -7077,7 +7132,7 @@
         <w:t xml:space="preserve"> </w:t>
       </w:r>
       <w:r>
-        <w:t xml:space="preserve">the simulated lifts often came with narrow intervals that excluded the real value, and statistical precision, which a synthetic population gives cheaply, must not be mistaken for validity.</w:t>
+        <w:t xml:space="preserve">the simulated lifts often came with narrow intervals that excluded the real value, and across cells narrow intervals went with larger decision errors (Section 5.9), so statistical precision, which a synthetic population gives cheaply, must not be mistaken for validity.</w:t>
       </w:r>
       <w:r>
         <w:t xml:space="preserve"> </w:t>
@@ -7112,8 +7167,8 @@
         <w:t xml:space="preserve">synthetic customers used as inputs to forecasts or other learned systems carry their compressed spread with them, so concentration is lost (Proposition 3) and the share of non-buyers is distorted, and the result enters downstream decisions as if it were observed data. These risks do not argue against the technology. They argue against using it as a replacement for evidence rather than as a complement to it, and against purchasing decisions based on demonstrations of fluency and plausible averages.</w:t>
       </w:r>
     </w:p>
-    <w:bookmarkEnd w:id="59"/>
-    <w:bookmarkStart w:id="60" w:name="X09d14e7ca6d203994f1ab3b488c22ba41949633"/>
+    <w:bookmarkEnd w:id="60"/>
+    <w:bookmarkStart w:id="61" w:name="X09d14e7ca6d203994f1ab3b488c22ba41949633"/>
     <w:p>
       <w:pPr>
         <w:pStyle w:val="Heading2"/>
@@ -7202,8 +7257,8 @@
         <w:t xml:space="preserve">The runs are cheap (about 25,600 calls cost under one US dollar with the least expensive models and about eleven with the most expensive of the four we priced); the relevant cost is the decision made on the output. Each randomized test is also a calibration data point, and storing the simulated and realized lift of each past campaign lets the system track its own bias and adjust the calibration step.</w:t>
       </w:r>
     </w:p>
-    <w:bookmarkEnd w:id="60"/>
-    <w:bookmarkStart w:id="61" w:name="limitations-and-future-research"/>
+    <w:bookmarkEnd w:id="61"/>
+    <w:bookmarkStart w:id="62" w:name="limitations-and-future-research"/>
     <w:p>
       <w:pPr>
         <w:pStyle w:val="Heading2"/>
@@ -7220,9 +7275,9 @@
         <w:t xml:space="preserve">The evidence is preliminary. Every design has one prompt wording, so our intervals capture the sampling of customers but not variation across prompts. All eight models were run on three seeds. Per-seed variance-to-mean ratios were stable for the direct and daily designs (median range 0.04 and 0.03, at most 0.30) except in a few DeepSeek-V4-Pro cells, but varied more for the describe design (median 0.9, at most 2.1) and the hybrid design (median 1.2, at most 4.2), so counts of cells that match the reference are approximate. The low-mean reference is a calibrated parametric distribution, the Complete Journey households are loyalty-card shoppers, and campaigns there were targeted rather than randomized, so only the email experiment supports a causal comparison. The demographic personas contain almost no information about purchase frequency; personas that carry purchase histories would be a stronger test of Proposition 1 and of whether the model contributes more than a level. Whether still larger or reasoning-enabled models collapse less remains open, design C truncates its top bin, and public data may be part of the models’ training data. The design principles and organizational arrangements are derived from the evidence and have not been tested in an organization. Future work should use a randomized promotion data set with purchase counts, for example from a partner firm, so that count distributions and treatment effects can be studied on the same customers.</w:t>
       </w:r>
     </w:p>
-    <w:bookmarkEnd w:id="61"/>
     <w:bookmarkEnd w:id="62"/>
-    <w:bookmarkStart w:id="63" w:name="conclusion"/>
+    <w:bookmarkEnd w:id="63"/>
+    <w:bookmarkStart w:id="64" w:name="conclusion"/>
     <w:p>
       <w:pPr>
         <w:pStyle w:val="Heading1"/>
@@ -7239,8 +7294,8 @@
         <w:t xml:space="preserve">A synthetic-customer system is an artifact whose quality cannot be read from its output. We showed that a persona-conditioned generative component can transmit only the customer heterogeneity that its persona describes, that the remainder must be supplied and calibrated by a layer connected to the firm’s own data, and that this turns a familiar statistical fact into a managerial problem: the spread of simulated behavior is no longer disciplined by the firm’s data, it cannot be seen from inside the system, and it can be checked only against the real data that the system was meant to economize. Evidence from eight language models, three transaction settings, and a randomized email experiment is consistent with this account. Direct and day-by-day designs lose the concentration of purchases among heavy buyers; taking the level from the model and the spread from an external calibrated source restores it; calibrating the level repairs the mean, but a baseline that uses the historical mean alone does about as well; and purchase lifts are overstated in 15 of 16 configurations, enough to turn a no-go decision into a go. For organizations the implication is a short list of duties: validate against the firm’s own data before use, revalidate when the model, provider, or prompt changes, keep synthetic data apart from real data, keep running randomized tests, and assign accountability before the artifact is used. Future research should study these arrangements in organizations and test whether personas with informative purchase histories give the generative component more to contribute.</w:t>
       </w:r>
     </w:p>
-    <w:bookmarkEnd w:id="63"/>
-    <w:bookmarkStart w:id="64" w:name="references"/>
+    <w:bookmarkEnd w:id="64"/>
+    <w:bookmarkStart w:id="65" w:name="references"/>
     <w:p>
       <w:pPr>
         <w:pStyle w:val="Heading1"/>
@@ -7737,7 +7792,7 @@
         <w:t xml:space="preserve">An Online Appendix (Appendix A, prompt templates; Appendix B, full results by model and prompt; Appendix C, reproducibility; Appendix D, proofs of Propositions 1 to 3) is provided as a separate file.</w:t>
       </w:r>
     </w:p>
-    <w:bookmarkEnd w:id="64"/>
+    <w:bookmarkEnd w:id="65"/>
     <w:sectPr>
       <w:footerReference w:type="default" r:id="rId9"/>
       <w:pgMar w:left="1440" w:right="1440" w:top="1440" w:bottom="1440"/>

</xml_diff>

<commit_message>
Manuscript: correct Section 5.9 and false-precision text after within-design cue correlations (interval width is not a reliable cue)
Co-Authored-By: Claude Sonnet 5.5 <noreply@anthropic.com>
Claude-Session: https://claude.ai/code/session_01VRbK37d38KZhVAbWS4xw4x
</commit_message>
<xml_diff>
--- a/llm-count-study/ISR_manuscript_draft.docx
+++ b/llm-count-study/ISR_manuscript_draft.docx
@@ -6112,7 +6112,7 @@
         <w:t xml:space="preserve"> </w:t>
       </w:r>
       <w:r>
-        <w:t xml:space="preserve">of more than a factor of 1.65 or an error of more than 0.15 in the top-decile share, and for the email experiment as a lift ratio outside 0.5 to 2. The thresholds were fixed before the analysis, and a cell passes a face-validity check if its mean is within 50% of the reference and fewer than 5% of answers failed to parse (in the email experiment, if both lifts have the right sign). Of the 191 transaction cells, 135 pass, and 60 of those (44%) have a large decision error, against 51 of the 56 cells that fail. The check works as a screen for gross failure, mainly because the hybrid design passes it with no large errors in 45 cells. It does not work for the designs that collapse: of the 48 direct and daily cells that pass, 47 have a large decision error, and in the email experiment all 32 configurations have the right sign while 15 of 16 purchase lifts and 5 of 16 visit lifts are outside the 0.5 to 2 range. The interval is misleading in the opposite direction: the relative width of the interval of the mean correlates negatively with the decision errors (rank correlation -0.32 with the</w:t>
+        <w:t xml:space="preserve">of more than a factor of 1.65 or an error of more than 0.15 in the top-decile share, and for the email experiment as a lift ratio outside 0.5 to 2. The thresholds were fixed before the analysis, and a cell passes a face-validity check if its mean is within 50% of the reference and fewer than 5% of answers failed to parse (in the email experiment, if both lifts have the right sign). Of the 191 transaction cells, 135 pass, and 60 of those (44%) have a large decision error, against 51 of the 56 cells that fail. The check works as a screen for gross failure, mainly because the hybrid design passes it with no large errors in 45 cells. It does not work for the designs that collapse: of the 48 direct and daily cells that pass, 47 have a large decision error, and in the email experiment all 32 configurations have the right sign while 15 of 16 purchase lifts and 5 of 16 visit lifts are outside the 0.5 to 2 range. The interval is not a reliable cue either. Across all cells the relative width of the interval of the mean correlates negatively with the decision errors (rank correlation -0.32 with the</w:t>
       </w:r>
       <w:r>
         <w:t xml:space="preserve"> </w:t>
@@ -6126,7 +6126,7 @@
         <w:t xml:space="preserve"> </w:t>
       </w:r>
       <w:r>
-        <w:t xml:space="preserve">error and -0.43 with the top-decile error; model-bootstrap intervals exclude zero), because collapsed answers have very narrow intervals. With eight models the model-level permutation tests are not significant (p between 0.13 and 0.50), and cell-level correlations partly reflect differences between designs.</w:t>
+        <w:t xml:space="preserve">error and -0.43 with the top-decile error), because collapsed answers have very narrow intervals, but within each design the sign reverses (+0.22 to +0.57), so the width tells a user little. The error of the mean is more informative: within the direct and daily designs it correlates with the decision errors (+0.42 to +0.78), yet nearly all cells that pass the check still carry large errors. With eight models the model-level permutation tests are not significant (p between 0.13 and 0.50).</w:t>
       </w:r>
     </w:p>
     <w:bookmarkEnd w:id="55"/>
@@ -7132,7 +7132,7 @@
         <w:t xml:space="preserve"> </w:t>
       </w:r>
       <w:r>
-        <w:t xml:space="preserve">the simulated lifts often came with narrow intervals that excluded the real value, and across cells narrow intervals went with larger decision errors (Section 5.9), so statistical precision, which a synthetic population gives cheaply, must not be mistaken for validity.</w:t>
+        <w:t xml:space="preserve">the simulated lifts often came with narrow intervals that excluded the real value, and the width of an interval is not a reliable cue to the size of the decision error (Section 5.9), so statistical precision, which a synthetic population gives cheaply, must not be mistaken for validity.</w:t>
       </w:r>
       <w:r>
         <w:t xml:space="preserve"> </w:t>

</xml_diff>

<commit_message>
Add backtest of the acceptance test (Section 5.10, S5); trim to 38 pages
Co-Authored-By: Claude Sonnet 5.5 <noreply@anthropic.com>
Claude-Session: https://claude.ai/code/session_01VRbK37d38KZhVAbWS4xw4x
</commit_message>
<xml_diff>
--- a/llm-count-study/ISR_manuscript_draft.docx
+++ b/llm-count-study/ISR_manuscript_draft.docx
@@ -2825,7 +2825,7 @@
         <w:pStyle w:val="FirstParagraph"/>
       </w:pPr>
       <w:r>
-        <w:t xml:space="preserve">Four supplementary analyses are not hypotheses and are labeled S1 to S4 in Section 5.10: (S1) the concentration of purchases among heavy buyers (Proposition 3), (S2) calibration of the level, (S3) the robustness of collapse to the mean level, to richer personas, and to model scale, and (S4) whether the cues a user can see reveal decision errors.</w:t>
+        <w:t xml:space="preserve">Five supplementary analyses are not hypotheses and are labeled S1 to S5 in Section 5.11: (S1) the concentration of purchases among heavy buyers (Proposition 3), (S2) calibration of the level, (S3) the robustness of collapse to the mean level, to richer personas, and to model scale, (S4) whether the cues a user can see reveal decision errors, and (S5) a backtest of the acceptance test.</w:t>
       </w:r>
     </w:p>
     <w:bookmarkEnd w:id="32"/>
@@ -3029,7 +3029,7 @@
         <w:t xml:space="preserve"> </w:t>
       </w:r>
       <w:r>
-        <w:t xml:space="preserve">is working on the wrong lever, which can be known before any experiment. Second, Proposition 2 turns the remedy into a rule that can be computed, audited, and handed to a governance process, a form that organizations can use. Third, both propositions are independent of which model is used, so they hold when models and providers change, the condition for building a system around a component that the organization does not control. Fourth, they generate predictions that we test in Section 5, so they are testable, not post hoc description.</w:t>
+        <w:t xml:space="preserve">is working on the wrong lever, which can be known before any experiment. Second, Proposition 2 turns the remedy into a rule that can be computed, audited, and handed to a governance process, a form that organizations can use. Third, both propositions are independent of which model is used, so they hold when models and providers change. Fourth, they generate predictions that we test in Section 5.</w:t>
       </w:r>
     </w:p>
     <w:bookmarkEnd w:id="33"/>
@@ -4355,7 +4355,7 @@
         </m:r>
       </m:oMath>
       <w:r>
-        <w:t xml:space="preserve">. Our re-aggregation of the file gave a similar profile across seven consecutive windows (1,731 customers), and the Cameron and Trivedi (1990) test rejected the Poisson model in every window. In the second, the reference is the empirical distribution of 4-week basket counts, pooled over 13 windows, for the 2,469 loyalty-card households of the dunnhumby Complete Journey data in 2017 (32,097 household-windows), for which negative binomial was the best-fitting model by AIC in every window. In the third, the benchmark is the randomized email test of Hillstrom (2008), in which 64,000 customers received no email, a men’s merchandise email, or a women’s merchandise email, and visits and purchases were recorded for the following two weeks.</w:t>
+        <w:t xml:space="preserve">. In the second, the reference is the empirical distribution of 4-week basket counts, pooled over 13 windows, for the 2,469 loyalty-card households of the dunnhumby Complete Journey data in 2017 (32,097 household-windows), for which negative binomial was the best-fitting model by AIC in every window. In the third, the benchmark is the randomized email test of Hillstrom (2008), in which 64,000 customers received no email, a men’s merchandise email, or a women’s merchandise email, and visits and purchases were recorded for the following two weeks.</w:t>
       </w:r>
     </w:p>
     <w:tbl>
@@ -5263,7 +5263,7 @@
     </w:p>
     <w:bookmarkEnd w:id="39"/>
     <w:bookmarkEnd w:id="40"/>
-    <w:bookmarkStart w:id="57" w:name="results"/>
+    <w:bookmarkStart w:id="58" w:name="results"/>
     <w:p>
       <w:pPr>
         <w:pStyle w:val="Heading1"/>
@@ -6130,13 +6130,53 @@
       </w:r>
     </w:p>
     <w:bookmarkEnd w:id="55"/>
-    <w:bookmarkStart w:id="56" w:name="X294e70b192cec9543bd143ac9499730f79fa7d7"/>
+    <w:bookmarkStart w:id="56" w:name="backtest-of-the-acceptance-test"/>
     <w:p>
       <w:pPr>
         <w:pStyle w:val="Heading2"/>
       </w:pPr>
       <w:r>
-        <w:t xml:space="preserve">5.10 Summary of hypotheses and supplementary analyses</w:t>
+        <w:t xml:space="preserve">5.10 Backtest of the acceptance test</w:t>
+      </w:r>
+    </w:p>
+    <w:p>
+      <w:pPr>
+        <w:pStyle w:val="FirstParagraph"/>
+      </w:pPr>
+      <w:r>
+        <w:t xml:space="preserve">Section 6.2 proposes that a system be accepted only if it reproduces the organization’s own history. We tested this rule on the existing results, without new model calls. In the email experiment one email served as the past randomized test and the other as the new campaign (and the reverse), and the simulator was accepted only if its lift for the past campaign was within a factor of 2 of the measured one. A firm launches when the lift exceeds a break-even value, which we varied from one tenth to ten times the measured lift of the new campaign; a decision is wrong when simulated and measured lifts fall on different sides of it. Trusting the simulator gave wrong decisions at 29% of break-even values across the 64 cases, with a lift off by more than a factor of 2 in 69%, although the sign check passed in all of them. The gate admitted 20 cases, all for visits and none for purchases. Among the 32 visit cases, trusting the simulator gave 14% wrong decisions and a lift off by more than a factor of 2 in 12; among the 20 admitted cases the shares were 9% and 4. Rescaling the new lift by the past ratio lowered wrong decisions to 17% overall, but the lift stayed off by more than a factor of 2 in 59% of cases. Errors for the two campaigns are strongly correlated (Spearman 0.84), so a past test can reveal them, but for purchases they are too large to correct by one factor.</w:t>
+      </w:r>
+    </w:p>
+    <w:p>
+      <w:pPr>
+        <w:pStyle w:val="BodyText"/>
+      </w:pPr>
+      <w:r>
+        <w:t xml:space="preserve">In the transaction settings we gated on the reference mean and zero share and checked the top-decile share implied by the simulated</w:t>
+      </w:r>
+      <w:r>
+        <w:t xml:space="preserve"> </w:t>
+      </w:r>
+      <m:oMath>
+        <m:r>
+          <m:t>α</m:t>
+        </m:r>
+      </m:oMath>
+      <w:r>
+        <w:t xml:space="preserve"> </w:t>
+      </w:r>
+      <w:r>
+        <w:t xml:space="preserve">(Proposition 3(b)). Of 187 cells, 133 passed the face-validity check, and 50% of them had a top-decile share off by more than 0.10. The gate admitted 18 cells (14 hybrid, 4 describe-then-sample, none of direct or daily simulation), of which one was wrong. Because the hybrid design takes its dispersion from the reference, this shows that the gate removes failing designs, not that the hybrid is validated independently.</w:t>
+      </w:r>
+    </w:p>
+    <w:bookmarkEnd w:id="56"/>
+    <w:bookmarkStart w:id="57" w:name="X294e70b192cec9543bd143ac9499730f79fa7d7"/>
+    <w:p>
+      <w:pPr>
+        <w:pStyle w:val="Heading2"/>
+      </w:pPr>
+      <w:r>
+        <w:t xml:space="preserve">5.11 Summary of hypotheses and supplementary analyses</w:t>
       </w:r>
     </w:p>
     <w:tbl>
@@ -6604,6 +6644,44 @@
           </w:p>
         </w:tc>
       </w:tr>
+      <w:tr>
+        <w:tc>
+          <w:tcPr/>
+          <w:p>
+            <w:pPr>
+              <w:pStyle w:val="Compact"/>
+              <w:spacing w:before="20" w:after="20" w:line="240" w:lineRule="auto"/>
+              <w:ind w:firstLine="0"/>
+              <w:jc w:val="left"/>
+            </w:pPr>
+            <w:r>
+              <w:rPr>
+                <w:rFonts w:ascii="Times New Roman" w:hAnsi="Times New Roman"/>
+                <w:sz w:val="17"/>
+              </w:rPr>
+              <w:t xml:space="preserve">S5. An acceptance test based on history screens out bad simulators.</w:t>
+            </w:r>
+          </w:p>
+        </w:tc>
+        <w:tc>
+          <w:tcPr/>
+          <w:p>
+            <w:pPr>
+              <w:pStyle w:val="Compact"/>
+              <w:spacing w:before="20" w:after="20" w:line="240" w:lineRule="auto"/>
+              <w:ind w:firstLine="0"/>
+              <w:jc w:val="left"/>
+            </w:pPr>
+            <w:r>
+              <w:rPr>
+                <w:rFonts w:ascii="Times New Roman" w:hAnsi="Times New Roman"/>
+                <w:sz w:val="17"/>
+              </w:rPr>
+              <w:t xml:space="preserve">Partly. In the email backtest among visit cases the gate cut wrong launch decisions from 14% to 9% and rejected every purchase case; in the transaction settings it rejected every direct and daily cell (Section 5.10).</w:t>
+            </w:r>
+          </w:p>
+        </w:tc>
+      </w:tr>
     </w:tbl>
     <w:p>
       <w:pPr>
@@ -6619,9 +6697,9 @@
         <w:t xml:space="preserve">Table 2. Hypotheses (H) and supplementary analyses (S), with evidence.</w:t>
       </w:r>
     </w:p>
-    <w:bookmarkEnd w:id="56"/>
     <w:bookmarkEnd w:id="57"/>
-    <w:bookmarkStart w:id="63" w:name="discussion"/>
+    <w:bookmarkEnd w:id="58"/>
+    <w:bookmarkStart w:id="64" w:name="discussion"/>
     <w:p>
       <w:pPr>
         <w:pStyle w:val="Heading1"/>
@@ -6638,7 +6716,7 @@
         <w:t xml:space="preserve">We lead with the contributions to information systems research (Section 6.1) and the design principles and acceptance test that follow from them (Section 6.2), then turn to the decision consequences and the cost of uncritical trust (Section 6.3) and the organizational arrangements that follow (Section 6.4). The marketing results of Section 5 serve as evidence for these contributions. Limitations are in Section 6.5.</w:t>
       </w:r>
     </w:p>
-    <w:bookmarkStart w:id="58" w:name="X8b5d7cb2dd9a2ce0d7f424e3d7c91bdc66a3387"/>
+    <w:bookmarkStart w:id="59" w:name="X8b5d7cb2dd9a2ce0d7f424e3d7c91bdc66a3387"/>
     <w:p>
       <w:pPr>
         <w:pStyle w:val="Heading2"/>
@@ -6691,25 +6769,7 @@
         <w:t xml:space="preserve"> </w:t>
       </w:r>
       <w:r>
-        <w:t xml:space="preserve">that Proposition 1 predicts (about -0.12 in the demographic experiment). Persona enrichment cannot repair this, because the demographics explain about 1% of the heterogeneity. And the design that follows Proposition 2 restores the concentration of purchases among heavy buyers in 39 of 48 cells where direct and daily designs lose it entirely (Section 5.7). Larger and more recent models do not escape the constraint. This reframes the advice to</w:t>
-      </w:r>
-      <w:r>
-        <w:t xml:space="preserve"> </w:t>
-      </w:r>
-      <w:r>
-        <w:t xml:space="preserve">“</w:t>
-      </w:r>
-      <w:r>
-        <w:t xml:space="preserve">add noise</w:t>
-      </w:r>
-      <w:r>
-        <w:t xml:space="preserve">”</w:t>
-      </w:r>
-      <w:r>
-        <w:t xml:space="preserve"> </w:t>
-      </w:r>
-      <w:r>
-        <w:t xml:space="preserve">to synthetic respondents: the amount of noise is not a free parameter, and it is determined by how much heterogeneity the persona already carries.</w:t>
+        <w:t xml:space="preserve">that Proposition 1 predicts (about -0.12 in the demographic experiment). And the design that follows Proposition 2 restores the concentration of purchases among heavy buyers in 39 of 48 cells where direct and daily designs lose it entirely (Section 5.7).</w:t>
       </w:r>
     </w:p>
     <w:p>
@@ -6787,7 +6847,7 @@
         <w:t xml:space="preserve"> </w:t>
       </w:r>
       <w:r>
-        <w:t xml:space="preserve">A twin is usually understood as a replica that can stand in for the original in a decision. Our evidence supports a narrower reading. At the level of the individual customer, the demographic personas carried almost no information about real counts, so a customer-level replica is not supported. At the level of the population, the distribution of counts and the size of effects are reproduced only by designs in which the dispersion is supplied from outside the model and the level is checked against data. A claim that a simulated population is a twin is therefore a claim about specific properties, to be tested one by one: the share of zeros, the spread, the concentration among heavy buyers, and the absolute size of an effect. Fluency and aggregate plausibility, which are what users see, do not indicate them.</w:t>
+        <w:t xml:space="preserve">A twin is usually understood as a replica that can stand in for the original in a decision. Our evidence supports a narrower reading. At the level of the individual customer, the demographic personas carried almost no information about real counts, so a customer-level replica is not supported. At the level of the population, the distribution of counts and the size of effects are reproduced only by designs in which the dispersion is supplied from outside the model and the level is checked against data. A claim that a simulated population is a twin is therefore a claim about specific properties, to be tested one by one: the share of zeros, the spread, the concentration among heavy buyers, and the absolute size of an effect.</w:t>
       </w:r>
     </w:p>
     <w:p>
@@ -6861,8 +6921,8 @@
         <w:t xml:space="preserve">errors in the simulated base rate and in the simulated lift are confounded in the risk ratio.</w:t>
       </w:r>
     </w:p>
-    <w:bookmarkEnd w:id="58"/>
-    <w:bookmarkStart w:id="59" w:name="design-principles-and-an-acceptance-test"/>
+    <w:bookmarkEnd w:id="59"/>
+    <w:bookmarkStart w:id="60" w:name="design-principles-and-an-acceptance-test"/>
     <w:p>
       <w:pPr>
         <w:pStyle w:val="Heading2"/>
@@ -6876,7 +6936,7 @@
         <w:pStyle w:val="FirstParagraph"/>
       </w:pPr>
       <w:r>
-        <w:t xml:space="preserve">The evidence supports five design principles. They are derived from our experiments and analytical results and have not been tested as an intervention, so they are hypotheses for design rather than established prescriptions.</w:t>
+        <w:t xml:space="preserve">The evidence supports five design principles. They are derived from our experiments and analytical results. The acceptance test was backtested on our own data (Section 5.10), but no principle has been tested as an intervention in an organization, so they remain hypotheses for design.</w:t>
       </w:r>
     </w:p>
     <w:p>
@@ -6985,11 +7045,11 @@
         </m:r>
       </m:oMath>
       <w:r>
-        <w:t xml:space="preserve">, the zero share, and the share of purchases made by the top decile of customers, with intervals; compares the hybrid design with a baseline that uses no model information; checks sensitivity to the prompt context; and compares the simulated base rate and absolute lift, not only the risk ratio, with a past randomized test. Such a test is needed because these errors cannot be seen by inspecting the output: the sign of the promotion effect was right in nearly all cells, and the answers were fluent.</w:t>
-      </w:r>
-    </w:p>
-    <w:bookmarkEnd w:id="59"/>
-    <w:bookmarkStart w:id="60" w:name="X055b4e56704b177d348b257ab69ce21480d0ba8"/>
+        <w:t xml:space="preserve">, the zero share, and the share of purchases made by the top decile of customers, with intervals; compares the hybrid design with a baseline that uses no model information; checks sensitivity to the prompt context; and compares the simulated base rate and absolute lift, not only the risk ratio, with a past randomized test. These errors cannot be seen by inspecting the output: the sign was right in nearly all cells, and the answers were fluent.</w:t>
+      </w:r>
+    </w:p>
+    <w:bookmarkEnd w:id="60"/>
+    <w:bookmarkStart w:id="61" w:name="X055b4e56704b177d348b257ab69ce21480d0ba8"/>
     <w:p>
       <w:pPr>
         <w:pStyle w:val="Heading2"/>
@@ -7070,7 +7130,7 @@
         <w:t xml:space="preserve"> </w:t>
       </w:r>
       <w:r>
-        <w:t xml:space="preserve">per customer, a profit of about 213,000. The gap of about 280,000 for a single campaign favors launching, and because the error is systematic it does not average out over campaigns. The numbers are ours, not the retailer’s, and the email test does not involve a discount, but the example shows how an overstated lift turns directly into a wrong go decision.</w:t>
+        <w:t xml:space="preserve">per customer, a profit of about 213,000. The gap of about 280,000 for a single campaign favors launching, and because the error is systematic it does not average out over campaigns. The numbers are ours, not the retailer’s, but the example shows how an overstated lift turns directly into a wrong go decision.</w:t>
       </w:r>
     </w:p>
     <w:p>
@@ -7126,11 +7186,11 @@
         <w:t xml:space="preserve"> </w:t>
       </w:r>
       <w:r>
-        <w:t xml:space="preserve">synthetic customers used as inputs to forecasts or other learned systems carry their compressed spread with them, so concentration is lost (Proposition 3) and the share of non-buyers is distorted, and the result enters downstream decisions as if it were observed data. These risks do not argue against the technology. They argue against using it as a replacement for evidence rather than as a complement to it, and against purchasing decisions based on demonstrations of fluency and plausible averages.</w:t>
-      </w:r>
-    </w:p>
-    <w:bookmarkEnd w:id="60"/>
-    <w:bookmarkStart w:id="61" w:name="X09d14e7ca6d203994f1ab3b488c22ba41949633"/>
+        <w:t xml:space="preserve">synthetic customers used as inputs to forecasts or other learned systems carry their compressed spread with them, so concentration is lost (Proposition 3) and the share of non-buyers is distorted, and the result enters downstream decisions as if it were observed data. These risks argue against using the technology as a replacement for evidence rather than as a complement to it, and against purchasing decisions based on demonstrations of fluency and plausible averages.</w:t>
+      </w:r>
+    </w:p>
+    <w:bookmarkEnd w:id="61"/>
+    <w:bookmarkStart w:id="62" w:name="X09d14e7ca6d203994f1ab3b488c22ba41949633"/>
     <w:p>
       <w:pPr>
         <w:pStyle w:val="Heading2"/>
@@ -7162,7 +7222,7 @@
         <w:t xml:space="preserve"> </w:t>
       </w:r>
       <w:r>
-        <w:t xml:space="preserve">Before synthetic customers enter a planning process, the system should pass the acceptance test of Section 6.2 against the organization’s own history. The reference values come from the customer file and the experiment archive that the marketing analytics team already holds, so the test puts a concrete interface between two functions: marketing owns the reference data and the decision requirements, and information systems owns the pipeline, the model versions, and the calibration step. A decision that rests on a vendor’s model, an analyst’s prompt, and a calibration step maintained by another team has no owner for its errors unless accountability is assigned before use. A digital twin that no one is accountable for validating is a liability presented as an asset.</w:t>
+        <w:t xml:space="preserve">Before synthetic customers enter a planning process, the system should pass the acceptance test of Section 6.2 against the organization’s own history. Marketing owns the reference data and the decision requirements, and information systems owns the pipeline, the model versions, and the calibration step. A decision that rests on a vendor’s model, an analyst’s prompt, and a calibration step maintained by another team has no owner for its errors unless accountability is assigned before use.</w:t>
       </w:r>
     </w:p>
     <w:p>
@@ -7198,7 +7258,7 @@
         <w:t xml:space="preserve"> </w:t>
       </w:r>
       <w:r>
-        <w:t xml:space="preserve">The designs reproduced the sign of a promotion effect but not its size, so synthetic customers suit screening, ranking, and hypothesis generation better than sizing a campaign, for which a randomized holdout remains the standard. Provenance labels, separate storage, and a rule against pooling synthetic and real records in estimation keep their compressed spread out of dashboards and downstream models.</w:t>
+        <w:t xml:space="preserve">The designs reproduced the sign of a promotion effect but not its size, so synthetic customers suit screening, ranking, and hypothesis generation better than sizing a campaign, for which a randomized holdout remains the standard. Provenance labels and a rule against pooling synthetic and real records keep their compressed spread out of downstream models.</w:t>
       </w:r>
     </w:p>
     <w:p>
@@ -7216,11 +7276,11 @@
         <w:t xml:space="preserve"> </w:t>
       </w:r>
       <w:r>
-        <w:t xml:space="preserve">The runs are cheap (about 25,600 calls cost under one US dollar with the least expensive models and about eleven with the most expensive of the four we priced); the relevant cost is the decision made on the output. Each randomized test is also a calibration data point, and storing the simulated and realized lift of each past campaign lets the system track its own bias and adjust the calibration step.</w:t>
-      </w:r>
-    </w:p>
-    <w:bookmarkEnd w:id="61"/>
-    <w:bookmarkStart w:id="62" w:name="limitations-and-future-research"/>
+        <w:t xml:space="preserve">The runs are cheap (under about eleven US dollars for 25,600 calls with the models we priced); the relevant cost is the decision made on the output. Storing the simulated and realized lift of each past campaign lets the system track its own bias.</w:t>
+      </w:r>
+    </w:p>
+    <w:bookmarkEnd w:id="62"/>
+    <w:bookmarkStart w:id="63" w:name="limitations-and-future-research"/>
     <w:p>
       <w:pPr>
         <w:pStyle w:val="Heading2"/>
@@ -7234,12 +7294,12 @@
         <w:pStyle w:val="FirstParagraph"/>
       </w:pPr>
       <w:r>
-        <w:t xml:space="preserve">The evidence is preliminary. Every design has one prompt wording, so our intervals capture the sampling of customers but not variation across prompts. All eight models were run on three seeds. Per-seed variance-to-mean ratios were stable for the direct and daily designs (median range 0.04 and 0.03, at most 0.30) except in a few DeepSeek-V4-Pro cells, but varied more for the describe design (median 0.9, at most 2.1) and the hybrid design (median 1.2, at most 4.2), so counts of cells that match the reference are approximate. The low-mean reference is a calibrated parametric distribution, the Complete Journey households are loyalty-card shoppers, and campaigns there were targeted rather than randomized, so only the email experiment supports a causal comparison. The demographic personas contain almost no information about purchase frequency; personas that carry purchase histories would be a stronger test of Proposition 1 and of whether the model contributes more than a level. Whether still larger or reasoning-enabled models collapse less remains open, design C truncates its top bin, and public data may be part of the models’ training data. The design principles and organizational arrangements are derived from the evidence and have not been tested in an organization. Future work should use a randomized promotion data set with purchase counts, for example from a partner firm, so that count distributions and treatment effects can be studied on the same customers.</w:t>
-      </w:r>
-    </w:p>
-    <w:bookmarkEnd w:id="62"/>
+        <w:t xml:space="preserve">The evidence is preliminary. Every design has one prompt wording, so our intervals capture the sampling of customers but not variation across prompts. All eight models were run on three seeds. Per-seed variance-to-mean ratios were stable for the direct and daily designs but varied more for the describe and hybrid designs (median ranges 0.9 and 1.2), so counts of cells that match the reference are approximate. The low-mean reference is a calibrated parametric distribution, the Complete Journey households are loyalty-card shoppers, and campaigns there were targeted rather than randomized, so only the email experiment supports a causal comparison. The demographic personas contain almost no information about purchase frequency; personas that carry purchase histories would be a stronger test of Proposition 1 and of whether the model contributes more than a level. Whether still larger or reasoning-enabled models collapse less remains open, and public data may be part of the models’ training data. The principles and organizational arrangements have not been tested in an organization, and the backtest of the acceptance test (Section 5.10) uses one pair of campaigns. Future work should use a randomized promotion data set with purchase counts, for example from a partner firm, so that count distributions and treatment effects can be studied on the same customers.</w:t>
+      </w:r>
+    </w:p>
     <w:bookmarkEnd w:id="63"/>
-    <w:bookmarkStart w:id="64" w:name="conclusion"/>
+    <w:bookmarkEnd w:id="64"/>
+    <w:bookmarkStart w:id="65" w:name="conclusion"/>
     <w:p>
       <w:pPr>
         <w:pStyle w:val="Heading1"/>
@@ -7256,8 +7316,8 @@
         <w:t xml:space="preserve">A synthetic-customer system is an artifact whose quality cannot be read from its output. We showed that a persona-conditioned generative component can transmit only the customer heterogeneity that its persona describes, that the remainder must be supplied and calibrated by a layer connected to the firm’s own data, and that this turns a familiar statistical fact into a managerial problem: the spread of simulated behavior is no longer disciplined by the firm’s data, it cannot be seen from inside the system, and it can be checked only against the real data that the system was meant to economize. Evidence from eight language models, three transaction settings, and a randomized email experiment is consistent with this account. Direct and day-by-day designs lose the concentration of purchases among heavy buyers; taking the level from the model and the spread from an external calibrated source restores it; calibrating the level repairs the mean, but a baseline that uses the historical mean alone does about as well; and purchase lifts are overstated in 15 of 16 configurations, enough to turn a no-go decision into a go. For organizations the implication is a short list of duties: validate against the firm’s own data before use, revalidate when the model, provider, or prompt changes, keep synthetic data apart from real data, keep running randomized tests, and assign accountability before the artifact is used. Future research should study these arrangements in organizations and test whether personas with informative purchase histories give the generative component more to contribute.</w:t>
       </w:r>
     </w:p>
-    <w:bookmarkEnd w:id="64"/>
-    <w:bookmarkStart w:id="65" w:name="references"/>
+    <w:bookmarkEnd w:id="65"/>
+    <w:bookmarkStart w:id="66" w:name="references"/>
     <w:p>
       <w:pPr>
         <w:pStyle w:val="Heading1"/>
@@ -7706,7 +7766,7 @@
         <w:t xml:space="preserve">An Online Appendix (Appendix A, prompt templates; Appendix B, full results by model and prompt; Appendix C, reproducibility; Appendix D, proofs of Propositions 1 to 3) is provided as a separate file.</w:t>
       </w:r>
     </w:p>
-    <w:bookmarkEnd w:id="65"/>
+    <w:bookmarkEnd w:id="66"/>
     <w:sectPr>
       <w:footerReference w:type="default" r:id="rId9"/>
       <w:pgMar w:left="1440" w:right="1440" w:top="1440" w:bottom="1440"/>

</xml_diff>

<commit_message>
Add Online Appendix E: backtest of the acceptance test
Co-Authored-By: Claude Sonnet 5.5 <noreply@anthropic.com>
Claude-Session: https://claude.ai/code/session_01VRbK37d38KZhVAbWS4xw4x
</commit_message>
<xml_diff>
--- a/llm-count-study/ISR_manuscript_draft.docx
+++ b/llm-count-study/ISR_manuscript_draft.docx
@@ -6144,7 +6144,7 @@
         <w:pStyle w:val="FirstParagraph"/>
       </w:pPr>
       <w:r>
-        <w:t xml:space="preserve">Section 6.2 proposes that a system be accepted only if it reproduces the organization’s own history. We tested this rule on the existing results, without new model calls. In the email experiment one email served as the past randomized test and the other as the new campaign (and the reverse), and the simulator was accepted only if its lift for the past campaign was within a factor of 2 of the measured one. A firm launches when the lift exceeds a break-even value, which we varied from one tenth to ten times the measured lift of the new campaign; a decision is wrong when simulated and measured lifts fall on different sides of it. Trusting the simulator gave wrong decisions at 29% of break-even values across the 64 cases, with a lift off by more than a factor of 2 in 69%, although the sign check passed in all of them. The gate admitted 20 cases, all for visits and none for purchases. Among the 32 visit cases, trusting the simulator gave 14% wrong decisions and a lift off by more than a factor of 2 in 12; among the 20 admitted cases the shares were 9% and 4. Rescaling the new lift by the past ratio lowered wrong decisions to 17% overall, but the lift stayed off by more than a factor of 2 in 59% of cases. Errors for the two campaigns are strongly correlated (Spearman 0.84), so a past test can reveal them, but for purchases they are too large to correct by one factor.</w:t>
+        <w:t xml:space="preserve">Details are in Online Appendix E. Section 6.2 proposes that a system be accepted only if it reproduces the organization’s own history. We tested this rule on the existing results, without new model calls. In the email experiment one email served as the past randomized test and the other as the new campaign (and the reverse), and the simulator was accepted only if its lift for the past campaign was within a factor of 2 of the measured one. A firm launches when the lift exceeds a break-even value, which we varied from one tenth to ten times the measured lift of the new campaign; a decision is wrong when simulated and measured lifts fall on different sides of it. Trusting the simulator gave wrong decisions at 29% of break-even values across the 64 cases, with a lift off by more than a factor of 2 in 69%, although the sign check passed in all of them. The gate admitted 20 cases, all for visits and none for purchases. Among the 32 visit cases, trusting the simulator gave 14% wrong decisions and a lift off by more than a factor of 2 in 12; among the 20 admitted cases the shares were 9% and 4. Rescaling the new lift by the past ratio lowered wrong decisions to 17% overall, but the lift stayed off by more than a factor of 2 in 59% of cases. Errors for the two campaigns are strongly correlated (Spearman 0.84), so a past test can reveal them, but for purchases they are too large to correct by one factor.</w:t>
       </w:r>
     </w:p>
     <w:p>
@@ -7763,7 +7763,7 @@
           <w:iCs/>
           <w:i/>
         </w:rPr>
-        <w:t xml:space="preserve">An Online Appendix (Appendix A, prompt templates; Appendix B, full results by model and prompt; Appendix C, reproducibility; Appendix D, proofs of Propositions 1 to 3) is provided as a separate file.</w:t>
+        <w:t xml:space="preserve">An Online Appendix (Appendix A, prompt templates; Appendix B, full results by model and prompt; Appendix C, reproducibility; Appendix D, proofs of Propositions 1 to 3; Appendix E, backtest of the acceptance test) is provided as a separate file.</w:t>
       </w:r>
     </w:p>
     <w:bookmarkEnd w:id="66"/>

</xml_diff>

<commit_message>
Add prompt-wording robustness (stage 5): Section 5.4 paragraph and Online Appendix F
Co-Authored-By: Claude Sonnet 5.5 <noreply@anthropic.com>
Claude-Session: https://claude.ai/code/session_01VRbK37d38KZhVAbWS4xw4x
</commit_message>
<xml_diff>
--- a/llm-count-study/ISR_manuscript_draft.docx
+++ b/llm-count-study/ISR_manuscript_draft.docx
@@ -5445,13 +5445,13 @@
       </w:r>
     </w:p>
     <w:bookmarkEnd w:id="46"/>
-    <w:bookmarkStart w:id="47" w:name="is-collapse-specific-to-low-means"/>
+    <w:bookmarkStart w:id="47" w:name="X55b7e78110247fa838620de0aa094d71db99230"/>
     <w:p>
       <w:pPr>
         <w:pStyle w:val="Heading2"/>
       </w:pPr>
       <w:r>
-        <w:t xml:space="preserve">5.4 Is collapse specific to low means?</w:t>
+        <w:t xml:space="preserve">5.4 Is collapse specific to low means or to one prompt wording?</w:t>
       </w:r>
     </w:p>
     <w:p>
@@ -5459,7 +5459,7 @@
         <w:pStyle w:val="FirstParagraph"/>
       </w:pPr>
       <w:r>
-        <w:t xml:space="preserve">If direct answers were underdispersed only because small expected counts are rounded to 0, 1, or 2, the problem should shrink at higher means. It does not: the variance-to-mean ratio of direct answers is at most 0.87 in 11 of 16 cells at a mean of 0.5, at most 0.36 in 13 of 16 at a mean of 4.8, and at most 0.53 in 14 of 16 at a mean of 7.8, and larger or more recent models do not escape it.</w:t>
+        <w:t xml:space="preserve">If direct answers were underdispersed only because small expected counts are rounded to 0, 1, or 2, the problem should shrink at higher means. It does not: the variance-to-mean ratio of direct answers is at most 0.87 in 11 of 16 cells at a mean of 0.5, at most 0.36 in 13 of 16 at a mean of 4.8, and at most 0.53 in 14 of 16 at a mean of 7.8, and larger or more recent models do not escape it. We also reran four models (both prompt variants) with two rewordings, one in the third person and one in the style of a survey, in the low-mean and high-mean settings and in the email experiment (Online Appendix F). The variance-to-mean ratio of designs A and B was below the reference in 58 of 60 cells with a defined ratio, the hybrid design matched it in 20 of 32, and describe-then-sample gave too few zeros in 28 of 32. Wording changed effect sizes: the purchase lift of the probability design was above twice the real lift in 7 of 8 configurations under the third-person wording (median 6 times) and in all 8 under the survey wording (median 18 times), and the sign was missing in 3 of 16 under the third-person wording.</w:t>
       </w:r>
     </w:p>
     <w:bookmarkEnd w:id="47"/>
@@ -6112,7 +6112,7 @@
         <w:t xml:space="preserve"> </w:t>
       </w:r>
       <w:r>
-        <w:t xml:space="preserve">of more than a factor of 1.65 or an error of more than 0.15 in the top-decile share, and for the email experiment as a lift ratio outside 0.5 to 2. The thresholds were fixed before the analysis, and a cell passes a face-validity check if its mean is within 50% of the reference and fewer than 5% of answers failed to parse (in the email experiment, if both lifts have the right sign). Of the 191 transaction cells, 135 pass, and 60 of those (44%) have a large decision error, against 51 of the 56 cells that fail. The check works as a screen for gross failure, mainly because the hybrid design passes it with no large errors in 45 cells. It does not work for the designs that collapse: of the 48 direct and daily cells that pass, 47 have a large decision error, and in the email experiment all 32 configurations have the right sign while 15 of 16 purchase lifts and 5 of 16 visit lifts are outside the 0.5 to 2 range. The interval is not a reliable cue either. Across all cells the relative width of the interval of the mean correlates negatively with the decision errors (rank correlation -0.32 with the</w:t>
+        <w:t xml:space="preserve">of more than a factor of 1.65 or an error of more than 0.15 in the top-decile share, and for the email experiment as a lift ratio outside 0.5 to 2. A cell passes a face-validity check if its mean is within 50% of the reference and fewer than 5% of answers failed to parse (in the email experiment, if both lifts have the right sign). Of the 191 transaction cells, 135 pass, and 60 of those (44%) have a large decision error, against 51 of the 56 cells that fail. The check works as a screen for gross failure, mainly because the hybrid design passes it with no large errors in 45 cells. It does not work for the designs that collapse: of the 48 direct and daily cells that pass, 47 have a large decision error, and in the email experiment all 32 configurations have the right sign while 15 of 16 purchase lifts and 5 of 16 visit lifts are outside the 0.5 to 2 range. The interval is not a reliable cue either. Across all cells the relative width of the interval of the mean correlates negatively with the decision errors (rank correlation -0.32 with the</w:t>
       </w:r>
       <w:r>
         <w:t xml:space="preserve"> </w:t>
@@ -6126,7 +6126,7 @@
         <w:t xml:space="preserve"> </w:t>
       </w:r>
       <w:r>
-        <w:t xml:space="preserve">error and -0.43 with the top-decile error), because collapsed answers have very narrow intervals, but within each design the sign reverses (+0.22 to +0.57), so the width tells a user little. The error of the mean is more informative: within the direct and daily designs it correlates with the decision errors (+0.42 to +0.78), yet nearly all cells that pass the check still carry large errors. With eight models the model-level permutation tests are not significant (p between 0.13 and 0.50).</w:t>
+        <w:t xml:space="preserve">error and -0.43 with the top-decile error), because collapsed answers have very narrow intervals, but within each design the sign reverses (+0.22 to +0.57), so the width tells a user little. The error of the mean is more informative within the direct and daily designs (+0.42 to +0.78), yet nearly all cells that pass the check still carry large errors. Model-level permutation tests are not significant (p between 0.13 and 0.50).</w:t>
       </w:r>
     </w:p>
     <w:bookmarkEnd w:id="55"/>
@@ -6144,7 +6144,7 @@
         <w:pStyle w:val="FirstParagraph"/>
       </w:pPr>
       <w:r>
-        <w:t xml:space="preserve">Details are in Online Appendix E. Section 6.2 proposes that a system be accepted only if it reproduces the organization’s own history. We tested this rule on the existing results, without new model calls. In the email experiment one email served as the past randomized test and the other as the new campaign (and the reverse), and the simulator was accepted only if its lift for the past campaign was within a factor of 2 of the measured one. A firm launches when the lift exceeds a break-even value, which we varied from one tenth to ten times the measured lift of the new campaign; a decision is wrong when simulated and measured lifts fall on different sides of it. Trusting the simulator gave wrong decisions at 29% of break-even values across the 64 cases, with a lift off by more than a factor of 2 in 69%, although the sign check passed in all of them. The gate admitted 20 cases, all for visits and none for purchases. Among the 32 visit cases, trusting the simulator gave 14% wrong decisions and a lift off by more than a factor of 2 in 12; among the 20 admitted cases the shares were 9% and 4. Rescaling the new lift by the past ratio lowered wrong decisions to 17% overall, but the lift stayed off by more than a factor of 2 in 59% of cases. Errors for the two campaigns are strongly correlated (Spearman 0.84), so a past test can reveal them, but for purchases they are too large to correct by one factor.</w:t>
+        <w:t xml:space="preserve">Details are in Online Appendix E. Section 6.2 proposes that a system be accepted only if it reproduces the organization’s own history. We tested this rule on the existing results, without new model calls (Online Appendix E). In the email experiment one email served as the past randomized test and the other as the new campaign (and the reverse), and the simulator was accepted only if its lift for the past campaign was within a factor of 2 of the measured one. A firm launches when the lift exceeds a break-even value, which we varied from one tenth to ten times the measured lift of the new campaign; a decision is wrong when simulated and measured lifts fall on different sides of it. Trusting the simulator gave wrong decisions at 29% of break-even values across the 64 cases, with a lift off by more than a factor of 2 in 69%, although the sign check passed in all of them. The gate admitted 20 cases, all for visits and none for purchases. Among the 32 visit cases, trusting the simulator gave 14% wrong decisions and a lift off by more than a factor of 2 in 12; among the 20 admitted cases the shares were 9% and 4. Rescaling the new lift by the past ratio lowered wrong decisions to 17% overall, but the lift stayed off by more than a factor of 2 in 59% of cases, so for purchases the errors are too large to correct by one factor.</w:t>
       </w:r>
     </w:p>
     <w:p>
@@ -6166,7 +6166,7 @@
         <w:t xml:space="preserve"> </w:t>
       </w:r>
       <w:r>
-        <w:t xml:space="preserve">(Proposition 3(b)). Of 187 cells, 133 passed the face-validity check, and 50% of them had a top-decile share off by more than 0.10. The gate admitted 18 cells (14 hybrid, 4 describe-then-sample, none of direct or daily simulation), of which one was wrong. Because the hybrid design takes its dispersion from the reference, this shows that the gate removes failing designs, not that the hybrid is validated independently.</w:t>
+        <w:t xml:space="preserve">(Proposition 3(b)). Of 187 cells, 133 passed the face-validity check, and 50% of them had a top-decile share off by more than 0.10. The gate admitted 18 cells (14 hybrid, 4 describe-then-sample, none of direct or daily simulation), of which one was wrong. Because the hybrid design takes its dispersion from the reference, this shows that the gate removes failing designs, not that the hybrid is validated.</w:t>
       </w:r>
     </w:p>
     <w:bookmarkEnd w:id="56"/>
@@ -6601,7 +6601,7 @@
                 <w:rFonts w:ascii="Times New Roman" w:hAnsi="Times New Roman"/>
                 <w:sz w:val="17"/>
               </w:rPr>
-              <w:t xml:space="preserve">Collapse is not specific to low means (direct answers have ratios of at most 0.87, 0.36, and 0.53 in most cells at means of 0.5, 4.8, and 7.8). Richer personas do not repair it (rank correlations with real counts -0.11 to +0.08; demographics explain about 1% of the heterogeneity). Larger and more recent models do not escape it (ratios of at most 1.00 in 42 of 48 direct cells; the hybrid’s mean matched in 13 of 48 cells).</w:t>
+              <w:t xml:space="preserve">Collapse is not specific to low means. Richer personas do not repair it (rank correlations -0.11 to +0.08). Larger and more recent models do not escape it (ratios of at most 1.00 in 42 of 48 direct cells).</w:t>
             </w:r>
           </w:p>
         </w:tc>
@@ -6787,7 +6787,7 @@
         <w:t xml:space="preserve"> </w:t>
       </w:r>
       <w:r>
-        <w:t xml:space="preserve">The constraint has organizational consequences that a purely statistical reading would miss (Section 3.8). The system’s quality is bounded by the firm’s data assets and not by the capability of the model: the model contributed little heterogeneity of its own (squared coefficients of variation of its rates of 0.00 to 0.75 against dispersion parameters of 0.71 to 3.05) and nothing that identified which customers buy more (rank correlations with real counts between -0.11 and +0.08). Calibrating the model’s level to the historical mean repaired the mean in 44 of 48 cells, but a baseline that gave every customer the historical mean did as well or better on the joint fit (Section 5.8). The value of the generative component therefore has to be shown against the firm’s own data, which is the data the system was meant to economize.</w:t>
+        <w:t xml:space="preserve">The constraint has organizational consequences that a purely statistical reading would miss (Section 3.8). The system’s quality is bounded by the firm’s data assets and not by the capability of the model: the model contributed little heterogeneity of its own (squared coefficients of variation of its rates of 0.00 to 0.75 against dispersion parameters of 0.71 to 3.05) and nothing that identified which customers buy more (rank correlations with real counts between -0.11 and +0.08). Calibrating the level repaired the mean in 44 of 48 cells, but a baseline that gave every customer the historical mean did as well or better on the joint fit (Section 5.8). The value of the generative component therefore has to be shown against the firm’s own data, which is the data the system was meant to economize.</w:t>
       </w:r>
     </w:p>
     <w:p>
@@ -6847,7 +6847,7 @@
         <w:t xml:space="preserve"> </w:t>
       </w:r>
       <w:r>
-        <w:t xml:space="preserve">A twin is usually understood as a replica that can stand in for the original in a decision. Our evidence supports a narrower reading. At the level of the individual customer, the demographic personas carried almost no information about real counts, so a customer-level replica is not supported. At the level of the population, the distribution of counts and the size of effects are reproduced only by designs in which the dispersion is supplied from outside the model and the level is checked against data. A claim that a simulated population is a twin is therefore a claim about specific properties, to be tested one by one: the share of zeros, the spread, the concentration among heavy buyers, and the absolute size of an effect.</w:t>
+        <w:t xml:space="preserve">A twin is usually understood as a replica that can stand in for the original in a decision. Our evidence supports a narrower reading. At the customer level the demographic personas carried almost no information about real counts, so a replica is not supported. At the population level, counts and effect sizes are reproduced only when the dispersion is supplied from outside the model and the level is checked against data. A claim that a simulated population is a twin is therefore a claim about specific properties, to be tested one by one: the share of zeros, the spread, the concentration among heavy buyers, and the absolute size of an effect.</w:t>
       </w:r>
     </w:p>
     <w:p>
@@ -6865,7 +6865,7 @@
         <w:t xml:space="preserve"> </w:t>
       </w:r>
       <w:r>
-        <w:t xml:space="preserve">Describing a distribution (Jang et al. 2026, Zhang et al. 2025a) helps more at a high mean than at a low mean and under-produces zeros where they are common, which matters because the zero share decides how many customers a campaign does not reach. And evaluating a promotion simulator on relative effects alone is hazardous, because by</w:t>
+        <w:t xml:space="preserve">Describing a distribution (Jang et al. 2026, Zhang et al. 2025a) helps more at a high mean and under-produces zeros where they are common, which matters because the zero share decides how many customers a campaign does not reach. Evaluating a promotion simulator on relative effects alone is hazardous, because</w:t>
       </w:r>
       <w:r>
         <w:t xml:space="preserve"> </w:t>
@@ -6918,7 +6918,7 @@
         <w:t xml:space="preserve"> </w:t>
       </w:r>
       <w:r>
-        <w:t xml:space="preserve">errors in the simulated base rate and in the simulated lift are confounded in the risk ratio.</w:t>
+        <w:t xml:space="preserve">confounds errors in the simulated base rate and the simulated lift.</w:t>
       </w:r>
     </w:p>
     <w:bookmarkEnd w:id="59"/>
@@ -6972,7 +6972,7 @@
         <w:t xml:space="preserve"> </w:t>
       </w:r>
       <w:r>
-        <w:t xml:space="preserve">Direct integer answers and day-by-day simulation returned nearly constant values in almost every cell, and their errors were systematic, not random.</w:t>
+        <w:t xml:space="preserve">Direct integer answers and day-by-day simulation returned nearly constant values in almost every cell.</w:t>
       </w:r>
     </w:p>
     <w:p>
@@ -6990,7 +6990,7 @@
         <w:t xml:space="preserve"> </w:t>
       </w:r>
       <w:r>
-        <w:t xml:space="preserve">Because the persona bounds what the model can carry (Section 3.8), the data assets that feed the persona matter more than the choice of model. Rescaling the model’s rates to the historical mean repaired the mean in 44 of 48 cells (19 before in the same simulation; Section 5.8), but a baseline that gives every customer the historical mean did as well or better on the joint fit, so calibration should be paired with a test against such a baseline to show what the model adds.</w:t>
+        <w:t xml:space="preserve">Because the persona bounds what the model can carry (Section 3.8), persona data matter more than the choice of model. Rescaling the model’s rates to the historical mean repaired the mean in 44 of 48 cells (19 before in the same simulation; Section 5.8), but a baseline that gives every customer the historical mean did as well or better on the joint fit, so calibration should be tested against that baseline.</w:t>
       </w:r>
     </w:p>
     <w:p>
@@ -7008,7 +7008,7 @@
         <w:t xml:space="preserve"> </w:t>
       </w:r>
       <w:r>
-        <w:t xml:space="preserve">A stated base rate changed some outputs by an order of magnitude and in several cells made the model repeat the stated number for every customer.</w:t>
+        <w:t xml:space="preserve">A stated base rate or a rewording of the prompt changed some outputs by an order of magnitude (Section 5.4), and in several cells the model repeated the stated number for every customer.</w:t>
       </w:r>
     </w:p>
     <w:p>
@@ -7020,13 +7020,13 @@
           <w:iCs/>
           <w:i/>
         </w:rPr>
-        <w:t xml:space="preserve">Principle 5: Evaluate on absolute effects against a randomized benchmark.</w:t>
-      </w:r>
-      <w:r>
-        <w:t xml:space="preserve"> </w:t>
-      </w:r>
-      <w:r>
-        <w:t xml:space="preserve">Risk ratios hid errors in the simulated base rate (Section 5.6).</w:t>
+        <w:t xml:space="preserve">Principle 5: Evaluate absolute effects against a randomized benchmark.</w:t>
+      </w:r>
+      <w:r>
+        <w:t xml:space="preserve"> </w:t>
+      </w:r>
+      <w:r>
+        <w:t xml:space="preserve">Risk ratios hid base-rate errors (Section 5.6).</w:t>
       </w:r>
     </w:p>
     <w:p>
@@ -7045,7 +7045,7 @@
         </m:r>
       </m:oMath>
       <w:r>
-        <w:t xml:space="preserve">, the zero share, and the share of purchases made by the top decile of customers, with intervals; compares the hybrid design with a baseline that uses no model information; checks sensitivity to the prompt context; and compares the simulated base rate and absolute lift, not only the risk ratio, with a past randomized test. These errors cannot be seen by inspecting the output: the sign was right in nearly all cells, and the answers were fluent.</w:t>
+        <w:t xml:space="preserve">, the zero share, and the share of purchases made by the top decile of customers, with intervals; compares the hybrid design with a baseline that uses no model information; checks sensitivity to the prompt context; and compares the simulated base rate and absolute lift, not only the risk ratio, with a past randomized test. These errors cannot be seen in the output: the sign was right in nearly all cells and the answers were fluent.</w:t>
       </w:r>
     </w:p>
     <w:bookmarkEnd w:id="60"/>
@@ -7130,7 +7130,7 @@
         <w:t xml:space="preserve"> </w:t>
       </w:r>
       <w:r>
-        <w:t xml:space="preserve">per customer, a profit of about 213,000. The gap of about 280,000 for a single campaign favors launching, and because the error is systematic it does not average out over campaigns. The numbers are ours, not the retailer’s, but the example shows how an overstated lift turns directly into a wrong go decision.</w:t>
+        <w:t xml:space="preserve">per customer, a profit of about 213,000. The gap of about 280,000 for one campaign favors launching, and because the error is systematic it does not average out. The numbers are ours, not the retailer’s, but the example shows how an overstated lift turns directly into a wrong go decision.</w:t>
       </w:r>
     </w:p>
     <w:p>
@@ -7154,7 +7154,7 @@
         <w:t xml:space="preserve"> </w:t>
       </w:r>
       <w:r>
-        <w:t xml:space="preserve">the simulated lifts often came with narrow intervals that excluded the real value, and the width of an interval is not a reliable cue to the size of the decision error (Section 5.9), so statistical precision, which a synthetic population gives cheaply, must not be mistaken for validity.</w:t>
+        <w:t xml:space="preserve">simulated lifts often came with narrow intervals that excluded the real value, and interval width is not a reliable cue to decision error (Section 5.9), so cheap statistical precision must not be mistaken for validity.</w:t>
       </w:r>
       <w:r>
         <w:t xml:space="preserve"> </w:t>
@@ -7204,7 +7204,7 @@
         <w:pStyle w:val="FirstParagraph"/>
       </w:pPr>
       <w:r>
-        <w:t xml:space="preserve">The following arrangements follow from our evidence and from the artifact view; we did not test them in an organization.</w:t>
+        <w:t xml:space="preserve">These arrangements follow from our evidence; we did not test them in an organization.</w:t>
       </w:r>
     </w:p>
     <w:p>
@@ -7240,7 +7240,7 @@
         <w:t xml:space="preserve"> </w:t>
       </w:r>
       <w:r>
-        <w:t xml:space="preserve">The eight models differed widely in the same design, and the same model reacted differently to different prompt context. A vendor update, a switch of model or provider, or a change of prompt template should trigger the acceptance test again.</w:t>
+        <w:t xml:space="preserve">The models differed widely in the same design, and the same model reacted differently to different prompts. A vendor update, a switch of model or provider, or a change of prompt template should trigger the acceptance test again.</w:t>
       </w:r>
     </w:p>
     <w:p>
@@ -7294,7 +7294,7 @@
         <w:pStyle w:val="FirstParagraph"/>
       </w:pPr>
       <w:r>
-        <w:t xml:space="preserve">The evidence is preliminary. Every design has one prompt wording, so our intervals capture the sampling of customers but not variation across prompts. All eight models were run on three seeds. Per-seed variance-to-mean ratios were stable for the direct and daily designs but varied more for the describe and hybrid designs (median ranges 0.9 and 1.2), so counts of cells that match the reference are approximate. The low-mean reference is a calibrated parametric distribution, the Complete Journey households are loyalty-card shoppers, and campaigns there were targeted rather than randomized, so only the email experiment supports a causal comparison. The demographic personas contain almost no information about purchase frequency; personas that carry purchase histories would be a stronger test of Proposition 1 and of whether the model contributes more than a level. Whether still larger or reasoning-enabled models collapse less remains open, and public data may be part of the models’ training data. The principles and organizational arrangements have not been tested in an organization, and the backtest of the acceptance test (Section 5.10) uses one pair of campaigns. Future work should use a randomized promotion data set with purchase counts, for example from a partner firm, so that count distributions and treatment effects can be studied on the same customers.</w:t>
+        <w:t xml:space="preserve">The evidence is preliminary. Our intervals capture the sampling of customers but not variation across prompts, which we examined only for four models and two rewordings (Section 5.4). All eight models were run on three seeds. Per-seed variance-to-mean ratios were stable for the direct and daily designs but varied more for the describe and hybrid designs (median ranges 0.9 and 1.2), so counts of cells that match the reference are approximate. The low-mean reference is a calibrated parametric distribution, the Complete Journey households are loyalty-card shoppers, and campaigns there were targeted rather than randomized, so only the email experiment supports a causal comparison. The demographic personas contain almost no information about purchase frequency; personas that carry purchase histories would be a stronger test of Proposition 1 and of whether the model contributes more than a level. Whether reasoning-enabled models collapse less remains open, and public data may be part of the models’ training data. The principles and organizational arrangements have not been tested in an organization, and the backtest (Section 5.10) uses one pair of campaigns. Future work should use a randomized promotion data set with purchase counts, for example from a partner firm.</w:t>
       </w:r>
     </w:p>
     <w:bookmarkEnd w:id="63"/>
@@ -7763,7 +7763,7 @@
           <w:iCs/>
           <w:i/>
         </w:rPr>
-        <w:t xml:space="preserve">An Online Appendix (Appendix A, prompt templates; Appendix B, full results by model and prompt; Appendix C, reproducibility; Appendix D, proofs of Propositions 1 to 3; Appendix E, backtest of the acceptance test) is provided as a separate file.</w:t>
+        <w:t xml:space="preserve">An Online Appendix (Appendices A to F: prompts, full results, reproducibility, proofs, backtest, wording robustness) is provided as a separate file.</w:t>
       </w:r>
     </w:p>
     <w:bookmarkEnd w:id="66"/>

</xml_diff>